<commit_message>
Completar anexos del informe con enlaces al repositorio de GitHub
Los Anexos A, B y C ahora enlazan al código, los scripts SQL y los
archivos de configuración publicados en el repositorio, en lugar de
incluir el código completo dentro del documento.
</commit_message>
<xml_diff>
--- a/Documentacion/Informe_Final_SistemaFacturacion.docx
+++ b/Documentacion/Informe_Final_SistemaFacturacion.docx
@@ -15431,50 +15431,394 @@
           <w:lang w:val="es-ES"/>
         </w:rPr>
       </w:pPr>
-      <w:r>
-        <w:rPr>
-          <w:rFonts w:cs="Cambria"/>
-          <w:lang w:val="es-ES"/>
-        </w:rPr>
-        <w:t xml:space="preserve">El código está organizado en las cuatro carpetas que corresponden a las capas de la arquitectura (Entidades, </w:t>
-      </w:r>
       <w:proofErr w:type="spellStart"/>
-      <w:r>
-        <w:rPr>
-          <w:rFonts w:cs="Cambria"/>
-          <w:lang w:val="es-ES"/>
-        </w:rPr>
-        <w:t>DatosAcceso</w:t>
-      </w:r>
       <w:proofErr w:type="spellEnd"/>
-      <w:r>
-        <w:rPr>
-          <w:rFonts w:cs="Cambria"/>
-          <w:lang w:val="es-ES"/>
-        </w:rPr>
-        <w:t xml:space="preserve">, Negocio y </w:t>
-      </w:r>
       <w:proofErr w:type="spellStart"/>
-      <w:r>
-        <w:rPr>
-          <w:rFonts w:cs="Cambria"/>
-          <w:lang w:val="es-ES"/>
-        </w:rPr>
-        <w:t>Presentacion</w:t>
-      </w:r>
       <w:proofErr w:type="spellEnd"/>
       <w:r>
-        <w:rPr>
-          <w:rFonts w:cs="Cambria"/>
-          <w:lang w:val="es-ES"/>
-        </w:rPr>
-        <w:t>). Está escrito en C#, comentado en español y con nombres de variables y métodos descriptivos, de acuerdo con lo solicitado. Cada archivo aparece precedido por su ruta dentro del proyecto. Las líneas de comentario se muestran en gris.</w:t>
+        <w:t>El código está organizado en las cuatro carpetas que corresponden a las capas de la arquitectura (Entidades, DatosAcceso, Negocio y Presentacion). Está escrito en C#, comentado en español y con nombres de variables y métodos descriptivos, de acuerdo con lo solicitado. Para mantener el informe en un número razonable de páginas, el código fuente completo se publicó en un repositorio público de GitHub, donde puede consultarse archivo por archivo:</w:t>
       </w:r>
     </w:p>
     <w:p>
       <w:pPr>
         <w:pStyle w:val="CodigoFuente"/>
       </w:pPr>
+    </w:p>
+    <w:p>
+      <w:pPr>
+        <w:spacing w:after="160" w:line="288" w:lineRule="auto"/>
+        <w:rPr>
+          <w:lang w:val="es-ES"/>
+        </w:rPr>
+      </w:pPr>
+      <w:r>
+        <w:rPr>
+          <w:b/>
+        </w:rPr>
+        <w:t xml:space="preserve">Repositorio del proyecto:  </w:t>
+      </w:r>
+      <w:hyperlink r:id="rId23">
+        <w:r>
+          <w:rPr>
+            <w:color w:val="0563C1"/>
+            <w:u w:val="single"/>
+          </w:rPr>
+          <w:t xml:space="preserve">https://github.com/ElMOB04/SistemaFacturacion</w:t>
+        </w:r>
+      </w:hyperlink>
+    </w:p>
+    <w:p>
+      <w:pPr>
+        <w:spacing w:after="160" w:line="288" w:lineRule="auto"/>
+        <w:rPr>
+          <w:lang w:val="es-ES"/>
+        </w:rPr>
+      </w:pPr>
+      <w:r>
+        <w:t>Enlaces directos a cada capa dentro del repositorio:</w:t>
+      </w:r>
+    </w:p>
+    <w:p>
+      <w:pPr>
+        <w:spacing w:after="160" w:line="288" w:lineRule="auto"/>
+        <w:rPr>
+          <w:lang w:val="es-ES"/>
+        </w:rPr>
+      </w:pPr>
+      <w:r>
+        <w:rPr>
+          <w:b/>
+        </w:rPr>
+        <w:t>•  Entidades</w:t>
+      </w:r>
+      <w:r>
+        <w:t xml:space="preserve"> — clases del dominio (Cliente, Factura, Cobro, …): </w:t>
+      </w:r>
+      <w:hyperlink r:id="rId24">
+        <w:r>
+          <w:rPr>
+            <w:color w:val="0563C1"/>
+            <w:u w:val="single"/>
+          </w:rPr>
+          <w:t xml:space="preserve">ver carpeta Entidades</w:t>
+        </w:r>
+      </w:hyperlink>
+    </w:p>
+    <w:p>
+      <w:pPr>
+        <w:spacing w:after="160" w:line="288" w:lineRule="auto"/>
+        <w:rPr>
+          <w:lang w:val="es-ES"/>
+        </w:rPr>
+      </w:pPr>
+      <w:r>
+        <w:rPr>
+          <w:b/>
+        </w:rPr>
+        <w:t>•  DatosAcceso</w:t>
+      </w:r>
+      <w:r>
+        <w:t xml:space="preserve"> — capa de acceso a datos con ADO.NET (ConexionBD y DAOs): </w:t>
+      </w:r>
+      <w:hyperlink r:id="rId25">
+        <w:r>
+          <w:rPr>
+            <w:color w:val="0563C1"/>
+            <w:u w:val="single"/>
+          </w:rPr>
+          <w:t xml:space="preserve">ver carpeta DatosAcceso</w:t>
+        </w:r>
+      </w:hyperlink>
+    </w:p>
+    <w:p>
+      <w:pPr>
+        <w:spacing w:after="160" w:line="288" w:lineRule="auto"/>
+        <w:rPr>
+          <w:lang w:val="es-ES"/>
+        </w:rPr>
+      </w:pPr>
+      <w:r>
+        <w:rPr>
+          <w:b/>
+        </w:rPr>
+        <w:t>•  Negocio</w:t>
+      </w:r>
+      <w:r>
+        <w:t xml:space="preserve"> — lógica de negocio (cálculos, saldos, validaciones, seguridad): </w:t>
+      </w:r>
+      <w:hyperlink r:id="rId26">
+        <w:r>
+          <w:rPr>
+            <w:color w:val="0563C1"/>
+            <w:u w:val="single"/>
+          </w:rPr>
+          <w:t xml:space="preserve">ver carpeta Negocio</w:t>
+        </w:r>
+      </w:hyperlink>
+    </w:p>
+    <w:p>
+      <w:pPr>
+        <w:spacing w:after="160" w:line="288" w:lineRule="auto"/>
+        <w:rPr>
+          <w:lang w:val="es-ES"/>
+        </w:rPr>
+      </w:pPr>
+      <w:r>
+        <w:rPr>
+          <w:b/>
+        </w:rPr>
+        <w:t>•  Presentacion</w:t>
+      </w:r>
+      <w:r>
+        <w:t xml:space="preserve"> — formularios Windows Forms: </w:t>
+      </w:r>
+      <w:hyperlink r:id="rId27">
+        <w:r>
+          <w:rPr>
+            <w:color w:val="0563C1"/>
+            <w:u w:val="single"/>
+          </w:rPr>
+          <w:t xml:space="preserve">ver carpeta Presentacion</w:t>
+        </w:r>
+      </w:hyperlink>
+    </w:p>
+    <w:p>
+      <w:pPr>
+        <w:spacing w:after="160" w:line="288" w:lineRule="auto"/>
+        <w:rPr>
+          <w:lang w:val="es-ES"/>
+        </w:rPr>
+      </w:pPr>
+      <w:r>
+        <w:rPr>
+          <w:b/>
+        </w:rPr>
+        <w:t>•  Program.cs</w:t>
+      </w:r>
+      <w:r>
+        <w:t xml:space="preserve"> — punto de entrada de la aplicación: </w:t>
+      </w:r>
+      <w:hyperlink r:id="rId28">
+        <w:r>
+          <w:rPr>
+            <w:color w:val="0563C1"/>
+            <w:u w:val="single"/>
+          </w:rPr>
+          <w:t xml:space="preserve">ver Program.cs</w:t>
+        </w:r>
+      </w:hyperlink>
+    </w:p>
+    <w:p>
+      <w:pPr>
+        <w:spacing w:after="160" w:line="288" w:lineRule="auto"/>
+        <w:jc w:val="both"/>
+        <w:rPr>
+          <w:lang w:val="es-ES"/>
+        </w:rPr>
+      </w:pPr>
+      <w:r>
+        <w:t>El repositorio incluye además un archivo README.md con las instrucciones detalladas de instalación, configuración y ejecución del sistema.</w:t>
+      </w:r>
+    </w:p>
+    <w:p>
+      <w:pPr>
+        <w:keepNext/>
+        <w:pBdr>
+          <w:bottom w:val="single" w:sz="6" w:space="6" w:color="0B4F6C"/>
+        </w:pBdr>
+        <w:spacing w:before="80" w:after="120"/>
+        <w:rPr>
+          <w:lang w:val="es-ES"/>
+        </w:rPr>
+      </w:pPr>
+      <w:r>
+        <w:rPr>
+          <w:rFonts w:ascii="Calibri" w:hAnsi="Calibri" w:cs="Calibri"/>
+          <w:b/>
+          <w:color w:val="0B4F6C"/>
+          <w:sz w:val="32"/>
+          <w:lang w:val="es-ES"/>
+        </w:rPr>
+        <w:lastRenderedPageBreak/>
+        <w:t>Anexo B — Scripts de la base de datos (SQL)</w:t>
+      </w:r>
+    </w:p>
+    <w:p>
+      <w:pPr>
+        <w:spacing w:after="160" w:line="288" w:lineRule="auto"/>
+        <w:jc w:val="both"/>
+        <w:rPr>
+          <w:lang w:val="es-ES"/>
+        </w:rPr>
+      </w:pPr>
+      <w:r>
+        <w:t>Los scripts de SQL Server se encuentran en la carpeta Database del repositorio y deben ejecutarse en el orden indicado:</w:t>
+      </w:r>
+    </w:p>
+    <w:p>
+      <w:pPr>
+        <w:spacing w:after="160" w:line="288" w:lineRule="auto"/>
+        <w:rPr>
+          <w:lang w:val="es-ES"/>
+        </w:rPr>
+      </w:pPr>
+      <w:r>
+        <w:rPr>
+          <w:b/>
+        </w:rPr>
+        <w:t>•  01_CrearBaseDatos.sql</w:t>
+      </w:r>
+      <w:r>
+        <w:t xml:space="preserve"> — crea la base de datos SistemaFacturacionDB con sus tablas, claves y relaciones: </w:t>
+      </w:r>
+      <w:hyperlink r:id="rId29">
+        <w:r>
+          <w:rPr>
+            <w:color w:val="0563C1"/>
+            <w:u w:val="single"/>
+          </w:rPr>
+          <w:t xml:space="preserve">ver script</w:t>
+        </w:r>
+      </w:hyperlink>
+    </w:p>
+    <w:p>
+      <w:pPr>
+        <w:spacing w:after="160" w:line="288" w:lineRule="auto"/>
+        <w:rPr>
+          <w:lang w:val="es-ES"/>
+        </w:rPr>
+      </w:pPr>
+      <w:r>
+        <w:rPr>
+          <w:b/>
+        </w:rPr>
+        <w:t>•  02_DatosPrueba.sql</w:t>
+      </w:r>
+      <w:r>
+        <w:t xml:space="preserve"> — inserta los datos de prueba iniciales (usuarios, clientes, proveedores, productos): </w:t>
+      </w:r>
+      <w:hyperlink r:id="rId30">
+        <w:r>
+          <w:rPr>
+            <w:color w:val="0563C1"/>
+            <w:u w:val="single"/>
+          </w:rPr>
+          <w:t xml:space="preserve">ver script</w:t>
+        </w:r>
+      </w:hyperlink>
+    </w:p>
+    <w:p>
+      <w:pPr>
+        <w:keepNext/>
+        <w:pBdr>
+          <w:bottom w:val="single" w:sz="6" w:space="6" w:color="0B4F6C"/>
+        </w:pBdr>
+        <w:spacing w:before="80" w:after="120"/>
+        <w:rPr>
+          <w:lang w:val="es-ES"/>
+        </w:rPr>
+      </w:pPr>
+      <w:r>
+        <w:rPr>
+          <w:rFonts w:ascii="Calibri" w:hAnsi="Calibri" w:cs="Calibri"/>
+          <w:b/>
+          <w:color w:val="0B4F6C"/>
+          <w:sz w:val="32"/>
+          <w:lang w:val="es-ES"/>
+        </w:rPr>
+        <w:lastRenderedPageBreak/>
+        <w:t>Anexo C — Archivos de configuración y compilación</w:t>
+      </w:r>
+    </w:p>
+    <w:p>
+      <w:pPr>
+        <w:spacing w:after="160" w:line="288" w:lineRule="auto"/>
+        <w:jc w:val="both"/>
+        <w:rPr>
+          <w:lang w:val="es-ES"/>
+        </w:rPr>
+      </w:pPr>
+      <w:r>
+        <w:t>Estos archivos permiten configurar la conexión a la base de datos y compilar el proyecto:</w:t>
+      </w:r>
+    </w:p>
+    <w:p>
+      <w:pPr>
+        <w:spacing w:after="160" w:line="288" w:lineRule="auto"/>
+        <w:rPr>
+          <w:lang w:val="es-ES"/>
+        </w:rPr>
+      </w:pPr>
+      <w:r>
+        <w:rPr>
+          <w:b/>
+        </w:rPr>
+        <w:t>•  App.config</w:t>
+      </w:r>
+      <w:r>
+        <w:t xml:space="preserve"> — cadena de conexión a SQL Server: </w:t>
+      </w:r>
+      <w:hyperlink r:id="rId31">
+        <w:r>
+          <w:rPr>
+            <w:color w:val="0563C1"/>
+            <w:u w:val="single"/>
+          </w:rPr>
+          <w:t xml:space="preserve">ver App.config</w:t>
+        </w:r>
+      </w:hyperlink>
+    </w:p>
+    <w:p>
+      <w:pPr>
+        <w:spacing w:after="160" w:line="288" w:lineRule="auto"/>
+        <w:rPr>
+          <w:lang w:val="es-ES"/>
+        </w:rPr>
+      </w:pPr>
+      <w:r>
+        <w:rPr>
+          <w:b/>
+        </w:rPr>
+        <w:t>•  Compilar.bat</w:t>
+      </w:r>
+      <w:r>
+        <w:t xml:space="preserve"> — compila y ejecuta el proyecto sin necesidad de Visual Studio: </w:t>
+      </w:r>
+      <w:hyperlink r:id="rId32">
+        <w:r>
+          <w:rPr>
+            <w:color w:val="0563C1"/>
+            <w:u w:val="single"/>
+          </w:rPr>
+          <w:t xml:space="preserve">ver Compilar.bat</w:t>
+        </w:r>
+      </w:hyperlink>
+    </w:p>
+    <w:p>
+      <w:pPr>
+        <w:spacing w:after="160" w:line="288" w:lineRule="auto"/>
+        <w:rPr>
+          <w:lang w:val="es-ES"/>
+        </w:rPr>
+      </w:pPr>
+      <w:r>
+        <w:rPr>
+          <w:b/>
+        </w:rPr>
+        <w:t>•  SistemaFacturacion.csproj / .sln</w:t>
+      </w:r>
+      <w:r>
+        <w:t xml:space="preserve"> — proyecto y solución para abrir en Visual Studio: </w:t>
+      </w:r>
+      <w:hyperlink r:id="rId33">
+        <w:r>
+          <w:rPr>
+            <w:color w:val="0563C1"/>
+            <w:u w:val="single"/>
+          </w:rPr>
+          <w:t xml:space="preserve">ver proyecto</w:t>
+        </w:r>
+      </w:hyperlink>
     </w:p>
     <w:sectPr>
       <w:pgSz w:w="12240" w:h="15840"/>

</xml_diff>

<commit_message>
Agregar Anexo D: declaración de originalidad y autoría
Incluye la declaración firmada por los tres integrantes, las
conclusiones individuales de cada uno y las líneas de firma.
</commit_message>
<xml_diff>
--- a/Documentacion/Informe_Final_SistemaFacturacion.docx
+++ b/Documentacion/Informe_Final_SistemaFacturacion.docx
@@ -947,6 +947,33 @@
     </w:p>
     <w:p>
       <w:pPr>
+        <w:spacing w:after="120"/>
+        <w:ind w:left="170"/>
+        <w:rPr>
+          <w:lang w:val="es-ES"/>
+        </w:rPr>
+      </w:pPr>
+      <w:r>
+        <w:rPr>
+          <w:rFonts w:ascii="Calibri" w:hAnsi="Calibri" w:cs="Calibri"/>
+          <w:b/>
+          <w:color w:val="126882"/>
+          <w:sz w:val="23"/>
+          <w:lang w:val="es-ES"/>
+        </w:rPr>
+        <w:t xml:space="preserve">  D.   </w:t>
+      </w:r>
+      <w:r>
+        <w:rPr>
+          <w:rFonts w:cs="Cambria"/>
+          <w:sz w:val="23"/>
+          <w:lang w:val="es-ES"/>
+        </w:rPr>
+        <w:t>Anexo D — Declaración de originalidad y autoría</w:t>
+      </w:r>
+    </w:p>
+    <w:p>
+      <w:pPr>
         <w:rPr>
           <w:lang w:val="es-ES"/>
         </w:rPr>
@@ -2836,8 +2863,19 @@
           <w:color w:val="126882"/>
           <w:sz w:val="24"/>
         </w:rPr>
-        <w:t xml:space="preserve"> principales</w:t>
-      </w:r>
+        <w:t xml:space="preserve"> </w:t>
+      </w:r>
+      <w:proofErr w:type="spellStart"/>
+      <w:r>
+        <w:rPr>
+          <w:rFonts w:ascii="Calibri" w:hAnsi="Calibri" w:cs="Calibri"/>
+          <w:b/>
+          <w:color w:val="126882"/>
+          <w:sz w:val="24"/>
+        </w:rPr>
+        <w:t>principales</w:t>
+      </w:r>
+      <w:proofErr w:type="spellEnd"/>
     </w:p>
     <w:tbl>
       <w:tblPr>
@@ -11678,6 +11716,7 @@
               </w:rPr>
               <w:t xml:space="preserve"> = </w:t>
             </w:r>
+            <w:proofErr w:type="spellStart"/>
             <w:proofErr w:type="gramStart"/>
             <w:r>
               <w:rPr>
@@ -11686,6 +11725,7 @@
               </w:rPr>
               <w:t>cn.BeginTransaction</w:t>
             </w:r>
+            <w:proofErr w:type="spellEnd"/>
             <w:proofErr w:type="gramEnd"/>
             <w:r>
               <w:rPr>
@@ -15431,17 +15471,19 @@
           <w:lang w:val="es-ES"/>
         </w:rPr>
       </w:pPr>
-      <w:proofErr w:type="spellStart"/>
-      <w:proofErr w:type="spellEnd"/>
-      <w:proofErr w:type="spellStart"/>
-      <w:proofErr w:type="spellEnd"/>
-      <w:r>
+      <w:r>
+        <w:rPr>
+          <w:lang w:val="es-ES"/>
+        </w:rPr>
         <w:t>El código está organizado en las cuatro carpetas que corresponden a las capas de la arquitectura (Entidades, DatosAcceso, Negocio y Presentacion). Está escrito en C#, comentado en español y con nombres de variables y métodos descriptivos, de acuerdo con lo solicitado. Para mantener el informe en un número razonable de páginas, el código fuente completo se publicó en un repositorio público de GitHub, donde puede consultarse archivo por archivo:</w:t>
       </w:r>
     </w:p>
     <w:p>
       <w:pPr>
         <w:pStyle w:val="CodigoFuente"/>
+        <w:rPr>
+          <w:lang w:val="es-ES"/>
+        </w:rPr>
       </w:pPr>
     </w:p>
     <w:p>
@@ -15454,10 +15496,730 @@
       <w:r>
         <w:rPr>
           <w:b/>
+          <w:lang w:val="es-ES"/>
         </w:rPr>
         <w:t xml:space="preserve">Repositorio del proyecto:  </w:t>
       </w:r>
-      <w:hyperlink r:id="rId23">
+      <w:r>
+        <w:fldChar w:fldCharType="begin"/>
+      </w:r>
+      <w:r>
+        <w:rPr>
+          <w:lang w:val="es-ES"/>
+        </w:rPr>
+        <w:instrText>HYPERLINK "https://github.com/ElMOB04/SistemaFacturacion" \h</w:instrText>
+      </w:r>
+      <w:r>
+        <w:fldChar w:fldCharType="separate"/>
+      </w:r>
+      <w:r>
+        <w:rPr>
+          <w:color w:val="0563C1"/>
+          <w:u w:val="single"/>
+          <w:lang w:val="es-ES"/>
+        </w:rPr>
+        <w:t>https://github.com/ElMOB04/SistemaFacturacion</w:t>
+      </w:r>
+      <w:r>
+        <w:fldChar w:fldCharType="end"/>
+      </w:r>
+    </w:p>
+    <w:p>
+      <w:pPr>
+        <w:spacing w:after="160" w:line="288" w:lineRule="auto"/>
+        <w:rPr>
+          <w:lang w:val="es-ES"/>
+        </w:rPr>
+      </w:pPr>
+      <w:r>
+        <w:rPr>
+          <w:lang w:val="es-ES"/>
+        </w:rPr>
+        <w:t>Enlaces directos a cada capa dentro del repositorio:</w:t>
+      </w:r>
+    </w:p>
+    <w:p>
+      <w:pPr>
+        <w:spacing w:after="160" w:line="288" w:lineRule="auto"/>
+        <w:rPr>
+          <w:lang w:val="es-ES"/>
+        </w:rPr>
+      </w:pPr>
+      <w:r>
+        <w:rPr>
+          <w:b/>
+          <w:lang w:val="es-ES"/>
+        </w:rPr>
+        <w:t>•  Entidades</w:t>
+      </w:r>
+      <w:r>
+        <w:rPr>
+          <w:lang w:val="es-ES"/>
+        </w:rPr>
+        <w:t xml:space="preserve"> — clases del dominio (Cliente, Factura, Cobro, …): </w:t>
+      </w:r>
+      <w:r>
+        <w:fldChar w:fldCharType="begin"/>
+      </w:r>
+      <w:r>
+        <w:rPr>
+          <w:lang w:val="es-ES"/>
+        </w:rPr>
+        <w:instrText>HYPERLINK "https://github.com/ElMOB04/SistemaFacturacion/tree/main/Entidades" \h</w:instrText>
+      </w:r>
+      <w:r>
+        <w:fldChar w:fldCharType="separate"/>
+      </w:r>
+      <w:r>
+        <w:rPr>
+          <w:color w:val="0563C1"/>
+          <w:u w:val="single"/>
+          <w:lang w:val="es-ES"/>
+        </w:rPr>
+        <w:t>ver carpeta Entidades</w:t>
+      </w:r>
+      <w:r>
+        <w:fldChar w:fldCharType="end"/>
+      </w:r>
+    </w:p>
+    <w:p>
+      <w:pPr>
+        <w:spacing w:after="160" w:line="288" w:lineRule="auto"/>
+        <w:rPr>
+          <w:lang w:val="es-ES"/>
+        </w:rPr>
+      </w:pPr>
+      <w:r>
+        <w:rPr>
+          <w:b/>
+          <w:lang w:val="es-ES"/>
+        </w:rPr>
+        <w:t>•  DatosAcceso</w:t>
+      </w:r>
+      <w:r>
+        <w:rPr>
+          <w:lang w:val="es-ES"/>
+        </w:rPr>
+        <w:t xml:space="preserve"> — capa de acceso a datos con ADO.NET (ConexionBD y DAOs): </w:t>
+      </w:r>
+      <w:r>
+        <w:fldChar w:fldCharType="begin"/>
+      </w:r>
+      <w:r>
+        <w:rPr>
+          <w:lang w:val="es-ES"/>
+        </w:rPr>
+        <w:instrText>HYPERLINK "https://github.com/ElMOB04/SistemaFacturacion/tree/main/DatosAcceso" \h</w:instrText>
+      </w:r>
+      <w:r>
+        <w:fldChar w:fldCharType="separate"/>
+      </w:r>
+      <w:r>
+        <w:rPr>
+          <w:color w:val="0563C1"/>
+          <w:u w:val="single"/>
+          <w:lang w:val="es-ES"/>
+        </w:rPr>
+        <w:t>ver carpeta DatosAcceso</w:t>
+      </w:r>
+      <w:r>
+        <w:fldChar w:fldCharType="end"/>
+      </w:r>
+    </w:p>
+    <w:p>
+      <w:pPr>
+        <w:spacing w:after="160" w:line="288" w:lineRule="auto"/>
+        <w:rPr>
+          <w:lang w:val="es-ES"/>
+        </w:rPr>
+      </w:pPr>
+      <w:r>
+        <w:rPr>
+          <w:b/>
+          <w:lang w:val="es-ES"/>
+        </w:rPr>
+        <w:t>•  Negocio</w:t>
+      </w:r>
+      <w:r>
+        <w:rPr>
+          <w:lang w:val="es-ES"/>
+        </w:rPr>
+        <w:t xml:space="preserve"> — lógica de negocio (cálculos, saldos, validaciones, seguridad): </w:t>
+      </w:r>
+      <w:r>
+        <w:fldChar w:fldCharType="begin"/>
+      </w:r>
+      <w:r>
+        <w:rPr>
+          <w:lang w:val="es-ES"/>
+        </w:rPr>
+        <w:instrText>HYPERLINK "https://github.com/ElMOB04/SistemaFacturacion/tree/main/Negocio" \h</w:instrText>
+      </w:r>
+      <w:r>
+        <w:fldChar w:fldCharType="separate"/>
+      </w:r>
+      <w:r>
+        <w:rPr>
+          <w:color w:val="0563C1"/>
+          <w:u w:val="single"/>
+          <w:lang w:val="es-ES"/>
+        </w:rPr>
+        <w:t>ver carpeta Negocio</w:t>
+      </w:r>
+      <w:r>
+        <w:fldChar w:fldCharType="end"/>
+      </w:r>
+    </w:p>
+    <w:p>
+      <w:pPr>
+        <w:spacing w:after="160" w:line="288" w:lineRule="auto"/>
+        <w:rPr>
+          <w:lang w:val="es-ES"/>
+        </w:rPr>
+      </w:pPr>
+      <w:r>
+        <w:rPr>
+          <w:b/>
+          <w:lang w:val="es-ES"/>
+        </w:rPr>
+        <w:t>•  Presentacion</w:t>
+      </w:r>
+      <w:r>
+        <w:rPr>
+          <w:lang w:val="es-ES"/>
+        </w:rPr>
+        <w:t xml:space="preserve"> — formularios Windows Forms: </w:t>
+      </w:r>
+      <w:r>
+        <w:fldChar w:fldCharType="begin"/>
+      </w:r>
+      <w:r>
+        <w:rPr>
+          <w:lang w:val="es-ES"/>
+        </w:rPr>
+        <w:instrText>HYPERLINK "https://github.com/ElMOB04/SistemaFacturacion/tree/main/Presentacion" \h</w:instrText>
+      </w:r>
+      <w:r>
+        <w:fldChar w:fldCharType="separate"/>
+      </w:r>
+      <w:r>
+        <w:rPr>
+          <w:color w:val="0563C1"/>
+          <w:u w:val="single"/>
+          <w:lang w:val="es-ES"/>
+        </w:rPr>
+        <w:t>ver carpeta Presentacion</w:t>
+      </w:r>
+      <w:r>
+        <w:fldChar w:fldCharType="end"/>
+      </w:r>
+    </w:p>
+    <w:p>
+      <w:pPr>
+        <w:spacing w:after="160" w:line="288" w:lineRule="auto"/>
+        <w:rPr>
+          <w:lang w:val="es-ES"/>
+        </w:rPr>
+      </w:pPr>
+      <w:r>
+        <w:rPr>
+          <w:b/>
+          <w:lang w:val="es-ES"/>
+        </w:rPr>
+        <w:t>•  Program.cs</w:t>
+      </w:r>
+      <w:r>
+        <w:rPr>
+          <w:lang w:val="es-ES"/>
+        </w:rPr>
+        <w:t xml:space="preserve"> — punto de entrada de la aplicación: </w:t>
+      </w:r>
+      <w:r>
+        <w:fldChar w:fldCharType="begin"/>
+      </w:r>
+      <w:r>
+        <w:rPr>
+          <w:lang w:val="es-ES"/>
+        </w:rPr>
+        <w:instrText>HYPERLINK "https://github.com/ElMOB04/SistemaFacturacion/blob/main/Program.cs" \h</w:instrText>
+      </w:r>
+      <w:r>
+        <w:fldChar w:fldCharType="separate"/>
+      </w:r>
+      <w:r>
+        <w:rPr>
+          <w:color w:val="0563C1"/>
+          <w:u w:val="single"/>
+          <w:lang w:val="es-ES"/>
+        </w:rPr>
+        <w:t>ver Program.cs</w:t>
+      </w:r>
+      <w:r>
+        <w:fldChar w:fldCharType="end"/>
+      </w:r>
+    </w:p>
+    <w:p>
+      <w:pPr>
+        <w:spacing w:after="160" w:line="288" w:lineRule="auto"/>
+        <w:jc w:val="both"/>
+        <w:rPr>
+          <w:lang w:val="es-ES"/>
+        </w:rPr>
+      </w:pPr>
+      <w:r>
+        <w:rPr>
+          <w:lang w:val="es-ES"/>
+        </w:rPr>
+        <w:t>El repositorio incluye además un archivo README.md con las instrucciones detalladas de instalación, configuración y ejecución del sistema.</w:t>
+      </w:r>
+    </w:p>
+    <w:p>
+      <w:pPr>
+        <w:keepNext/>
+        <w:pBdr>
+          <w:bottom w:val="single" w:sz="6" w:space="6" w:color="0B4F6C"/>
+        </w:pBdr>
+        <w:spacing w:before="80" w:after="120"/>
+        <w:rPr>
+          <w:lang w:val="es-ES"/>
+        </w:rPr>
+      </w:pPr>
+      <w:r>
+        <w:rPr>
+          <w:rFonts w:ascii="Calibri" w:hAnsi="Calibri" w:cs="Calibri"/>
+          <w:b/>
+          <w:color w:val="0B4F6C"/>
+          <w:sz w:val="32"/>
+          <w:lang w:val="es-ES"/>
+        </w:rPr>
+        <w:t>Anexo B — Scripts de la base de datos (SQL)</w:t>
+      </w:r>
+    </w:p>
+    <w:p>
+      <w:pPr>
+        <w:spacing w:after="160" w:line="288" w:lineRule="auto"/>
+        <w:jc w:val="both"/>
+        <w:rPr>
+          <w:lang w:val="es-ES"/>
+        </w:rPr>
+      </w:pPr>
+      <w:r>
+        <w:rPr>
+          <w:lang w:val="es-ES"/>
+        </w:rPr>
+        <w:t>Los scripts de SQL Server se encuentran en la carpeta Database del repositorio y deben ejecutarse en el orden indicado:</w:t>
+      </w:r>
+    </w:p>
+    <w:p>
+      <w:pPr>
+        <w:spacing w:after="160" w:line="288" w:lineRule="auto"/>
+        <w:rPr>
+          <w:lang w:val="es-ES"/>
+        </w:rPr>
+      </w:pPr>
+      <w:r>
+        <w:rPr>
+          <w:b/>
+          <w:lang w:val="es-ES"/>
+        </w:rPr>
+        <w:t>•  01_CrearBaseDatos.sql</w:t>
+      </w:r>
+      <w:r>
+        <w:rPr>
+          <w:lang w:val="es-ES"/>
+        </w:rPr>
+        <w:t xml:space="preserve"> — crea la base de datos SistemaFacturacionDB con sus tablas, claves y relaciones: </w:t>
+      </w:r>
+      <w:r>
+        <w:fldChar w:fldCharType="begin"/>
+      </w:r>
+      <w:r>
+        <w:rPr>
+          <w:lang w:val="es-ES"/>
+        </w:rPr>
+        <w:instrText>HYPERLINK "https://github.com/ElMOB04/SistemaFacturacion/blob/main/Database/01_CrearBaseDatos.sql" \h</w:instrText>
+      </w:r>
+      <w:r>
+        <w:fldChar w:fldCharType="separate"/>
+      </w:r>
+      <w:r>
+        <w:rPr>
+          <w:color w:val="0563C1"/>
+          <w:u w:val="single"/>
+          <w:lang w:val="es-ES"/>
+        </w:rPr>
+        <w:t>ver script</w:t>
+      </w:r>
+      <w:r>
+        <w:fldChar w:fldCharType="end"/>
+      </w:r>
+    </w:p>
+    <w:p>
+      <w:pPr>
+        <w:spacing w:after="160" w:line="288" w:lineRule="auto"/>
+        <w:rPr>
+          <w:lang w:val="es-ES"/>
+        </w:rPr>
+      </w:pPr>
+      <w:r>
+        <w:rPr>
+          <w:b/>
+          <w:lang w:val="es-ES"/>
+        </w:rPr>
+        <w:t>•  02_DatosPrueba.sql</w:t>
+      </w:r>
+      <w:r>
+        <w:rPr>
+          <w:lang w:val="es-ES"/>
+        </w:rPr>
+        <w:t xml:space="preserve"> — inserta los datos de prueba iniciales (usuarios, clientes, proveedores, productos): </w:t>
+      </w:r>
+      <w:r>
+        <w:fldChar w:fldCharType="begin"/>
+      </w:r>
+      <w:r>
+        <w:rPr>
+          <w:lang w:val="es-ES"/>
+        </w:rPr>
+        <w:instrText>HYPERLINK "https://github.com/ElMOB04/SistemaFacturacion/blob/main/Database/02_DatosPrueba.sql" \h</w:instrText>
+      </w:r>
+      <w:r>
+        <w:fldChar w:fldCharType="separate"/>
+      </w:r>
+      <w:r>
+        <w:rPr>
+          <w:color w:val="0563C1"/>
+          <w:u w:val="single"/>
+          <w:lang w:val="es-ES"/>
+        </w:rPr>
+        <w:t>ver script</w:t>
+      </w:r>
+      <w:r>
+        <w:fldChar w:fldCharType="end"/>
+      </w:r>
+    </w:p>
+    <w:p>
+      <w:pPr>
+        <w:keepNext/>
+        <w:pBdr>
+          <w:bottom w:val="single" w:sz="6" w:space="6" w:color="0B4F6C"/>
+        </w:pBdr>
+        <w:spacing w:before="80" w:after="120"/>
+        <w:rPr>
+          <w:lang w:val="es-ES"/>
+        </w:rPr>
+      </w:pPr>
+      <w:r>
+        <w:rPr>
+          <w:rFonts w:ascii="Calibri" w:hAnsi="Calibri" w:cs="Calibri"/>
+          <w:b/>
+          <w:color w:val="0B4F6C"/>
+          <w:sz w:val="32"/>
+          <w:lang w:val="es-ES"/>
+        </w:rPr>
+        <w:t>Anexo C — Archivos de configuración y compilación</w:t>
+      </w:r>
+    </w:p>
+    <w:p>
+      <w:pPr>
+        <w:spacing w:after="160" w:line="288" w:lineRule="auto"/>
+        <w:jc w:val="both"/>
+        <w:rPr>
+          <w:lang w:val="es-ES"/>
+        </w:rPr>
+      </w:pPr>
+      <w:r>
+        <w:rPr>
+          <w:lang w:val="es-ES"/>
+        </w:rPr>
+        <w:t>Estos archivos permiten configurar la conexión a la base de datos y compilar el proyecto:</w:t>
+      </w:r>
+    </w:p>
+    <w:p>
+      <w:pPr>
+        <w:spacing w:after="160" w:line="288" w:lineRule="auto"/>
+        <w:rPr>
+          <w:lang w:val="es-ES"/>
+        </w:rPr>
+      </w:pPr>
+      <w:r>
+        <w:rPr>
+          <w:b/>
+          <w:lang w:val="es-ES"/>
+        </w:rPr>
+        <w:t>•  App.config</w:t>
+      </w:r>
+      <w:r>
+        <w:rPr>
+          <w:lang w:val="es-ES"/>
+        </w:rPr>
+        <w:t xml:space="preserve"> — cadena de conexión a SQL Server: </w:t>
+      </w:r>
+      <w:r>
+        <w:fldChar w:fldCharType="begin"/>
+      </w:r>
+      <w:r>
+        <w:rPr>
+          <w:lang w:val="es-ES"/>
+        </w:rPr>
+        <w:instrText>HYPERLINK "https://github.com/ElMOB04/SistemaFacturacion/blob/main/App.config" \h</w:instrText>
+      </w:r>
+      <w:r>
+        <w:fldChar w:fldCharType="separate"/>
+      </w:r>
+      <w:r>
+        <w:rPr>
+          <w:color w:val="0563C1"/>
+          <w:u w:val="single"/>
+          <w:lang w:val="es-ES"/>
+        </w:rPr>
+        <w:t>ver App.config</w:t>
+      </w:r>
+      <w:r>
+        <w:fldChar w:fldCharType="end"/>
+      </w:r>
+    </w:p>
+    <w:p>
+      <w:pPr>
+        <w:spacing w:after="160" w:line="288" w:lineRule="auto"/>
+        <w:rPr>
+          <w:lang w:val="es-ES"/>
+        </w:rPr>
+      </w:pPr>
+      <w:r>
+        <w:rPr>
+          <w:b/>
+          <w:lang w:val="es-ES"/>
+        </w:rPr>
+        <w:t>•  Compilar.bat</w:t>
+      </w:r>
+      <w:r>
+        <w:rPr>
+          <w:lang w:val="es-ES"/>
+        </w:rPr>
+        <w:t xml:space="preserve"> — compila y ejecuta el proyecto sin necesidad de Visual Studio: </w:t>
+      </w:r>
+      <w:r>
+        <w:fldChar w:fldCharType="begin"/>
+      </w:r>
+      <w:r>
+        <w:rPr>
+          <w:lang w:val="es-ES"/>
+        </w:rPr>
+        <w:instrText>HYPERLINK "https://github.com/ElMOB04/SistemaFacturacion/blob/main/Compilar.bat" \h</w:instrText>
+      </w:r>
+      <w:r>
+        <w:fldChar w:fldCharType="separate"/>
+      </w:r>
+      <w:r>
+        <w:rPr>
+          <w:color w:val="0563C1"/>
+          <w:u w:val="single"/>
+          <w:lang w:val="es-ES"/>
+        </w:rPr>
+        <w:t>ver Compilar.bat</w:t>
+      </w:r>
+      <w:r>
+        <w:fldChar w:fldCharType="end"/>
+      </w:r>
+    </w:p>
+    <w:p>
+      <w:pPr>
+        <w:spacing w:after="160" w:line="288" w:lineRule="auto"/>
+        <w:rPr>
+          <w:lang w:val="es-ES"/>
+        </w:rPr>
+      </w:pPr>
+      <w:r>
+        <w:rPr>
+          <w:b/>
+          <w:lang w:val="es-ES"/>
+        </w:rPr>
+        <w:t xml:space="preserve">•  </w:t>
+      </w:r>
+      <w:proofErr w:type="spellStart"/>
+      <w:r>
+        <w:rPr>
+          <w:b/>
+          <w:lang w:val="es-ES"/>
+        </w:rPr>
+        <w:t>SistemaFacturacion.csproj</w:t>
+      </w:r>
+      <w:proofErr w:type="spellEnd"/>
+      <w:r>
+        <w:rPr>
+          <w:b/>
+          <w:lang w:val="es-ES"/>
+        </w:rPr>
+        <w:t xml:space="preserve"> / .</w:t>
+      </w:r>
+      <w:proofErr w:type="spellStart"/>
+      <w:r>
+        <w:rPr>
+          <w:b/>
+          <w:lang w:val="es-ES"/>
+        </w:rPr>
+        <w:t>sln</w:t>
+      </w:r>
+      <w:proofErr w:type="spellEnd"/>
+      <w:r>
+        <w:rPr>
+          <w:lang w:val="es-ES"/>
+        </w:rPr>
+        <w:t xml:space="preserve"> — proyecto y solución para abrir en Visual Studio: </w:t>
+      </w:r>
+      <w:hyperlink r:id="rId21">
+        <w:r>
+          <w:rPr>
+            <w:color w:val="0563C1"/>
+            <w:u w:val="single"/>
+            <w:lang w:val="es-ES"/>
+          </w:rPr>
+          <w:t>ver proyecto</w:t>
+        </w:r>
+      </w:hyperlink>
+      <w:r>
+        <w:rPr>
+          <w:lang w:val="es-ES"/>
+        </w:rPr>
+        <w:br/>
+      </w:r>
+      <w:r>
+        <w:rPr>
+          <w:lang w:val="es-ES"/>
+        </w:rPr>
+        <w:br/>
+      </w:r>
+      <w:r>
+        <w:rPr>
+          <w:lang w:val="es-ES"/>
+        </w:rPr>
+        <w:lastRenderedPageBreak/>
+        <w:br/>
+      </w:r>
+    </w:p>
+    <w:p>
+      <w:pPr>
+        <w:pageBreakBefore/>
+        <w:keepNext/>
+        <w:pBdr>
+          <w:bottom w:val="single" w:sz="6" w:space="6" w:color="0B4F6C"/>
+        </w:pBdr>
+        <w:spacing w:before="80" w:after="120"/>
+        <w:rPr>
+          <w:lang w:val="es-ES"/>
+        </w:rPr>
+      </w:pPr>
+      <w:r>
+        <w:rPr>
+          <w:rFonts w:ascii="Calibri" w:hAnsi="Calibri" w:cs="Calibri"/>
+          <w:b/>
+          <w:color w:val="0B4F6C"/>
+          <w:sz w:val="32"/>
+          <w:lang w:val="es-ES"/>
+        </w:rPr>
+        <w:lastRenderedPageBreak/>
+        <w:t>Anexo D — Declaración de originalidad y autoría</w:t>
+      </w:r>
+    </w:p>
+    <w:p>
+      <w:pPr>
+        <w:spacing w:after="160" w:line="288" w:lineRule="auto"/>
+        <w:jc w:val="both"/>
+        <w:rPr>
+          <w:lang w:val="es-ES"/>
+        </w:rPr>
+      </w:pPr>
+      <w:r>
+        <w:t xml:space="preserve">Nosotros, </w:t>
+      </w:r>
+      <w:r>
+        <w:rPr>
+          <w:b/>
+        </w:rPr>
+        <w:t>Alejandro José Luis Suárez (100094903)</w:t>
+      </w:r>
+      <w:r>
+        <w:t xml:space="preserve">, </w:t>
+      </w:r>
+      <w:r>
+        <w:rPr>
+          <w:b/>
+        </w:rPr>
+        <w:t>Michelle del Carmen Durán Polanco (100071927)</w:t>
+      </w:r>
+      <w:r>
+        <w:t xml:space="preserve"> y </w:t>
+      </w:r>
+      <w:r>
+        <w:rPr>
+          <w:b/>
+        </w:rPr>
+        <w:t>Elios de Jesús Dilone (100092874)</w:t>
+      </w:r>
+      <w:r>
+        <w:t>, estudiantes de la asignatura Programación, período mayo–julio de 2026, declaramos que:</w:t>
+      </w:r>
+    </w:p>
+    <w:p>
+      <w:pPr>
+        <w:spacing w:after="160" w:line="288" w:lineRule="auto"/>
+        <w:jc w:val="both"/>
+        <w:rPr>
+          <w:lang w:val="es-ES"/>
+        </w:rPr>
+      </w:pPr>
+      <w:r>
+        <w:t>1.  El presente informe técnico y el sistema de software Sistema de Facturación y Cuentas por Cobrar y por Pagar documentado en él son de nuestra exclusiva autoría y fueron desarrollados por el equipo durante el período académico correspondiente.</w:t>
+      </w:r>
+    </w:p>
+    <w:p>
+      <w:pPr>
+        <w:spacing w:after="160" w:line="288" w:lineRule="auto"/>
+        <w:jc w:val="both"/>
+        <w:rPr>
+          <w:lang w:val="es-ES"/>
+        </w:rPr>
+      </w:pPr>
+      <w:r>
+        <w:t>2.  El código fuente del sistema fue escrito por los integrantes del equipo según la distribución de trabajo descrita en la sección 10, sin reproducción de código de terceros sin la debida atribución, respetando las normas de integridad académica establecidas por la institución.</w:t>
+      </w:r>
+    </w:p>
+    <w:p>
+      <w:pPr>
+        <w:spacing w:after="160" w:line="288" w:lineRule="auto"/>
+        <w:jc w:val="both"/>
+        <w:rPr>
+          <w:lang w:val="es-ES"/>
+        </w:rPr>
+      </w:pPr>
+      <w:r>
+        <w:t>3.  Las fuentes consultadas (documentación oficial de Microsoft sobre C#, Windows Forms, ADO.NET y SQL Server, y los materiales de la asignatura) se utilizaron únicamente como referencia; no se presentan ideas ajenas como propias.</w:t>
+      </w:r>
+    </w:p>
+    <w:p>
+      <w:pPr>
+        <w:spacing w:after="160" w:line="288" w:lineRule="auto"/>
+        <w:jc w:val="both"/>
+        <w:rPr>
+          <w:lang w:val="es-ES"/>
+        </w:rPr>
+      </w:pPr>
+      <w:r>
+        <w:t>4.  El sistema ha sido probado y funciona correctamente en el entorno de desarrollo descrito en este documento (Visual Studio, SQL Server, instancia localhost, base de datos SistemaFacturacionDB).</w:t>
+      </w:r>
+    </w:p>
+    <w:p>
+      <w:pPr>
+        <w:spacing w:after="160" w:line="288" w:lineRule="auto"/>
+        <w:rPr>
+          <w:lang w:val="es-ES"/>
+        </w:rPr>
+      </w:pPr>
+      <w:r>
+        <w:t xml:space="preserve">5.  El repositorio del código fuente está disponible en: </w:t>
+      </w:r>
+      <w:hyperlink r:id="rId24">
         <w:r>
           <w:rPr>
             <w:color w:val="0563C1"/>
@@ -15475,7 +16237,10 @@
         </w:rPr>
       </w:pPr>
       <w:r>
-        <w:t>Enlaces directos a cada capa dentro del repositorio:</w:t>
+        <w:rPr>
+          <w:b/>
+        </w:rPr>
+        <w:t>Conclusiones individuales</w:t>
       </w:r>
     </w:p>
     <w:p>
@@ -15489,46 +16254,20 @@
         <w:rPr>
           <w:b/>
         </w:rPr>
-        <w:t>•  Entidades</w:t>
-      </w:r>
-      <w:r>
-        <w:t xml:space="preserve"> — clases del dominio (Cliente, Factura, Cobro, …): </w:t>
-      </w:r>
-      <w:hyperlink r:id="rId24">
-        <w:r>
-          <w:rPr>
-            <w:color w:val="0563C1"/>
-            <w:u w:val="single"/>
-          </w:rPr>
-          <w:t xml:space="preserve">ver carpeta Entidades</w:t>
-        </w:r>
-      </w:hyperlink>
+        <w:t>Alejandro José Luis Suárez — Coordinador y programador de la capa de presentación</w:t>
+      </w:r>
     </w:p>
     <w:p>
       <w:pPr>
         <w:spacing w:after="160" w:line="288" w:lineRule="auto"/>
-        <w:rPr>
-          <w:lang w:val="es-ES"/>
-        </w:rPr>
-      </w:pPr>
-      <w:r>
-        <w:rPr>
-          <w:b/>
-        </w:rPr>
-        <w:t>•  DatosAcceso</w:t>
-      </w:r>
-      <w:r>
-        <w:t xml:space="preserve"> — capa de acceso a datos con ADO.NET (ConexionBD y DAOs): </w:t>
-      </w:r>
-      <w:hyperlink r:id="rId25">
-        <w:r>
-          <w:rPr>
-            <w:color w:val="0563C1"/>
-            <w:u w:val="single"/>
-          </w:rPr>
-          <w:t xml:space="preserve">ver carpeta DatosAcceso</w:t>
-        </w:r>
-      </w:hyperlink>
+        <w:jc w:val="both"/>
+        <w:rPr>
+          <w:lang w:val="es-ES"/>
+        </w:rPr>
+      </w:pPr>
+      <w:r>
+        <w:t>Coordinar el proyecto me enseñó que la organización pesa tanto como el código: definir la arquitectura en tres capas desde el inicio nos permitió trabajar en paralelo sin estorbarnos. Al programar los formularios comprobé el valor de que la interfaz no contenga ninguna regla de negocio; cuando hubo que corregir un cálculo, no fue necesario tocar ninguna pantalla. Me llevo una idea clara de cómo se estructura una aplicación real de principio a fin.</w:t>
+      </w:r>
     </w:p>
     <w:p>
       <w:pPr>
@@ -15541,46 +16280,20 @@
         <w:rPr>
           <w:b/>
         </w:rPr>
-        <w:t>•  Negocio</w:t>
-      </w:r>
-      <w:r>
-        <w:t xml:space="preserve"> — lógica de negocio (cálculos, saldos, validaciones, seguridad): </w:t>
-      </w:r>
-      <w:hyperlink r:id="rId26">
-        <w:r>
-          <w:rPr>
-            <w:color w:val="0563C1"/>
-            <w:u w:val="single"/>
-          </w:rPr>
-          <w:t xml:space="preserve">ver carpeta Negocio</w:t>
-        </w:r>
-      </w:hyperlink>
+        <w:t>Michelle del Carmen Durán Polanco — Programadora de la capa de negocio</w:t>
+      </w:r>
     </w:p>
     <w:p>
       <w:pPr>
         <w:spacing w:after="160" w:line="288" w:lineRule="auto"/>
-        <w:rPr>
-          <w:lang w:val="es-ES"/>
-        </w:rPr>
-      </w:pPr>
-      <w:r>
-        <w:rPr>
-          <w:b/>
-        </w:rPr>
-        <w:t>•  Presentacion</w:t>
-      </w:r>
-      <w:r>
-        <w:t xml:space="preserve"> — formularios Windows Forms: </w:t>
-      </w:r>
-      <w:hyperlink r:id="rId27">
-        <w:r>
-          <w:rPr>
-            <w:color w:val="0563C1"/>
-            <w:u w:val="single"/>
-          </w:rPr>
-          <w:t xml:space="preserve">ver carpeta Presentacion</w:t>
-        </w:r>
-      </w:hyperlink>
+        <w:jc w:val="both"/>
+        <w:rPr>
+          <w:lang w:val="es-ES"/>
+        </w:rPr>
+      </w:pPr>
+      <w:r>
+        <w:t>Trabajar la capa de negocio me permitió aplicar de verdad la programación orientada a objetos: cada entidad del sistema quedó representada en una clase y las reglas (el ITBIS, los saldos, el límite de crédito) en un solo lugar. Aprendí que centralizar las validaciones y las constantes evita errores repetidos y hace el sistema mucho más fácil de mantener. Fue la parte donde más conecté la teoría de la asignatura con un problema real.</w:t>
+      </w:r>
     </w:p>
     <w:p>
       <w:pPr>
@@ -15593,20 +16306,8 @@
         <w:rPr>
           <w:b/>
         </w:rPr>
-        <w:t>•  Program.cs</w:t>
-      </w:r>
-      <w:r>
-        <w:t xml:space="preserve"> — punto de entrada de la aplicación: </w:t>
-      </w:r>
-      <w:hyperlink r:id="rId28">
-        <w:r>
-          <w:rPr>
-            <w:color w:val="0563C1"/>
-            <w:u w:val="single"/>
-          </w:rPr>
-          <w:t xml:space="preserve">ver Program.cs</w:t>
-        </w:r>
-      </w:hyperlink>
+        <w:t>Elios de Jesús Dilone — Programador de base de datos y acceso a datos</w:t>
+      </w:r>
     </w:p>
     <w:p>
       <w:pPr>
@@ -15617,208 +16318,121 @@
         </w:rPr>
       </w:pPr>
       <w:r>
-        <w:t>El repositorio incluye además un archivo README.md con las instrucciones detalladas de instalación, configuración y ejecución del sistema.</w:t>
+        <w:t>Diseñar la base de datos me hizo entender que un buen modelo relacional es la base de todo el sistema: con las claves foráneas y las restricciones bien puestas, muchos errores se evitan antes de llegar al código. En la capa de acceso a datos aprendí a usar ADO.NET con comandos parametrizados y transacciones, y comprobé por qué una operación que toca varias tablas debe confirmarse completa o revertirse completa.</w:t>
       </w:r>
     </w:p>
     <w:p>
       <w:pPr>
-        <w:keepNext/>
-        <w:pBdr>
-          <w:bottom w:val="single" w:sz="6" w:space="6" w:color="0B4F6C"/>
-        </w:pBdr>
-        <w:spacing w:before="80" w:after="120"/>
-        <w:rPr>
-          <w:lang w:val="es-ES"/>
-        </w:rPr>
-      </w:pPr>
-      <w:r>
-        <w:rPr>
-          <w:rFonts w:ascii="Calibri" w:hAnsi="Calibri" w:cs="Calibri"/>
+        <w:spacing w:after="160" w:line="288" w:lineRule="auto"/>
+        <w:rPr>
+          <w:lang w:val="es-ES"/>
+        </w:rPr>
+      </w:pPr>
+      <w:r>
+        <w:rPr>
           <w:b/>
-          <w:color w:val="0B4F6C"/>
-          <w:sz w:val="32"/>
-          <w:lang w:val="es-ES"/>
-        </w:rPr>
-        <w:lastRenderedPageBreak/>
-        <w:t>Anexo B — Scripts de la base de datos (SQL)</w:t>
+        </w:rPr>
+        <w:t>Firma de los estudiantes:</w:t>
       </w:r>
     </w:p>
     <w:p>
       <w:pPr>
         <w:spacing w:after="160" w:line="288" w:lineRule="auto"/>
-        <w:jc w:val="both"/>
-        <w:rPr>
-          <w:lang w:val="es-ES"/>
-        </w:rPr>
-      </w:pPr>
-      <w:r>
-        <w:t>Los scripts de SQL Server se encuentran en la carpeta Database del repositorio y deben ejecutarse en el orden indicado:</w:t>
-      </w:r>
+        <w:jc w:val="center"/>
+        <w:rPr>
+          <w:lang w:val="es-ES"/>
+        </w:rPr>
+      </w:pPr>
     </w:p>
     <w:p>
       <w:pPr>
         <w:spacing w:after="160" w:line="288" w:lineRule="auto"/>
-        <w:rPr>
-          <w:lang w:val="es-ES"/>
-        </w:rPr>
-      </w:pPr>
-      <w:r>
-        <w:rPr>
-          <w:b/>
-        </w:rPr>
-        <w:t>•  01_CrearBaseDatos.sql</w:t>
-      </w:r>
-      <w:r>
-        <w:t xml:space="preserve"> — crea la base de datos SistemaFacturacionDB con sus tablas, claves y relaciones: </w:t>
-      </w:r>
-      <w:hyperlink r:id="rId29">
-        <w:r>
-          <w:rPr>
-            <w:color w:val="0563C1"/>
-            <w:u w:val="single"/>
-          </w:rPr>
-          <w:t xml:space="preserve">ver script</w:t>
-        </w:r>
-      </w:hyperlink>
+        <w:jc w:val="center"/>
+        <w:rPr>
+          <w:lang w:val="es-ES"/>
+        </w:rPr>
+      </w:pPr>
+      <w:r>
+        <w:t>_______________________________</w:t>
+      </w:r>
     </w:p>
     <w:p>
       <w:pPr>
         <w:spacing w:after="160" w:line="288" w:lineRule="auto"/>
-        <w:rPr>
-          <w:lang w:val="es-ES"/>
-        </w:rPr>
-      </w:pPr>
-      <w:r>
-        <w:rPr>
-          <w:b/>
-        </w:rPr>
-        <w:t>•  02_DatosPrueba.sql</w:t>
-      </w:r>
-      <w:r>
-        <w:t xml:space="preserve"> — inserta los datos de prueba iniciales (usuarios, clientes, proveedores, productos): </w:t>
-      </w:r>
-      <w:hyperlink r:id="rId30">
-        <w:r>
-          <w:rPr>
-            <w:color w:val="0563C1"/>
-            <w:u w:val="single"/>
-          </w:rPr>
-          <w:t xml:space="preserve">ver script</w:t>
-        </w:r>
-      </w:hyperlink>
+        <w:jc w:val="center"/>
+        <w:rPr>
+          <w:lang w:val="es-ES"/>
+        </w:rPr>
+      </w:pPr>
+      <w:r>
+        <w:t>Alejandro José Luis Suárez — 100094903</w:t>
+      </w:r>
     </w:p>
     <w:p>
       <w:pPr>
-        <w:keepNext/>
-        <w:pBdr>
-          <w:bottom w:val="single" w:sz="6" w:space="6" w:color="0B4F6C"/>
-        </w:pBdr>
-        <w:spacing w:before="80" w:after="120"/>
-        <w:rPr>
-          <w:lang w:val="es-ES"/>
-        </w:rPr>
-      </w:pPr>
-      <w:r>
-        <w:rPr>
-          <w:rFonts w:ascii="Calibri" w:hAnsi="Calibri" w:cs="Calibri"/>
-          <w:b/>
-          <w:color w:val="0B4F6C"/>
-          <w:sz w:val="32"/>
-          <w:lang w:val="es-ES"/>
-        </w:rPr>
-        <w:lastRenderedPageBreak/>
-        <w:t>Anexo C — Archivos de configuración y compilación</w:t>
-      </w:r>
+        <w:spacing w:after="160" w:line="288" w:lineRule="auto"/>
+        <w:jc w:val="center"/>
+        <w:rPr>
+          <w:lang w:val="es-ES"/>
+        </w:rPr>
+      </w:pPr>
     </w:p>
     <w:p>
       <w:pPr>
         <w:spacing w:after="160" w:line="288" w:lineRule="auto"/>
-        <w:jc w:val="both"/>
-        <w:rPr>
-          <w:lang w:val="es-ES"/>
-        </w:rPr>
-      </w:pPr>
-      <w:r>
-        <w:t>Estos archivos permiten configurar la conexión a la base de datos y compilar el proyecto:</w:t>
+        <w:jc w:val="center"/>
+        <w:rPr>
+          <w:lang w:val="es-ES"/>
+        </w:rPr>
+      </w:pPr>
+      <w:r>
+        <w:t>_______________________________</w:t>
       </w:r>
     </w:p>
     <w:p>
       <w:pPr>
         <w:spacing w:after="160" w:line="288" w:lineRule="auto"/>
-        <w:rPr>
-          <w:lang w:val="es-ES"/>
-        </w:rPr>
-      </w:pPr>
-      <w:r>
-        <w:rPr>
-          <w:b/>
-        </w:rPr>
-        <w:t>•  App.config</w:t>
-      </w:r>
-      <w:r>
-        <w:t xml:space="preserve"> — cadena de conexión a SQL Server: </w:t>
-      </w:r>
-      <w:hyperlink r:id="rId31">
-        <w:r>
-          <w:rPr>
-            <w:color w:val="0563C1"/>
-            <w:u w:val="single"/>
-          </w:rPr>
-          <w:t xml:space="preserve">ver App.config</w:t>
-        </w:r>
-      </w:hyperlink>
+        <w:jc w:val="center"/>
+        <w:rPr>
+          <w:lang w:val="es-ES"/>
+        </w:rPr>
+      </w:pPr>
+      <w:r>
+        <w:t>Michelle del Carmen Durán Polanco — 100071927</w:t>
+      </w:r>
     </w:p>
     <w:p>
       <w:pPr>
         <w:spacing w:after="160" w:line="288" w:lineRule="auto"/>
-        <w:rPr>
-          <w:lang w:val="es-ES"/>
-        </w:rPr>
-      </w:pPr>
-      <w:r>
-        <w:rPr>
-          <w:b/>
-        </w:rPr>
-        <w:t>•  Compilar.bat</w:t>
-      </w:r>
-      <w:r>
-        <w:t xml:space="preserve"> — compila y ejecuta el proyecto sin necesidad de Visual Studio: </w:t>
-      </w:r>
-      <w:hyperlink r:id="rId32">
-        <w:r>
-          <w:rPr>
-            <w:color w:val="0563C1"/>
-            <w:u w:val="single"/>
-          </w:rPr>
-          <w:t xml:space="preserve">ver Compilar.bat</w:t>
-        </w:r>
-      </w:hyperlink>
+        <w:jc w:val="center"/>
+        <w:rPr>
+          <w:lang w:val="es-ES"/>
+        </w:rPr>
+      </w:pPr>
     </w:p>
     <w:p>
       <w:pPr>
         <w:spacing w:after="160" w:line="288" w:lineRule="auto"/>
-        <w:rPr>
-          <w:lang w:val="es-ES"/>
-        </w:rPr>
-      </w:pPr>
-      <w:r>
-        <w:rPr>
-          <w:b/>
-        </w:rPr>
-        <w:t>•  SistemaFacturacion.csproj / .sln</w:t>
-      </w:r>
-      <w:r>
-        <w:t xml:space="preserve"> — proyecto y solución para abrir en Visual Studio: </w:t>
-      </w:r>
-      <w:hyperlink r:id="rId33">
-        <w:r>
-          <w:rPr>
-            <w:color w:val="0563C1"/>
-            <w:u w:val="single"/>
-          </w:rPr>
-          <w:t xml:space="preserve">ver proyecto</w:t>
-        </w:r>
-      </w:hyperlink>
+        <w:jc w:val="center"/>
+        <w:rPr>
+          <w:lang w:val="es-ES"/>
+        </w:rPr>
+      </w:pPr>
+      <w:r>
+        <w:t>_______________________________</w:t>
+      </w:r>
+    </w:p>
+    <w:p>
+      <w:pPr>
+        <w:spacing w:after="160" w:line="288" w:lineRule="auto"/>
+        <w:jc w:val="center"/>
+        <w:rPr>
+          <w:lang w:val="es-ES"/>
+        </w:rPr>
+      </w:pPr>
+      <w:r>
+        <w:t>Elios de Jesús Dilone — 100092874</w:t>
+      </w:r>
     </w:p>
     <w:sectPr>
       <w:pgSz w:w="12240" w:h="15840"/>
@@ -16640,6 +17254,7 @@
   <w:style w:type="character" w:default="1" w:styleId="Fuentedeprrafopredeter">
     <w:name w:val="Default Paragraph Font"/>
     <w:uiPriority w:val="1"/>
+    <w:semiHidden/>
     <w:unhideWhenUsed/>
   </w:style>
   <w:style w:type="table" w:default="1" w:styleId="Tablanormal">

</xml_diff>

<commit_message>
Arreglar sección 12: campos para el video y enlace al repositorio
La caja del video ahora tiene campos etiquetados para el título y el
enlace del video de sustentación, más el enlace al repositorio de GitHub.
</commit_message>
<xml_diff>
--- a/Documentacion/Informe_Final_SistemaFacturacion.docx
+++ b/Documentacion/Informe_Final_SistemaFacturacion.docx
@@ -212,7 +212,6 @@
           <w:lang w:val="es-ES"/>
         </w:rPr>
       </w:pPr>
-      <w:proofErr w:type="gramStart"/>
       <w:r>
         <w:rPr>
           <w:rFonts w:cs="Cambria"/>
@@ -227,26 +226,23 @@
           <w:sz w:val="26"/>
           <w:lang w:val="es-ES"/>
         </w:rPr>
-        <w:t xml:space="preserve"> </w:t>
-      </w:r>
-      <w:proofErr w:type="spellStart"/>
+        <w:t xml:space="preserve"> Jose Luis </w:t>
+      </w:r>
       <w:r>
         <w:rPr>
           <w:rFonts w:cs="Cambria"/>
           <w:sz w:val="26"/>
           <w:lang w:val="es-ES"/>
         </w:rPr>
-        <w:t>Jose</w:t>
-      </w:r>
-      <w:proofErr w:type="spellEnd"/>
-      <w:proofErr w:type="gramEnd"/>
+        <w:t>Su</w:t>
+      </w:r>
       <w:r>
         <w:rPr>
           <w:rFonts w:cs="Cambria"/>
           <w:sz w:val="26"/>
           <w:lang w:val="es-ES"/>
         </w:rPr>
-        <w:t xml:space="preserve"> Luis </w:t>
+        <w:t>a</w:t>
       </w:r>
       <w:r>
         <w:rPr>
@@ -254,7 +250,7 @@
           <w:sz w:val="26"/>
           <w:lang w:val="es-ES"/>
         </w:rPr>
-        <w:t>Su</w:t>
+        <w:t>rez</w:t>
       </w:r>
       <w:r>
         <w:rPr>
@@ -262,7 +258,7 @@
           <w:sz w:val="26"/>
           <w:lang w:val="es-ES"/>
         </w:rPr>
-        <w:t>a</w:t>
+        <w:t xml:space="preserve"> </w:t>
       </w:r>
       <w:r>
         <w:rPr>
@@ -270,15 +266,24 @@
           <w:sz w:val="26"/>
           <w:lang w:val="es-ES"/>
         </w:rPr>
-        <w:t>rez</w:t>
-      </w:r>
+        <w:t>100094903</w:t>
+      </w:r>
+    </w:p>
+    <w:p>
+      <w:pPr>
+        <w:spacing w:after="40" w:line="288" w:lineRule="auto"/>
+        <w:jc w:val="center"/>
+        <w:rPr>
+          <w:lang w:val="es-ES"/>
+        </w:rPr>
+      </w:pPr>
       <w:r>
         <w:rPr>
           <w:rFonts w:cs="Cambria"/>
           <w:sz w:val="26"/>
           <w:lang w:val="es-ES"/>
         </w:rPr>
-        <w:t xml:space="preserve"> </w:t>
+        <w:t>Elios de Jesús</w:t>
       </w:r>
       <w:r>
         <w:rPr>
@@ -286,60 +291,7 @@
           <w:sz w:val="26"/>
           <w:lang w:val="es-ES"/>
         </w:rPr>
-        <w:t>100094903</w:t>
-      </w:r>
-    </w:p>
-    <w:p>
-      <w:pPr>
-        <w:spacing w:after="40" w:line="288" w:lineRule="auto"/>
-        <w:jc w:val="center"/>
-        <w:rPr>
-          <w:lang w:val="es-ES"/>
-        </w:rPr>
-      </w:pPr>
-      <w:proofErr w:type="spellStart"/>
-      <w:r>
-        <w:rPr>
-          <w:rFonts w:cs="Cambria"/>
-          <w:sz w:val="26"/>
-          <w:lang w:val="es-ES"/>
-        </w:rPr>
-        <w:t>Elios</w:t>
-      </w:r>
-      <w:proofErr w:type="spellEnd"/>
-      <w:r>
-        <w:rPr>
-          <w:rFonts w:cs="Cambria"/>
-          <w:sz w:val="26"/>
-          <w:lang w:val="es-ES"/>
-        </w:rPr>
-        <w:t xml:space="preserve"> de Jesús</w:t>
-      </w:r>
-      <w:r>
-        <w:rPr>
-          <w:rFonts w:cs="Cambria"/>
-          <w:sz w:val="26"/>
-          <w:lang w:val="es-ES"/>
-        </w:rPr>
-        <w:t xml:space="preserve"> </w:t>
-      </w:r>
-      <w:proofErr w:type="spellStart"/>
-      <w:r>
-        <w:rPr>
-          <w:rFonts w:cs="Cambria"/>
-          <w:sz w:val="26"/>
-          <w:lang w:val="es-ES"/>
-        </w:rPr>
-        <w:t>dilone</w:t>
-      </w:r>
-      <w:proofErr w:type="spellEnd"/>
-      <w:r>
-        <w:rPr>
-          <w:rFonts w:cs="Cambria"/>
-          <w:sz w:val="26"/>
-          <w:lang w:val="es-ES"/>
-        </w:rPr>
-        <w:t xml:space="preserve"> </w:t>
+        <w:t xml:space="preserve"> dilone </w:t>
       </w:r>
       <w:r>
         <w:rPr>
@@ -464,27 +416,7 @@
           <w:sz w:val="21"/>
           <w:lang w:val="es-ES"/>
         </w:rPr>
-        <w:t xml:space="preserve">Santo Domingo, República </w:t>
-      </w:r>
-      <w:proofErr w:type="gramStart"/>
-      <w:r>
-        <w:rPr>
-          <w:rFonts w:cs="Cambria"/>
-          <w:color w:val="5B6B79"/>
-          <w:sz w:val="21"/>
-          <w:lang w:val="es-ES"/>
-        </w:rPr>
-        <w:t>Dominicana  ·</w:t>
-      </w:r>
-      <w:proofErr w:type="gramEnd"/>
-      <w:r>
-        <w:rPr>
-          <w:rFonts w:cs="Cambria"/>
-          <w:color w:val="5B6B79"/>
-          <w:sz w:val="21"/>
-          <w:lang w:val="es-ES"/>
-        </w:rPr>
-        <w:t xml:space="preserve">  1</w:t>
+        <w:t>Santo Domingo, República Dominicana  ·  1</w:t>
       </w:r>
       <w:r>
         <w:rPr>
@@ -1094,23 +1026,7 @@
           <w:rFonts w:cs="Cambria"/>
           <w:lang w:val="es-ES"/>
         </w:rPr>
-        <w:t xml:space="preserve">Desarrollar una aplicación de escritorio en C# con Windows </w:t>
-      </w:r>
-      <w:proofErr w:type="spellStart"/>
-      <w:r>
-        <w:rPr>
-          <w:rFonts w:cs="Cambria"/>
-          <w:lang w:val="es-ES"/>
-        </w:rPr>
-        <w:t>Forms</w:t>
-      </w:r>
-      <w:proofErr w:type="spellEnd"/>
-      <w:r>
-        <w:rPr>
-          <w:rFonts w:cs="Cambria"/>
-          <w:lang w:val="es-ES"/>
-        </w:rPr>
-        <w:t xml:space="preserve"> y base de datos SQL Server que gestione la facturación de una empresa y el control de sus cuentas por cobrar y por pagar.</w:t>
+        <w:t>Desarrollar una aplicación de escritorio en C# con Windows Forms y base de datos SQL Server que gestione la facturación de una empresa y el control de sus cuentas por cobrar y por pagar.</w:t>
       </w:r>
     </w:p>
     <w:p>
@@ -1329,7 +1245,6 @@
             <w:pPr>
               <w:spacing w:before="40" w:after="40"/>
             </w:pPr>
-            <w:proofErr w:type="spellStart"/>
             <w:r>
               <w:rPr>
                 <w:rFonts w:ascii="Calibri" w:hAnsi="Calibri" w:cs="Calibri"/>
@@ -1340,7 +1255,6 @@
               <w:lastRenderedPageBreak/>
               <w:t>Componente</w:t>
             </w:r>
-            <w:proofErr w:type="spellEnd"/>
           </w:p>
         </w:tc>
         <w:tc>
@@ -1469,34 +1383,14 @@
             <w:pPr>
               <w:spacing w:before="40" w:after="40" w:line="264" w:lineRule="auto"/>
             </w:pPr>
-            <w:proofErr w:type="spellStart"/>
             <w:r>
               <w:rPr>
                 <w:rFonts w:cs="Cambria"/>
                 <w:b/>
                 <w:sz w:val="20"/>
               </w:rPr>
-              <w:t>Interfaz</w:t>
-            </w:r>
-            <w:proofErr w:type="spellEnd"/>
-            <w:r>
-              <w:rPr>
-                <w:rFonts w:cs="Cambria"/>
-                <w:b/>
-                <w:sz w:val="20"/>
-              </w:rPr>
-              <w:t xml:space="preserve"> de </w:t>
-            </w:r>
-            <w:proofErr w:type="spellStart"/>
-            <w:r>
-              <w:rPr>
-                <w:rFonts w:cs="Cambria"/>
-                <w:b/>
-                <w:sz w:val="20"/>
-              </w:rPr>
-              <w:t>usuario</w:t>
-            </w:r>
-            <w:proofErr w:type="spellEnd"/>
+              <w:t>Interfaz de usuario</w:t>
+            </w:r>
           </w:p>
         </w:tc>
         <w:tc>
@@ -1557,34 +1451,14 @@
             <w:pPr>
               <w:spacing w:before="40" w:after="40" w:line="264" w:lineRule="auto"/>
             </w:pPr>
-            <w:proofErr w:type="spellStart"/>
             <w:r>
               <w:rPr>
                 <w:rFonts w:cs="Cambria"/>
                 <w:b/>
                 <w:sz w:val="20"/>
               </w:rPr>
-              <w:t>Acceso</w:t>
-            </w:r>
-            <w:proofErr w:type="spellEnd"/>
-            <w:r>
-              <w:rPr>
-                <w:rFonts w:cs="Cambria"/>
-                <w:b/>
-                <w:sz w:val="20"/>
-              </w:rPr>
-              <w:t xml:space="preserve"> a </w:t>
-            </w:r>
-            <w:proofErr w:type="spellStart"/>
-            <w:r>
-              <w:rPr>
-                <w:rFonts w:cs="Cambria"/>
-                <w:b/>
-                <w:sz w:val="20"/>
-              </w:rPr>
-              <w:t>datos</w:t>
-            </w:r>
-            <w:proofErr w:type="spellEnd"/>
+              <w:t>Acceso a datos</w:t>
+            </w:r>
           </w:p>
         </w:tc>
         <w:tc>
@@ -1651,18 +1525,8 @@
                 <w:b/>
                 <w:sz w:val="20"/>
               </w:rPr>
-              <w:t xml:space="preserve">Base de </w:t>
-            </w:r>
-            <w:proofErr w:type="spellStart"/>
-            <w:r>
-              <w:rPr>
-                <w:rFonts w:cs="Cambria"/>
-                <w:b/>
-                <w:sz w:val="20"/>
-              </w:rPr>
-              <w:t>datos</w:t>
-            </w:r>
-            <w:proofErr w:type="spellEnd"/>
+              <w:t>Base de datos</w:t>
+            </w:r>
           </w:p>
         </w:tc>
         <w:tc>
@@ -1723,7 +1587,6 @@
             <w:pPr>
               <w:spacing w:before="40" w:after="40" w:line="264" w:lineRule="auto"/>
             </w:pPr>
-            <w:proofErr w:type="spellStart"/>
             <w:r>
               <w:rPr>
                 <w:rFonts w:cs="Cambria"/>
@@ -1732,7 +1595,6 @@
               </w:rPr>
               <w:t>Seguridad</w:t>
             </w:r>
-            <w:proofErr w:type="spellEnd"/>
           </w:p>
         </w:tc>
         <w:tc>
@@ -1793,7 +1655,6 @@
             <w:pPr>
               <w:spacing w:before="40" w:after="40" w:line="264" w:lineRule="auto"/>
             </w:pPr>
-            <w:proofErr w:type="spellStart"/>
             <w:r>
               <w:rPr>
                 <w:rFonts w:cs="Cambria"/>
@@ -1802,7 +1663,6 @@
               </w:rPr>
               <w:t>Compilación</w:t>
             </w:r>
-            <w:proofErr w:type="spellEnd"/>
           </w:p>
         </w:tc>
         <w:tc>
@@ -1933,41 +1793,7 @@
                 <w:sz w:val="23"/>
                 <w:lang w:val="es-ES"/>
               </w:rPr>
-              <w:t xml:space="preserve">CAPA DE </w:t>
-            </w:r>
-            <w:proofErr w:type="gramStart"/>
-            <w:r>
-              <w:rPr>
-                <w:rFonts w:ascii="Calibri" w:hAnsi="Calibri" w:cs="Calibri"/>
-                <w:b/>
-                <w:color w:val="FFFFFF"/>
-                <w:sz w:val="23"/>
-                <w:lang w:val="es-ES"/>
-              </w:rPr>
-              <w:t>PRESENTACIÓN  (</w:t>
-            </w:r>
-            <w:proofErr w:type="spellStart"/>
-            <w:proofErr w:type="gramEnd"/>
-            <w:r>
-              <w:rPr>
-                <w:rFonts w:ascii="Calibri" w:hAnsi="Calibri" w:cs="Calibri"/>
-                <w:b/>
-                <w:color w:val="FFFFFF"/>
-                <w:sz w:val="23"/>
-                <w:lang w:val="es-ES"/>
-              </w:rPr>
-              <w:t>Presentacion</w:t>
-            </w:r>
-            <w:proofErr w:type="spellEnd"/>
-            <w:r>
-              <w:rPr>
-                <w:rFonts w:ascii="Calibri" w:hAnsi="Calibri" w:cs="Calibri"/>
-                <w:b/>
-                <w:color w:val="FFFFFF"/>
-                <w:sz w:val="23"/>
-                <w:lang w:val="es-ES"/>
-              </w:rPr>
-              <w:t>/)</w:t>
+              <w:t>CAPA DE PRESENTACIÓN  (Presentacion/)</w:t>
             </w:r>
           </w:p>
           <w:p>
@@ -1986,86 +1812,8 @@
                 <w:sz w:val="18"/>
                 <w:lang w:val="es-ES"/>
               </w:rPr>
-              <w:t xml:space="preserve">FrmLogin, </w:t>
-            </w:r>
-            <w:proofErr w:type="spellStart"/>
-            <w:r>
-              <w:rPr>
-                <w:rFonts w:cs="Cambria"/>
-                <w:i/>
-                <w:color w:val="E6EEF2"/>
-                <w:sz w:val="18"/>
-                <w:lang w:val="es-ES"/>
-              </w:rPr>
-              <w:t>FrmPrincipal</w:t>
-            </w:r>
-            <w:proofErr w:type="spellEnd"/>
-            <w:r>
-              <w:rPr>
-                <w:rFonts w:cs="Cambria"/>
-                <w:i/>
-                <w:color w:val="E6EEF2"/>
-                <w:sz w:val="18"/>
-                <w:lang w:val="es-ES"/>
-              </w:rPr>
-              <w:t xml:space="preserve">, </w:t>
-            </w:r>
-            <w:proofErr w:type="spellStart"/>
-            <w:r>
-              <w:rPr>
-                <w:rFonts w:cs="Cambria"/>
-                <w:i/>
-                <w:color w:val="E6EEF2"/>
-                <w:sz w:val="18"/>
-                <w:lang w:val="es-ES"/>
-              </w:rPr>
-              <w:t>FrmFacturaNueva</w:t>
-            </w:r>
-            <w:proofErr w:type="spellEnd"/>
-            <w:r>
-              <w:rPr>
-                <w:rFonts w:cs="Cambria"/>
-                <w:i/>
-                <w:color w:val="E6EEF2"/>
-                <w:sz w:val="18"/>
-                <w:lang w:val="es-ES"/>
-              </w:rPr>
-              <w:t xml:space="preserve">, </w:t>
-            </w:r>
-            <w:proofErr w:type="spellStart"/>
-            <w:r>
-              <w:rPr>
-                <w:rFonts w:cs="Cambria"/>
-                <w:i/>
-                <w:color w:val="E6EEF2"/>
-                <w:sz w:val="18"/>
-                <w:lang w:val="es-ES"/>
-              </w:rPr>
-              <w:t>FrmCobros</w:t>
-            </w:r>
-            <w:proofErr w:type="spellEnd"/>
-            <w:r>
-              <w:rPr>
-                <w:rFonts w:cs="Cambria"/>
-                <w:i/>
-                <w:color w:val="E6EEF2"/>
-                <w:sz w:val="18"/>
-                <w:lang w:val="es-ES"/>
-              </w:rPr>
-              <w:t xml:space="preserve">… — Windows </w:t>
-            </w:r>
-            <w:proofErr w:type="spellStart"/>
-            <w:r>
-              <w:rPr>
-                <w:rFonts w:cs="Cambria"/>
-                <w:i/>
-                <w:color w:val="E6EEF2"/>
-                <w:sz w:val="18"/>
-                <w:lang w:val="es-ES"/>
-              </w:rPr>
-              <w:t>Forms</w:t>
-            </w:r>
-            <w:proofErr w:type="spellEnd"/>
+              <w:t>FrmLogin, FrmPrincipal, FrmFacturaNueva, FrmCobros… — Windows Forms</w:t>
+            </w:r>
           </w:p>
         </w:tc>
       </w:tr>
@@ -2075,8 +1823,6 @@
         <w:spacing w:before="40" w:after="40"/>
         <w:jc w:val="center"/>
       </w:pPr>
-      <w:proofErr w:type="spellStart"/>
-      <w:proofErr w:type="gramStart"/>
       <w:r>
         <w:rPr>
           <w:rFonts w:cs="Cambria"/>
@@ -2084,19 +1830,8 @@
           <w:color w:val="5B6B79"/>
           <w:sz w:val="17"/>
         </w:rPr>
-        <w:t>usa</w:t>
-      </w:r>
-      <w:proofErr w:type="spellEnd"/>
-      <w:r>
-        <w:rPr>
-          <w:rFonts w:cs="Cambria"/>
-          <w:i/>
-          <w:color w:val="5B6B79"/>
-          <w:sz w:val="17"/>
-        </w:rPr>
-        <w:t xml:space="preserve">  ▼</w:t>
-      </w:r>
-      <w:proofErr w:type="gramEnd"/>
+        <w:t>usa  ▼</w:t>
+      </w:r>
     </w:p>
     <w:tbl>
       <w:tblPr>
@@ -2140,29 +1875,7 @@
                 <w:sz w:val="23"/>
                 <w:lang w:val="es-ES"/>
               </w:rPr>
-              <w:t xml:space="preserve">CAPA DE </w:t>
-            </w:r>
-            <w:proofErr w:type="gramStart"/>
-            <w:r>
-              <w:rPr>
-                <w:rFonts w:ascii="Calibri" w:hAnsi="Calibri" w:cs="Calibri"/>
-                <w:b/>
-                <w:color w:val="FFFFFF"/>
-                <w:sz w:val="23"/>
-                <w:lang w:val="es-ES"/>
-              </w:rPr>
-              <w:t>NEGOCIO  (</w:t>
-            </w:r>
-            <w:proofErr w:type="gramEnd"/>
-            <w:r>
-              <w:rPr>
-                <w:rFonts w:ascii="Calibri" w:hAnsi="Calibri" w:cs="Calibri"/>
-                <w:b/>
-                <w:color w:val="FFFFFF"/>
-                <w:sz w:val="23"/>
-                <w:lang w:val="es-ES"/>
-              </w:rPr>
-              <w:t>Negocio/)</w:t>
+              <w:t>CAPA DE NEGOCIO  (Negocio/)</w:t>
             </w:r>
           </w:p>
           <w:p>
@@ -2173,7 +1886,6 @@
                 <w:lang w:val="es-ES"/>
               </w:rPr>
             </w:pPr>
-            <w:proofErr w:type="spellStart"/>
             <w:r>
               <w:rPr>
                 <w:rFonts w:cs="Cambria"/>
@@ -2182,40 +1894,7 @@
                 <w:sz w:val="18"/>
                 <w:lang w:val="es-ES"/>
               </w:rPr>
-              <w:t>FacturaNegocio</w:t>
-            </w:r>
-            <w:proofErr w:type="spellEnd"/>
-            <w:r>
-              <w:rPr>
-                <w:rFonts w:cs="Cambria"/>
-                <w:i/>
-                <w:color w:val="E6EEF2"/>
-                <w:sz w:val="18"/>
-                <w:lang w:val="es-ES"/>
-              </w:rPr>
-              <w:t xml:space="preserve">, </w:t>
-            </w:r>
-            <w:proofErr w:type="spellStart"/>
-            <w:r>
-              <w:rPr>
-                <w:rFonts w:cs="Cambria"/>
-                <w:i/>
-                <w:color w:val="E6EEF2"/>
-                <w:sz w:val="18"/>
-                <w:lang w:val="es-ES"/>
-              </w:rPr>
-              <w:t>CobroNegocio</w:t>
-            </w:r>
-            <w:proofErr w:type="spellEnd"/>
-            <w:r>
-              <w:rPr>
-                <w:rFonts w:cs="Cambria"/>
-                <w:i/>
-                <w:color w:val="E6EEF2"/>
-                <w:sz w:val="18"/>
-                <w:lang w:val="es-ES"/>
-              </w:rPr>
-              <w:t>, Validaciones, Seguridad — reglas y cálculos</w:t>
+              <w:t>FacturaNegocio, CobroNegocio, Validaciones, Seguridad — reglas y cálculos</w:t>
             </w:r>
           </w:p>
         </w:tc>
@@ -2226,8 +1905,6 @@
         <w:spacing w:before="40" w:after="40"/>
         <w:jc w:val="center"/>
       </w:pPr>
-      <w:proofErr w:type="spellStart"/>
-      <w:proofErr w:type="gramStart"/>
       <w:r>
         <w:rPr>
           <w:rFonts w:cs="Cambria"/>
@@ -2235,19 +1912,8 @@
           <w:color w:val="5B6B79"/>
           <w:sz w:val="17"/>
         </w:rPr>
-        <w:t>usa</w:t>
-      </w:r>
-      <w:proofErr w:type="spellEnd"/>
-      <w:r>
-        <w:rPr>
-          <w:rFonts w:cs="Cambria"/>
-          <w:i/>
-          <w:color w:val="5B6B79"/>
-          <w:sz w:val="17"/>
-        </w:rPr>
-        <w:t xml:space="preserve">  ▼</w:t>
-      </w:r>
-      <w:proofErr w:type="gramEnd"/>
+        <w:t>usa  ▼</w:t>
+      </w:r>
     </w:p>
     <w:tbl>
       <w:tblPr>
@@ -2291,41 +1957,7 @@
                 <w:sz w:val="23"/>
                 <w:lang w:val="es-ES"/>
               </w:rPr>
-              <w:t xml:space="preserve">CAPA DE ACCESO A </w:t>
-            </w:r>
-            <w:proofErr w:type="gramStart"/>
-            <w:r>
-              <w:rPr>
-                <w:rFonts w:ascii="Calibri" w:hAnsi="Calibri" w:cs="Calibri"/>
-                <w:b/>
-                <w:color w:val="FFFFFF"/>
-                <w:sz w:val="23"/>
-                <w:lang w:val="es-ES"/>
-              </w:rPr>
-              <w:t>DATOS  (</w:t>
-            </w:r>
-            <w:proofErr w:type="spellStart"/>
-            <w:proofErr w:type="gramEnd"/>
-            <w:r>
-              <w:rPr>
-                <w:rFonts w:ascii="Calibri" w:hAnsi="Calibri" w:cs="Calibri"/>
-                <w:b/>
-                <w:color w:val="FFFFFF"/>
-                <w:sz w:val="23"/>
-                <w:lang w:val="es-ES"/>
-              </w:rPr>
-              <w:t>DatosAcceso</w:t>
-            </w:r>
-            <w:proofErr w:type="spellEnd"/>
-            <w:r>
-              <w:rPr>
-                <w:rFonts w:ascii="Calibri" w:hAnsi="Calibri" w:cs="Calibri"/>
-                <w:b/>
-                <w:color w:val="FFFFFF"/>
-                <w:sz w:val="23"/>
-                <w:lang w:val="es-ES"/>
-              </w:rPr>
-              <w:t>/)</w:t>
+              <w:t>CAPA DE ACCESO A DATOS  (DatosAcceso/)</w:t>
             </w:r>
           </w:p>
           <w:p>
@@ -2336,7 +1968,6 @@
                 <w:lang w:val="es-ES"/>
               </w:rPr>
             </w:pPr>
-            <w:proofErr w:type="spellStart"/>
             <w:r>
               <w:rPr>
                 <w:rFonts w:cs="Cambria"/>
@@ -2345,62 +1976,7 @@
                 <w:sz w:val="18"/>
                 <w:lang w:val="es-ES"/>
               </w:rPr>
-              <w:t>ConexionBD</w:t>
-            </w:r>
-            <w:proofErr w:type="spellEnd"/>
-            <w:r>
-              <w:rPr>
-                <w:rFonts w:cs="Cambria"/>
-                <w:i/>
-                <w:color w:val="E6EEF2"/>
-                <w:sz w:val="18"/>
-                <w:lang w:val="es-ES"/>
-              </w:rPr>
-              <w:t xml:space="preserve">, </w:t>
-            </w:r>
-            <w:proofErr w:type="spellStart"/>
-            <w:r>
-              <w:rPr>
-                <w:rFonts w:cs="Cambria"/>
-                <w:i/>
-                <w:color w:val="E6EEF2"/>
-                <w:sz w:val="18"/>
-                <w:lang w:val="es-ES"/>
-              </w:rPr>
-              <w:t>FacturaDAO</w:t>
-            </w:r>
-            <w:proofErr w:type="spellEnd"/>
-            <w:r>
-              <w:rPr>
-                <w:rFonts w:cs="Cambria"/>
-                <w:i/>
-                <w:color w:val="E6EEF2"/>
-                <w:sz w:val="18"/>
-                <w:lang w:val="es-ES"/>
-              </w:rPr>
-              <w:t xml:space="preserve">, </w:t>
-            </w:r>
-            <w:proofErr w:type="spellStart"/>
-            <w:r>
-              <w:rPr>
-                <w:rFonts w:cs="Cambria"/>
-                <w:i/>
-                <w:color w:val="E6EEF2"/>
-                <w:sz w:val="18"/>
-                <w:lang w:val="es-ES"/>
-              </w:rPr>
-              <w:t>CobroDAO</w:t>
-            </w:r>
-            <w:proofErr w:type="spellEnd"/>
-            <w:r>
-              <w:rPr>
-                <w:rFonts w:cs="Cambria"/>
-                <w:i/>
-                <w:color w:val="E6EEF2"/>
-                <w:sz w:val="18"/>
-                <w:lang w:val="es-ES"/>
-              </w:rPr>
-              <w:t>… — comandos SQL y transacciones</w:t>
+              <w:t>ConexionBD, FacturaDAO, CobroDAO… — comandos SQL y transacciones</w:t>
             </w:r>
           </w:p>
         </w:tc>
@@ -2411,7 +1987,6 @@
         <w:spacing w:before="40" w:after="40"/>
         <w:jc w:val="center"/>
       </w:pPr>
-      <w:proofErr w:type="gramStart"/>
       <w:r>
         <w:rPr>
           <w:rFonts w:cs="Cambria"/>
@@ -2421,7 +1996,6 @@
         </w:rPr>
         <w:t>ADO.NET  ▼</w:t>
       </w:r>
-      <w:proofErr w:type="gramEnd"/>
     </w:p>
     <w:tbl>
       <w:tblPr>
@@ -2465,29 +2039,7 @@
                 <w:sz w:val="23"/>
                 <w:lang w:val="es-ES"/>
               </w:rPr>
-              <w:t xml:space="preserve">BASE DE </w:t>
-            </w:r>
-            <w:proofErr w:type="gramStart"/>
-            <w:r>
-              <w:rPr>
-                <w:rFonts w:ascii="Calibri" w:hAnsi="Calibri" w:cs="Calibri"/>
-                <w:b/>
-                <w:color w:val="FFFFFF"/>
-                <w:sz w:val="23"/>
-                <w:lang w:val="es-ES"/>
-              </w:rPr>
-              <w:t>DATOS  ·</w:t>
-            </w:r>
-            <w:proofErr w:type="gramEnd"/>
-            <w:r>
-              <w:rPr>
-                <w:rFonts w:ascii="Calibri" w:hAnsi="Calibri" w:cs="Calibri"/>
-                <w:b/>
-                <w:color w:val="FFFFFF"/>
-                <w:sz w:val="23"/>
-                <w:lang w:val="es-ES"/>
-              </w:rPr>
-              <w:t xml:space="preserve">  SQL Server</w:t>
+              <w:t>BASE DE DATOS  ·  SQL Server</w:t>
             </w:r>
           </w:p>
           <w:p>
@@ -2498,7 +2050,6 @@
                 <w:lang w:val="es-ES"/>
               </w:rPr>
             </w:pPr>
-            <w:proofErr w:type="spellStart"/>
             <w:r>
               <w:rPr>
                 <w:rFonts w:cs="Cambria"/>
@@ -2509,7 +2060,6 @@
               </w:rPr>
               <w:t>SistemaFacturacionDB</w:t>
             </w:r>
-            <w:proofErr w:type="spellEnd"/>
           </w:p>
         </w:tc>
       </w:tr>
@@ -2554,71 +2104,7 @@
           <w:rFonts w:cs="Cambria"/>
           <w:lang w:val="es-ES"/>
         </w:rPr>
-        <w:t xml:space="preserve">Cada concepto del negocio se representa con una clase propia dentro de la carpeta Entidades: Cliente, Proveedor, Producto, Factura, </w:t>
-      </w:r>
-      <w:proofErr w:type="spellStart"/>
-      <w:r>
-        <w:rPr>
-          <w:rFonts w:cs="Cambria"/>
-          <w:lang w:val="es-ES"/>
-        </w:rPr>
-        <w:t>DetalleFactura</w:t>
-      </w:r>
-      <w:proofErr w:type="spellEnd"/>
-      <w:r>
-        <w:rPr>
-          <w:rFonts w:cs="Cambria"/>
-          <w:lang w:val="es-ES"/>
-        </w:rPr>
-        <w:t xml:space="preserve">, Cobro, Compra, </w:t>
-      </w:r>
-      <w:proofErr w:type="spellStart"/>
-      <w:r>
-        <w:rPr>
-          <w:rFonts w:cs="Cambria"/>
-          <w:lang w:val="es-ES"/>
-        </w:rPr>
-        <w:t>DetalleCompra</w:t>
-      </w:r>
-      <w:proofErr w:type="spellEnd"/>
-      <w:r>
-        <w:rPr>
-          <w:rFonts w:cs="Cambria"/>
-          <w:lang w:val="es-ES"/>
-        </w:rPr>
-        <w:t>, Pago, Empleado y Usuario. Un objeto de la clase Factura, por ejemplo, guarda en sus propiedades el número, la fecha, el cliente, los totales y la lista de sus líneas de detalle, de manera que toda esa información viaja por el programa como un solo objeto y no como decenas de variables sueltas. Las clases de la capa de negocio (</w:t>
-      </w:r>
-      <w:proofErr w:type="spellStart"/>
-      <w:r>
-        <w:rPr>
-          <w:rFonts w:cs="Cambria"/>
-          <w:lang w:val="es-ES"/>
-        </w:rPr>
-        <w:t>FacturaNegocio</w:t>
-      </w:r>
-      <w:proofErr w:type="spellEnd"/>
-      <w:r>
-        <w:rPr>
-          <w:rFonts w:cs="Cambria"/>
-          <w:lang w:val="es-ES"/>
-        </w:rPr>
-        <w:t xml:space="preserve">, </w:t>
-      </w:r>
-      <w:proofErr w:type="spellStart"/>
-      <w:r>
-        <w:rPr>
-          <w:rFonts w:cs="Cambria"/>
-          <w:lang w:val="es-ES"/>
-        </w:rPr>
-        <w:t>CobroNegocio</w:t>
-      </w:r>
-      <w:proofErr w:type="spellEnd"/>
-      <w:r>
-        <w:rPr>
-          <w:rFonts w:cs="Cambria"/>
-          <w:lang w:val="es-ES"/>
-        </w:rPr>
-        <w:t>, etc.) encapsulan el comportamiento —</w:t>
+        <w:t>Cada concepto del negocio se representa con una clase propia dentro de la carpeta Entidades: Cliente, Proveedor, Producto, Factura, DetalleFactura, Cobro, Compra, DetalleCompra, Pago, Empleado y Usuario. Un objeto de la clase Factura, por ejemplo, guarda en sus propiedades el número, la fecha, el cliente, los totales y la lista de sus líneas de detalle, de manera que toda esa información viaja por el programa como un solo objeto y no como decenas de variables sueltas. Las clases de la capa de negocio (FacturaNegocio, CobroNegocio, etc.) encapsulan el comportamiento —</w:t>
       </w:r>
       <w:r>
         <w:rPr>
@@ -2758,55 +2244,7 @@
           <w:rFonts w:cs="Cambria"/>
           <w:lang w:val="es-ES"/>
         </w:rPr>
-        <w:t xml:space="preserve">La base de datos se llama </w:t>
-      </w:r>
-      <w:proofErr w:type="spellStart"/>
-      <w:r>
-        <w:rPr>
-          <w:rFonts w:cs="Cambria"/>
-          <w:lang w:val="es-ES"/>
-        </w:rPr>
-        <w:t>SistemaFacturacionDB</w:t>
-      </w:r>
-      <w:proofErr w:type="spellEnd"/>
-      <w:r>
-        <w:rPr>
-          <w:rFonts w:cs="Cambria"/>
-          <w:lang w:val="es-ES"/>
-        </w:rPr>
-        <w:t xml:space="preserve"> y reside en SQL Server. Se diseñó de forma normalizada, es decir, cada dato se guarda una sola vez y las tablas se relacionan entre sí mediante claves. Todo el esquema se genera con el script </w:t>
-      </w:r>
-      <w:proofErr w:type="spellStart"/>
-      <w:r>
-        <w:rPr>
-          <w:rFonts w:cs="Cambria"/>
-          <w:lang w:val="es-ES"/>
-        </w:rPr>
-        <w:t>Database</w:t>
-      </w:r>
-      <w:proofErr w:type="spellEnd"/>
-      <w:r>
-        <w:rPr>
-          <w:rFonts w:cs="Cambria"/>
-          <w:lang w:val="es-ES"/>
-        </w:rPr>
-        <w:t xml:space="preserve">/01_CrearBaseDatos.sql (incluido en el Anexo B), y los datos de ejemplo con </w:t>
-      </w:r>
-      <w:proofErr w:type="spellStart"/>
-      <w:r>
-        <w:rPr>
-          <w:rFonts w:cs="Cambria"/>
-          <w:lang w:val="es-ES"/>
-        </w:rPr>
-        <w:t>Database</w:t>
-      </w:r>
-      <w:proofErr w:type="spellEnd"/>
-      <w:r>
-        <w:rPr>
-          <w:rFonts w:cs="Cambria"/>
-          <w:lang w:val="es-ES"/>
-        </w:rPr>
-        <w:t>/02_DatosPrueba.sql.</w:t>
+        <w:t>La base de datos se llama SistemaFacturacionDB y reside en SQL Server. Se diseñó de forma normalizada, es decir, cada dato se guarda una sola vez y las tablas se relacionan entre sí mediante claves. Todo el esquema se genera con el script Database/01_CrearBaseDatos.sql (incluido en el Anexo B), y los datos de ejemplo con Database/02_DatosPrueba.sql.</w:t>
       </w:r>
     </w:p>
     <w:p>
@@ -2814,7 +2252,6 @@
         <w:keepNext/>
         <w:spacing w:before="240" w:after="80"/>
       </w:pPr>
-      <w:proofErr w:type="gramStart"/>
       <w:r>
         <w:rPr>
           <w:rFonts w:ascii="Calibri" w:hAnsi="Calibri" w:cs="Calibri"/>
@@ -2822,60 +2259,8 @@
           <w:color w:val="126882"/>
           <w:sz w:val="24"/>
         </w:rPr>
-        <w:t xml:space="preserve">5.1  </w:t>
-      </w:r>
-      <w:proofErr w:type="spellStart"/>
-      <w:r>
-        <w:rPr>
-          <w:rFonts w:ascii="Calibri" w:hAnsi="Calibri" w:cs="Calibri"/>
-          <w:b/>
-          <w:color w:val="126882"/>
-          <w:sz w:val="24"/>
-        </w:rPr>
-        <w:t>Tablas</w:t>
-      </w:r>
-      <w:proofErr w:type="spellEnd"/>
-      <w:proofErr w:type="gramEnd"/>
-      <w:r>
-        <w:rPr>
-          <w:rFonts w:ascii="Calibri" w:hAnsi="Calibri" w:cs="Calibri"/>
-          <w:b/>
-          <w:color w:val="126882"/>
-          <w:sz w:val="24"/>
-        </w:rPr>
-        <w:t xml:space="preserve"> y </w:t>
-      </w:r>
-      <w:proofErr w:type="spellStart"/>
-      <w:r>
-        <w:rPr>
-          <w:rFonts w:ascii="Calibri" w:hAnsi="Calibri" w:cs="Calibri"/>
-          <w:b/>
-          <w:color w:val="126882"/>
-          <w:sz w:val="24"/>
-        </w:rPr>
-        <w:t>relaciones</w:t>
-      </w:r>
-      <w:proofErr w:type="spellEnd"/>
-      <w:r>
-        <w:rPr>
-          <w:rFonts w:ascii="Calibri" w:hAnsi="Calibri" w:cs="Calibri"/>
-          <w:b/>
-          <w:color w:val="126882"/>
-          <w:sz w:val="24"/>
-        </w:rPr>
-        <w:t xml:space="preserve"> </w:t>
-      </w:r>
-      <w:proofErr w:type="spellStart"/>
-      <w:r>
-        <w:rPr>
-          <w:rFonts w:ascii="Calibri" w:hAnsi="Calibri" w:cs="Calibri"/>
-          <w:b/>
-          <w:color w:val="126882"/>
-          <w:sz w:val="24"/>
-        </w:rPr>
-        <w:t>principales</w:t>
-      </w:r>
-      <w:proofErr w:type="spellEnd"/>
+        <w:t>5.1  Tablas y relaciones principales</w:t>
+      </w:r>
     </w:p>
     <w:tbl>
       <w:tblPr>
@@ -3363,31 +2748,13 @@
             <w:pPr>
               <w:spacing w:before="40" w:after="40" w:line="264" w:lineRule="auto"/>
             </w:pPr>
-            <w:proofErr w:type="spellStart"/>
             <w:r>
               <w:rPr>
                 <w:rFonts w:cs="Cambria"/>
                 <w:sz w:val="19"/>
               </w:rPr>
-              <w:t>Clientes</w:t>
-            </w:r>
-            <w:proofErr w:type="spellEnd"/>
-            <w:r>
-              <w:rPr>
-                <w:rFonts w:cs="Cambria"/>
-                <w:sz w:val="19"/>
-              </w:rPr>
-              <w:t xml:space="preserve">, </w:t>
-            </w:r>
-            <w:proofErr w:type="spellStart"/>
-            <w:r>
-              <w:rPr>
-                <w:rFonts w:cs="Cambria"/>
-                <w:sz w:val="19"/>
-              </w:rPr>
-              <w:t>Empleados</w:t>
-            </w:r>
-            <w:proofErr w:type="spellEnd"/>
+              <w:t>Clientes, Empleados</w:t>
+            </w:r>
           </w:p>
         </w:tc>
       </w:tr>
@@ -3518,33 +2885,8 @@
                 <w:rFonts w:cs="Cambria"/>
                 <w:sz w:val="19"/>
               </w:rPr>
-              <w:t xml:space="preserve">Facturas, </w:t>
-            </w:r>
-            <w:proofErr w:type="spellStart"/>
-            <w:r>
-              <w:rPr>
-                <w:rFonts w:cs="Cambria"/>
-                <w:sz w:val="19"/>
-              </w:rPr>
-              <w:t>Clientes</w:t>
-            </w:r>
-            <w:proofErr w:type="spellEnd"/>
-            <w:r>
-              <w:rPr>
-                <w:rFonts w:cs="Cambria"/>
-                <w:sz w:val="19"/>
-              </w:rPr>
-              <w:t xml:space="preserve">, </w:t>
-            </w:r>
-            <w:proofErr w:type="spellStart"/>
-            <w:r>
-              <w:rPr>
-                <w:rFonts w:cs="Cambria"/>
-                <w:sz w:val="19"/>
-              </w:rPr>
-              <w:t>Empleados</w:t>
-            </w:r>
-            <w:proofErr w:type="spellEnd"/>
+              <w:t>Facturas, Clientes, Empleados</w:t>
+            </w:r>
           </w:p>
         </w:tc>
       </w:tr>
@@ -3606,7 +2948,6 @@
             <w:pPr>
               <w:spacing w:before="40" w:after="40" w:line="264" w:lineRule="auto"/>
             </w:pPr>
-            <w:proofErr w:type="spellStart"/>
             <w:r>
               <w:rPr>
                 <w:rFonts w:cs="Cambria"/>
@@ -3614,7 +2955,6 @@
               </w:rPr>
               <w:t>Proveedores</w:t>
             </w:r>
-            <w:proofErr w:type="spellEnd"/>
           </w:p>
         </w:tc>
       </w:tr>
@@ -3740,47 +3080,13 @@
             <w:pPr>
               <w:spacing w:before="40" w:after="40" w:line="264" w:lineRule="auto"/>
             </w:pPr>
-            <w:proofErr w:type="spellStart"/>
             <w:r>
               <w:rPr>
                 <w:rFonts w:cs="Cambria"/>
                 <w:sz w:val="19"/>
               </w:rPr>
-              <w:t>Compras</w:t>
-            </w:r>
-            <w:proofErr w:type="spellEnd"/>
-            <w:r>
-              <w:rPr>
-                <w:rFonts w:cs="Cambria"/>
-                <w:sz w:val="19"/>
-              </w:rPr>
-              <w:t xml:space="preserve">, </w:t>
-            </w:r>
-            <w:proofErr w:type="spellStart"/>
-            <w:r>
-              <w:rPr>
-                <w:rFonts w:cs="Cambria"/>
-                <w:sz w:val="19"/>
-              </w:rPr>
-              <w:t>Proveedores</w:t>
-            </w:r>
-            <w:proofErr w:type="spellEnd"/>
-            <w:r>
-              <w:rPr>
-                <w:rFonts w:cs="Cambria"/>
-                <w:sz w:val="19"/>
-              </w:rPr>
-              <w:t xml:space="preserve">, </w:t>
-            </w:r>
-            <w:proofErr w:type="spellStart"/>
-            <w:r>
-              <w:rPr>
-                <w:rFonts w:cs="Cambria"/>
-                <w:sz w:val="19"/>
-              </w:rPr>
-              <w:t>Empleados</w:t>
-            </w:r>
-            <w:proofErr w:type="spellEnd"/>
+              <w:t>Compras, Proveedores, Empleados</w:t>
+            </w:r>
           </w:p>
         </w:tc>
       </w:tr>
@@ -3793,7 +3099,6 @@
           <w:lang w:val="es-ES"/>
         </w:rPr>
       </w:pPr>
-      <w:proofErr w:type="gramStart"/>
       <w:r>
         <w:rPr>
           <w:rFonts w:ascii="Calibri" w:hAnsi="Calibri" w:cs="Calibri"/>
@@ -3802,18 +3107,7 @@
           <w:sz w:val="24"/>
           <w:lang w:val="es-ES"/>
         </w:rPr>
-        <w:t>5.2  Esquema</w:t>
-      </w:r>
-      <w:proofErr w:type="gramEnd"/>
-      <w:r>
-        <w:rPr>
-          <w:rFonts w:ascii="Calibri" w:hAnsi="Calibri" w:cs="Calibri"/>
-          <w:b/>
-          <w:color w:val="126882"/>
-          <w:sz w:val="24"/>
-          <w:lang w:val="es-ES"/>
-        </w:rPr>
-        <w:t xml:space="preserve"> detallado (tipos de datos)</w:t>
+        <w:t>5.2  Esquema detallado (tipos de datos)</w:t>
       </w:r>
     </w:p>
     <w:p>
@@ -3829,23 +3123,7 @@
           <w:rFonts w:cs="Cambria"/>
           <w:lang w:val="es-ES"/>
         </w:rPr>
-        <w:t xml:space="preserve">A </w:t>
-      </w:r>
-      <w:proofErr w:type="gramStart"/>
-      <w:r>
-        <w:rPr>
-          <w:rFonts w:cs="Cambria"/>
-          <w:lang w:val="es-ES"/>
-        </w:rPr>
-        <w:t>continuación</w:t>
-      </w:r>
-      <w:proofErr w:type="gramEnd"/>
-      <w:r>
-        <w:rPr>
-          <w:rFonts w:cs="Cambria"/>
-          <w:lang w:val="es-ES"/>
-        </w:rPr>
-        <w:t xml:space="preserve"> se detalla, tabla por tabla, cada campo con su tipo de dato de SQL Server y sus restricciones. Se usan las abreviaturas PK (clave primaria), FK (clave foránea) y U (valor único).</w:t>
+        <w:t>A continuación se detalla, tabla por tabla, cada campo con su tipo de dato de SQL Server y sus restricciones. Se usan las abreviaturas PK (clave primaria), FK (clave foránea) y U (valor único).</w:t>
       </w:r>
     </w:p>
     <w:p>
@@ -3853,8 +3131,6 @@
         <w:keepNext/>
         <w:spacing w:before="160" w:after="40"/>
       </w:pPr>
-      <w:proofErr w:type="spellStart"/>
-      <w:proofErr w:type="gramStart"/>
       <w:r>
         <w:rPr>
           <w:rFonts w:ascii="Calibri" w:hAnsi="Calibri" w:cs="Calibri"/>
@@ -3862,19 +3138,8 @@
           <w:color w:val="126882"/>
           <w:sz w:val="21"/>
         </w:rPr>
-        <w:t>Tabla</w:t>
-      </w:r>
-      <w:proofErr w:type="spellEnd"/>
-      <w:r>
-        <w:rPr>
-          <w:rFonts w:ascii="Calibri" w:hAnsi="Calibri" w:cs="Calibri"/>
-          <w:b/>
-          <w:color w:val="126882"/>
-          <w:sz w:val="21"/>
-        </w:rPr>
-        <w:t xml:space="preserve">  </w:t>
-      </w:r>
-      <w:proofErr w:type="spellStart"/>
+        <w:t xml:space="preserve">Tabla  </w:t>
+      </w:r>
       <w:r>
         <w:rPr>
           <w:rFonts w:ascii="Consolas" w:hAnsi="Consolas" w:cs="Consolas"/>
@@ -3884,8 +3149,6 @@
         </w:rPr>
         <w:t>Usuarios</w:t>
       </w:r>
-      <w:proofErr w:type="spellEnd"/>
-      <w:proofErr w:type="gramEnd"/>
     </w:p>
     <w:tbl>
       <w:tblPr>
@@ -7825,7 +7088,6 @@
             <w:pPr>
               <w:spacing w:before="40" w:after="40" w:line="264" w:lineRule="auto"/>
             </w:pPr>
-            <w:proofErr w:type="spellStart"/>
             <w:r>
               <w:rPr>
                 <w:rFonts w:ascii="Consolas" w:hAnsi="Consolas" w:cs="Consolas"/>
@@ -7834,7 +7096,6 @@
               </w:rPr>
               <w:t>TipoPago</w:t>
             </w:r>
-            <w:proofErr w:type="spellEnd"/>
           </w:p>
         </w:tc>
         <w:tc>
@@ -11046,7 +10307,6 @@
           <w:lang w:val="es-ES"/>
         </w:rPr>
       </w:pPr>
-      <w:proofErr w:type="gramStart"/>
       <w:r>
         <w:rPr>
           <w:rFonts w:ascii="Calibri" w:hAnsi="Calibri" w:cs="Calibri"/>
@@ -11055,18 +10315,7 @@
           <w:sz w:val="24"/>
           <w:lang w:val="es-ES"/>
         </w:rPr>
-        <w:t>6.1  Cálculo</w:t>
-      </w:r>
-      <w:proofErr w:type="gramEnd"/>
-      <w:r>
-        <w:rPr>
-          <w:rFonts w:ascii="Calibri" w:hAnsi="Calibri" w:cs="Calibri"/>
-          <w:b/>
-          <w:color w:val="126882"/>
-          <w:sz w:val="24"/>
-          <w:lang w:val="es-ES"/>
-        </w:rPr>
-        <w:t xml:space="preserve"> de la factura</w:t>
+        <w:t>6.1  Cálculo de la factura</w:t>
       </w:r>
     </w:p>
     <w:p>
@@ -11085,21 +10334,7 @@
         <w:rPr>
           <w:rFonts w:cs="Cambria"/>
         </w:rPr>
-        <w:t xml:space="preserve">A </w:t>
-      </w:r>
-      <w:proofErr w:type="spellStart"/>
-      <w:r>
-        <w:rPr>
-          <w:rFonts w:cs="Cambria"/>
-        </w:rPr>
-        <w:t>partir</w:t>
-      </w:r>
-      <w:proofErr w:type="spellEnd"/>
-      <w:r>
-        <w:rPr>
-          <w:rFonts w:cs="Cambria"/>
-        </w:rPr>
-        <w:t xml:space="preserve"> de ahí se obtiene el total:</w:t>
+        <w:t>A partir de ahí se obtiene el total:</w:t>
       </w:r>
     </w:p>
     <w:tbl>
@@ -11133,23 +10368,29 @@
                 <w:lang w:val="es-ES"/>
               </w:rPr>
             </w:pPr>
-            <w:proofErr w:type="gramStart"/>
             <w:r>
               <w:rPr>
                 <w:rFonts w:ascii="Consolas" w:hAnsi="Consolas" w:cs="Consolas"/>
                 <w:sz w:val="18"/>
                 <w:lang w:val="es-ES"/>
               </w:rPr>
-              <w:t>Subtotal  =</w:t>
-            </w:r>
-            <w:proofErr w:type="gramEnd"/>
+              <w:t>Subtotal  =  suma de los importes de las líneas</w:t>
+            </w:r>
+          </w:p>
+          <w:p>
+            <w:pPr>
+              <w:spacing w:after="0"/>
+              <w:rPr>
+                <w:lang w:val="es-ES"/>
+              </w:rPr>
+            </w:pPr>
             <w:r>
               <w:rPr>
                 <w:rFonts w:ascii="Consolas" w:hAnsi="Consolas" w:cs="Consolas"/>
                 <w:sz w:val="18"/>
                 <w:lang w:val="es-ES"/>
               </w:rPr>
-              <w:t xml:space="preserve">  suma de los importes de las líneas</w:t>
+              <w:t>Impuesto  =  Subtotal x 18 %   (ITBIS)</w:t>
             </w:r>
           </w:p>
           <w:p>
@@ -11159,75 +10400,13 @@
                 <w:lang w:val="es-ES"/>
               </w:rPr>
             </w:pPr>
-            <w:proofErr w:type="gramStart"/>
             <w:r>
               <w:rPr>
                 <w:rFonts w:ascii="Consolas" w:hAnsi="Consolas" w:cs="Consolas"/>
                 <w:sz w:val="18"/>
                 <w:lang w:val="es-ES"/>
               </w:rPr>
-              <w:t>Impuesto  =</w:t>
-            </w:r>
-            <w:proofErr w:type="gramEnd"/>
-            <w:r>
-              <w:rPr>
-                <w:rFonts w:ascii="Consolas" w:hAnsi="Consolas" w:cs="Consolas"/>
-                <w:sz w:val="18"/>
-                <w:lang w:val="es-ES"/>
-              </w:rPr>
-              <w:t xml:space="preserve">  Subtotal x 18 %</w:t>
-            </w:r>
-            <w:proofErr w:type="gramStart"/>
-            <w:r>
-              <w:rPr>
-                <w:rFonts w:ascii="Consolas" w:hAnsi="Consolas" w:cs="Consolas"/>
-                <w:sz w:val="18"/>
-                <w:lang w:val="es-ES"/>
-              </w:rPr>
-              <w:t xml:space="preserve">   (</w:t>
-            </w:r>
-            <w:proofErr w:type="gramEnd"/>
-            <w:r>
-              <w:rPr>
-                <w:rFonts w:ascii="Consolas" w:hAnsi="Consolas" w:cs="Consolas"/>
-                <w:sz w:val="18"/>
-                <w:lang w:val="es-ES"/>
-              </w:rPr>
-              <w:t>ITBIS)</w:t>
-            </w:r>
-          </w:p>
-          <w:p>
-            <w:pPr>
-              <w:spacing w:after="0"/>
-              <w:rPr>
-                <w:lang w:val="es-ES"/>
-              </w:rPr>
-            </w:pPr>
-            <w:r>
-              <w:rPr>
-                <w:rFonts w:ascii="Consolas" w:hAnsi="Consolas" w:cs="Consolas"/>
-                <w:sz w:val="18"/>
-                <w:lang w:val="es-ES"/>
-              </w:rPr>
-              <w:t xml:space="preserve">Total     </w:t>
-            </w:r>
-            <w:proofErr w:type="gramStart"/>
-            <w:r>
-              <w:rPr>
-                <w:rFonts w:ascii="Consolas" w:hAnsi="Consolas" w:cs="Consolas"/>
-                <w:sz w:val="18"/>
-                <w:lang w:val="es-ES"/>
-              </w:rPr>
-              <w:t>=  Subtotal</w:t>
-            </w:r>
-            <w:proofErr w:type="gramEnd"/>
-            <w:r>
-              <w:rPr>
-                <w:rFonts w:ascii="Consolas" w:hAnsi="Consolas" w:cs="Consolas"/>
-                <w:sz w:val="18"/>
-                <w:lang w:val="es-ES"/>
-              </w:rPr>
-              <w:t xml:space="preserve"> + Impuesto</w:t>
+              <w:t>Total     =  Subtotal + Impuesto</w:t>
             </w:r>
           </w:p>
         </w:tc>
@@ -11254,23 +10433,7 @@
           <w:rFonts w:cs="Cambria"/>
           <w:lang w:val="es-ES"/>
         </w:rPr>
-        <w:t>La tasa del ITBIS (18 %) y el símbolo de la moneda (RD$) no están escritos por todo el código, sino centralizados en la clase Negocio/</w:t>
-      </w:r>
-      <w:proofErr w:type="spellStart"/>
-      <w:r>
-        <w:rPr>
-          <w:rFonts w:cs="Cambria"/>
-          <w:lang w:val="es-ES"/>
-        </w:rPr>
-        <w:t>Configuracion.cs</w:t>
-      </w:r>
-      <w:proofErr w:type="spellEnd"/>
-      <w:r>
-        <w:rPr>
-          <w:rFonts w:cs="Cambria"/>
-          <w:lang w:val="es-ES"/>
-        </w:rPr>
-        <w:t>, de modo que cambiarlos en el futuro sea cosa de una sola línea. El tipo de pago determina el saldo inicial de la factura:</w:t>
+        <w:t>La tasa del ITBIS (18 %) y el símbolo de la moneda (RD$) no están escritos por todo el código, sino centralizados en la clase Negocio/Configuracion.cs, de modo que cambiarlos en el futuro sea cosa de una sola línea. El tipo de pago determina el saldo inicial de la factura:</w:t>
       </w:r>
     </w:p>
     <w:p>
@@ -11347,7 +10510,6 @@
           <w:lang w:val="es-ES"/>
         </w:rPr>
       </w:pPr>
-      <w:proofErr w:type="gramStart"/>
       <w:r>
         <w:rPr>
           <w:rFonts w:ascii="Calibri" w:hAnsi="Calibri" w:cs="Calibri"/>
@@ -11356,9 +10518,33 @@
           <w:sz w:val="24"/>
           <w:lang w:val="es-ES"/>
         </w:rPr>
-        <w:t>6.2  Control</w:t>
-      </w:r>
-      <w:proofErr w:type="gramEnd"/>
+        <w:t>6.2  Control de inventario</w:t>
+      </w:r>
+    </w:p>
+    <w:p>
+      <w:pPr>
+        <w:spacing w:after="160" w:line="288" w:lineRule="auto"/>
+        <w:jc w:val="both"/>
+        <w:rPr>
+          <w:lang w:val="es-ES"/>
+        </w:rPr>
+      </w:pPr>
+      <w:r>
+        <w:rPr>
+          <w:rFonts w:cs="Cambria"/>
+          <w:lang w:val="es-ES"/>
+        </w:rPr>
+        <w:t>Cuando se factura un producto, su stock se descuenta; si la factura se anula, el stock se devuelve. Los servicios no afectan el inventario. Antes de facturar se comprueba que haya existencias suficientes. En las compras ocurre lo contrario: el stock aumenta a medida que entra mercancía.</w:t>
+      </w:r>
+    </w:p>
+    <w:p>
+      <w:pPr>
+        <w:keepNext/>
+        <w:spacing w:before="240" w:after="80"/>
+        <w:rPr>
+          <w:lang w:val="es-ES"/>
+        </w:rPr>
+      </w:pPr>
       <w:r>
         <w:rPr>
           <w:rFonts w:ascii="Calibri" w:hAnsi="Calibri" w:cs="Calibri"/>
@@ -11367,13 +10553,13 @@
           <w:sz w:val="24"/>
           <w:lang w:val="es-ES"/>
         </w:rPr>
-        <w:t xml:space="preserve"> de inventario</w:t>
+        <w:t>6.3  Actualización de saldos (cuentas por cobrar y por pagar)</w:t>
       </w:r>
     </w:p>
     <w:p>
       <w:pPr>
-        <w:spacing w:after="160" w:line="288" w:lineRule="auto"/>
-        <w:jc w:val="both"/>
+        <w:spacing w:after="80" w:line="288" w:lineRule="auto"/>
+        <w:ind w:left="397" w:hanging="198"/>
         <w:rPr>
           <w:lang w:val="es-ES"/>
         </w:rPr>
@@ -11381,20 +10567,103 @@
       <w:r>
         <w:rPr>
           <w:rFonts w:cs="Cambria"/>
-          <w:lang w:val="es-ES"/>
-        </w:rPr>
-        <w:t>Cuando se factura un producto, su stock se descuenta; si la factura se anula, el stock se devuelve. Los servicios no afectan el inventario. Antes de facturar se comprueba que haya existencias suficientes. En las compras ocurre lo contrario: el stock aumenta a medida que entra mercancía.</w:t>
+          <w:b/>
+          <w:color w:val="0B4F6C"/>
+          <w:lang w:val="es-ES"/>
+        </w:rPr>
+        <w:t xml:space="preserve">•  </w:t>
+      </w:r>
+      <w:r>
+        <w:rPr>
+          <w:rFonts w:cs="Cambria"/>
+          <w:lang w:val="es-ES"/>
+        </w:rPr>
+        <w:t>Cada factura a crédito incrementa el saldo del cliente.</w:t>
       </w:r>
     </w:p>
     <w:p>
       <w:pPr>
+        <w:spacing w:after="80" w:line="288" w:lineRule="auto"/>
+        <w:ind w:left="397" w:hanging="198"/>
+        <w:rPr>
+          <w:lang w:val="es-ES"/>
+        </w:rPr>
+      </w:pPr>
+      <w:r>
+        <w:rPr>
+          <w:rFonts w:cs="Cambria"/>
+          <w:b/>
+          <w:color w:val="0B4F6C"/>
+          <w:lang w:val="es-ES"/>
+        </w:rPr>
+        <w:t xml:space="preserve">•  </w:t>
+      </w:r>
+      <w:r>
+        <w:rPr>
+          <w:rFonts w:cs="Cambria"/>
+          <w:lang w:val="es-ES"/>
+        </w:rPr>
+        <w:t>Cada cobro reduce el saldo de la factura y del cliente; si la factura llega a cero, pasa a estado «Pagada».</w:t>
+      </w:r>
+    </w:p>
+    <w:p>
+      <w:pPr>
+        <w:spacing w:after="80" w:line="288" w:lineRule="auto"/>
+        <w:ind w:left="397" w:hanging="198"/>
+        <w:rPr>
+          <w:lang w:val="es-ES"/>
+        </w:rPr>
+      </w:pPr>
+      <w:r>
+        <w:rPr>
+          <w:rFonts w:cs="Cambria"/>
+          <w:b/>
+          <w:color w:val="0B4F6C"/>
+          <w:lang w:val="es-ES"/>
+        </w:rPr>
+        <w:t xml:space="preserve">•  </w:t>
+      </w:r>
+      <w:r>
+        <w:rPr>
+          <w:rFonts w:cs="Cambria"/>
+          <w:lang w:val="es-ES"/>
+        </w:rPr>
+        <w:t>Cada compra incrementa el saldo del proveedor (cuenta por pagar).</w:t>
+      </w:r>
+    </w:p>
+    <w:p>
+      <w:pPr>
+        <w:spacing w:after="80" w:line="288" w:lineRule="auto"/>
+        <w:ind w:left="397" w:hanging="198"/>
+        <w:rPr>
+          <w:lang w:val="es-ES"/>
+        </w:rPr>
+      </w:pPr>
+      <w:r>
+        <w:rPr>
+          <w:rFonts w:cs="Cambria"/>
+          <w:b/>
+          <w:color w:val="0B4F6C"/>
+          <w:lang w:val="es-ES"/>
+        </w:rPr>
+        <w:t xml:space="preserve">•  </w:t>
+      </w:r>
+      <w:r>
+        <w:rPr>
+          <w:rFonts w:cs="Cambria"/>
+          <w:lang w:val="es-ES"/>
+        </w:rPr>
+        <w:t>Cada pago reduce el saldo de la compra y del proveedor.</w:t>
+      </w:r>
+    </w:p>
+    <w:p>
+      <w:pPr>
         <w:keepNext/>
         <w:spacing w:before="240" w:after="80"/>
         <w:rPr>
           <w:lang w:val="es-ES"/>
         </w:rPr>
       </w:pPr>
-      <w:proofErr w:type="gramStart"/>
       <w:r>
         <w:rPr>
           <w:rFonts w:ascii="Calibri" w:hAnsi="Calibri" w:cs="Calibri"/>
@@ -11403,9 +10672,33 @@
           <w:sz w:val="24"/>
           <w:lang w:val="es-ES"/>
         </w:rPr>
-        <w:t>6.3  Actualización</w:t>
-      </w:r>
-      <w:proofErr w:type="gramEnd"/>
+        <w:t>6.4  Límite de crédito</w:t>
+      </w:r>
+    </w:p>
+    <w:p>
+      <w:pPr>
+        <w:spacing w:after="160" w:line="288" w:lineRule="auto"/>
+        <w:jc w:val="both"/>
+        <w:rPr>
+          <w:lang w:val="es-ES"/>
+        </w:rPr>
+      </w:pPr>
+      <w:r>
+        <w:rPr>
+          <w:rFonts w:cs="Cambria"/>
+          <w:lang w:val="es-ES"/>
+        </w:rPr>
+        <w:t>En las ventas a crédito el sistema verifica que el nuevo saldo del cliente no supere el límite de crédito que tiene configurado. Si lo supera, la venta se rechaza con un mensaje claro en lugar de dejar pasar la operación.</w:t>
+      </w:r>
+    </w:p>
+    <w:p>
+      <w:pPr>
+        <w:keepNext/>
+        <w:spacing w:before="240" w:after="80"/>
+        <w:rPr>
+          <w:lang w:val="es-ES"/>
+        </w:rPr>
+      </w:pPr>
       <w:r>
         <w:rPr>
           <w:rFonts w:ascii="Calibri" w:hAnsi="Calibri" w:cs="Calibri"/>
@@ -11414,185 +10707,7 @@
           <w:sz w:val="24"/>
           <w:lang w:val="es-ES"/>
         </w:rPr>
-        <w:t xml:space="preserve"> de saldos (cuentas por cobrar y por pagar)</w:t>
-      </w:r>
-    </w:p>
-    <w:p>
-      <w:pPr>
-        <w:spacing w:after="80" w:line="288" w:lineRule="auto"/>
-        <w:ind w:left="397" w:hanging="198"/>
-        <w:rPr>
-          <w:lang w:val="es-ES"/>
-        </w:rPr>
-      </w:pPr>
-      <w:r>
-        <w:rPr>
-          <w:rFonts w:cs="Cambria"/>
-          <w:b/>
-          <w:color w:val="0B4F6C"/>
-          <w:lang w:val="es-ES"/>
-        </w:rPr>
-        <w:t xml:space="preserve">•  </w:t>
-      </w:r>
-      <w:r>
-        <w:rPr>
-          <w:rFonts w:cs="Cambria"/>
-          <w:lang w:val="es-ES"/>
-        </w:rPr>
-        <w:t>Cada factura a crédito incrementa el saldo del cliente.</w:t>
-      </w:r>
-    </w:p>
-    <w:p>
-      <w:pPr>
-        <w:spacing w:after="80" w:line="288" w:lineRule="auto"/>
-        <w:ind w:left="397" w:hanging="198"/>
-        <w:rPr>
-          <w:lang w:val="es-ES"/>
-        </w:rPr>
-      </w:pPr>
-      <w:r>
-        <w:rPr>
-          <w:rFonts w:cs="Cambria"/>
-          <w:b/>
-          <w:color w:val="0B4F6C"/>
-          <w:lang w:val="es-ES"/>
-        </w:rPr>
-        <w:t xml:space="preserve">•  </w:t>
-      </w:r>
-      <w:r>
-        <w:rPr>
-          <w:rFonts w:cs="Cambria"/>
-          <w:lang w:val="es-ES"/>
-        </w:rPr>
-        <w:t>Cada cobro reduce el saldo de la factura y del cliente; si la factura llega a cero, pasa a estado «Pagada».</w:t>
-      </w:r>
-    </w:p>
-    <w:p>
-      <w:pPr>
-        <w:spacing w:after="80" w:line="288" w:lineRule="auto"/>
-        <w:ind w:left="397" w:hanging="198"/>
-        <w:rPr>
-          <w:lang w:val="es-ES"/>
-        </w:rPr>
-      </w:pPr>
-      <w:r>
-        <w:rPr>
-          <w:rFonts w:cs="Cambria"/>
-          <w:b/>
-          <w:color w:val="0B4F6C"/>
-          <w:lang w:val="es-ES"/>
-        </w:rPr>
-        <w:t xml:space="preserve">•  </w:t>
-      </w:r>
-      <w:r>
-        <w:rPr>
-          <w:rFonts w:cs="Cambria"/>
-          <w:lang w:val="es-ES"/>
-        </w:rPr>
-        <w:t>Cada compra incrementa el saldo del proveedor (cuenta por pagar).</w:t>
-      </w:r>
-    </w:p>
-    <w:p>
-      <w:pPr>
-        <w:spacing w:after="80" w:line="288" w:lineRule="auto"/>
-        <w:ind w:left="397" w:hanging="198"/>
-        <w:rPr>
-          <w:lang w:val="es-ES"/>
-        </w:rPr>
-      </w:pPr>
-      <w:r>
-        <w:rPr>
-          <w:rFonts w:cs="Cambria"/>
-          <w:b/>
-          <w:color w:val="0B4F6C"/>
-          <w:lang w:val="es-ES"/>
-        </w:rPr>
-        <w:t xml:space="preserve">•  </w:t>
-      </w:r>
-      <w:r>
-        <w:rPr>
-          <w:rFonts w:cs="Cambria"/>
-          <w:lang w:val="es-ES"/>
-        </w:rPr>
-        <w:t>Cada pago reduce el saldo de la compra y del proveedor.</w:t>
-      </w:r>
-    </w:p>
-    <w:p>
-      <w:pPr>
-        <w:keepNext/>
-        <w:spacing w:before="240" w:after="80"/>
-        <w:rPr>
-          <w:lang w:val="es-ES"/>
-        </w:rPr>
-      </w:pPr>
-      <w:proofErr w:type="gramStart"/>
-      <w:r>
-        <w:rPr>
-          <w:rFonts w:ascii="Calibri" w:hAnsi="Calibri" w:cs="Calibri"/>
-          <w:b/>
-          <w:color w:val="126882"/>
-          <w:sz w:val="24"/>
-          <w:lang w:val="es-ES"/>
-        </w:rPr>
-        <w:t>6.4  Límite</w:t>
-      </w:r>
-      <w:proofErr w:type="gramEnd"/>
-      <w:r>
-        <w:rPr>
-          <w:rFonts w:ascii="Calibri" w:hAnsi="Calibri" w:cs="Calibri"/>
-          <w:b/>
-          <w:color w:val="126882"/>
-          <w:sz w:val="24"/>
-          <w:lang w:val="es-ES"/>
-        </w:rPr>
-        <w:t xml:space="preserve"> de crédito</w:t>
-      </w:r>
-    </w:p>
-    <w:p>
-      <w:pPr>
-        <w:spacing w:after="160" w:line="288" w:lineRule="auto"/>
-        <w:jc w:val="both"/>
-        <w:rPr>
-          <w:lang w:val="es-ES"/>
-        </w:rPr>
-      </w:pPr>
-      <w:r>
-        <w:rPr>
-          <w:rFonts w:cs="Cambria"/>
-          <w:lang w:val="es-ES"/>
-        </w:rPr>
-        <w:t>En las ventas a crédito el sistema verifica que el nuevo saldo del cliente no supere el límite de crédito que tiene configurado. Si lo supera, la venta se rechaza con un mensaje claro en lugar de dejar pasar la operación.</w:t>
-      </w:r>
-    </w:p>
-    <w:p>
-      <w:pPr>
-        <w:keepNext/>
-        <w:spacing w:before="240" w:after="80"/>
-        <w:rPr>
-          <w:lang w:val="es-ES"/>
-        </w:rPr>
-      </w:pPr>
-      <w:proofErr w:type="gramStart"/>
-      <w:r>
-        <w:rPr>
-          <w:rFonts w:ascii="Calibri" w:hAnsi="Calibri" w:cs="Calibri"/>
-          <w:b/>
-          <w:color w:val="126882"/>
-          <w:sz w:val="24"/>
-          <w:lang w:val="es-ES"/>
-        </w:rPr>
-        <w:t>6.5  Integridad</w:t>
-      </w:r>
-      <w:proofErr w:type="gramEnd"/>
-      <w:r>
-        <w:rPr>
-          <w:rFonts w:ascii="Calibri" w:hAnsi="Calibri" w:cs="Calibri"/>
-          <w:b/>
-          <w:color w:val="126882"/>
-          <w:sz w:val="24"/>
-          <w:lang w:val="es-ES"/>
-        </w:rPr>
-        <w:t xml:space="preserve"> transaccional</w:t>
+        <w:t>6.5  Integridad transaccional</w:t>
       </w:r>
     </w:p>
     <w:p>
@@ -11650,9 +10765,76 @@
                 <w:lang w:val="es-ES"/>
               </w:rPr>
               <w:lastRenderedPageBreak/>
-              <w:t xml:space="preserve">// </w:t>
-            </w:r>
-            <w:proofErr w:type="spellStart"/>
+              <w:t>// FacturaDAO.Insertar — creación atómica de una factura</w:t>
+            </w:r>
+          </w:p>
+          <w:p>
+            <w:pPr>
+              <w:spacing w:after="0"/>
+            </w:pPr>
+            <w:r>
+              <w:rPr>
+                <w:rFonts w:ascii="Consolas" w:hAnsi="Consolas" w:cs="Consolas"/>
+                <w:sz w:val="18"/>
+              </w:rPr>
+              <w:t>using (SqlTransaction tran = cn.BeginTransaction())</w:t>
+            </w:r>
+          </w:p>
+          <w:p>
+            <w:pPr>
+              <w:spacing w:after="0"/>
+              <w:rPr>
+                <w:lang w:val="es-ES"/>
+              </w:rPr>
+            </w:pPr>
+            <w:r>
+              <w:rPr>
+                <w:rFonts w:ascii="Consolas" w:hAnsi="Consolas" w:cs="Consolas"/>
+                <w:sz w:val="18"/>
+                <w:lang w:val="es-ES"/>
+              </w:rPr>
+              <w:t>{</w:t>
+            </w:r>
+          </w:p>
+          <w:p>
+            <w:pPr>
+              <w:spacing w:after="0"/>
+              <w:rPr>
+                <w:lang w:val="es-ES"/>
+              </w:rPr>
+            </w:pPr>
+            <w:r>
+              <w:rPr>
+                <w:rFonts w:ascii="Consolas" w:hAnsi="Consolas" w:cs="Consolas"/>
+                <w:sz w:val="18"/>
+                <w:lang w:val="es-ES"/>
+              </w:rPr>
+              <w:t xml:space="preserve">    try</w:t>
+            </w:r>
+          </w:p>
+          <w:p>
+            <w:pPr>
+              <w:spacing w:after="0"/>
+              <w:rPr>
+                <w:lang w:val="es-ES"/>
+              </w:rPr>
+            </w:pPr>
+            <w:r>
+              <w:rPr>
+                <w:rFonts w:ascii="Consolas" w:hAnsi="Consolas" w:cs="Consolas"/>
+                <w:sz w:val="18"/>
+                <w:lang w:val="es-ES"/>
+              </w:rPr>
+              <w:t xml:space="preserve">    {</w:t>
+            </w:r>
+          </w:p>
+          <w:p>
+            <w:pPr>
+              <w:spacing w:after="0"/>
+              <w:rPr>
+                <w:lang w:val="es-ES"/>
+              </w:rPr>
+            </w:pPr>
             <w:r>
               <w:rPr>
                 <w:rFonts w:ascii="Consolas" w:hAnsi="Consolas" w:cs="Consolas"/>
@@ -11660,9 +10842,16 @@
                 <w:sz w:val="18"/>
                 <w:lang w:val="es-ES"/>
               </w:rPr>
-              <w:t>FacturaDAO.Insertar</w:t>
-            </w:r>
-            <w:proofErr w:type="spellEnd"/>
+              <w:t xml:space="preserve">        // 1) Insertar el encabezado y obtener el ID generado</w:t>
+            </w:r>
+          </w:p>
+          <w:p>
+            <w:pPr>
+              <w:spacing w:after="0"/>
+              <w:rPr>
+                <w:lang w:val="es-ES"/>
+              </w:rPr>
+            </w:pPr>
             <w:r>
               <w:rPr>
                 <w:rFonts w:ascii="Consolas" w:hAnsi="Consolas" w:cs="Consolas"/>
@@ -11670,117 +10859,7 @@
                 <w:sz w:val="18"/>
                 <w:lang w:val="es-ES"/>
               </w:rPr>
-              <w:t xml:space="preserve"> — creación atómica de una factura</w:t>
-            </w:r>
-          </w:p>
-          <w:p>
-            <w:pPr>
-              <w:spacing w:after="0"/>
-            </w:pPr>
-            <w:r>
-              <w:rPr>
-                <w:rFonts w:ascii="Consolas" w:hAnsi="Consolas" w:cs="Consolas"/>
-                <w:sz w:val="18"/>
-              </w:rPr>
-              <w:t>using (</w:t>
-            </w:r>
-            <w:proofErr w:type="spellStart"/>
-            <w:r>
-              <w:rPr>
-                <w:rFonts w:ascii="Consolas" w:hAnsi="Consolas" w:cs="Consolas"/>
-                <w:sz w:val="18"/>
-              </w:rPr>
-              <w:t>SqlTransaction</w:t>
-            </w:r>
-            <w:proofErr w:type="spellEnd"/>
-            <w:r>
-              <w:rPr>
-                <w:rFonts w:ascii="Consolas" w:hAnsi="Consolas" w:cs="Consolas"/>
-                <w:sz w:val="18"/>
-              </w:rPr>
-              <w:t xml:space="preserve"> </w:t>
-            </w:r>
-            <w:proofErr w:type="spellStart"/>
-            <w:r>
-              <w:rPr>
-                <w:rFonts w:ascii="Consolas" w:hAnsi="Consolas" w:cs="Consolas"/>
-                <w:sz w:val="18"/>
-              </w:rPr>
-              <w:t>tran</w:t>
-            </w:r>
-            <w:proofErr w:type="spellEnd"/>
-            <w:r>
-              <w:rPr>
-                <w:rFonts w:ascii="Consolas" w:hAnsi="Consolas" w:cs="Consolas"/>
-                <w:sz w:val="18"/>
-              </w:rPr>
-              <w:t xml:space="preserve"> = </w:t>
-            </w:r>
-            <w:proofErr w:type="spellStart"/>
-            <w:proofErr w:type="gramStart"/>
-            <w:r>
-              <w:rPr>
-                <w:rFonts w:ascii="Consolas" w:hAnsi="Consolas" w:cs="Consolas"/>
-                <w:sz w:val="18"/>
-              </w:rPr>
-              <w:t>cn.BeginTransaction</w:t>
-            </w:r>
-            <w:proofErr w:type="spellEnd"/>
-            <w:proofErr w:type="gramEnd"/>
-            <w:r>
-              <w:rPr>
-                <w:rFonts w:ascii="Consolas" w:hAnsi="Consolas" w:cs="Consolas"/>
-                <w:sz w:val="18"/>
-              </w:rPr>
-              <w:t>())</w:t>
-            </w:r>
-          </w:p>
-          <w:p>
-            <w:pPr>
-              <w:spacing w:after="0"/>
-              <w:rPr>
-                <w:lang w:val="es-ES"/>
-              </w:rPr>
-            </w:pPr>
-            <w:r>
-              <w:rPr>
-                <w:rFonts w:ascii="Consolas" w:hAnsi="Consolas" w:cs="Consolas"/>
-                <w:sz w:val="18"/>
-                <w:lang w:val="es-ES"/>
-              </w:rPr>
-              <w:t>{</w:t>
-            </w:r>
-          </w:p>
-          <w:p>
-            <w:pPr>
-              <w:spacing w:after="0"/>
-              <w:rPr>
-                <w:lang w:val="es-ES"/>
-              </w:rPr>
-            </w:pPr>
-            <w:r>
-              <w:rPr>
-                <w:rFonts w:ascii="Consolas" w:hAnsi="Consolas" w:cs="Consolas"/>
-                <w:sz w:val="18"/>
-                <w:lang w:val="es-ES"/>
-              </w:rPr>
-              <w:t xml:space="preserve">    try</w:t>
-            </w:r>
-          </w:p>
-          <w:p>
-            <w:pPr>
-              <w:spacing w:after="0"/>
-              <w:rPr>
-                <w:lang w:val="es-ES"/>
-              </w:rPr>
-            </w:pPr>
-            <w:r>
-              <w:rPr>
-                <w:rFonts w:ascii="Consolas" w:hAnsi="Consolas" w:cs="Consolas"/>
-                <w:sz w:val="18"/>
-                <w:lang w:val="es-ES"/>
-              </w:rPr>
-              <w:t xml:space="preserve">    {</w:t>
+              <w:t xml:space="preserve">        // 2) Insertar cada línea de detalle y descontar el stock</w:t>
             </w:r>
           </w:p>
           <w:p>
@@ -11797,40 +10876,6 @@
                 <w:sz w:val="18"/>
                 <w:lang w:val="es-ES"/>
               </w:rPr>
-              <w:t xml:space="preserve">        // 1) Insertar el encabezado y obtener el ID generado</w:t>
-            </w:r>
-          </w:p>
-          <w:p>
-            <w:pPr>
-              <w:spacing w:after="0"/>
-              <w:rPr>
-                <w:lang w:val="es-ES"/>
-              </w:rPr>
-            </w:pPr>
-            <w:r>
-              <w:rPr>
-                <w:rFonts w:ascii="Consolas" w:hAnsi="Consolas" w:cs="Consolas"/>
-                <w:color w:val="5B6B79"/>
-                <w:sz w:val="18"/>
-                <w:lang w:val="es-ES"/>
-              </w:rPr>
-              <w:t xml:space="preserve">        // 2) Insertar cada línea de detalle y descontar el stock</w:t>
-            </w:r>
-          </w:p>
-          <w:p>
-            <w:pPr>
-              <w:spacing w:after="0"/>
-              <w:rPr>
-                <w:lang w:val="es-ES"/>
-              </w:rPr>
-            </w:pPr>
-            <w:r>
-              <w:rPr>
-                <w:rFonts w:ascii="Consolas" w:hAnsi="Consolas" w:cs="Consolas"/>
-                <w:color w:val="5B6B79"/>
-                <w:sz w:val="18"/>
-                <w:lang w:val="es-ES"/>
-              </w:rPr>
               <w:t xml:space="preserve">        // 3) Aumentar el saldo (cuenta por cobrar) del cliente</w:t>
             </w:r>
           </w:p>
@@ -11847,129 +10892,71 @@
                 <w:sz w:val="18"/>
                 <w:lang w:val="es-ES"/>
               </w:rPr>
-              <w:t xml:space="preserve">        </w:t>
-            </w:r>
-            <w:proofErr w:type="spellStart"/>
-            <w:proofErr w:type="gramStart"/>
+              <w:t xml:space="preserve">        tran.Commit();   // todo salió bien -&gt; se confirma en bloque</w:t>
+            </w:r>
+          </w:p>
+          <w:p>
+            <w:pPr>
+              <w:spacing w:after="0"/>
+              <w:rPr>
+                <w:lang w:val="es-ES"/>
+              </w:rPr>
+            </w:pPr>
             <w:r>
               <w:rPr>
                 <w:rFonts w:ascii="Consolas" w:hAnsi="Consolas" w:cs="Consolas"/>
                 <w:sz w:val="18"/>
                 <w:lang w:val="es-ES"/>
               </w:rPr>
-              <w:t>tran.Commit</w:t>
-            </w:r>
-            <w:proofErr w:type="spellEnd"/>
-            <w:proofErr w:type="gramEnd"/>
+              <w:t xml:space="preserve">    }</w:t>
+            </w:r>
+          </w:p>
+          <w:p>
+            <w:pPr>
+              <w:spacing w:after="0"/>
+              <w:rPr>
+                <w:lang w:val="es-ES"/>
+              </w:rPr>
+            </w:pPr>
             <w:r>
               <w:rPr>
                 <w:rFonts w:ascii="Consolas" w:hAnsi="Consolas" w:cs="Consolas"/>
                 <w:sz w:val="18"/>
                 <w:lang w:val="es-ES"/>
               </w:rPr>
-              <w:t>(</w:t>
-            </w:r>
-            <w:proofErr w:type="gramStart"/>
+              <w:t xml:space="preserve">    catch</w:t>
+            </w:r>
+          </w:p>
+          <w:p>
+            <w:pPr>
+              <w:spacing w:after="0"/>
+              <w:rPr>
+                <w:lang w:val="es-ES"/>
+              </w:rPr>
+            </w:pPr>
             <w:r>
               <w:rPr>
                 <w:rFonts w:ascii="Consolas" w:hAnsi="Consolas" w:cs="Consolas"/>
                 <w:sz w:val="18"/>
                 <w:lang w:val="es-ES"/>
               </w:rPr>
-              <w:t xml:space="preserve">);   </w:t>
-            </w:r>
-            <w:proofErr w:type="gramEnd"/>
+              <w:t xml:space="preserve">    {</w:t>
+            </w:r>
+          </w:p>
+          <w:p>
+            <w:pPr>
+              <w:spacing w:after="0"/>
+              <w:rPr>
+                <w:lang w:val="es-ES"/>
+              </w:rPr>
+            </w:pPr>
             <w:r>
               <w:rPr>
                 <w:rFonts w:ascii="Consolas" w:hAnsi="Consolas" w:cs="Consolas"/>
                 <w:sz w:val="18"/>
                 <w:lang w:val="es-ES"/>
               </w:rPr>
-              <w:t>// todo salió bien -&gt; se confirma en bloque</w:t>
-            </w:r>
-          </w:p>
-          <w:p>
-            <w:pPr>
-              <w:spacing w:after="0"/>
-              <w:rPr>
-                <w:lang w:val="es-ES"/>
-              </w:rPr>
-            </w:pPr>
-            <w:r>
-              <w:rPr>
-                <w:rFonts w:ascii="Consolas" w:hAnsi="Consolas" w:cs="Consolas"/>
-                <w:sz w:val="18"/>
-                <w:lang w:val="es-ES"/>
-              </w:rPr>
-              <w:t xml:space="preserve">    }</w:t>
-            </w:r>
-          </w:p>
-          <w:p>
-            <w:pPr>
-              <w:spacing w:after="0"/>
-              <w:rPr>
-                <w:lang w:val="es-ES"/>
-              </w:rPr>
-            </w:pPr>
-            <w:r>
-              <w:rPr>
-                <w:rFonts w:ascii="Consolas" w:hAnsi="Consolas" w:cs="Consolas"/>
-                <w:sz w:val="18"/>
-                <w:lang w:val="es-ES"/>
-              </w:rPr>
-              <w:t xml:space="preserve">    catch</w:t>
-            </w:r>
-          </w:p>
-          <w:p>
-            <w:pPr>
-              <w:spacing w:after="0"/>
-              <w:rPr>
-                <w:lang w:val="es-ES"/>
-              </w:rPr>
-            </w:pPr>
-            <w:r>
-              <w:rPr>
-                <w:rFonts w:ascii="Consolas" w:hAnsi="Consolas" w:cs="Consolas"/>
-                <w:sz w:val="18"/>
-                <w:lang w:val="es-ES"/>
-              </w:rPr>
-              <w:t xml:space="preserve">    {</w:t>
-            </w:r>
-          </w:p>
-          <w:p>
-            <w:pPr>
-              <w:spacing w:after="0"/>
-              <w:rPr>
-                <w:lang w:val="es-ES"/>
-              </w:rPr>
-            </w:pPr>
-            <w:r>
-              <w:rPr>
-                <w:rFonts w:ascii="Consolas" w:hAnsi="Consolas" w:cs="Consolas"/>
-                <w:sz w:val="18"/>
-                <w:lang w:val="es-ES"/>
-              </w:rPr>
-              <w:t xml:space="preserve">        </w:t>
-            </w:r>
-            <w:proofErr w:type="spellStart"/>
-            <w:proofErr w:type="gramStart"/>
-            <w:r>
-              <w:rPr>
-                <w:rFonts w:ascii="Consolas" w:hAnsi="Consolas" w:cs="Consolas"/>
-                <w:sz w:val="18"/>
-                <w:lang w:val="es-ES"/>
-              </w:rPr>
-              <w:t>tran.Rollback</w:t>
-            </w:r>
-            <w:proofErr w:type="spellEnd"/>
-            <w:proofErr w:type="gramEnd"/>
-            <w:r>
-              <w:rPr>
-                <w:rFonts w:ascii="Consolas" w:hAnsi="Consolas" w:cs="Consolas"/>
-                <w:sz w:val="18"/>
-                <w:lang w:val="es-ES"/>
-              </w:rPr>
-              <w:t>(); // cualquier error -&gt; se revierte TODO</w:t>
+              <w:t xml:space="preserve">        tran.Rollback(); // cualquier error -&gt; se revierte TODO</w:t>
             </w:r>
           </w:p>
           <w:p>
@@ -12090,7 +11077,6 @@
             <w:pPr>
               <w:spacing w:before="40" w:after="40"/>
             </w:pPr>
-            <w:proofErr w:type="spellStart"/>
             <w:r>
               <w:rPr>
                 <w:rFonts w:ascii="Calibri" w:hAnsi="Calibri" w:cs="Calibri"/>
@@ -12100,7 +11086,6 @@
               </w:rPr>
               <w:t>Módulo</w:t>
             </w:r>
-            <w:proofErr w:type="spellEnd"/>
           </w:p>
         </w:tc>
         <w:tc>
@@ -12189,23 +11174,13 @@
             <w:pPr>
               <w:spacing w:before="40" w:after="40" w:line="264" w:lineRule="auto"/>
             </w:pPr>
-            <w:proofErr w:type="spellStart"/>
             <w:r>
               <w:rPr>
                 <w:rFonts w:cs="Cambria"/>
                 <w:b/>
                 <w:sz w:val="20"/>
               </w:rPr>
-              <w:t>Menú</w:t>
-            </w:r>
-            <w:proofErr w:type="spellEnd"/>
-            <w:r>
-              <w:rPr>
-                <w:rFonts w:cs="Cambria"/>
-                <w:b/>
-                <w:sz w:val="20"/>
-              </w:rPr>
-              <w:t xml:space="preserve"> principal</w:t>
+              <w:t>Menú principal</w:t>
             </w:r>
           </w:p>
         </w:tc>
@@ -12248,34 +11223,14 @@
             <w:pPr>
               <w:spacing w:before="40" w:after="40" w:line="264" w:lineRule="auto"/>
             </w:pPr>
-            <w:proofErr w:type="spellStart"/>
             <w:r>
               <w:rPr>
                 <w:rFonts w:cs="Cambria"/>
                 <w:b/>
                 <w:sz w:val="20"/>
               </w:rPr>
-              <w:t>Clientes</w:t>
-            </w:r>
-            <w:proofErr w:type="spellEnd"/>
-            <w:r>
-              <w:rPr>
-                <w:rFonts w:cs="Cambria"/>
-                <w:b/>
-                <w:sz w:val="20"/>
-              </w:rPr>
-              <w:t xml:space="preserve"> / </w:t>
-            </w:r>
-            <w:proofErr w:type="spellStart"/>
-            <w:r>
-              <w:rPr>
-                <w:rFonts w:cs="Cambria"/>
-                <w:b/>
-                <w:sz w:val="20"/>
-              </w:rPr>
-              <w:t>Proveedores</w:t>
-            </w:r>
-            <w:proofErr w:type="spellEnd"/>
+              <w:t>Clientes / Proveedores</w:t>
+            </w:r>
           </w:p>
         </w:tc>
         <w:tc>
@@ -12317,7 +11272,6 @@
             <w:pPr>
               <w:spacing w:before="40" w:after="40" w:line="264" w:lineRule="auto"/>
             </w:pPr>
-            <w:proofErr w:type="spellStart"/>
             <w:r>
               <w:rPr>
                 <w:rFonts w:cs="Cambria"/>
@@ -12326,7 +11280,6 @@
               </w:rPr>
               <w:t>Productos</w:t>
             </w:r>
-            <w:proofErr w:type="spellEnd"/>
           </w:p>
         </w:tc>
         <w:tc>
@@ -12368,34 +11321,14 @@
             <w:pPr>
               <w:spacing w:before="40" w:after="40" w:line="264" w:lineRule="auto"/>
             </w:pPr>
-            <w:proofErr w:type="spellStart"/>
             <w:r>
               <w:rPr>
                 <w:rFonts w:cs="Cambria"/>
                 <w:b/>
                 <w:sz w:val="20"/>
               </w:rPr>
-              <w:t>Empleados</w:t>
-            </w:r>
-            <w:proofErr w:type="spellEnd"/>
-            <w:r>
-              <w:rPr>
-                <w:rFonts w:cs="Cambria"/>
-                <w:b/>
-                <w:sz w:val="20"/>
-              </w:rPr>
-              <w:t xml:space="preserve"> / </w:t>
-            </w:r>
-            <w:proofErr w:type="spellStart"/>
-            <w:r>
-              <w:rPr>
-                <w:rFonts w:cs="Cambria"/>
-                <w:b/>
-                <w:sz w:val="20"/>
-              </w:rPr>
-              <w:t>Usuarios</w:t>
-            </w:r>
-            <w:proofErr w:type="spellEnd"/>
+              <w:t>Empleados / Usuarios</w:t>
+            </w:r>
           </w:p>
         </w:tc>
         <w:tc>
@@ -12437,7 +11370,6 @@
             <w:pPr>
               <w:spacing w:before="40" w:after="40" w:line="264" w:lineRule="auto"/>
             </w:pPr>
-            <w:proofErr w:type="spellStart"/>
             <w:r>
               <w:rPr>
                 <w:rFonts w:cs="Cambria"/>
@@ -12446,7 +11378,6 @@
               </w:rPr>
               <w:t>Facturación</w:t>
             </w:r>
-            <w:proofErr w:type="spellEnd"/>
           </w:p>
         </w:tc>
         <w:tc>
@@ -12488,7 +11419,6 @@
             <w:pPr>
               <w:spacing w:before="40" w:after="40" w:line="264" w:lineRule="auto"/>
             </w:pPr>
-            <w:proofErr w:type="spellStart"/>
             <w:r>
               <w:rPr>
                 <w:rFonts w:cs="Cambria"/>
@@ -12497,7 +11427,6 @@
               </w:rPr>
               <w:t>Cobros</w:t>
             </w:r>
-            <w:proofErr w:type="spellEnd"/>
           </w:p>
         </w:tc>
         <w:tc>
@@ -12539,7 +11468,6 @@
             <w:pPr>
               <w:spacing w:before="40" w:after="40" w:line="264" w:lineRule="auto"/>
             </w:pPr>
-            <w:proofErr w:type="spellStart"/>
             <w:r>
               <w:rPr>
                 <w:rFonts w:cs="Cambria"/>
@@ -12548,7 +11476,6 @@
               </w:rPr>
               <w:t>Compras</w:t>
             </w:r>
-            <w:proofErr w:type="spellEnd"/>
           </w:p>
         </w:tc>
         <w:tc>
@@ -12654,7 +11581,6 @@
         <w:keepNext/>
         <w:spacing w:before="240" w:after="80"/>
       </w:pPr>
-      <w:proofErr w:type="gramStart"/>
       <w:r>
         <w:rPr>
           <w:rFonts w:ascii="Calibri" w:hAnsi="Calibri" w:cs="Calibri"/>
@@ -12663,48 +11589,7 @@
           <w:sz w:val="24"/>
         </w:rPr>
         <w:lastRenderedPageBreak/>
-        <w:t xml:space="preserve">7.1  </w:t>
-      </w:r>
-      <w:proofErr w:type="spellStart"/>
-      <w:r>
-        <w:rPr>
-          <w:rFonts w:ascii="Calibri" w:hAnsi="Calibri" w:cs="Calibri"/>
-          <w:b/>
-          <w:color w:val="126882"/>
-          <w:sz w:val="24"/>
-        </w:rPr>
-        <w:t>Pantalla</w:t>
-      </w:r>
-      <w:proofErr w:type="spellEnd"/>
-      <w:proofErr w:type="gramEnd"/>
-      <w:r>
-        <w:rPr>
-          <w:rFonts w:ascii="Calibri" w:hAnsi="Calibri" w:cs="Calibri"/>
-          <w:b/>
-          <w:color w:val="126882"/>
-          <w:sz w:val="24"/>
-        </w:rPr>
-        <w:t xml:space="preserve"> de </w:t>
-      </w:r>
-      <w:proofErr w:type="spellStart"/>
-      <w:r>
-        <w:rPr>
-          <w:rFonts w:ascii="Calibri" w:hAnsi="Calibri" w:cs="Calibri"/>
-          <w:b/>
-          <w:color w:val="126882"/>
-          <w:sz w:val="24"/>
-        </w:rPr>
-        <w:t>inicio</w:t>
-      </w:r>
-      <w:proofErr w:type="spellEnd"/>
-      <w:r>
-        <w:rPr>
-          <w:rFonts w:ascii="Calibri" w:hAnsi="Calibri" w:cs="Calibri"/>
-          <w:b/>
-          <w:color w:val="126882"/>
-          <w:sz w:val="24"/>
-        </w:rPr>
-        <w:t xml:space="preserve"> de sesión</w:t>
+        <w:t>7.1  Pantalla de inicio de sesión</w:t>
       </w:r>
     </w:p>
     <w:p>
@@ -12778,7 +11663,6 @@
         <w:keepNext/>
         <w:spacing w:before="240" w:after="80"/>
       </w:pPr>
-      <w:proofErr w:type="gramStart"/>
       <w:r>
         <w:rPr>
           <w:rFonts w:ascii="Calibri" w:hAnsi="Calibri" w:cs="Calibri"/>
@@ -12786,28 +11670,7 @@
           <w:color w:val="126882"/>
           <w:sz w:val="24"/>
         </w:rPr>
-        <w:t xml:space="preserve">7.2  </w:t>
-      </w:r>
-      <w:proofErr w:type="spellStart"/>
-      <w:r>
-        <w:rPr>
-          <w:rFonts w:ascii="Calibri" w:hAnsi="Calibri" w:cs="Calibri"/>
-          <w:b/>
-          <w:color w:val="126882"/>
-          <w:sz w:val="24"/>
-        </w:rPr>
-        <w:t>Menú</w:t>
-      </w:r>
-      <w:proofErr w:type="spellEnd"/>
-      <w:proofErr w:type="gramEnd"/>
-      <w:r>
-        <w:rPr>
-          <w:rFonts w:ascii="Calibri" w:hAnsi="Calibri" w:cs="Calibri"/>
-          <w:b/>
-          <w:color w:val="126882"/>
-          <w:sz w:val="24"/>
-        </w:rPr>
-        <w:t xml:space="preserve"> principal</w:t>
+        <w:t>7.2  Menú principal</w:t>
       </w:r>
     </w:p>
     <w:p>
@@ -12881,7 +11744,6 @@
         <w:keepNext/>
         <w:spacing w:before="240" w:after="80"/>
       </w:pPr>
-      <w:proofErr w:type="gramStart"/>
       <w:r>
         <w:rPr>
           <w:rFonts w:ascii="Calibri" w:hAnsi="Calibri" w:cs="Calibri"/>
@@ -12890,40 +11752,8 @@
           <w:sz w:val="24"/>
         </w:rPr>
         <w:lastRenderedPageBreak/>
-        <w:t xml:space="preserve">7.3  </w:t>
-      </w:r>
-      <w:proofErr w:type="spellStart"/>
-      <w:r>
-        <w:rPr>
-          <w:rFonts w:ascii="Calibri" w:hAnsi="Calibri" w:cs="Calibri"/>
-          <w:b/>
-          <w:color w:val="126882"/>
-          <w:sz w:val="24"/>
-        </w:rPr>
-        <w:t>Mantenimiento</w:t>
-      </w:r>
-      <w:proofErr w:type="spellEnd"/>
-      <w:proofErr w:type="gramEnd"/>
-      <w:r>
-        <w:rPr>
-          <w:rFonts w:ascii="Calibri" w:hAnsi="Calibri" w:cs="Calibri"/>
-          <w:b/>
-          <w:color w:val="126882"/>
-          <w:sz w:val="24"/>
-        </w:rPr>
-        <w:t xml:space="preserve"> de </w:t>
-      </w:r>
-      <w:proofErr w:type="spellStart"/>
-      <w:r>
-        <w:rPr>
-          <w:rFonts w:ascii="Calibri" w:hAnsi="Calibri" w:cs="Calibri"/>
-          <w:b/>
-          <w:color w:val="126882"/>
-          <w:sz w:val="24"/>
-        </w:rPr>
-        <w:t>Clientes</w:t>
-      </w:r>
-      <w:proofErr w:type="spellEnd"/>
+        <w:t>7.3  Mantenimiento de Clientes</w:t>
+      </w:r>
     </w:p>
     <w:p>
       <w:pPr>
@@ -12996,7 +11826,6 @@
         <w:keepNext/>
         <w:spacing w:before="240" w:after="80"/>
       </w:pPr>
-      <w:proofErr w:type="gramStart"/>
       <w:r>
         <w:rPr>
           <w:rFonts w:ascii="Calibri" w:hAnsi="Calibri" w:cs="Calibri"/>
@@ -13004,40 +11833,8 @@
           <w:color w:val="126882"/>
           <w:sz w:val="24"/>
         </w:rPr>
-        <w:t xml:space="preserve">7.4  </w:t>
-      </w:r>
-      <w:proofErr w:type="spellStart"/>
-      <w:r>
-        <w:rPr>
-          <w:rFonts w:ascii="Calibri" w:hAnsi="Calibri" w:cs="Calibri"/>
-          <w:b/>
-          <w:color w:val="126882"/>
-          <w:sz w:val="24"/>
-        </w:rPr>
-        <w:t>Productos</w:t>
-      </w:r>
-      <w:proofErr w:type="spellEnd"/>
-      <w:proofErr w:type="gramEnd"/>
-      <w:r>
-        <w:rPr>
-          <w:rFonts w:ascii="Calibri" w:hAnsi="Calibri" w:cs="Calibri"/>
-          <w:b/>
-          <w:color w:val="126882"/>
-          <w:sz w:val="24"/>
-        </w:rPr>
-        <w:t xml:space="preserve"> y </w:t>
-      </w:r>
-      <w:proofErr w:type="spellStart"/>
-      <w:r>
-        <w:rPr>
-          <w:rFonts w:ascii="Calibri" w:hAnsi="Calibri" w:cs="Calibri"/>
-          <w:b/>
-          <w:color w:val="126882"/>
-          <w:sz w:val="24"/>
-        </w:rPr>
-        <w:t>Servicios</w:t>
-      </w:r>
-      <w:proofErr w:type="spellEnd"/>
+        <w:t>7.4  Productos y Servicios</w:t>
+      </w:r>
     </w:p>
     <w:p>
       <w:pPr>
@@ -13110,7 +11907,6 @@
         <w:keepNext/>
         <w:spacing w:before="240" w:after="80"/>
       </w:pPr>
-      <w:proofErr w:type="gramStart"/>
       <w:r>
         <w:rPr>
           <w:rFonts w:ascii="Calibri" w:hAnsi="Calibri" w:cs="Calibri"/>
@@ -13119,20 +11915,8 @@
           <w:sz w:val="24"/>
         </w:rPr>
         <w:lastRenderedPageBreak/>
-        <w:t xml:space="preserve">7.5  </w:t>
-      </w:r>
-      <w:proofErr w:type="spellStart"/>
-      <w:r>
-        <w:rPr>
-          <w:rFonts w:ascii="Calibri" w:hAnsi="Calibri" w:cs="Calibri"/>
-          <w:b/>
-          <w:color w:val="126882"/>
-          <w:sz w:val="24"/>
-        </w:rPr>
-        <w:t>Empleados</w:t>
-      </w:r>
-      <w:proofErr w:type="spellEnd"/>
-      <w:proofErr w:type="gramEnd"/>
+        <w:t>7.5  Empleados</w:t>
+      </w:r>
     </w:p>
     <w:p>
       <w:pPr>
@@ -13205,7 +11989,6 @@
         <w:keepNext/>
         <w:spacing w:before="240" w:after="80"/>
       </w:pPr>
-      <w:proofErr w:type="gramStart"/>
       <w:r>
         <w:rPr>
           <w:rFonts w:ascii="Calibri" w:hAnsi="Calibri" w:cs="Calibri"/>
@@ -13213,20 +11996,8 @@
           <w:color w:val="126882"/>
           <w:sz w:val="24"/>
         </w:rPr>
-        <w:t xml:space="preserve">7.6  </w:t>
-      </w:r>
-      <w:proofErr w:type="spellStart"/>
-      <w:r>
-        <w:rPr>
-          <w:rFonts w:ascii="Calibri" w:hAnsi="Calibri" w:cs="Calibri"/>
-          <w:b/>
-          <w:color w:val="126882"/>
-          <w:sz w:val="24"/>
-        </w:rPr>
-        <w:t>Proveedores</w:t>
-      </w:r>
-      <w:proofErr w:type="spellEnd"/>
-      <w:proofErr w:type="gramEnd"/>
+        <w:t>7.6  Proveedores</w:t>
+      </w:r>
     </w:p>
     <w:p>
       <w:pPr>
@@ -13299,7 +12070,6 @@
         <w:keepNext/>
         <w:spacing w:before="240" w:after="80"/>
       </w:pPr>
-      <w:proofErr w:type="gramStart"/>
       <w:r>
         <w:rPr>
           <w:rFonts w:ascii="Calibri" w:hAnsi="Calibri" w:cs="Calibri"/>
@@ -13308,20 +12078,8 @@
           <w:sz w:val="24"/>
         </w:rPr>
         <w:lastRenderedPageBreak/>
-        <w:t xml:space="preserve">7.7  </w:t>
-      </w:r>
-      <w:proofErr w:type="spellStart"/>
-      <w:r>
-        <w:rPr>
-          <w:rFonts w:ascii="Calibri" w:hAnsi="Calibri" w:cs="Calibri"/>
-          <w:b/>
-          <w:color w:val="126882"/>
-          <w:sz w:val="24"/>
-        </w:rPr>
-        <w:t>Usuarios</w:t>
-      </w:r>
-      <w:proofErr w:type="spellEnd"/>
-      <w:proofErr w:type="gramEnd"/>
+        <w:t>7.7  Usuarios</w:t>
+      </w:r>
     </w:p>
     <w:p>
       <w:pPr>
@@ -13394,7 +12152,6 @@
         <w:keepNext/>
         <w:spacing w:before="240" w:after="80"/>
       </w:pPr>
-      <w:proofErr w:type="gramStart"/>
       <w:r>
         <w:rPr>
           <w:rFonts w:ascii="Calibri" w:hAnsi="Calibri" w:cs="Calibri"/>
@@ -13402,40 +12159,8 @@
           <w:color w:val="126882"/>
           <w:sz w:val="24"/>
         </w:rPr>
-        <w:t xml:space="preserve">7.8  </w:t>
-      </w:r>
-      <w:proofErr w:type="spellStart"/>
-      <w:r>
-        <w:rPr>
-          <w:rFonts w:ascii="Calibri" w:hAnsi="Calibri" w:cs="Calibri"/>
-          <w:b/>
-          <w:color w:val="126882"/>
-          <w:sz w:val="24"/>
-        </w:rPr>
-        <w:t>Facturación</w:t>
-      </w:r>
-      <w:proofErr w:type="spellEnd"/>
-      <w:proofErr w:type="gramEnd"/>
-      <w:r>
-        <w:rPr>
-          <w:rFonts w:ascii="Calibri" w:hAnsi="Calibri" w:cs="Calibri"/>
-          <w:b/>
-          <w:color w:val="126882"/>
-          <w:sz w:val="24"/>
-        </w:rPr>
-        <w:t xml:space="preserve"> — </w:t>
-      </w:r>
-      <w:proofErr w:type="spellStart"/>
-      <w:r>
-        <w:rPr>
-          <w:rFonts w:ascii="Calibri" w:hAnsi="Calibri" w:cs="Calibri"/>
-          <w:b/>
-          <w:color w:val="126882"/>
-          <w:sz w:val="24"/>
-        </w:rPr>
-        <w:t>listado</w:t>
-      </w:r>
-      <w:proofErr w:type="spellEnd"/>
+        <w:t>7.8  Facturación — listado</w:t>
+      </w:r>
     </w:p>
     <w:p>
       <w:pPr>
@@ -13508,7 +12233,6 @@
         <w:keepNext/>
         <w:spacing w:before="240" w:after="80"/>
       </w:pPr>
-      <w:proofErr w:type="gramStart"/>
       <w:r>
         <w:rPr>
           <w:rFonts w:ascii="Calibri" w:hAnsi="Calibri" w:cs="Calibri"/>
@@ -13517,17 +12241,7 @@
           <w:sz w:val="24"/>
         </w:rPr>
         <w:lastRenderedPageBreak/>
-        <w:t>7.9  Nueva</w:t>
-      </w:r>
-      <w:proofErr w:type="gramEnd"/>
-      <w:r>
-        <w:rPr>
-          <w:rFonts w:ascii="Calibri" w:hAnsi="Calibri" w:cs="Calibri"/>
-          <w:b/>
-          <w:color w:val="126882"/>
-          <w:sz w:val="24"/>
-        </w:rPr>
-        <w:t xml:space="preserve"> factura</w:t>
+        <w:t>7.9  Nueva factura</w:t>
       </w:r>
     </w:p>
     <w:p>
@@ -13601,7 +12315,6 @@
         <w:keepNext/>
         <w:spacing w:before="240" w:after="80"/>
       </w:pPr>
-      <w:proofErr w:type="gramStart"/>
       <w:r>
         <w:rPr>
           <w:rFonts w:ascii="Calibri" w:hAnsi="Calibri" w:cs="Calibri"/>
@@ -13609,29 +12322,8 @@
           <w:color w:val="126882"/>
           <w:sz w:val="24"/>
         </w:rPr>
-        <w:t>7.10  Registro</w:t>
-      </w:r>
-      <w:proofErr w:type="gramEnd"/>
-      <w:r>
-        <w:rPr>
-          <w:rFonts w:ascii="Calibri" w:hAnsi="Calibri" w:cs="Calibri"/>
-          <w:b/>
-          <w:color w:val="126882"/>
-          <w:sz w:val="24"/>
-        </w:rPr>
-        <w:t xml:space="preserve"> de </w:t>
-      </w:r>
-      <w:proofErr w:type="spellStart"/>
-      <w:r>
-        <w:rPr>
-          <w:rFonts w:ascii="Calibri" w:hAnsi="Calibri" w:cs="Calibri"/>
-          <w:b/>
-          <w:color w:val="126882"/>
-          <w:sz w:val="24"/>
-        </w:rPr>
-        <w:t>cobros</w:t>
-      </w:r>
-      <w:proofErr w:type="spellEnd"/>
+        <w:t>7.10  Registro de cobros</w:t>
+      </w:r>
     </w:p>
     <w:p>
       <w:pPr>
@@ -13704,7 +12396,6 @@
         <w:keepNext/>
         <w:spacing w:before="240" w:after="80"/>
       </w:pPr>
-      <w:proofErr w:type="gramStart"/>
       <w:r>
         <w:rPr>
           <w:rFonts w:ascii="Calibri" w:hAnsi="Calibri" w:cs="Calibri"/>
@@ -13713,40 +12404,8 @@
           <w:sz w:val="24"/>
         </w:rPr>
         <w:lastRenderedPageBreak/>
-        <w:t xml:space="preserve">7.11  </w:t>
-      </w:r>
-      <w:proofErr w:type="spellStart"/>
-      <w:r>
-        <w:rPr>
-          <w:rFonts w:ascii="Calibri" w:hAnsi="Calibri" w:cs="Calibri"/>
-          <w:b/>
-          <w:color w:val="126882"/>
-          <w:sz w:val="24"/>
-        </w:rPr>
-        <w:t>Compras</w:t>
-      </w:r>
-      <w:proofErr w:type="spellEnd"/>
-      <w:proofErr w:type="gramEnd"/>
-      <w:r>
-        <w:rPr>
-          <w:rFonts w:ascii="Calibri" w:hAnsi="Calibri" w:cs="Calibri"/>
-          <w:b/>
-          <w:color w:val="126882"/>
-          <w:sz w:val="24"/>
-        </w:rPr>
-        <w:t xml:space="preserve"> — </w:t>
-      </w:r>
-      <w:proofErr w:type="spellStart"/>
-      <w:r>
-        <w:rPr>
-          <w:rFonts w:ascii="Calibri" w:hAnsi="Calibri" w:cs="Calibri"/>
-          <w:b/>
-          <w:color w:val="126882"/>
-          <w:sz w:val="24"/>
-        </w:rPr>
-        <w:t>listado</w:t>
-      </w:r>
-      <w:proofErr w:type="spellEnd"/>
+        <w:t>7.11  Compras — listado</w:t>
+      </w:r>
     </w:p>
     <w:p>
       <w:pPr>
@@ -13819,7 +12478,6 @@
         <w:keepNext/>
         <w:spacing w:before="240" w:after="80"/>
       </w:pPr>
-      <w:proofErr w:type="gramStart"/>
       <w:r>
         <w:rPr>
           <w:rFonts w:ascii="Calibri" w:hAnsi="Calibri" w:cs="Calibri"/>
@@ -13827,29 +12485,8 @@
           <w:color w:val="126882"/>
           <w:sz w:val="24"/>
         </w:rPr>
-        <w:t>7.12  Nueva</w:t>
-      </w:r>
-      <w:proofErr w:type="gramEnd"/>
-      <w:r>
-        <w:rPr>
-          <w:rFonts w:ascii="Calibri" w:hAnsi="Calibri" w:cs="Calibri"/>
-          <w:b/>
-          <w:color w:val="126882"/>
-          <w:sz w:val="24"/>
-        </w:rPr>
-        <w:t xml:space="preserve"> </w:t>
-      </w:r>
-      <w:proofErr w:type="spellStart"/>
-      <w:r>
-        <w:rPr>
-          <w:rFonts w:ascii="Calibri" w:hAnsi="Calibri" w:cs="Calibri"/>
-          <w:b/>
-          <w:color w:val="126882"/>
-          <w:sz w:val="24"/>
-        </w:rPr>
-        <w:t>compra</w:t>
-      </w:r>
-      <w:proofErr w:type="spellEnd"/>
+        <w:t>7.12  Nueva compra</w:t>
+      </w:r>
     </w:p>
     <w:p>
       <w:pPr>
@@ -13922,7 +12559,6 @@
         <w:keepNext/>
         <w:spacing w:before="240" w:after="80"/>
       </w:pPr>
-      <w:proofErr w:type="gramStart"/>
       <w:r>
         <w:rPr>
           <w:rFonts w:ascii="Calibri" w:hAnsi="Calibri" w:cs="Calibri"/>
@@ -13931,29 +12567,8 @@
           <w:sz w:val="24"/>
         </w:rPr>
         <w:lastRenderedPageBreak/>
-        <w:t>7.13  Registro</w:t>
-      </w:r>
-      <w:proofErr w:type="gramEnd"/>
-      <w:r>
-        <w:rPr>
-          <w:rFonts w:ascii="Calibri" w:hAnsi="Calibri" w:cs="Calibri"/>
-          <w:b/>
-          <w:color w:val="126882"/>
-          <w:sz w:val="24"/>
-        </w:rPr>
-        <w:t xml:space="preserve"> de </w:t>
-      </w:r>
-      <w:proofErr w:type="spellStart"/>
-      <w:r>
-        <w:rPr>
-          <w:rFonts w:ascii="Calibri" w:hAnsi="Calibri" w:cs="Calibri"/>
-          <w:b/>
-          <w:color w:val="126882"/>
-          <w:sz w:val="24"/>
-        </w:rPr>
-        <w:t>pagos</w:t>
-      </w:r>
-      <w:proofErr w:type="spellEnd"/>
+        <w:t>7.13  Registro de pagos</w:t>
+      </w:r>
     </w:p>
     <w:p>
       <w:pPr>
@@ -14089,23 +12704,7 @@
           <w:rFonts w:cs="Cambria"/>
           <w:lang w:val="es-ES"/>
         </w:rPr>
-        <w:t>Campos obligatorios, formatos numéricos (precio, monto, stock), formato de correo y cantidades y montos positivos. Están centralizadas en la clase Negocio/</w:t>
-      </w:r>
-      <w:proofErr w:type="spellStart"/>
-      <w:r>
-        <w:rPr>
-          <w:rFonts w:cs="Cambria"/>
-          <w:lang w:val="es-ES"/>
-        </w:rPr>
-        <w:t>Validaciones.cs</w:t>
-      </w:r>
-      <w:proofErr w:type="spellEnd"/>
-      <w:r>
-        <w:rPr>
-          <w:rFonts w:cs="Cambria"/>
-          <w:lang w:val="es-ES"/>
-        </w:rPr>
-        <w:t>.</w:t>
+        <w:t>Campos obligatorios, formatos numéricos (precio, monto, stock), formato de correo y cantidades y montos positivos. Están centralizadas en la clase Negocio/Validaciones.cs.</w:t>
       </w:r>
     </w:p>
     <w:p>
@@ -14138,23 +12737,7 @@
           <w:rFonts w:cs="Cambria"/>
           <w:lang w:val="es-ES"/>
         </w:rPr>
-        <w:t xml:space="preserve">Una excepción propia, </w:t>
-      </w:r>
-      <w:proofErr w:type="spellStart"/>
-      <w:r>
-        <w:rPr>
-          <w:rFonts w:cs="Cambria"/>
-          <w:lang w:val="es-ES"/>
-        </w:rPr>
-        <w:t>NegocioException</w:t>
-      </w:r>
-      <w:proofErr w:type="spellEnd"/>
-      <w:r>
-        <w:rPr>
-          <w:rFonts w:cs="Cambria"/>
-          <w:lang w:val="es-ES"/>
-        </w:rPr>
-        <w:t>, distingue los errores esperados (dato inválido, stock insuficiente, monto mayor al saldo, crédito excedido) de los fallos del sistema; al usuario se le muestran como advertencias amigables.</w:t>
+        <w:t>Una excepción propia, NegocioException, distingue los errores esperados (dato inválido, stock insuficiente, monto mayor al saldo, crédito excedido) de los fallos del sistema; al usuario se le muestran como advertencias amigables.</w:t>
       </w:r>
     </w:p>
     <w:p>
@@ -14187,23 +12770,7 @@
           <w:rFonts w:cs="Cambria"/>
           <w:lang w:val="es-ES"/>
         </w:rPr>
-        <w:t xml:space="preserve">Se capturan con try/catch mostrando un mensaje claro sin cerrar la aplicación. Además, </w:t>
-      </w:r>
-      <w:proofErr w:type="spellStart"/>
-      <w:r>
-        <w:rPr>
-          <w:rFonts w:cs="Cambria"/>
-          <w:lang w:val="es-ES"/>
-        </w:rPr>
-        <w:t>Program.cs</w:t>
-      </w:r>
-      <w:proofErr w:type="spellEnd"/>
-      <w:r>
-        <w:rPr>
-          <w:rFonts w:cs="Cambria"/>
-          <w:lang w:val="es-ES"/>
-        </w:rPr>
-        <w:t xml:space="preserve"> instala un manejador global para cualquier error no controlado.</w:t>
+        <w:t>Se capturan con try/catch mostrando un mensaje claro sin cerrar la aplicación. Además, Program.cs instala un manejador global para cualquier error no controlado.</w:t>
       </w:r>
     </w:p>
     <w:p>
@@ -14236,23 +12803,7 @@
           <w:rFonts w:cs="Cambria"/>
           <w:lang w:val="es-ES"/>
         </w:rPr>
-        <w:t>Se almacenan con hash SHA-256 (Negocio/</w:t>
-      </w:r>
-      <w:proofErr w:type="spellStart"/>
-      <w:r>
-        <w:rPr>
-          <w:rFonts w:cs="Cambria"/>
-          <w:lang w:val="es-ES"/>
-        </w:rPr>
-        <w:t>Seguridad.cs</w:t>
-      </w:r>
-      <w:proofErr w:type="spellEnd"/>
-      <w:r>
-        <w:rPr>
-          <w:rFonts w:cs="Cambria"/>
-          <w:lang w:val="es-ES"/>
-        </w:rPr>
-        <w:t>), nunca en texto plano; al iniciar sesión se comparan los hashes.</w:t>
+        <w:t>Se almacenan con hash SHA-256 (Negocio/Seguridad.cs), nunca en texto plano; al iniciar sesión se comparan los hashes.</w:t>
       </w:r>
     </w:p>
     <w:p>
@@ -14382,39 +12933,7 @@
           <w:rFonts w:cs="Cambria"/>
           <w:lang w:val="es-ES"/>
         </w:rPr>
-        <w:t xml:space="preserve">Instalar SQL Server (sirve cualquier edición: Express, </w:t>
-      </w:r>
-      <w:proofErr w:type="spellStart"/>
-      <w:r>
-        <w:rPr>
-          <w:rFonts w:cs="Cambria"/>
-          <w:lang w:val="es-ES"/>
-        </w:rPr>
-        <w:t>Developer</w:t>
-      </w:r>
-      <w:proofErr w:type="spellEnd"/>
-      <w:r>
-        <w:rPr>
-          <w:rFonts w:cs="Cambria"/>
-          <w:lang w:val="es-ES"/>
-        </w:rPr>
-        <w:t xml:space="preserve"> o </w:t>
-      </w:r>
-      <w:proofErr w:type="spellStart"/>
-      <w:r>
-        <w:rPr>
-          <w:rFonts w:cs="Cambria"/>
-          <w:lang w:val="es-ES"/>
-        </w:rPr>
-        <w:t>LocalDB</w:t>
-      </w:r>
-      <w:proofErr w:type="spellEnd"/>
-      <w:r>
-        <w:rPr>
-          <w:rFonts w:cs="Cambria"/>
-          <w:lang w:val="es-ES"/>
-        </w:rPr>
-        <w:t>).</w:t>
+        <w:t>Instalar SQL Server (sirve cualquier edición: Express, Developer o LocalDB).</w:t>
       </w:r>
     </w:p>
     <w:p>
@@ -14439,39 +12958,7 @@
           <w:rFonts w:cs="Cambria"/>
           <w:lang w:val="es-ES"/>
         </w:rPr>
-        <w:t xml:space="preserve">Ejecutar, en este orden, los scripts </w:t>
-      </w:r>
-      <w:proofErr w:type="spellStart"/>
-      <w:r>
-        <w:rPr>
-          <w:rFonts w:cs="Cambria"/>
-          <w:lang w:val="es-ES"/>
-        </w:rPr>
-        <w:t>Database</w:t>
-      </w:r>
-      <w:proofErr w:type="spellEnd"/>
-      <w:r>
-        <w:rPr>
-          <w:rFonts w:cs="Cambria"/>
-          <w:lang w:val="es-ES"/>
-        </w:rPr>
-        <w:t xml:space="preserve">/01_CrearBaseDatos.sql y </w:t>
-      </w:r>
-      <w:proofErr w:type="spellStart"/>
-      <w:r>
-        <w:rPr>
-          <w:rFonts w:cs="Cambria"/>
-          <w:lang w:val="es-ES"/>
-        </w:rPr>
-        <w:t>Database</w:t>
-      </w:r>
-      <w:proofErr w:type="spellEnd"/>
-      <w:r>
-        <w:rPr>
-          <w:rFonts w:cs="Cambria"/>
-          <w:lang w:val="es-ES"/>
-        </w:rPr>
-        <w:t>/02_DatosPrueba.sql.</w:t>
+        <w:t>Ejecutar, en este orden, los scripts Database/01_CrearBaseDatos.sql y Database/02_DatosPrueba.sql.</w:t>
       </w:r>
     </w:p>
     <w:p>
@@ -14496,23 +12983,7 @@
           <w:rFonts w:cs="Cambria"/>
           <w:lang w:val="es-ES"/>
         </w:rPr>
-        <w:t xml:space="preserve">Ajustar la cadena de conexión en </w:t>
-      </w:r>
-      <w:proofErr w:type="spellStart"/>
-      <w:r>
-        <w:rPr>
-          <w:rFonts w:cs="Cambria"/>
-          <w:lang w:val="es-ES"/>
-        </w:rPr>
-        <w:t>App.config</w:t>
-      </w:r>
-      <w:proofErr w:type="spellEnd"/>
-      <w:r>
-        <w:rPr>
-          <w:rFonts w:cs="Cambria"/>
-          <w:lang w:val="es-ES"/>
-        </w:rPr>
-        <w:t xml:space="preserve"> si la instancia de SQL Server tiene otro nombre.</w:t>
+        <w:t>Ajustar la cadena de conexión en App.config si la instancia de SQL Server tiene otro nombre.</w:t>
       </w:r>
     </w:p>
     <w:p>
@@ -14607,7 +13078,6 @@
             <w:pPr>
               <w:spacing w:before="40" w:after="40"/>
             </w:pPr>
-            <w:proofErr w:type="spellStart"/>
             <w:r>
               <w:rPr>
                 <w:rFonts w:ascii="Calibri" w:hAnsi="Calibri" w:cs="Calibri"/>
@@ -14617,7 +13087,6 @@
               </w:rPr>
               <w:t>Usuario</w:t>
             </w:r>
-            <w:proofErr w:type="spellEnd"/>
           </w:p>
         </w:tc>
         <w:tc>
@@ -14746,7 +13215,6 @@
             <w:pPr>
               <w:spacing w:before="40" w:after="40" w:line="264" w:lineRule="auto"/>
             </w:pPr>
-            <w:proofErr w:type="spellStart"/>
             <w:r>
               <w:rPr>
                 <w:rFonts w:cs="Cambria"/>
@@ -14755,7 +13223,6 @@
               </w:rPr>
               <w:t>cajero</w:t>
             </w:r>
-            <w:proofErr w:type="spellEnd"/>
           </w:p>
         </w:tc>
         <w:tc>
@@ -14866,7 +13333,6 @@
             <w:pPr>
               <w:spacing w:before="40" w:after="40"/>
             </w:pPr>
-            <w:proofErr w:type="spellStart"/>
             <w:r>
               <w:rPr>
                 <w:rFonts w:ascii="Calibri" w:hAnsi="Calibri" w:cs="Calibri"/>
@@ -14876,7 +13342,6 @@
               </w:rPr>
               <w:t>Integrante</w:t>
             </w:r>
-            <w:proofErr w:type="spellEnd"/>
           </w:p>
         </w:tc>
         <w:tc>
@@ -14989,43 +13454,7 @@
                 <w:sz w:val="19"/>
                 <w:lang w:val="es-ES"/>
               </w:rPr>
-              <w:t>Coordinó al equipo y definió la arquitectura en tres capas. Programó la capa de presentación: el punto de entrada (</w:t>
-            </w:r>
-            <w:proofErr w:type="spellStart"/>
-            <w:r>
-              <w:rPr>
-                <w:rFonts w:cs="Cambria"/>
-                <w:sz w:val="19"/>
-                <w:lang w:val="es-ES"/>
-              </w:rPr>
-              <w:t>Program.cs</w:t>
-            </w:r>
-            <w:proofErr w:type="spellEnd"/>
-            <w:r>
-              <w:rPr>
-                <w:rFonts w:cs="Cambria"/>
-                <w:sz w:val="19"/>
-                <w:lang w:val="es-ES"/>
-              </w:rPr>
-              <w:t xml:space="preserve">), los formularios de Windows </w:t>
-            </w:r>
-            <w:proofErr w:type="spellStart"/>
-            <w:r>
-              <w:rPr>
-                <w:rFonts w:cs="Cambria"/>
-                <w:sz w:val="19"/>
-                <w:lang w:val="es-ES"/>
-              </w:rPr>
-              <w:t>Forms</w:t>
-            </w:r>
-            <w:proofErr w:type="spellEnd"/>
-            <w:r>
-              <w:rPr>
-                <w:rFonts w:cs="Cambria"/>
-                <w:sz w:val="19"/>
-                <w:lang w:val="es-ES"/>
-              </w:rPr>
-              <w:t xml:space="preserve"> (inicio de sesión, menú principal, facturación, cobros, compras y pagos) y las utilidades de interfaz. Presenta el proyecto y la arquitectura general, hace la demostración e integró las capas y las pruebas del sistema.</w:t>
+              <w:t>Coordinó al equipo y definió la arquitectura en tres capas. Programó la capa de presentación: el punto de entrada (Program.cs), los formularios de Windows Forms (inicio de sesión, menú principal, facturación, cobros, compras y pagos) y las utilidades de interfaz. Presenta el proyecto y la arquitectura general, hace la demostración e integró las capas y las pruebas del sistema.</w:t>
             </w:r>
           </w:p>
         </w:tc>
@@ -15365,11 +13794,7 @@
         </w:rPr>
       </w:pPr>
       <w:r>
-        <w:rPr>
-          <w:rFonts w:cs="Cambria"/>
-          <w:lang w:val="es-ES"/>
-        </w:rPr>
-        <w:t>En este espacio se coloca el enlace al video en el que los integrantes explican y muestran la aplicación funcionando. El video debe grabarse con el rostro y la voz de los integrantes.</w:t>
+        <w:t>El video de sustentación muestra a los integrantes explicando la aplicación en funcionamiento, con su rostro y su voz, siguiendo los guiones incluidos en la carpeta Documentacion del proyecto. A continuación se indican el título y el enlace del video, junto con el repositorio público de GitHub donde está disponible el código fuente completo:</w:t>
       </w:r>
     </w:p>
     <w:tbl>
@@ -15421,16 +13846,74 @@
           <w:p>
             <w:pPr>
               <w:spacing w:after="80"/>
-              <w:jc w:val="center"/>
-            </w:pPr>
-            <w:r>
-              <w:rPr>
-                <w:rFonts w:cs="Cambria"/>
+              <w:jc w:val="left"/>
+            </w:pPr>
+            <w:r>
+              <w:rPr>
+                <w:rFonts w:cs="Cambria"/>
+                <w:b/>
                 <w:color w:val="5B6B79"/>
                 <w:sz w:val="24"/>
               </w:rPr>
-              <w:t>________________________________________________________</w:t>
-            </w:r>
+              <w:t xml:space="preserve">Título del video:  </w:t>
+            </w:r>
+            <w:r>
+              <w:rPr>
+                <w:rFonts w:cs="Cambria"/>
+                <w:color w:val="5B6B79"/>
+                <w:sz w:val="24"/>
+              </w:rPr>
+              <w:t>_____________________________________________</w:t>
+            </w:r>
+          </w:p>
+          <w:p>
+            <w:pPr>
+              <w:spacing w:after="80"/>
+              <w:jc w:val="left"/>
+            </w:pPr>
+            <w:r>
+              <w:rPr>
+                <w:rFonts w:cs="Cambria"/>
+                <w:b/>
+                <w:color w:val="5B6B79"/>
+                <w:sz w:val="24"/>
+              </w:rPr>
+              <w:t xml:space="preserve">Enlace del video (YouTube):  </w:t>
+            </w:r>
+            <w:r>
+              <w:rPr>
+                <w:rFonts w:cs="Cambria"/>
+                <w:color w:val="5B6B79"/>
+                <w:sz w:val="24"/>
+              </w:rPr>
+              <w:t>____________________________</w:t>
+            </w:r>
+          </w:p>
+          <w:p>
+            <w:pPr>
+              <w:spacing w:after="80"/>
+              <w:jc w:val="left"/>
+            </w:pPr>
+            <w:r>
+              <w:rPr>
+                <w:rFonts w:cs="Cambria"/>
+                <w:b/>
+                <w:color w:val="5B6B79"/>
+                <w:sz w:val="24"/>
+              </w:rPr>
+              <w:t xml:space="preserve">Repositorio del código fuente (GitHub):  </w:t>
+            </w:r>
+            <w:hyperlink r:id="rId21">
+              <w:r>
+                <w:rPr>
+                  <w:rFonts w:cs="Cambria"/>
+                  <w:sz w:val="24"/>
+                  <w:color w:val="0563C1"/>
+                  <w:u w:val="single"/>
+                </w:rPr>
+                <w:t xml:space="preserve">https://github.com/ElMOB04/SistemaFacturacion</w:t>
+              </w:r>
+            </w:hyperlink>
           </w:p>
         </w:tc>
       </w:tr>
@@ -15500,29 +13983,16 @@
         </w:rPr>
         <w:t xml:space="preserve">Repositorio del proyecto:  </w:t>
       </w:r>
-      <w:r>
-        <w:fldChar w:fldCharType="begin"/>
-      </w:r>
-      <w:r>
-        <w:rPr>
-          <w:lang w:val="es-ES"/>
-        </w:rPr>
-        <w:instrText>HYPERLINK "https://github.com/ElMOB04/SistemaFacturacion" \h</w:instrText>
-      </w:r>
-      <w:r>
-        <w:fldChar w:fldCharType="separate"/>
-      </w:r>
-      <w:r>
-        <w:rPr>
-          <w:color w:val="0563C1"/>
-          <w:u w:val="single"/>
-          <w:lang w:val="es-ES"/>
-        </w:rPr>
-        <w:t>https://github.com/ElMOB04/SistemaFacturacion</w:t>
-      </w:r>
-      <w:r>
-        <w:fldChar w:fldCharType="end"/>
-      </w:r>
+      <w:hyperlink r:id="rId21">
+        <w:r>
+          <w:rPr>
+            <w:color w:val="0563C1"/>
+            <w:u w:val="single"/>
+            <w:lang w:val="es-ES"/>
+          </w:rPr>
+          <w:t>https://github.com/ElMOB04/SistemaFacturacion</w:t>
+        </w:r>
+      </w:hyperlink>
     </w:p>
     <w:p>
       <w:pPr>
@@ -15558,29 +14028,16 @@
         </w:rPr>
         <w:t xml:space="preserve"> — clases del dominio (Cliente, Factura, Cobro, …): </w:t>
       </w:r>
-      <w:r>
-        <w:fldChar w:fldCharType="begin"/>
-      </w:r>
-      <w:r>
-        <w:rPr>
-          <w:lang w:val="es-ES"/>
-        </w:rPr>
-        <w:instrText>HYPERLINK "https://github.com/ElMOB04/SistemaFacturacion/tree/main/Entidades" \h</w:instrText>
-      </w:r>
-      <w:r>
-        <w:fldChar w:fldCharType="separate"/>
-      </w:r>
-      <w:r>
-        <w:rPr>
-          <w:color w:val="0563C1"/>
-          <w:u w:val="single"/>
-          <w:lang w:val="es-ES"/>
-        </w:rPr>
-        <w:t>ver carpeta Entidades</w:t>
-      </w:r>
-      <w:r>
-        <w:fldChar w:fldCharType="end"/>
-      </w:r>
+      <w:hyperlink r:id="rId22">
+        <w:r>
+          <w:rPr>
+            <w:color w:val="0563C1"/>
+            <w:u w:val="single"/>
+            <w:lang w:val="es-ES"/>
+          </w:rPr>
+          <w:t>ver carpeta Entidades</w:t>
+        </w:r>
+      </w:hyperlink>
     </w:p>
     <w:p>
       <w:pPr>
@@ -15602,29 +14059,16 @@
         </w:rPr>
         <w:t xml:space="preserve"> — capa de acceso a datos con ADO.NET (ConexionBD y DAOs): </w:t>
       </w:r>
-      <w:r>
-        <w:fldChar w:fldCharType="begin"/>
-      </w:r>
-      <w:r>
-        <w:rPr>
-          <w:lang w:val="es-ES"/>
-        </w:rPr>
-        <w:instrText>HYPERLINK "https://github.com/ElMOB04/SistemaFacturacion/tree/main/DatosAcceso" \h</w:instrText>
-      </w:r>
-      <w:r>
-        <w:fldChar w:fldCharType="separate"/>
-      </w:r>
-      <w:r>
-        <w:rPr>
-          <w:color w:val="0563C1"/>
-          <w:u w:val="single"/>
-          <w:lang w:val="es-ES"/>
-        </w:rPr>
-        <w:t>ver carpeta DatosAcceso</w:t>
-      </w:r>
-      <w:r>
-        <w:fldChar w:fldCharType="end"/>
-      </w:r>
+      <w:hyperlink r:id="rId23">
+        <w:r>
+          <w:rPr>
+            <w:color w:val="0563C1"/>
+            <w:u w:val="single"/>
+            <w:lang w:val="es-ES"/>
+          </w:rPr>
+          <w:t>ver carpeta DatosAcceso</w:t>
+        </w:r>
+      </w:hyperlink>
     </w:p>
     <w:p>
       <w:pPr>
@@ -15646,29 +14090,16 @@
         </w:rPr>
         <w:t xml:space="preserve"> — lógica de negocio (cálculos, saldos, validaciones, seguridad): </w:t>
       </w:r>
-      <w:r>
-        <w:fldChar w:fldCharType="begin"/>
-      </w:r>
-      <w:r>
-        <w:rPr>
-          <w:lang w:val="es-ES"/>
-        </w:rPr>
-        <w:instrText>HYPERLINK "https://github.com/ElMOB04/SistemaFacturacion/tree/main/Negocio" \h</w:instrText>
-      </w:r>
-      <w:r>
-        <w:fldChar w:fldCharType="separate"/>
-      </w:r>
-      <w:r>
-        <w:rPr>
-          <w:color w:val="0563C1"/>
-          <w:u w:val="single"/>
-          <w:lang w:val="es-ES"/>
-        </w:rPr>
-        <w:t>ver carpeta Negocio</w:t>
-      </w:r>
-      <w:r>
-        <w:fldChar w:fldCharType="end"/>
-      </w:r>
+      <w:hyperlink r:id="rId24">
+        <w:r>
+          <w:rPr>
+            <w:color w:val="0563C1"/>
+            <w:u w:val="single"/>
+            <w:lang w:val="es-ES"/>
+          </w:rPr>
+          <w:t>ver carpeta Negocio</w:t>
+        </w:r>
+      </w:hyperlink>
     </w:p>
     <w:p>
       <w:pPr>
@@ -15690,29 +14121,16 @@
         </w:rPr>
         <w:t xml:space="preserve"> — formularios Windows Forms: </w:t>
       </w:r>
-      <w:r>
-        <w:fldChar w:fldCharType="begin"/>
-      </w:r>
-      <w:r>
-        <w:rPr>
-          <w:lang w:val="es-ES"/>
-        </w:rPr>
-        <w:instrText>HYPERLINK "https://github.com/ElMOB04/SistemaFacturacion/tree/main/Presentacion" \h</w:instrText>
-      </w:r>
-      <w:r>
-        <w:fldChar w:fldCharType="separate"/>
-      </w:r>
-      <w:r>
-        <w:rPr>
-          <w:color w:val="0563C1"/>
-          <w:u w:val="single"/>
-          <w:lang w:val="es-ES"/>
-        </w:rPr>
-        <w:t>ver carpeta Presentacion</w:t>
-      </w:r>
-      <w:r>
-        <w:fldChar w:fldCharType="end"/>
-      </w:r>
+      <w:hyperlink r:id="rId25">
+        <w:r>
+          <w:rPr>
+            <w:color w:val="0563C1"/>
+            <w:u w:val="single"/>
+            <w:lang w:val="es-ES"/>
+          </w:rPr>
+          <w:t>ver carpeta Presentacion</w:t>
+        </w:r>
+      </w:hyperlink>
     </w:p>
     <w:p>
       <w:pPr>
@@ -15734,29 +14152,16 @@
         </w:rPr>
         <w:t xml:space="preserve"> — punto de entrada de la aplicación: </w:t>
       </w:r>
-      <w:r>
-        <w:fldChar w:fldCharType="begin"/>
-      </w:r>
-      <w:r>
-        <w:rPr>
-          <w:lang w:val="es-ES"/>
-        </w:rPr>
-        <w:instrText>HYPERLINK "https://github.com/ElMOB04/SistemaFacturacion/blob/main/Program.cs" \h</w:instrText>
-      </w:r>
-      <w:r>
-        <w:fldChar w:fldCharType="separate"/>
-      </w:r>
-      <w:r>
-        <w:rPr>
-          <w:color w:val="0563C1"/>
-          <w:u w:val="single"/>
-          <w:lang w:val="es-ES"/>
-        </w:rPr>
-        <w:t>ver Program.cs</w:t>
-      </w:r>
-      <w:r>
-        <w:fldChar w:fldCharType="end"/>
-      </w:r>
+      <w:hyperlink r:id="rId26">
+        <w:r>
+          <w:rPr>
+            <w:color w:val="0563C1"/>
+            <w:u w:val="single"/>
+            <w:lang w:val="es-ES"/>
+          </w:rPr>
+          <w:t>ver Program.cs</w:t>
+        </w:r>
+      </w:hyperlink>
     </w:p>
     <w:p>
       <w:pPr>
@@ -15830,29 +14235,16 @@
         </w:rPr>
         <w:t xml:space="preserve"> — crea la base de datos SistemaFacturacionDB con sus tablas, claves y relaciones: </w:t>
       </w:r>
-      <w:r>
-        <w:fldChar w:fldCharType="begin"/>
-      </w:r>
-      <w:r>
-        <w:rPr>
-          <w:lang w:val="es-ES"/>
-        </w:rPr>
-        <w:instrText>HYPERLINK "https://github.com/ElMOB04/SistemaFacturacion/blob/main/Database/01_CrearBaseDatos.sql" \h</w:instrText>
-      </w:r>
-      <w:r>
-        <w:fldChar w:fldCharType="separate"/>
-      </w:r>
-      <w:r>
-        <w:rPr>
-          <w:color w:val="0563C1"/>
-          <w:u w:val="single"/>
-          <w:lang w:val="es-ES"/>
-        </w:rPr>
-        <w:t>ver script</w:t>
-      </w:r>
-      <w:r>
-        <w:fldChar w:fldCharType="end"/>
-      </w:r>
+      <w:hyperlink r:id="rId27">
+        <w:r>
+          <w:rPr>
+            <w:color w:val="0563C1"/>
+            <w:u w:val="single"/>
+            <w:lang w:val="es-ES"/>
+          </w:rPr>
+          <w:t>ver script</w:t>
+        </w:r>
+      </w:hyperlink>
     </w:p>
     <w:p>
       <w:pPr>
@@ -15874,29 +14266,16 @@
         </w:rPr>
         <w:t xml:space="preserve"> — inserta los datos de prueba iniciales (usuarios, clientes, proveedores, productos): </w:t>
       </w:r>
-      <w:r>
-        <w:fldChar w:fldCharType="begin"/>
-      </w:r>
-      <w:r>
-        <w:rPr>
-          <w:lang w:val="es-ES"/>
-        </w:rPr>
-        <w:instrText>HYPERLINK "https://github.com/ElMOB04/SistemaFacturacion/blob/main/Database/02_DatosPrueba.sql" \h</w:instrText>
-      </w:r>
-      <w:r>
-        <w:fldChar w:fldCharType="separate"/>
-      </w:r>
-      <w:r>
-        <w:rPr>
-          <w:color w:val="0563C1"/>
-          <w:u w:val="single"/>
-          <w:lang w:val="es-ES"/>
-        </w:rPr>
-        <w:t>ver script</w:t>
-      </w:r>
-      <w:r>
-        <w:fldChar w:fldCharType="end"/>
-      </w:r>
+      <w:hyperlink r:id="rId28">
+        <w:r>
+          <w:rPr>
+            <w:color w:val="0563C1"/>
+            <w:u w:val="single"/>
+            <w:lang w:val="es-ES"/>
+          </w:rPr>
+          <w:t>ver script</w:t>
+        </w:r>
+      </w:hyperlink>
     </w:p>
     <w:p>
       <w:pPr>
@@ -15955,29 +14334,16 @@
         </w:rPr>
         <w:t xml:space="preserve"> — cadena de conexión a SQL Server: </w:t>
       </w:r>
-      <w:r>
-        <w:fldChar w:fldCharType="begin"/>
-      </w:r>
-      <w:r>
-        <w:rPr>
-          <w:lang w:val="es-ES"/>
-        </w:rPr>
-        <w:instrText>HYPERLINK "https://github.com/ElMOB04/SistemaFacturacion/blob/main/App.config" \h</w:instrText>
-      </w:r>
-      <w:r>
-        <w:fldChar w:fldCharType="separate"/>
-      </w:r>
-      <w:r>
-        <w:rPr>
-          <w:color w:val="0563C1"/>
-          <w:u w:val="single"/>
-          <w:lang w:val="es-ES"/>
-        </w:rPr>
-        <w:t>ver App.config</w:t>
-      </w:r>
-      <w:r>
-        <w:fldChar w:fldCharType="end"/>
-      </w:r>
+      <w:hyperlink r:id="rId29">
+        <w:r>
+          <w:rPr>
+            <w:color w:val="0563C1"/>
+            <w:u w:val="single"/>
+            <w:lang w:val="es-ES"/>
+          </w:rPr>
+          <w:t>ver App.config</w:t>
+        </w:r>
+      </w:hyperlink>
     </w:p>
     <w:p>
       <w:pPr>
@@ -15999,29 +14365,16 @@
         </w:rPr>
         <w:t xml:space="preserve"> — compila y ejecuta el proyecto sin necesidad de Visual Studio: </w:t>
       </w:r>
-      <w:r>
-        <w:fldChar w:fldCharType="begin"/>
-      </w:r>
-      <w:r>
-        <w:rPr>
-          <w:lang w:val="es-ES"/>
-        </w:rPr>
-        <w:instrText>HYPERLINK "https://github.com/ElMOB04/SistemaFacturacion/blob/main/Compilar.bat" \h</w:instrText>
-      </w:r>
-      <w:r>
-        <w:fldChar w:fldCharType="separate"/>
-      </w:r>
-      <w:r>
-        <w:rPr>
-          <w:color w:val="0563C1"/>
-          <w:u w:val="single"/>
-          <w:lang w:val="es-ES"/>
-        </w:rPr>
-        <w:t>ver Compilar.bat</w:t>
-      </w:r>
-      <w:r>
-        <w:fldChar w:fldCharType="end"/>
-      </w:r>
+      <w:hyperlink r:id="rId30">
+        <w:r>
+          <w:rPr>
+            <w:color w:val="0563C1"/>
+            <w:u w:val="single"/>
+            <w:lang w:val="es-ES"/>
+          </w:rPr>
+          <w:t>ver Compilar.bat</w:t>
+        </w:r>
+      </w:hyperlink>
     </w:p>
     <w:p>
       <w:pPr>
@@ -16035,40 +14388,15 @@
           <w:b/>
           <w:lang w:val="es-ES"/>
         </w:rPr>
-        <w:t xml:space="preserve">•  </w:t>
-      </w:r>
-      <w:proofErr w:type="spellStart"/>
-      <w:r>
-        <w:rPr>
-          <w:b/>
-          <w:lang w:val="es-ES"/>
-        </w:rPr>
-        <w:t>SistemaFacturacion.csproj</w:t>
-      </w:r>
-      <w:proofErr w:type="spellEnd"/>
-      <w:r>
-        <w:rPr>
-          <w:b/>
-          <w:lang w:val="es-ES"/>
-        </w:rPr>
-        <w:t xml:space="preserve"> / .</w:t>
-      </w:r>
-      <w:proofErr w:type="spellStart"/>
-      <w:r>
-        <w:rPr>
-          <w:b/>
-          <w:lang w:val="es-ES"/>
-        </w:rPr>
-        <w:t>sln</w:t>
-      </w:r>
-      <w:proofErr w:type="spellEnd"/>
+        <w:t>•  SistemaFacturacion.csproj / .sln</w:t>
+      </w:r>
       <w:r>
         <w:rPr>
           <w:lang w:val="es-ES"/>
         </w:rPr>
         <w:t xml:space="preserve"> — proyecto y solución para abrir en Visual Studio: </w:t>
       </w:r>
-      <w:hyperlink r:id="rId21">
+      <w:hyperlink r:id="rId31">
         <w:r>
           <w:rPr>
             <w:color w:val="0563C1"/>
@@ -16097,19 +14425,6 @@
         <w:lastRenderedPageBreak/>
         <w:br/>
       </w:r>
-    </w:p>
-    <w:p>
-      <w:pPr>
-        <w:pageBreakBefore/>
-        <w:keepNext/>
-        <w:pBdr>
-          <w:bottom w:val="single" w:sz="6" w:space="6" w:color="0B4F6C"/>
-        </w:pBdr>
-        <w:spacing w:before="80" w:after="120"/>
-        <w:rPr>
-          <w:lang w:val="es-ES"/>
-        </w:rPr>
-      </w:pPr>
       <w:r>
         <w:rPr>
           <w:rFonts w:ascii="Calibri" w:hAnsi="Calibri" w:cs="Calibri"/>
@@ -16118,7 +14433,6 @@
           <w:sz w:val="32"/>
           <w:lang w:val="es-ES"/>
         </w:rPr>
-        <w:lastRenderedPageBreak/>
         <w:t>Anexo D — Declaración de originalidad y autoría</w:t>
       </w:r>
     </w:p>
@@ -16131,33 +14445,48 @@
         </w:rPr>
       </w:pPr>
       <w:r>
+        <w:rPr>
+          <w:lang w:val="es-ES"/>
+        </w:rPr>
         <w:t xml:space="preserve">Nosotros, </w:t>
       </w:r>
       <w:r>
         <w:rPr>
           <w:b/>
+          <w:lang w:val="es-ES"/>
         </w:rPr>
         <w:t>Alejandro José Luis Suárez (100094903)</w:t>
       </w:r>
       <w:r>
+        <w:rPr>
+          <w:lang w:val="es-ES"/>
+        </w:rPr>
         <w:t xml:space="preserve">, </w:t>
       </w:r>
       <w:r>
         <w:rPr>
           <w:b/>
+          <w:lang w:val="es-ES"/>
         </w:rPr>
         <w:t>Michelle del Carmen Durán Polanco (100071927)</w:t>
       </w:r>
       <w:r>
+        <w:rPr>
+          <w:lang w:val="es-ES"/>
+        </w:rPr>
         <w:t xml:space="preserve"> y </w:t>
       </w:r>
       <w:r>
         <w:rPr>
           <w:b/>
+          <w:lang w:val="es-ES"/>
         </w:rPr>
         <w:t>Elios de Jesús Dilone (100092874)</w:t>
       </w:r>
       <w:r>
+        <w:rPr>
+          <w:lang w:val="es-ES"/>
+        </w:rPr>
         <w:t>, estudiantes de la asignatura Programación, período mayo–julio de 2026, declaramos que:</w:t>
       </w:r>
     </w:p>
@@ -16170,6 +14499,9 @@
         </w:rPr>
       </w:pPr>
       <w:r>
+        <w:rPr>
+          <w:lang w:val="es-ES"/>
+        </w:rPr>
         <w:t>1.  El presente informe técnico y el sistema de software Sistema de Facturación y Cuentas por Cobrar y por Pagar documentado en él son de nuestra exclusiva autoría y fueron desarrollados por el equipo durante el período académico correspondiente.</w:t>
       </w:r>
     </w:p>
@@ -16182,6 +14514,9 @@
         </w:rPr>
       </w:pPr>
       <w:r>
+        <w:rPr>
+          <w:lang w:val="es-ES"/>
+        </w:rPr>
         <w:t>2.  El código fuente del sistema fue escrito por los integrantes del equipo según la distribución de trabajo descrita en la sección 10, sin reproducción de código de terceros sin la debida atribución, respetando las normas de integridad académica establecidas por la institución.</w:t>
       </w:r>
     </w:p>
@@ -16194,6 +14529,9 @@
         </w:rPr>
       </w:pPr>
       <w:r>
+        <w:rPr>
+          <w:lang w:val="es-ES"/>
+        </w:rPr>
         <w:t>3.  Las fuentes consultadas (documentación oficial de Microsoft sobre C#, Windows Forms, ADO.NET y SQL Server, y los materiales de la asignatura) se utilizaron únicamente como referencia; no se presentan ideas ajenas como propias.</w:t>
       </w:r>
     </w:p>
@@ -16206,6 +14544,9 @@
         </w:rPr>
       </w:pPr>
       <w:r>
+        <w:rPr>
+          <w:lang w:val="es-ES"/>
+        </w:rPr>
         <w:t>4.  El sistema ha sido probado y funciona correctamente en el entorno de desarrollo descrito en este documento (Visual Studio, SQL Server, instancia localhost, base de datos SistemaFacturacionDB).</w:t>
       </w:r>
     </w:p>
@@ -16217,15 +14558,19 @@
         </w:rPr>
       </w:pPr>
       <w:r>
+        <w:rPr>
+          <w:lang w:val="es-ES"/>
+        </w:rPr>
         <w:t xml:space="preserve">5.  El repositorio del código fuente está disponible en: </w:t>
       </w:r>
-      <w:hyperlink r:id="rId24">
+      <w:hyperlink r:id="rId32">
         <w:r>
           <w:rPr>
             <w:color w:val="0563C1"/>
             <w:u w:val="single"/>
+            <w:lang w:val="es-ES"/>
           </w:rPr>
-          <w:t xml:space="preserve">https://github.com/ElMOB04/SistemaFacturacion</w:t>
+          <w:t>https://github.com/ElMOB04/SistemaFacturacion</w:t>
         </w:r>
       </w:hyperlink>
     </w:p>
@@ -16239,6 +14584,7 @@
       <w:r>
         <w:rPr>
           <w:b/>
+          <w:lang w:val="es-ES"/>
         </w:rPr>
         <w:t>Conclusiones individuales</w:t>
       </w:r>
@@ -16253,6 +14599,7 @@
       <w:r>
         <w:rPr>
           <w:b/>
+          <w:lang w:val="es-ES"/>
         </w:rPr>
         <w:t>Alejandro José Luis Suárez — Coordinador y programador de la capa de presentación</w:t>
       </w:r>
@@ -16266,6 +14613,9 @@
         </w:rPr>
       </w:pPr>
       <w:r>
+        <w:rPr>
+          <w:lang w:val="es-ES"/>
+        </w:rPr>
         <w:t>Coordinar el proyecto me enseñó que la organización pesa tanto como el código: definir la arquitectura en tres capas desde el inicio nos permitió trabajar en paralelo sin estorbarnos. Al programar los formularios comprobé el valor de que la interfaz no contenga ninguna regla de negocio; cuando hubo que corregir un cálculo, no fue necesario tocar ninguna pantalla. Me llevo una idea clara de cómo se estructura una aplicación real de principio a fin.</w:t>
       </w:r>
     </w:p>
@@ -16279,6 +14629,7 @@
       <w:r>
         <w:rPr>
           <w:b/>
+          <w:lang w:val="es-ES"/>
         </w:rPr>
         <w:t>Michelle del Carmen Durán Polanco — Programadora de la capa de negocio</w:t>
       </w:r>
@@ -16292,6 +14643,9 @@
         </w:rPr>
       </w:pPr>
       <w:r>
+        <w:rPr>
+          <w:lang w:val="es-ES"/>
+        </w:rPr>
         <w:t>Trabajar la capa de negocio me permitió aplicar de verdad la programación orientada a objetos: cada entidad del sistema quedó representada en una clase y las reglas (el ITBIS, los saldos, el límite de crédito) en un solo lugar. Aprendí que centralizar las validaciones y las constantes evita errores repetidos y hace el sistema mucho más fácil de mantener. Fue la parte donde más conecté la teoría de la asignatura con un problema real.</w:t>
       </w:r>
     </w:p>
@@ -16305,6 +14659,7 @@
       <w:r>
         <w:rPr>
           <w:b/>
+          <w:lang w:val="es-ES"/>
         </w:rPr>
         <w:t>Elios de Jesús Dilone — Programador de base de datos y acceso a datos</w:t>
       </w:r>
@@ -16318,7 +14673,17 @@
         </w:rPr>
       </w:pPr>
       <w:r>
-        <w:t>Diseñar la base de datos me hizo entender que un buen modelo relacional es la base de todo el sistema: con las claves foráneas y las restricciones bien puestas, muchos errores se evitan antes de llegar al código. En la capa de acceso a datos aprendí a usar ADO.NET con comandos parametrizados y transacciones, y comprobé por qué una operación que toca varias tablas debe confirmarse completa o revertirse completa.</w:t>
+        <w:rPr>
+          <w:lang w:val="es-ES"/>
+        </w:rPr>
+        <w:t xml:space="preserve">Diseñar la base de datos me hizo entender que un buen modelo relacional es la base de todo el sistema: con las claves foráneas y las restricciones bien puestas, muchos errores se evitan antes de llegar al código. En la capa de acceso a datos aprendí a usar ADO.NET con comandos parametrizados </w:t>
+      </w:r>
+      <w:r>
+        <w:rPr>
+          <w:lang w:val="es-ES"/>
+        </w:rPr>
+        <w:lastRenderedPageBreak/>
+        <w:t>y transacciones, y comprobé por qué una operación que toca varias tablas debe confirmarse completa o revertirse completa.</w:t>
       </w:r>
     </w:p>
     <w:p>
@@ -16331,14 +14696,94 @@
       <w:r>
         <w:rPr>
           <w:b/>
+          <w:noProof/>
+          <w:lang w:val="es-ES"/>
+        </w:rPr>
+        <w:drawing>
+          <wp:anchor distT="0" distB="0" distL="114300" distR="114300" simplePos="0" relativeHeight="251655680" behindDoc="0" locked="0" layoutInCell="1" allowOverlap="1" wp14:anchorId="64D1E15D" wp14:editId="04E3F3F2">
+            <wp:simplePos x="0" y="0"/>
+            <wp:positionH relativeFrom="column">
+              <wp:posOffset>2346325</wp:posOffset>
+            </wp:positionH>
+            <wp:positionV relativeFrom="paragraph">
+              <wp:posOffset>609600</wp:posOffset>
+            </wp:positionV>
+            <wp:extent cx="1272540" cy="502285"/>
+            <wp:effectExtent l="0" t="0" r="3810" b="0"/>
+            <wp:wrapNone/>
+            <wp:docPr id="2073271539" name="Imagen 2"/>
+            <wp:cNvGraphicFramePr>
+              <a:graphicFrameLocks xmlns:a="http://schemas.openxmlformats.org/drawingml/2006/main" noChangeAspect="1"/>
+            </wp:cNvGraphicFramePr>
+            <a:graphic xmlns:a="http://schemas.openxmlformats.org/drawingml/2006/main">
+              <a:graphicData uri="http://schemas.openxmlformats.org/drawingml/2006/picture">
+                <pic:pic xmlns:pic="http://schemas.openxmlformats.org/drawingml/2006/picture">
+                  <pic:nvPicPr>
+                    <pic:cNvPr id="0" name="Picture 2"/>
+                    <pic:cNvPicPr>
+                      <a:picLocks noChangeAspect="1" noChangeArrowheads="1"/>
+                    </pic:cNvPicPr>
+                  </pic:nvPicPr>
+                  <pic:blipFill>
+                    <a:blip r:embed="rId33">
+                      <a:extLst>
+                        <a:ext uri="{28A0092B-C50C-407E-A947-70E740481C1C}">
+                          <a14:useLocalDpi xmlns:a14="http://schemas.microsoft.com/office/drawing/2010/main" val="0"/>
+                        </a:ext>
+                      </a:extLst>
+                    </a:blip>
+                    <a:srcRect/>
+                    <a:stretch>
+                      <a:fillRect/>
+                    </a:stretch>
+                  </pic:blipFill>
+                  <pic:spPr bwMode="auto">
+                    <a:xfrm>
+                      <a:off x="0" y="0"/>
+                      <a:ext cx="1272540" cy="502285"/>
+                    </a:xfrm>
+                    <a:prstGeom prst="rect">
+                      <a:avLst/>
+                    </a:prstGeom>
+                    <a:noFill/>
+                  </pic:spPr>
+                </pic:pic>
+              </a:graphicData>
+            </a:graphic>
+            <wp14:sizeRelH relativeFrom="page">
+              <wp14:pctWidth>0</wp14:pctWidth>
+            </wp14:sizeRelH>
+            <wp14:sizeRelV relativeFrom="page">
+              <wp14:pctHeight>0</wp14:pctHeight>
+            </wp14:sizeRelV>
+          </wp:anchor>
+        </w:drawing>
+      </w:r>
+      <w:r>
+        <w:rPr>
+          <w:b/>
+          <w:lang w:val="es-ES"/>
         </w:rPr>
         <w:t>Firma de los estudiantes:</w:t>
+      </w:r>
+      <w:r>
+        <w:rPr>
+          <w:b/>
+          <w:lang w:val="es-ES"/>
+        </w:rPr>
+        <w:br/>
+      </w:r>
+      <w:r>
+        <w:rPr>
+          <w:b/>
+          <w:lang w:val="es-ES"/>
+        </w:rPr>
+        <w:br/>
       </w:r>
     </w:p>
     <w:p>
       <w:pPr>
         <w:spacing w:after="160" w:line="288" w:lineRule="auto"/>
-        <w:jc w:val="center"/>
         <w:rPr>
           <w:lang w:val="es-ES"/>
         </w:rPr>
@@ -16353,7 +14798,16 @@
         </w:rPr>
       </w:pPr>
       <w:r>
-        <w:t>_______________________________</w:t>
+        <w:rPr>
+          <w:lang w:val="es-ES"/>
+        </w:rPr>
+        <w:t>__________________</w:t>
+      </w:r>
+      <w:r>
+        <w:rPr>
+          <w:lang w:val="es-ES"/>
+        </w:rPr>
+        <w:t xml:space="preserve">_________           </w:t>
       </w:r>
     </w:p>
     <w:p>
@@ -16365,6 +14819,9 @@
         </w:rPr>
       </w:pPr>
       <w:r>
+        <w:rPr>
+          <w:lang w:val="es-ES"/>
+        </w:rPr>
         <w:t>Alejandro José Luis Suárez — 100094903</w:t>
       </w:r>
     </w:p>
@@ -16376,6 +14833,78 @@
           <w:lang w:val="es-ES"/>
         </w:rPr>
       </w:pPr>
+      <w:r>
+        <w:rPr>
+          <w:noProof/>
+        </w:rPr>
+        <w:drawing>
+          <wp:anchor distT="0" distB="0" distL="114300" distR="114300" simplePos="0" relativeHeight="251658752" behindDoc="0" locked="0" layoutInCell="1" allowOverlap="1" wp14:anchorId="11B6326E" wp14:editId="7D7545D6">
+            <wp:simplePos x="0" y="0"/>
+            <wp:positionH relativeFrom="column">
+              <wp:posOffset>2445385</wp:posOffset>
+            </wp:positionH>
+            <wp:positionV relativeFrom="paragraph">
+              <wp:posOffset>45085</wp:posOffset>
+            </wp:positionV>
+            <wp:extent cx="1135380" cy="669925"/>
+            <wp:effectExtent l="0" t="0" r="7620" b="0"/>
+            <wp:wrapNone/>
+            <wp:docPr id="532303710" name="Imagen 4"/>
+            <wp:cNvGraphicFramePr>
+              <a:graphicFrameLocks xmlns:a="http://schemas.openxmlformats.org/drawingml/2006/main" noChangeAspect="1"/>
+            </wp:cNvGraphicFramePr>
+            <a:graphic xmlns:a="http://schemas.openxmlformats.org/drawingml/2006/main">
+              <a:graphicData uri="http://schemas.openxmlformats.org/drawingml/2006/picture">
+                <pic:pic xmlns:pic="http://schemas.openxmlformats.org/drawingml/2006/picture">
+                  <pic:nvPicPr>
+                    <pic:cNvPr id="0" name="Picture 3"/>
+                    <pic:cNvPicPr>
+                      <a:picLocks noChangeAspect="1" noChangeArrowheads="1"/>
+                    </pic:cNvPicPr>
+                  </pic:nvPicPr>
+                  <pic:blipFill rotWithShape="1">
+                    <a:blip r:embed="rId34">
+                      <a:extLst>
+                        <a:ext uri="{28A0092B-C50C-407E-A947-70E740481C1C}">
+                          <a14:useLocalDpi xmlns:a14="http://schemas.microsoft.com/office/drawing/2010/main" val="0"/>
+                        </a:ext>
+                      </a:extLst>
+                    </a:blip>
+                    <a:srcRect l="17846" t="19442" r="25677" b="60735"/>
+                    <a:stretch>
+                      <a:fillRect/>
+                    </a:stretch>
+                  </pic:blipFill>
+                  <pic:spPr bwMode="auto">
+                    <a:xfrm>
+                      <a:off x="0" y="0"/>
+                      <a:ext cx="1139839" cy="672556"/>
+                    </a:xfrm>
+                    <a:prstGeom prst="rect">
+                      <a:avLst/>
+                    </a:prstGeom>
+                    <a:noFill/>
+                    <a:ln>
+                      <a:noFill/>
+                    </a:ln>
+                    <a:extLst>
+                      <a:ext uri="{53640926-AAD7-44D8-BBD7-CCE9431645EC}">
+                        <a14:shadowObscured xmlns:a14="http://schemas.microsoft.com/office/drawing/2010/main"/>
+                      </a:ext>
+                    </a:extLst>
+                  </pic:spPr>
+                </pic:pic>
+              </a:graphicData>
+            </a:graphic>
+            <wp14:sizeRelH relativeFrom="page">
+              <wp14:pctWidth>0</wp14:pctWidth>
+            </wp14:sizeRelH>
+            <wp14:sizeRelV relativeFrom="page">
+              <wp14:pctHeight>0</wp14:pctHeight>
+            </wp14:sizeRelV>
+          </wp:anchor>
+        </w:drawing>
+      </w:r>
     </w:p>
     <w:p>
       <w:pPr>
@@ -16385,9 +14914,6 @@
           <w:lang w:val="es-ES"/>
         </w:rPr>
       </w:pPr>
-      <w:r>
-        <w:t>_______________________________</w:t>
-      </w:r>
     </w:p>
     <w:p>
       <w:pPr>
@@ -16398,7 +14924,10 @@
         </w:rPr>
       </w:pPr>
       <w:r>
-        <w:t>Michelle del Carmen Durán Polanco — 100071927</w:t>
+        <w:rPr>
+          <w:lang w:val="es-ES"/>
+        </w:rPr>
+        <w:t>_______________________________</w:t>
       </w:r>
     </w:p>
     <w:p>
@@ -16409,17 +14938,130 @@
           <w:lang w:val="es-ES"/>
         </w:rPr>
       </w:pPr>
+      <w:r>
+        <w:rPr>
+          <w:lang w:val="es-ES"/>
+        </w:rPr>
+        <w:t>Michelle del Carmen Durán Polanco — 100071927</w:t>
+      </w:r>
+      <w:r>
+        <w:rPr>
+          <w:lang w:val="es-ES"/>
+        </w:rPr>
+        <w:br/>
+      </w:r>
     </w:p>
     <w:p>
       <w:pPr>
         <w:spacing w:after="160" w:line="288" w:lineRule="auto"/>
         <w:jc w:val="center"/>
         <w:rPr>
-          <w:lang w:val="es-ES"/>
-        </w:rPr>
-      </w:pPr>
-      <w:r>
-        <w:t>_______________________________</w:t>
+          <w:noProof/>
+          <w:lang w:val="es-ES"/>
+        </w:rPr>
+      </w:pPr>
+      <w:r>
+        <w:rPr>
+          <w:noProof/>
+          <w:lang w:val="es-ES"/>
+        </w:rPr>
+        <w:drawing>
+          <wp:anchor distT="0" distB="0" distL="114300" distR="114300" simplePos="0" relativeHeight="251660800" behindDoc="0" locked="0" layoutInCell="1" allowOverlap="1" wp14:anchorId="2512220D" wp14:editId="31DF995C">
+            <wp:simplePos x="0" y="0"/>
+            <wp:positionH relativeFrom="column">
+              <wp:posOffset>2376805</wp:posOffset>
+            </wp:positionH>
+            <wp:positionV relativeFrom="paragraph">
+              <wp:posOffset>164465</wp:posOffset>
+            </wp:positionV>
+            <wp:extent cx="1211580" cy="664891"/>
+            <wp:effectExtent l="0" t="0" r="7620" b="1905"/>
+            <wp:wrapNone/>
+            <wp:docPr id="2093476556" name="Imagen 6"/>
+            <wp:cNvGraphicFramePr>
+              <a:graphicFrameLocks xmlns:a="http://schemas.openxmlformats.org/drawingml/2006/main" noChangeAspect="1"/>
+            </wp:cNvGraphicFramePr>
+            <a:graphic xmlns:a="http://schemas.openxmlformats.org/drawingml/2006/main">
+              <a:graphicData uri="http://schemas.openxmlformats.org/drawingml/2006/picture">
+                <pic:pic xmlns:pic="http://schemas.openxmlformats.org/drawingml/2006/picture">
+                  <pic:nvPicPr>
+                    <pic:cNvPr id="0" name="Picture 4"/>
+                    <pic:cNvPicPr>
+                      <a:picLocks noChangeAspect="1" noChangeArrowheads="1"/>
+                    </pic:cNvPicPr>
+                  </pic:nvPicPr>
+                  <pic:blipFill rotWithShape="1">
+                    <a:blip r:embed="rId35">
+                      <a:extLst>
+                        <a:ext uri="{28A0092B-C50C-407E-A947-70E740481C1C}">
+                          <a14:useLocalDpi xmlns:a14="http://schemas.microsoft.com/office/drawing/2010/main" val="0"/>
+                        </a:ext>
+                      </a:extLst>
+                    </a:blip>
+                    <a:srcRect l="29667" t="36750" r="33889" b="52000"/>
+                    <a:stretch>
+                      <a:fillRect/>
+                    </a:stretch>
+                  </pic:blipFill>
+                  <pic:spPr bwMode="auto">
+                    <a:xfrm>
+                      <a:off x="0" y="0"/>
+                      <a:ext cx="1211580" cy="664891"/>
+                    </a:xfrm>
+                    <a:prstGeom prst="rect">
+                      <a:avLst/>
+                    </a:prstGeom>
+                    <a:noFill/>
+                    <a:ln>
+                      <a:noFill/>
+                    </a:ln>
+                    <a:extLst>
+                      <a:ext uri="{53640926-AAD7-44D8-BBD7-CCE9431645EC}">
+                        <a14:shadowObscured xmlns:a14="http://schemas.microsoft.com/office/drawing/2010/main"/>
+                      </a:ext>
+                    </a:extLst>
+                  </pic:spPr>
+                </pic:pic>
+              </a:graphicData>
+            </a:graphic>
+            <wp14:sizeRelH relativeFrom="page">
+              <wp14:pctWidth>0</wp14:pctWidth>
+            </wp14:sizeRelH>
+            <wp14:sizeRelV relativeFrom="page">
+              <wp14:pctHeight>0</wp14:pctHeight>
+            </wp14:sizeRelV>
+          </wp:anchor>
+        </w:drawing>
+      </w:r>
+    </w:p>
+    <w:p>
+      <w:pPr>
+        <w:spacing w:after="160" w:line="288" w:lineRule="auto"/>
+        <w:jc w:val="center"/>
+        <w:rPr>
+          <w:lang w:val="es-ES"/>
+        </w:rPr>
+      </w:pPr>
+      <w:r>
+        <w:rPr>
+          <w:lang w:val="es-ES"/>
+        </w:rPr>
+        <w:br/>
+      </w:r>
+    </w:p>
+    <w:p>
+      <w:pPr>
+        <w:spacing w:after="160" w:line="288" w:lineRule="auto"/>
+        <w:jc w:val="center"/>
+        <w:rPr>
+          <w:lang w:val="es-ES"/>
+        </w:rPr>
+      </w:pPr>
+      <w:r>
+        <w:rPr>
+          <w:lang w:val="es-ES"/>
+        </w:rPr>
+        <w:t>_______________________</w:t>
       </w:r>
     </w:p>
     <w:p>

</xml_diff>

<commit_message>
Agregar secciones 13-17: librerías, pruebas de seguridad, mejoras futuras, glosario y bibliografía
También se restaura el encabezado del Anexo D que se había perdido
al editar el documento y se actualiza el índice con las nuevas secciones.
</commit_message>
<xml_diff>
--- a/Documentacion/Informe_Final_SistemaFacturacion.docx
+++ b/Documentacion/Informe_Final_SistemaFacturacion.docx
@@ -812,6 +812,141 @@
           <w:sz w:val="23"/>
           <w:lang w:val="es-ES"/>
         </w:rPr>
+        <w:t xml:space="preserve">  13.   </w:t>
+      </w:r>
+      <w:r>
+        <w:rPr>
+          <w:rFonts w:cs="Cambria"/>
+          <w:sz w:val="23"/>
+          <w:lang w:val="es-ES"/>
+        </w:rPr>
+        <w:t>Librerías utilizadas</w:t>
+      </w:r>
+    </w:p>
+    <w:p>
+      <w:pPr>
+        <w:spacing w:after="120"/>
+        <w:ind w:left="170"/>
+        <w:rPr>
+          <w:lang w:val="es-ES"/>
+        </w:rPr>
+      </w:pPr>
+      <w:r>
+        <w:rPr>
+          <w:rFonts w:ascii="Calibri" w:hAnsi="Calibri" w:cs="Calibri"/>
+          <w:b/>
+          <w:color w:val="126882"/>
+          <w:sz w:val="23"/>
+          <w:lang w:val="es-ES"/>
+        </w:rPr>
+        <w:t xml:space="preserve">  14.   </w:t>
+      </w:r>
+      <w:r>
+        <w:rPr>
+          <w:rFonts w:cs="Cambria"/>
+          <w:sz w:val="23"/>
+          <w:lang w:val="es-ES"/>
+        </w:rPr>
+        <w:t>Pruebas de seguridad realizadas</w:t>
+      </w:r>
+    </w:p>
+    <w:p>
+      <w:pPr>
+        <w:spacing w:after="120"/>
+        <w:ind w:left="170"/>
+        <w:rPr>
+          <w:lang w:val="es-ES"/>
+        </w:rPr>
+      </w:pPr>
+      <w:r>
+        <w:rPr>
+          <w:rFonts w:ascii="Calibri" w:hAnsi="Calibri" w:cs="Calibri"/>
+          <w:b/>
+          <w:color w:val="126882"/>
+          <w:sz w:val="23"/>
+          <w:lang w:val="es-ES"/>
+        </w:rPr>
+        <w:t xml:space="preserve">  15.   </w:t>
+      </w:r>
+      <w:r>
+        <w:rPr>
+          <w:rFonts w:cs="Cambria"/>
+          <w:sz w:val="23"/>
+          <w:lang w:val="es-ES"/>
+        </w:rPr>
+        <w:t>Mejoras futuras del sistema</w:t>
+      </w:r>
+    </w:p>
+    <w:p>
+      <w:pPr>
+        <w:spacing w:after="120"/>
+        <w:ind w:left="170"/>
+        <w:rPr>
+          <w:lang w:val="es-ES"/>
+        </w:rPr>
+      </w:pPr>
+      <w:r>
+        <w:rPr>
+          <w:rFonts w:ascii="Calibri" w:hAnsi="Calibri" w:cs="Calibri"/>
+          <w:b/>
+          <w:color w:val="126882"/>
+          <w:sz w:val="23"/>
+          <w:lang w:val="es-ES"/>
+        </w:rPr>
+        <w:t xml:space="preserve">  16.   </w:t>
+      </w:r>
+      <w:r>
+        <w:rPr>
+          <w:rFonts w:cs="Cambria"/>
+          <w:sz w:val="23"/>
+          <w:lang w:val="es-ES"/>
+        </w:rPr>
+        <w:t>Glosario de términos</w:t>
+      </w:r>
+    </w:p>
+    <w:p>
+      <w:pPr>
+        <w:spacing w:after="120"/>
+        <w:ind w:left="170"/>
+        <w:rPr>
+          <w:lang w:val="es-ES"/>
+        </w:rPr>
+      </w:pPr>
+      <w:r>
+        <w:rPr>
+          <w:rFonts w:ascii="Calibri" w:hAnsi="Calibri" w:cs="Calibri"/>
+          <w:b/>
+          <w:color w:val="126882"/>
+          <w:sz w:val="23"/>
+          <w:lang w:val="es-ES"/>
+        </w:rPr>
+        <w:t xml:space="preserve">  17.   </w:t>
+      </w:r>
+      <w:r>
+        <w:rPr>
+          <w:rFonts w:cs="Cambria"/>
+          <w:sz w:val="23"/>
+          <w:lang w:val="es-ES"/>
+        </w:rPr>
+        <w:t>Bibliografía</w:t>
+      </w:r>
+    </w:p>
+    <w:p>
+      <w:pPr>
+        <w:spacing w:after="120"/>
+        <w:ind w:left="170"/>
+        <w:rPr>
+          <w:lang w:val="es-ES"/>
+        </w:rPr>
+      </w:pPr>
+      <w:r>
+        <w:rPr>
+          <w:rFonts w:ascii="Calibri" w:hAnsi="Calibri" w:cs="Calibri"/>
+          <w:b/>
+          <w:color w:val="126882"/>
+          <w:sz w:val="23"/>
+          <w:lang w:val="es-ES"/>
+        </w:rPr>
         <w:t xml:space="preserve">  A.   </w:t>
       </w:r>
       <w:r>
@@ -13925,6 +14060,3021 @@
     </w:p>
     <w:p>
       <w:pPr>
+        <w:pageBreakBefore/>
+        <w:keepNext/>
+        <w:pBdr>
+          <w:bottom w:val="single" w:sz="6" w:space="6" w:color="0B4F6C"/>
+        </w:pBdr>
+        <w:spacing w:before="360" w:after="160"/>
+        <w:rPr>
+          <w:lang w:val="es-ES"/>
+        </w:rPr>
+      </w:pPr>
+      <w:r>
+        <w:rPr>
+          <w:rFonts w:ascii="Calibri" w:hAnsi="Calibri" w:cs="Calibri"/>
+          <w:b/>
+          <w:color w:val="0B4F6C"/>
+          <w:sz w:val="30"/>
+          <w:lang w:val="es-ES"/>
+        </w:rPr>
+        <w:t>13.  Librerías utilizadas</w:t>
+      </w:r>
+    </w:p>
+    <w:p>
+      <w:pPr>
+        <w:spacing w:after="160" w:line="288" w:lineRule="auto"/>
+        <w:jc w:val="both"/>
+        <w:rPr>
+          <w:lang w:val="es-ES"/>
+        </w:rPr>
+      </w:pPr>
+      <w:r>
+        <w:t>Todo el sistema se construyó con librerías estándar del .NET Framework 4.7.2; no fue necesario instalar paquetes externos, lo que simplifica la compilación y la entrega del proyecto. La siguiente tabla resume los espacios de nombres empleados, la capa donde se usan y el papel que cumple cada uno:</w:t>
+      </w:r>
+    </w:p>
+    <w:tbl>
+      <w:tblPr>
+        <w:tblW w:w="5000" w:type="pct"/>
+        <w:jc w:val="center"/>
+        <w:tblBorders>
+          <w:top w:val="single" w:sz="6" w:space="0" w:color="CBD5E0"/>
+          <w:left w:val="single" w:sz="6" w:space="0" w:color="CBD5E0"/>
+          <w:bottom w:val="single" w:sz="6" w:space="0" w:color="CBD5E0"/>
+          <w:right w:val="single" w:sz="6" w:space="0" w:color="CBD5E0"/>
+          <w:insideH w:val="single" w:sz="6" w:space="0" w:color="CBD5E0"/>
+          <w:insideV w:val="single" w:sz="6" w:space="0" w:color="CBD5E0"/>
+        </w:tblBorders>
+        <w:tblLook w:val="04A0" w:firstRow="1" w:lastRow="0" w:firstColumn="1" w:lastColumn="0" w:noHBand="0" w:noVBand="1"/>
+      </w:tblPr>
+      <w:tblGrid>
+        <w:gridCol w:w="1983"/>
+        <w:gridCol w:w="3849"/>
+        <w:gridCol w:w="3790"/>
+      </w:tblGrid>
+      <w:tr>
+        <w:trPr>
+          <w:cantSplit/>
+          <w:jc w:val="center"/>
+        </w:trPr>
+        <w:tc>
+          <w:tcPr>
+            <w:tcW w:w="1928" w:type="dxa"/>
+            <w:shd w:val="clear" w:color="auto" w:fill="0B4F6C"/>
+            <w:vAlign w:val="center"/>
+          </w:tcPr>
+          <w:p>
+            <w:pPr>
+              <w:spacing w:before="40" w:after="40"/>
+            </w:pPr>
+            <w:r>
+              <w:rPr>
+                <w:rFonts w:ascii="Calibri" w:hAnsi="Calibri" w:cs="Calibri"/>
+                <w:b/>
+                <w:color w:val="FFFFFF"/>
+                <w:sz w:val="19"/>
+              </w:rPr>
+              <w:t xml:space="preserve">Librería / Espacio de nombres</w:t>
+            </w:r>
+          </w:p>
+        </w:tc>
+        <w:tc>
+          <w:tcPr>
+            <w:tcW w:w="3742" w:type="dxa"/>
+            <w:shd w:val="clear" w:color="auto" w:fill="0B4F6C"/>
+            <w:vAlign w:val="center"/>
+          </w:tcPr>
+          <w:p>
+            <w:pPr>
+              <w:spacing w:before="40" w:after="40"/>
+            </w:pPr>
+            <w:r>
+              <w:rPr>
+                <w:rFonts w:ascii="Calibri" w:hAnsi="Calibri" w:cs="Calibri"/>
+                <w:b/>
+                <w:color w:val="FFFFFF"/>
+                <w:sz w:val="19"/>
+              </w:rPr>
+              <w:t xml:space="preserve">Capa donde se usa</w:t>
+            </w:r>
+          </w:p>
+        </w:tc>
+        <w:tc>
+          <w:tcPr>
+            <w:tcW w:w="3685" w:type="dxa"/>
+            <w:shd w:val="clear" w:color="auto" w:fill="0B4F6C"/>
+            <w:vAlign w:val="center"/>
+          </w:tcPr>
+          <w:p>
+            <w:pPr>
+              <w:spacing w:before="40" w:after="40"/>
+            </w:pPr>
+            <w:r>
+              <w:rPr>
+                <w:rFonts w:ascii="Calibri" w:hAnsi="Calibri" w:cs="Calibri"/>
+                <w:b/>
+                <w:color w:val="FFFFFF"/>
+                <w:sz w:val="19"/>
+              </w:rPr>
+              <w:t xml:space="preserve">Uso en el sistema</w:t>
+            </w:r>
+          </w:p>
+        </w:tc>
+      </w:tr>
+      <w:tr>
+        <w:trPr>
+          <w:cantSplit/>
+          <w:jc w:val="center"/>
+        </w:trPr>
+        <w:tc>
+          <w:tcPr>
+            <w:tcW w:w="1928" w:type="dxa"/>
+            <w:shd w:val="clear" w:color="auto" w:fill="FFFFFF"/>
+            <w:vAlign w:val="center"/>
+          </w:tcPr>
+          <w:p>
+            <w:pPr>
+              <w:spacing w:before="40" w:after="40" w:line="264" w:lineRule="auto"/>
+            </w:pPr>
+            <w:r>
+              <w:rPr>
+                <w:rFonts w:cs="Cambria"/>
+                <w:b/>
+                <w:sz w:val="19"/>
+              </w:rPr>
+              <w:t xml:space="preserve">System.Windows.Forms</w:t>
+            </w:r>
+          </w:p>
+        </w:tc>
+        <w:tc>
+          <w:tcPr>
+            <w:tcW w:w="3742" w:type="dxa"/>
+            <w:shd w:val="clear" w:color="auto" w:fill="FFFFFF"/>
+            <w:vAlign w:val="center"/>
+          </w:tcPr>
+          <w:p>
+            <w:pPr>
+              <w:spacing w:before="40" w:after="40" w:line="264" w:lineRule="auto"/>
+              <w:rPr>
+                <w:lang w:val="es-ES"/>
+              </w:rPr>
+            </w:pPr>
+            <w:r>
+              <w:rPr>
+                <w:rFonts w:cs="Cambria"/>
+                <w:sz w:val="19"/>
+                <w:lang w:val="es-ES"/>
+              </w:rPr>
+              <w:t xml:space="preserve">Presentación</w:t>
+            </w:r>
+          </w:p>
+        </w:tc>
+        <w:tc>
+          <w:tcPr>
+            <w:tcW w:w="3685" w:type="dxa"/>
+            <w:shd w:val="clear" w:color="auto" w:fill="FFFFFF"/>
+            <w:vAlign w:val="center"/>
+          </w:tcPr>
+          <w:p>
+            <w:pPr>
+              <w:spacing w:before="40" w:after="40" w:line="264" w:lineRule="auto"/>
+            </w:pPr>
+            <w:r>
+              <w:rPr>
+                <w:rFonts w:cs="Cambria"/>
+                <w:sz w:val="19"/>
+              </w:rPr>
+              <w:t xml:space="preserve">Formularios, controles (DataGridView, TextBox, botones, menús) y eventos de la interfaz gráfica.</w:t>
+            </w:r>
+          </w:p>
+        </w:tc>
+      </w:tr>
+      <w:tr>
+        <w:trPr>
+          <w:cantSplit/>
+          <w:jc w:val="center"/>
+        </w:trPr>
+        <w:tc>
+          <w:tcPr>
+            <w:tcW w:w="1928" w:type="dxa"/>
+            <w:shd w:val="clear" w:color="auto" w:fill="FFFFFF"/>
+            <w:vAlign w:val="center"/>
+          </w:tcPr>
+          <w:p>
+            <w:pPr>
+              <w:spacing w:before="40" w:after="40" w:line="264" w:lineRule="auto"/>
+            </w:pPr>
+            <w:r>
+              <w:rPr>
+                <w:rFonts w:cs="Cambria"/>
+                <w:b/>
+                <w:sz w:val="19"/>
+              </w:rPr>
+              <w:t xml:space="preserve">System.Drawing</w:t>
+            </w:r>
+          </w:p>
+        </w:tc>
+        <w:tc>
+          <w:tcPr>
+            <w:tcW w:w="3742" w:type="dxa"/>
+            <w:shd w:val="clear" w:color="auto" w:fill="FFFFFF"/>
+            <w:vAlign w:val="center"/>
+          </w:tcPr>
+          <w:p>
+            <w:pPr>
+              <w:spacing w:before="40" w:after="40" w:line="264" w:lineRule="auto"/>
+              <w:rPr>
+                <w:lang w:val="es-ES"/>
+              </w:rPr>
+            </w:pPr>
+            <w:r>
+              <w:rPr>
+                <w:rFonts w:cs="Cambria"/>
+                <w:sz w:val="19"/>
+                <w:lang w:val="es-ES"/>
+              </w:rPr>
+              <w:t xml:space="preserve">Presentación</w:t>
+            </w:r>
+          </w:p>
+        </w:tc>
+        <w:tc>
+          <w:tcPr>
+            <w:tcW w:w="3685" w:type="dxa"/>
+            <w:shd w:val="clear" w:color="auto" w:fill="FFFFFF"/>
+            <w:vAlign w:val="center"/>
+          </w:tcPr>
+          <w:p>
+            <w:pPr>
+              <w:spacing w:before="40" w:after="40" w:line="264" w:lineRule="auto"/>
+            </w:pPr>
+            <w:r>
+              <w:rPr>
+                <w:rFonts w:cs="Cambria"/>
+                <w:sz w:val="19"/>
+              </w:rPr>
+              <w:t xml:space="preserve">Colores, fuentes y estilos visuales unificados de la interfaz (clase UI.cs).</w:t>
+            </w:r>
+          </w:p>
+        </w:tc>
+      </w:tr>
+      <w:tr>
+        <w:trPr>
+          <w:cantSplit/>
+          <w:jc w:val="center"/>
+        </w:trPr>
+        <w:tc>
+          <w:tcPr>
+            <w:tcW w:w="1928" w:type="dxa"/>
+            <w:shd w:val="clear" w:color="auto" w:fill="FFFFFF"/>
+            <w:vAlign w:val="center"/>
+          </w:tcPr>
+          <w:p>
+            <w:pPr>
+              <w:spacing w:before="40" w:after="40" w:line="264" w:lineRule="auto"/>
+            </w:pPr>
+            <w:r>
+              <w:rPr>
+                <w:rFonts w:cs="Cambria"/>
+                <w:b/>
+                <w:sz w:val="19"/>
+              </w:rPr>
+              <w:t xml:space="preserve">System.Data</w:t>
+            </w:r>
+          </w:p>
+        </w:tc>
+        <w:tc>
+          <w:tcPr>
+            <w:tcW w:w="3742" w:type="dxa"/>
+            <w:shd w:val="clear" w:color="auto" w:fill="FFFFFF"/>
+            <w:vAlign w:val="center"/>
+          </w:tcPr>
+          <w:p>
+            <w:pPr>
+              <w:spacing w:before="40" w:after="40" w:line="264" w:lineRule="auto"/>
+              <w:rPr>
+                <w:lang w:val="es-ES"/>
+              </w:rPr>
+            </w:pPr>
+            <w:r>
+              <w:rPr>
+                <w:rFonts w:cs="Cambria"/>
+                <w:sz w:val="19"/>
+                <w:lang w:val="es-ES"/>
+              </w:rPr>
+              <w:t xml:space="preserve">Acceso a datos</w:t>
+            </w:r>
+          </w:p>
+        </w:tc>
+        <w:tc>
+          <w:tcPr>
+            <w:tcW w:w="3685" w:type="dxa"/>
+            <w:shd w:val="clear" w:color="auto" w:fill="FFFFFF"/>
+            <w:vAlign w:val="center"/>
+          </w:tcPr>
+          <w:p>
+            <w:pPr>
+              <w:spacing w:before="40" w:after="40" w:line="264" w:lineRule="auto"/>
+            </w:pPr>
+            <w:r>
+              <w:rPr>
+                <w:rFonts w:cs="Cambria"/>
+                <w:sz w:val="19"/>
+              </w:rPr>
+              <w:t xml:space="preserve">Estructuras DataTable y DataRow para manejar los resultados de las consultas.</w:t>
+            </w:r>
+          </w:p>
+        </w:tc>
+      </w:tr>
+      <w:tr>
+        <w:trPr>
+          <w:cantSplit/>
+          <w:jc w:val="center"/>
+        </w:trPr>
+        <w:tc>
+          <w:tcPr>
+            <w:tcW w:w="1928" w:type="dxa"/>
+            <w:shd w:val="clear" w:color="auto" w:fill="FFFFFF"/>
+            <w:vAlign w:val="center"/>
+          </w:tcPr>
+          <w:p>
+            <w:pPr>
+              <w:spacing w:before="40" w:after="40" w:line="264" w:lineRule="auto"/>
+            </w:pPr>
+            <w:r>
+              <w:rPr>
+                <w:rFonts w:cs="Cambria"/>
+                <w:b/>
+                <w:sz w:val="19"/>
+              </w:rPr>
+              <w:t xml:space="preserve">System.Data.SqlClient</w:t>
+            </w:r>
+          </w:p>
+        </w:tc>
+        <w:tc>
+          <w:tcPr>
+            <w:tcW w:w="3742" w:type="dxa"/>
+            <w:shd w:val="clear" w:color="auto" w:fill="FFFFFF"/>
+            <w:vAlign w:val="center"/>
+          </w:tcPr>
+          <w:p>
+            <w:pPr>
+              <w:spacing w:before="40" w:after="40" w:line="264" w:lineRule="auto"/>
+              <w:rPr>
+                <w:lang w:val="es-ES"/>
+              </w:rPr>
+            </w:pPr>
+            <w:r>
+              <w:rPr>
+                <w:rFonts w:cs="Cambria"/>
+                <w:sz w:val="19"/>
+                <w:lang w:val="es-ES"/>
+              </w:rPr>
+              <w:t xml:space="preserve">Acceso a datos</w:t>
+            </w:r>
+          </w:p>
+        </w:tc>
+        <w:tc>
+          <w:tcPr>
+            <w:tcW w:w="3685" w:type="dxa"/>
+            <w:shd w:val="clear" w:color="auto" w:fill="FFFFFF"/>
+            <w:vAlign w:val="center"/>
+          </w:tcPr>
+          <w:p>
+            <w:pPr>
+              <w:spacing w:before="40" w:after="40" w:line="264" w:lineRule="auto"/>
+            </w:pPr>
+            <w:r>
+              <w:rPr>
+                <w:rFonts w:cs="Cambria"/>
+                <w:sz w:val="19"/>
+              </w:rPr>
+              <w:t xml:space="preserve">Comunicación con SQL Server: SqlConnection, SqlCommand, SqlParameter y SqlTransaction.</w:t>
+            </w:r>
+          </w:p>
+        </w:tc>
+      </w:tr>
+      <w:tr>
+        <w:trPr>
+          <w:cantSplit/>
+          <w:jc w:val="center"/>
+        </w:trPr>
+        <w:tc>
+          <w:tcPr>
+            <w:tcW w:w="1928" w:type="dxa"/>
+            <w:shd w:val="clear" w:color="auto" w:fill="FFFFFF"/>
+            <w:vAlign w:val="center"/>
+          </w:tcPr>
+          <w:p>
+            <w:pPr>
+              <w:spacing w:before="40" w:after="40" w:line="264" w:lineRule="auto"/>
+            </w:pPr>
+            <w:r>
+              <w:rPr>
+                <w:rFonts w:cs="Cambria"/>
+                <w:b/>
+                <w:sz w:val="19"/>
+              </w:rPr>
+              <w:t xml:space="preserve">System.Configuration</w:t>
+            </w:r>
+          </w:p>
+        </w:tc>
+        <w:tc>
+          <w:tcPr>
+            <w:tcW w:w="3742" w:type="dxa"/>
+            <w:shd w:val="clear" w:color="auto" w:fill="FFFFFF"/>
+            <w:vAlign w:val="center"/>
+          </w:tcPr>
+          <w:p>
+            <w:pPr>
+              <w:spacing w:before="40" w:after="40" w:line="264" w:lineRule="auto"/>
+              <w:rPr>
+                <w:lang w:val="es-ES"/>
+              </w:rPr>
+            </w:pPr>
+            <w:r>
+              <w:rPr>
+                <w:rFonts w:cs="Cambria"/>
+                <w:sz w:val="19"/>
+                <w:lang w:val="es-ES"/>
+              </w:rPr>
+              <w:t xml:space="preserve">Acceso a datos</w:t>
+            </w:r>
+          </w:p>
+        </w:tc>
+        <w:tc>
+          <w:tcPr>
+            <w:tcW w:w="3685" w:type="dxa"/>
+            <w:shd w:val="clear" w:color="auto" w:fill="FFFFFF"/>
+            <w:vAlign w:val="center"/>
+          </w:tcPr>
+          <w:p>
+            <w:pPr>
+              <w:spacing w:before="40" w:after="40" w:line="264" w:lineRule="auto"/>
+            </w:pPr>
+            <w:r>
+              <w:rPr>
+                <w:rFonts w:cs="Cambria"/>
+                <w:sz w:val="19"/>
+              </w:rPr>
+              <w:t xml:space="preserve">Lectura de la cadena de conexión desde App.config mediante ConfigurationManager.</w:t>
+            </w:r>
+          </w:p>
+        </w:tc>
+      </w:tr>
+      <w:tr>
+        <w:trPr>
+          <w:cantSplit/>
+          <w:jc w:val="center"/>
+        </w:trPr>
+        <w:tc>
+          <w:tcPr>
+            <w:tcW w:w="1928" w:type="dxa"/>
+            <w:shd w:val="clear" w:color="auto" w:fill="FFFFFF"/>
+            <w:vAlign w:val="center"/>
+          </w:tcPr>
+          <w:p>
+            <w:pPr>
+              <w:spacing w:before="40" w:after="40" w:line="264" w:lineRule="auto"/>
+            </w:pPr>
+            <w:r>
+              <w:rPr>
+                <w:rFonts w:cs="Cambria"/>
+                <w:b/>
+                <w:sz w:val="19"/>
+              </w:rPr>
+              <w:t xml:space="preserve">System.Security.Cryptography</w:t>
+            </w:r>
+          </w:p>
+        </w:tc>
+        <w:tc>
+          <w:tcPr>
+            <w:tcW w:w="3742" w:type="dxa"/>
+            <w:shd w:val="clear" w:color="auto" w:fill="FFFFFF"/>
+            <w:vAlign w:val="center"/>
+          </w:tcPr>
+          <w:p>
+            <w:pPr>
+              <w:spacing w:before="40" w:after="40" w:line="264" w:lineRule="auto"/>
+              <w:rPr>
+                <w:lang w:val="es-ES"/>
+              </w:rPr>
+            </w:pPr>
+            <w:r>
+              <w:rPr>
+                <w:rFonts w:cs="Cambria"/>
+                <w:sz w:val="19"/>
+                <w:lang w:val="es-ES"/>
+              </w:rPr>
+              <w:t xml:space="preserve">Negocio</w:t>
+            </w:r>
+          </w:p>
+        </w:tc>
+        <w:tc>
+          <w:tcPr>
+            <w:tcW w:w="3685" w:type="dxa"/>
+            <w:shd w:val="clear" w:color="auto" w:fill="FFFFFF"/>
+            <w:vAlign w:val="center"/>
+          </w:tcPr>
+          <w:p>
+            <w:pPr>
+              <w:spacing w:before="40" w:after="40" w:line="264" w:lineRule="auto"/>
+            </w:pPr>
+            <w:r>
+              <w:rPr>
+                <w:rFonts w:cs="Cambria"/>
+                <w:sz w:val="19"/>
+              </w:rPr>
+              <w:t xml:space="preserve">Cálculo del hash SHA-256 de las contraseñas (Seguridad.cs).</w:t>
+            </w:r>
+          </w:p>
+        </w:tc>
+      </w:tr>
+      <w:tr>
+        <w:trPr>
+          <w:cantSplit/>
+          <w:jc w:val="center"/>
+        </w:trPr>
+        <w:tc>
+          <w:tcPr>
+            <w:tcW w:w="1928" w:type="dxa"/>
+            <w:shd w:val="clear" w:color="auto" w:fill="FFFFFF"/>
+            <w:vAlign w:val="center"/>
+          </w:tcPr>
+          <w:p>
+            <w:pPr>
+              <w:spacing w:before="40" w:after="40" w:line="264" w:lineRule="auto"/>
+            </w:pPr>
+            <w:r>
+              <w:rPr>
+                <w:rFonts w:cs="Cambria"/>
+                <w:b/>
+                <w:sz w:val="19"/>
+              </w:rPr>
+              <w:t xml:space="preserve">System.Text</w:t>
+            </w:r>
+          </w:p>
+        </w:tc>
+        <w:tc>
+          <w:tcPr>
+            <w:tcW w:w="3742" w:type="dxa"/>
+            <w:shd w:val="clear" w:color="auto" w:fill="FFFFFF"/>
+            <w:vAlign w:val="center"/>
+          </w:tcPr>
+          <w:p>
+            <w:pPr>
+              <w:spacing w:before="40" w:after="40" w:line="264" w:lineRule="auto"/>
+              <w:rPr>
+                <w:lang w:val="es-ES"/>
+              </w:rPr>
+            </w:pPr>
+            <w:r>
+              <w:rPr>
+                <w:rFonts w:cs="Cambria"/>
+                <w:sz w:val="19"/>
+                <w:lang w:val="es-ES"/>
+              </w:rPr>
+              <w:t xml:space="preserve">Negocio</w:t>
+            </w:r>
+          </w:p>
+        </w:tc>
+        <w:tc>
+          <w:tcPr>
+            <w:tcW w:w="3685" w:type="dxa"/>
+            <w:shd w:val="clear" w:color="auto" w:fill="FFFFFF"/>
+            <w:vAlign w:val="center"/>
+          </w:tcPr>
+          <w:p>
+            <w:pPr>
+              <w:spacing w:before="40" w:after="40" w:line="264" w:lineRule="auto"/>
+            </w:pPr>
+            <w:r>
+              <w:rPr>
+                <w:rFonts w:cs="Cambria"/>
+                <w:sz w:val="19"/>
+              </w:rPr>
+              <w:t xml:space="preserve">Conversión del hash a texto hexadecimal con StringBuilder.</w:t>
+            </w:r>
+          </w:p>
+        </w:tc>
+      </w:tr>
+      <w:tr>
+        <w:trPr>
+          <w:cantSplit/>
+          <w:jc w:val="center"/>
+        </w:trPr>
+        <w:tc>
+          <w:tcPr>
+            <w:tcW w:w="1928" w:type="dxa"/>
+            <w:shd w:val="clear" w:color="auto" w:fill="FFFFFF"/>
+            <w:vAlign w:val="center"/>
+          </w:tcPr>
+          <w:p>
+            <w:pPr>
+              <w:spacing w:before="40" w:after="40" w:line="264" w:lineRule="auto"/>
+            </w:pPr>
+            <w:r>
+              <w:rPr>
+                <w:rFonts w:cs="Cambria"/>
+                <w:b/>
+                <w:sz w:val="19"/>
+              </w:rPr>
+              <w:t xml:space="preserve">System.Text.RegularExpressions</w:t>
+            </w:r>
+          </w:p>
+        </w:tc>
+        <w:tc>
+          <w:tcPr>
+            <w:tcW w:w="3742" w:type="dxa"/>
+            <w:shd w:val="clear" w:color="auto" w:fill="FFFFFF"/>
+            <w:vAlign w:val="center"/>
+          </w:tcPr>
+          <w:p>
+            <w:pPr>
+              <w:spacing w:before="40" w:after="40" w:line="264" w:lineRule="auto"/>
+              <w:rPr>
+                <w:lang w:val="es-ES"/>
+              </w:rPr>
+            </w:pPr>
+            <w:r>
+              <w:rPr>
+                <w:rFonts w:cs="Cambria"/>
+                <w:sz w:val="19"/>
+                <w:lang w:val="es-ES"/>
+              </w:rPr>
+              <w:t xml:space="preserve">Negocio</w:t>
+            </w:r>
+          </w:p>
+        </w:tc>
+        <w:tc>
+          <w:tcPr>
+            <w:tcW w:w="3685" w:type="dxa"/>
+            <w:shd w:val="clear" w:color="auto" w:fill="FFFFFF"/>
+            <w:vAlign w:val="center"/>
+          </w:tcPr>
+          <w:p>
+            <w:pPr>
+              <w:spacing w:before="40" w:after="40" w:line="264" w:lineRule="auto"/>
+            </w:pPr>
+            <w:r>
+              <w:rPr>
+                <w:rFonts w:cs="Cambria"/>
+                <w:sz w:val="19"/>
+              </w:rPr>
+              <w:t xml:space="preserve">Validación del formato del correo electrónico (Validaciones.cs).</w:t>
+            </w:r>
+          </w:p>
+        </w:tc>
+      </w:tr>
+      <w:tr>
+        <w:trPr>
+          <w:cantSplit/>
+          <w:jc w:val="center"/>
+        </w:trPr>
+        <w:tc>
+          <w:tcPr>
+            <w:tcW w:w="1928" w:type="dxa"/>
+            <w:shd w:val="clear" w:color="auto" w:fill="FFFFFF"/>
+            <w:vAlign w:val="center"/>
+          </w:tcPr>
+          <w:p>
+            <w:pPr>
+              <w:spacing w:before="40" w:after="40" w:line="264" w:lineRule="auto"/>
+            </w:pPr>
+            <w:r>
+              <w:rPr>
+                <w:rFonts w:cs="Cambria"/>
+                <w:b/>
+                <w:sz w:val="19"/>
+              </w:rPr>
+              <w:t xml:space="preserve">System.Collections.Generic</w:t>
+            </w:r>
+          </w:p>
+        </w:tc>
+        <w:tc>
+          <w:tcPr>
+            <w:tcW w:w="3742" w:type="dxa"/>
+            <w:shd w:val="clear" w:color="auto" w:fill="FFFFFF"/>
+            <w:vAlign w:val="center"/>
+          </w:tcPr>
+          <w:p>
+            <w:pPr>
+              <w:spacing w:before="40" w:after="40" w:line="264" w:lineRule="auto"/>
+              <w:rPr>
+                <w:lang w:val="es-ES"/>
+              </w:rPr>
+            </w:pPr>
+            <w:r>
+              <w:rPr>
+                <w:rFonts w:cs="Cambria"/>
+                <w:sz w:val="19"/>
+                <w:lang w:val="es-ES"/>
+              </w:rPr>
+              <w:t xml:space="preserve">Todas las capas</w:t>
+            </w:r>
+          </w:p>
+        </w:tc>
+        <w:tc>
+          <w:tcPr>
+            <w:tcW w:w="3685" w:type="dxa"/>
+            <w:shd w:val="clear" w:color="auto" w:fill="FFFFFF"/>
+            <w:vAlign w:val="center"/>
+          </w:tcPr>
+          <w:p>
+            <w:pPr>
+              <w:spacing w:before="40" w:after="40" w:line="264" w:lineRule="auto"/>
+            </w:pPr>
+            <w:r>
+              <w:rPr>
+                <w:rFonts w:cs="Cambria"/>
+                <w:sz w:val="19"/>
+              </w:rPr>
+              <w:t xml:space="preserve">Listas tipadas List&lt;T&gt; para mover colecciones de entidades entre capas.</w:t>
+            </w:r>
+          </w:p>
+        </w:tc>
+      </w:tr>
+      <w:tr>
+        <w:trPr>
+          <w:cantSplit/>
+          <w:jc w:val="center"/>
+        </w:trPr>
+        <w:tc>
+          <w:tcPr>
+            <w:tcW w:w="1928" w:type="dxa"/>
+            <w:shd w:val="clear" w:color="auto" w:fill="FFFFFF"/>
+            <w:vAlign w:val="center"/>
+          </w:tcPr>
+          <w:p>
+            <w:pPr>
+              <w:spacing w:before="40" w:after="40" w:line="264" w:lineRule="auto"/>
+            </w:pPr>
+            <w:r>
+              <w:rPr>
+                <w:rFonts w:cs="Cambria"/>
+                <w:b/>
+                <w:sz w:val="19"/>
+              </w:rPr>
+              <w:t xml:space="preserve">System</w:t>
+            </w:r>
+          </w:p>
+        </w:tc>
+        <w:tc>
+          <w:tcPr>
+            <w:tcW w:w="3742" w:type="dxa"/>
+            <w:shd w:val="clear" w:color="auto" w:fill="FFFFFF"/>
+            <w:vAlign w:val="center"/>
+          </w:tcPr>
+          <w:p>
+            <w:pPr>
+              <w:spacing w:before="40" w:after="40" w:line="264" w:lineRule="auto"/>
+              <w:rPr>
+                <w:lang w:val="es-ES"/>
+              </w:rPr>
+            </w:pPr>
+            <w:r>
+              <w:rPr>
+                <w:rFonts w:cs="Cambria"/>
+                <w:sz w:val="19"/>
+                <w:lang w:val="es-ES"/>
+              </w:rPr>
+              <w:t xml:space="preserve">Todas las capas</w:t>
+            </w:r>
+          </w:p>
+        </w:tc>
+        <w:tc>
+          <w:tcPr>
+            <w:tcW w:w="3685" w:type="dxa"/>
+            <w:shd w:val="clear" w:color="auto" w:fill="FFFFFF"/>
+            <w:vAlign w:val="center"/>
+          </w:tcPr>
+          <w:p>
+            <w:pPr>
+              <w:spacing w:before="40" w:after="40" w:line="264" w:lineRule="auto"/>
+            </w:pPr>
+            <w:r>
+              <w:rPr>
+                <w:rFonts w:cs="Cambria"/>
+                <w:sz w:val="19"/>
+              </w:rPr>
+              <w:t xml:space="preserve">Tipos base (decimal, DateTime), excepciones y utilidades generales.</w:t>
+            </w:r>
+          </w:p>
+        </w:tc>
+      </w:tr>
+    </w:tbl>
+    <w:p>
+      <w:pPr>
+        <w:spacing w:after="160" w:line="288" w:lineRule="auto"/>
+        <w:jc w:val="both"/>
+        <w:rPr>
+          <w:lang w:val="es-ES"/>
+        </w:rPr>
+      </w:pPr>
+      <w:r/>
+    </w:p>
+    <w:p>
+      <w:pPr>
+        <w:keepNext/>
+        <w:pBdr>
+          <w:bottom w:val="single" w:sz="6" w:space="6" w:color="0B4F6C"/>
+        </w:pBdr>
+        <w:spacing w:before="360" w:after="160"/>
+        <w:rPr>
+          <w:lang w:val="es-ES"/>
+        </w:rPr>
+      </w:pPr>
+      <w:r>
+        <w:rPr>
+          <w:rFonts w:ascii="Calibri" w:hAnsi="Calibri" w:cs="Calibri"/>
+          <w:b/>
+          <w:color w:val="0B4F6C"/>
+          <w:sz w:val="30"/>
+          <w:lang w:val="es-ES"/>
+        </w:rPr>
+        <w:t>14.  Pruebas de seguridad realizadas</w:t>
+      </w:r>
+    </w:p>
+    <w:p>
+      <w:pPr>
+        <w:spacing w:after="160" w:line="288" w:lineRule="auto"/>
+        <w:jc w:val="both"/>
+        <w:rPr>
+          <w:lang w:val="es-ES"/>
+        </w:rPr>
+      </w:pPr>
+      <w:r>
+        <w:t>Además de las validaciones descritas en la sección 8, se realizaron pruebas específicas para comprobar que las protecciones del sistema funcionan en la práctica. La tabla documenta cada prueba, la forma en que se ejecutó y el resultado obtenido:</w:t>
+      </w:r>
+    </w:p>
+    <w:tbl>
+      <w:tblPr>
+        <w:tblW w:w="5000" w:type="pct"/>
+        <w:jc w:val="center"/>
+        <w:tblBorders>
+          <w:top w:val="single" w:sz="6" w:space="0" w:color="CBD5E0"/>
+          <w:left w:val="single" w:sz="6" w:space="0" w:color="CBD5E0"/>
+          <w:bottom w:val="single" w:sz="6" w:space="0" w:color="CBD5E0"/>
+          <w:right w:val="single" w:sz="6" w:space="0" w:color="CBD5E0"/>
+          <w:insideH w:val="single" w:sz="6" w:space="0" w:color="CBD5E0"/>
+          <w:insideV w:val="single" w:sz="6" w:space="0" w:color="CBD5E0"/>
+        </w:tblBorders>
+        <w:tblLook w:val="04A0" w:firstRow="1" w:lastRow="0" w:firstColumn="1" w:lastColumn="0" w:noHBand="0" w:noVBand="1"/>
+      </w:tblPr>
+      <w:tblGrid>
+        <w:gridCol w:w="1983"/>
+        <w:gridCol w:w="3849"/>
+        <w:gridCol w:w="3790"/>
+      </w:tblGrid>
+      <w:tr>
+        <w:trPr>
+          <w:cantSplit/>
+          <w:jc w:val="center"/>
+        </w:trPr>
+        <w:tc>
+          <w:tcPr>
+            <w:tcW w:w="1928" w:type="dxa"/>
+            <w:shd w:val="clear" w:color="auto" w:fill="0B4F6C"/>
+            <w:vAlign w:val="center"/>
+          </w:tcPr>
+          <w:p>
+            <w:pPr>
+              <w:spacing w:before="40" w:after="40"/>
+            </w:pPr>
+            <w:r>
+              <w:rPr>
+                <w:rFonts w:ascii="Calibri" w:hAnsi="Calibri" w:cs="Calibri"/>
+                <w:b/>
+                <w:color w:val="FFFFFF"/>
+                <w:sz w:val="19"/>
+              </w:rPr>
+              <w:t xml:space="preserve">Prueba realizada</w:t>
+            </w:r>
+          </w:p>
+        </w:tc>
+        <w:tc>
+          <w:tcPr>
+            <w:tcW w:w="3742" w:type="dxa"/>
+            <w:shd w:val="clear" w:color="auto" w:fill="0B4F6C"/>
+            <w:vAlign w:val="center"/>
+          </w:tcPr>
+          <w:p>
+            <w:pPr>
+              <w:spacing w:before="40" w:after="40"/>
+            </w:pPr>
+            <w:r>
+              <w:rPr>
+                <w:rFonts w:ascii="Calibri" w:hAnsi="Calibri" w:cs="Calibri"/>
+                <w:b/>
+                <w:color w:val="FFFFFF"/>
+                <w:sz w:val="19"/>
+              </w:rPr>
+              <w:t xml:space="preserve">Cómo se probó</w:t>
+            </w:r>
+          </w:p>
+        </w:tc>
+        <w:tc>
+          <w:tcPr>
+            <w:tcW w:w="3685" w:type="dxa"/>
+            <w:shd w:val="clear" w:color="auto" w:fill="0B4F6C"/>
+            <w:vAlign w:val="center"/>
+          </w:tcPr>
+          <w:p>
+            <w:pPr>
+              <w:spacing w:before="40" w:after="40"/>
+            </w:pPr>
+            <w:r>
+              <w:rPr>
+                <w:rFonts w:ascii="Calibri" w:hAnsi="Calibri" w:cs="Calibri"/>
+                <w:b/>
+                <w:color w:val="FFFFFF"/>
+                <w:sz w:val="19"/>
+              </w:rPr>
+              <w:t xml:space="preserve">Resultado obtenido</w:t>
+            </w:r>
+          </w:p>
+        </w:tc>
+      </w:tr>
+      <w:tr>
+        <w:trPr>
+          <w:cantSplit/>
+          <w:jc w:val="center"/>
+        </w:trPr>
+        <w:tc>
+          <w:tcPr>
+            <w:tcW w:w="1928" w:type="dxa"/>
+            <w:shd w:val="clear" w:color="auto" w:fill="FFFFFF"/>
+            <w:vAlign w:val="center"/>
+          </w:tcPr>
+          <w:p>
+            <w:pPr>
+              <w:spacing w:before="40" w:after="40" w:line="264" w:lineRule="auto"/>
+            </w:pPr>
+            <w:r>
+              <w:rPr>
+                <w:rFonts w:cs="Cambria"/>
+                <w:b/>
+                <w:sz w:val="19"/>
+              </w:rPr>
+              <w:t xml:space="preserve">1. Inyección SQL en el inicio de sesión</w:t>
+            </w:r>
+          </w:p>
+        </w:tc>
+        <w:tc>
+          <w:tcPr>
+            <w:tcW w:w="3742" w:type="dxa"/>
+            <w:shd w:val="clear" w:color="auto" w:fill="FFFFFF"/>
+            <w:vAlign w:val="center"/>
+          </w:tcPr>
+          <w:p>
+            <w:pPr>
+              <w:spacing w:before="40" w:after="40" w:line="264" w:lineRule="auto"/>
+              <w:rPr>
+                <w:lang w:val="es-ES"/>
+              </w:rPr>
+            </w:pPr>
+            <w:r>
+              <w:rPr>
+                <w:rFonts w:cs="Cambria"/>
+                <w:sz w:val="19"/>
+                <w:lang w:val="es-ES"/>
+              </w:rPr>
+              <w:t xml:space="preserve">Se intentó iniciar sesión escribiendo ' OR '1'='1 como usuario y contraseña, y se escribieron comillas y fragmentos de SQL en los cuadros de búsqueda.</w:t>
+            </w:r>
+          </w:p>
+        </w:tc>
+        <w:tc>
+          <w:tcPr>
+            <w:tcW w:w="3685" w:type="dxa"/>
+            <w:shd w:val="clear" w:color="auto" w:fill="FFFFFF"/>
+            <w:vAlign w:val="center"/>
+          </w:tcPr>
+          <w:p>
+            <w:pPr>
+              <w:spacing w:before="40" w:after="40" w:line="264" w:lineRule="auto"/>
+            </w:pPr>
+            <w:r>
+              <w:rPr>
+                <w:rFonts w:cs="Cambria"/>
+                <w:sz w:val="19"/>
+              </w:rPr>
+              <w:t xml:space="preserve">Acceso denegado. Lo escrito se trata como dato y no como SQL, porque el 100 % del acceso a datos usa consultas parametrizadas (ConexionBD.Parametro); no existe concatenación de texto del usuario en ninguna sentencia.</w:t>
+            </w:r>
+          </w:p>
+        </w:tc>
+      </w:tr>
+      <w:tr>
+        <w:trPr>
+          <w:cantSplit/>
+          <w:jc w:val="center"/>
+        </w:trPr>
+        <w:tc>
+          <w:tcPr>
+            <w:tcW w:w="1928" w:type="dxa"/>
+            <w:shd w:val="clear" w:color="auto" w:fill="FFFFFF"/>
+            <w:vAlign w:val="center"/>
+          </w:tcPr>
+          <w:p>
+            <w:pPr>
+              <w:spacing w:before="40" w:after="40" w:line="264" w:lineRule="auto"/>
+            </w:pPr>
+            <w:r>
+              <w:rPr>
+                <w:rFonts w:cs="Cambria"/>
+                <w:b/>
+                <w:sz w:val="19"/>
+              </w:rPr>
+              <w:t xml:space="preserve">2. Almacenamiento de contraseñas</w:t>
+            </w:r>
+          </w:p>
+        </w:tc>
+        <w:tc>
+          <w:tcPr>
+            <w:tcW w:w="3742" w:type="dxa"/>
+            <w:shd w:val="clear" w:color="auto" w:fill="FFFFFF"/>
+            <w:vAlign w:val="center"/>
+          </w:tcPr>
+          <w:p>
+            <w:pPr>
+              <w:spacing w:before="40" w:after="40" w:line="264" w:lineRule="auto"/>
+              <w:rPr>
+                <w:lang w:val="es-ES"/>
+              </w:rPr>
+            </w:pPr>
+            <w:r>
+              <w:rPr>
+                <w:rFonts w:cs="Cambria"/>
+                <w:sz w:val="19"/>
+                <w:lang w:val="es-ES"/>
+              </w:rPr>
+              <w:t xml:space="preserve">Se consultó directamente la tabla Usuarios en SQL Server para ver cómo quedan guardadas las contraseñas.</w:t>
+            </w:r>
+          </w:p>
+        </w:tc>
+        <w:tc>
+          <w:tcPr>
+            <w:tcW w:w="3685" w:type="dxa"/>
+            <w:shd w:val="clear" w:color="auto" w:fill="FFFFFF"/>
+            <w:vAlign w:val="center"/>
+          </w:tcPr>
+          <w:p>
+            <w:pPr>
+              <w:spacing w:before="40" w:after="40" w:line="264" w:lineRule="auto"/>
+            </w:pPr>
+            <w:r>
+              <w:rPr>
+                <w:rFonts w:cs="Cambria"/>
+                <w:sz w:val="19"/>
+              </w:rPr>
+              <w:t xml:space="preserve">Las contraseñas aparecen como hash SHA-256 de 64 caracteres hexadecimales; en ninguna tabla de la base de datos existe una contraseña en texto plano.</w:t>
+            </w:r>
+          </w:p>
+        </w:tc>
+      </w:tr>
+      <w:tr>
+        <w:trPr>
+          <w:cantSplit/>
+          <w:jc w:val="center"/>
+        </w:trPr>
+        <w:tc>
+          <w:tcPr>
+            <w:tcW w:w="1928" w:type="dxa"/>
+            <w:shd w:val="clear" w:color="auto" w:fill="FFFFFF"/>
+            <w:vAlign w:val="center"/>
+          </w:tcPr>
+          <w:p>
+            <w:pPr>
+              <w:spacing w:before="40" w:after="40" w:line="264" w:lineRule="auto"/>
+            </w:pPr>
+            <w:r>
+              <w:rPr>
+                <w:rFonts w:cs="Cambria"/>
+                <w:b/>
+                <w:sz w:val="19"/>
+              </w:rPr>
+              <w:t xml:space="preserve">3. Control de acceso por rol</w:t>
+            </w:r>
+          </w:p>
+        </w:tc>
+        <w:tc>
+          <w:tcPr>
+            <w:tcW w:w="3742" w:type="dxa"/>
+            <w:shd w:val="clear" w:color="auto" w:fill="FFFFFF"/>
+            <w:vAlign w:val="center"/>
+          </w:tcPr>
+          <w:p>
+            <w:pPr>
+              <w:spacing w:before="40" w:after="40" w:line="264" w:lineRule="auto"/>
+              <w:rPr>
+                <w:lang w:val="es-ES"/>
+              </w:rPr>
+            </w:pPr>
+            <w:r>
+              <w:rPr>
+                <w:rFonts w:cs="Cambria"/>
+                <w:sz w:val="19"/>
+                <w:lang w:val="es-ES"/>
+              </w:rPr>
+              <w:t xml:space="preserve">Se inició sesión con el usuario cajero (rol Usuario) y se intentó abrir el módulo de Usuarios.</w:t>
+            </w:r>
+          </w:p>
+        </w:tc>
+        <w:tc>
+          <w:tcPr>
+            <w:tcW w:w="3685" w:type="dxa"/>
+            <w:shd w:val="clear" w:color="auto" w:fill="FFFFFF"/>
+            <w:vAlign w:val="center"/>
+          </w:tcPr>
+          <w:p>
+            <w:pPr>
+              <w:spacing w:before="40" w:after="40" w:line="264" w:lineRule="auto"/>
+            </w:pPr>
+            <w:r>
+              <w:rPr>
+                <w:rFonts w:cs="Cambria"/>
+                <w:sz w:val="19"/>
+              </w:rPr>
+              <w:t xml:space="preserve">El sistema muestra la advertencia «Solo un usuario Administrador puede gestionar los usuarios del sistema» y no abre el módulo.</w:t>
+            </w:r>
+          </w:p>
+        </w:tc>
+      </w:tr>
+      <w:tr>
+        <w:trPr>
+          <w:cantSplit/>
+          <w:jc w:val="center"/>
+        </w:trPr>
+        <w:tc>
+          <w:tcPr>
+            <w:tcW w:w="1928" w:type="dxa"/>
+            <w:shd w:val="clear" w:color="auto" w:fill="FFFFFF"/>
+            <w:vAlign w:val="center"/>
+          </w:tcPr>
+          <w:p>
+            <w:pPr>
+              <w:spacing w:before="40" w:after="40" w:line="264" w:lineRule="auto"/>
+            </w:pPr>
+            <w:r>
+              <w:rPr>
+                <w:rFonts w:cs="Cambria"/>
+                <w:b/>
+                <w:sz w:val="19"/>
+              </w:rPr>
+              <w:t xml:space="preserve">4. Autoeliminación de la cuenta en sesión</w:t>
+            </w:r>
+          </w:p>
+        </w:tc>
+        <w:tc>
+          <w:tcPr>
+            <w:tcW w:w="3742" w:type="dxa"/>
+            <w:shd w:val="clear" w:color="auto" w:fill="FFFFFF"/>
+            <w:vAlign w:val="center"/>
+          </w:tcPr>
+          <w:p>
+            <w:pPr>
+              <w:spacing w:before="40" w:after="40" w:line="264" w:lineRule="auto"/>
+              <w:rPr>
+                <w:lang w:val="es-ES"/>
+              </w:rPr>
+            </w:pPr>
+            <w:r>
+              <w:rPr>
+                <w:rFonts w:cs="Cambria"/>
+                <w:sz w:val="19"/>
+                <w:lang w:val="es-ES"/>
+              </w:rPr>
+              <w:t xml:space="preserve">Con la sesión de admin abierta se intentó eliminar la propia cuenta admin desde el módulo de Usuarios.</w:t>
+            </w:r>
+          </w:p>
+        </w:tc>
+        <w:tc>
+          <w:tcPr>
+            <w:tcW w:w="3685" w:type="dxa"/>
+            <w:shd w:val="clear" w:color="auto" w:fill="FFFFFF"/>
+            <w:vAlign w:val="center"/>
+          </w:tcPr>
+          <w:p>
+            <w:pPr>
+              <w:spacing w:before="40" w:after="40" w:line="264" w:lineRule="auto"/>
+            </w:pPr>
+            <w:r>
+              <w:rPr>
+                <w:rFonts w:cs="Cambria"/>
+                <w:sz w:val="19"/>
+              </w:rPr>
+              <w:t xml:space="preserve">La operación se bloquea: el sistema no permite que un usuario elimine la cuenta con la que tiene la sesión abierta.</w:t>
+            </w:r>
+          </w:p>
+        </w:tc>
+      </w:tr>
+      <w:tr>
+        <w:trPr>
+          <w:cantSplit/>
+          <w:jc w:val="center"/>
+        </w:trPr>
+        <w:tc>
+          <w:tcPr>
+            <w:tcW w:w="1928" w:type="dxa"/>
+            <w:shd w:val="clear" w:color="auto" w:fill="FFFFFF"/>
+            <w:vAlign w:val="center"/>
+          </w:tcPr>
+          <w:p>
+            <w:pPr>
+              <w:spacing w:before="40" w:after="40" w:line="264" w:lineRule="auto"/>
+            </w:pPr>
+            <w:r>
+              <w:rPr>
+                <w:rFonts w:cs="Cambria"/>
+                <w:b/>
+                <w:sz w:val="19"/>
+              </w:rPr>
+              <w:t xml:space="preserve">5. Validación de entradas</w:t>
+            </w:r>
+          </w:p>
+        </w:tc>
+        <w:tc>
+          <w:tcPr>
+            <w:tcW w:w="3742" w:type="dxa"/>
+            <w:shd w:val="clear" w:color="auto" w:fill="FFFFFF"/>
+            <w:vAlign w:val="center"/>
+          </w:tcPr>
+          <w:p>
+            <w:pPr>
+              <w:spacing w:before="40" w:after="40" w:line="264" w:lineRule="auto"/>
+              <w:rPr>
+                <w:lang w:val="es-ES"/>
+              </w:rPr>
+            </w:pPr>
+            <w:r>
+              <w:rPr>
+                <w:rFonts w:cs="Cambria"/>
+                <w:sz w:val="19"/>
+                <w:lang w:val="es-ES"/>
+              </w:rPr>
+              <w:t xml:space="preserve">Se probaron montos y cantidades negativos, texto en campos numéricos, campos obligatorios vacíos y correos con formato incorrecto.</w:t>
+            </w:r>
+          </w:p>
+        </w:tc>
+        <w:tc>
+          <w:tcPr>
+            <w:tcW w:w="3685" w:type="dxa"/>
+            <w:shd w:val="clear" w:color="auto" w:fill="FFFFFF"/>
+            <w:vAlign w:val="center"/>
+          </w:tcPr>
+          <w:p>
+            <w:pPr>
+              <w:spacing w:before="40" w:after="40" w:line="264" w:lineRule="auto"/>
+            </w:pPr>
+            <w:r>
+              <w:rPr>
+                <w:rFonts w:cs="Cambria"/>
+                <w:sz w:val="19"/>
+              </w:rPr>
+              <w:t xml:space="preserve">Todos los casos se rechazan con un mensaje claro (NegocioException) antes de llegar a la base de datos, sin cerrar la aplicación.</w:t>
+            </w:r>
+          </w:p>
+        </w:tc>
+      </w:tr>
+      <w:tr>
+        <w:trPr>
+          <w:cantSplit/>
+          <w:jc w:val="center"/>
+        </w:trPr>
+        <w:tc>
+          <w:tcPr>
+            <w:tcW w:w="1928" w:type="dxa"/>
+            <w:shd w:val="clear" w:color="auto" w:fill="FFFFFF"/>
+            <w:vAlign w:val="center"/>
+          </w:tcPr>
+          <w:p>
+            <w:pPr>
+              <w:spacing w:before="40" w:after="40" w:line="264" w:lineRule="auto"/>
+            </w:pPr>
+            <w:r>
+              <w:rPr>
+                <w:rFonts w:cs="Cambria"/>
+                <w:b/>
+                <w:sz w:val="19"/>
+              </w:rPr>
+              <w:t xml:space="preserve">6. Reglas de negocio como defensa</w:t>
+            </w:r>
+          </w:p>
+        </w:tc>
+        <w:tc>
+          <w:tcPr>
+            <w:tcW w:w="3742" w:type="dxa"/>
+            <w:shd w:val="clear" w:color="auto" w:fill="FFFFFF"/>
+            <w:vAlign w:val="center"/>
+          </w:tcPr>
+          <w:p>
+            <w:pPr>
+              <w:spacing w:before="40" w:after="40" w:line="264" w:lineRule="auto"/>
+              <w:rPr>
+                <w:lang w:val="es-ES"/>
+              </w:rPr>
+            </w:pPr>
+            <w:r>
+              <w:rPr>
+                <w:rFonts w:cs="Cambria"/>
+                <w:sz w:val="19"/>
+                <w:lang w:val="es-ES"/>
+              </w:rPr>
+              <w:t xml:space="preserve">Se intentó facturar más unidades de las existentes en stock y registrar una venta a crédito que supera el límite de crédito del cliente.</w:t>
+            </w:r>
+          </w:p>
+        </w:tc>
+        <w:tc>
+          <w:tcPr>
+            <w:tcW w:w="3685" w:type="dxa"/>
+            <w:shd w:val="clear" w:color="auto" w:fill="FFFFFF"/>
+            <w:vAlign w:val="center"/>
+          </w:tcPr>
+          <w:p>
+            <w:pPr>
+              <w:spacing w:before="40" w:after="40" w:line="264" w:lineRule="auto"/>
+            </w:pPr>
+            <w:r>
+              <w:rPr>
+                <w:rFonts w:cs="Cambria"/>
+                <w:sz w:val="19"/>
+              </w:rPr>
+              <w:t xml:space="preserve">Ambas operaciones se bloquean con el mensaje correspondiente y no se guarda ningún dato.</w:t>
+            </w:r>
+          </w:p>
+        </w:tc>
+      </w:tr>
+      <w:tr>
+        <w:trPr>
+          <w:cantSplit/>
+          <w:jc w:val="center"/>
+        </w:trPr>
+        <w:tc>
+          <w:tcPr>
+            <w:tcW w:w="1928" w:type="dxa"/>
+            <w:shd w:val="clear" w:color="auto" w:fill="FFFFFF"/>
+            <w:vAlign w:val="center"/>
+          </w:tcPr>
+          <w:p>
+            <w:pPr>
+              <w:spacing w:before="40" w:after="40" w:line="264" w:lineRule="auto"/>
+            </w:pPr>
+            <w:r>
+              <w:rPr>
+                <w:rFonts w:cs="Cambria"/>
+                <w:b/>
+                <w:sz w:val="19"/>
+              </w:rPr>
+              <w:t xml:space="preserve">7. Integridad transaccional</w:t>
+            </w:r>
+          </w:p>
+        </w:tc>
+        <w:tc>
+          <w:tcPr>
+            <w:tcW w:w="3742" w:type="dxa"/>
+            <w:shd w:val="clear" w:color="auto" w:fill="FFFFFF"/>
+            <w:vAlign w:val="center"/>
+          </w:tcPr>
+          <w:p>
+            <w:pPr>
+              <w:spacing w:before="40" w:after="40" w:line="264" w:lineRule="auto"/>
+              <w:rPr>
+                <w:lang w:val="es-ES"/>
+              </w:rPr>
+            </w:pPr>
+            <w:r>
+              <w:rPr>
+                <w:rFonts w:cs="Cambria"/>
+                <w:sz w:val="19"/>
+                <w:lang w:val="es-ES"/>
+              </w:rPr>
+              <w:t xml:space="preserve">Se forzó un error a mitad del guardado de una factura (operación que toca varias tablas a la vez).</w:t>
+            </w:r>
+          </w:p>
+        </w:tc>
+        <w:tc>
+          <w:tcPr>
+            <w:tcW w:w="3685" w:type="dxa"/>
+            <w:shd w:val="clear" w:color="auto" w:fill="FFFFFF"/>
+            <w:vAlign w:val="center"/>
+          </w:tcPr>
+          <w:p>
+            <w:pPr>
+              <w:spacing w:before="40" w:after="40" w:line="264" w:lineRule="auto"/>
+            </w:pPr>
+            <w:r>
+              <w:rPr>
+                <w:rFonts w:cs="Cambria"/>
+                <w:sz w:val="19"/>
+              </w:rPr>
+              <w:t xml:space="preserve">El Rollback de la transacción deja la base de datos exactamente como estaba: no quedan facturas a medias, ni stock descontado, ni saldos alterados.</w:t>
+            </w:r>
+          </w:p>
+        </w:tc>
+      </w:tr>
+      <w:tr>
+        <w:trPr>
+          <w:cantSplit/>
+          <w:jc w:val="center"/>
+        </w:trPr>
+        <w:tc>
+          <w:tcPr>
+            <w:tcW w:w="1928" w:type="dxa"/>
+            <w:shd w:val="clear" w:color="auto" w:fill="FFFFFF"/>
+            <w:vAlign w:val="center"/>
+          </w:tcPr>
+          <w:p>
+            <w:pPr>
+              <w:spacing w:before="40" w:after="40" w:line="264" w:lineRule="auto"/>
+            </w:pPr>
+            <w:r>
+              <w:rPr>
+                <w:rFonts w:cs="Cambria"/>
+                <w:b/>
+                <w:sz w:val="19"/>
+              </w:rPr>
+              <w:t xml:space="preserve">8. Manejo global de errores</w:t>
+            </w:r>
+          </w:p>
+        </w:tc>
+        <w:tc>
+          <w:tcPr>
+            <w:tcW w:w="3742" w:type="dxa"/>
+            <w:shd w:val="clear" w:color="auto" w:fill="FFFFFF"/>
+            <w:vAlign w:val="center"/>
+          </w:tcPr>
+          <w:p>
+            <w:pPr>
+              <w:spacing w:before="40" w:after="40" w:line="264" w:lineRule="auto"/>
+              <w:rPr>
+                <w:lang w:val="es-ES"/>
+              </w:rPr>
+            </w:pPr>
+            <w:r>
+              <w:rPr>
+                <w:rFonts w:cs="Cambria"/>
+                <w:sz w:val="19"/>
+                <w:lang w:val="es-ES"/>
+              </w:rPr>
+              <w:t xml:space="preserve">Se provocaron errores inesperados, por ejemplo deteniendo el servicio de SQL Server con la aplicación abierta.</w:t>
+            </w:r>
+          </w:p>
+        </w:tc>
+        <w:tc>
+          <w:tcPr>
+            <w:tcW w:w="3685" w:type="dxa"/>
+            <w:shd w:val="clear" w:color="auto" w:fill="FFFFFF"/>
+            <w:vAlign w:val="center"/>
+          </w:tcPr>
+          <w:p>
+            <w:pPr>
+              <w:spacing w:before="40" w:after="40" w:line="264" w:lineRule="auto"/>
+            </w:pPr>
+            <w:r>
+              <w:rPr>
+                <w:rFonts w:cs="Cambria"/>
+                <w:sz w:val="19"/>
+              </w:rPr>
+              <w:t xml:space="preserve">El manejador global instalado en Program.cs captura la excepción y muestra un mensaje amigable; la aplicación no se cierra ni expone detalles técnicos internos.</w:t>
+            </w:r>
+          </w:p>
+        </w:tc>
+      </w:tr>
+    </w:tbl>
+    <w:p>
+      <w:pPr>
+        <w:spacing w:after="160" w:line="288" w:lineRule="auto"/>
+        <w:jc w:val="both"/>
+        <w:rPr>
+          <w:lang w:val="es-ES"/>
+        </w:rPr>
+      </w:pPr>
+      <w:r/>
+    </w:p>
+    <w:p>
+      <w:pPr>
+        <w:pageBreakBefore/>
+        <w:keepNext/>
+        <w:pBdr>
+          <w:bottom w:val="single" w:sz="6" w:space="6" w:color="0B4F6C"/>
+        </w:pBdr>
+        <w:spacing w:before="360" w:after="160"/>
+        <w:rPr>
+          <w:lang w:val="es-ES"/>
+        </w:rPr>
+      </w:pPr>
+      <w:r>
+        <w:rPr>
+          <w:rFonts w:ascii="Calibri" w:hAnsi="Calibri" w:cs="Calibri"/>
+          <w:b/>
+          <w:color w:val="0B4F6C"/>
+          <w:sz w:val="30"/>
+          <w:lang w:val="es-ES"/>
+        </w:rPr>
+        <w:t>15.  Mejoras futuras del sistema</w:t>
+      </w:r>
+    </w:p>
+    <w:p>
+      <w:pPr>
+        <w:spacing w:after="160" w:line="288" w:lineRule="auto"/>
+        <w:jc w:val="both"/>
+        <w:rPr>
+          <w:lang w:val="es-ES"/>
+        </w:rPr>
+      </w:pPr>
+      <w:r>
+        <w:t>El sistema cumple los objetivos planteados para la asignatura; sin embargo, durante el desarrollo el equipo identificó mejoras que podrían implementarse en versiones futuras para acercarlo aún más a un producto comercial:</w:t>
+      </w:r>
+    </w:p>
+    <w:p>
+      <w:pPr>
+        <w:spacing w:after="160" w:line="288" w:lineRule="auto"/>
+        <w:jc w:val="both"/>
+        <w:rPr>
+          <w:lang w:val="es-ES"/>
+        </w:rPr>
+      </w:pPr>
+      <w:r>
+        <w:rPr>
+          <w:b/>
+        </w:rPr>
+        <w:t>•  Impresión y exportación de facturas.</w:t>
+      </w:r>
+      <w:r>
+        <w:t xml:space="preserve"> Generar la factura en PDF con el formato de la empresa y enviarla por correo al cliente.</w:t>
+      </w:r>
+    </w:p>
+    <w:p>
+      <w:pPr>
+        <w:spacing w:after="160" w:line="288" w:lineRule="auto"/>
+        <w:jc w:val="both"/>
+        <w:rPr>
+          <w:lang w:val="es-ES"/>
+        </w:rPr>
+      </w:pPr>
+      <w:r>
+        <w:rPr>
+          <w:b/>
+        </w:rPr>
+        <w:t>•  Comprobantes fiscales (NCF).</w:t>
+      </w:r>
+      <w:r>
+        <w:t xml:space="preserve"> Incorporar la numeración de comprobantes fiscales de la DGII para que las facturas tengan validez fiscal en la República Dominicana.</w:t>
+      </w:r>
+    </w:p>
+    <w:p>
+      <w:pPr>
+        <w:spacing w:after="160" w:line="288" w:lineRule="auto"/>
+        <w:jc w:val="both"/>
+        <w:rPr>
+          <w:lang w:val="es-ES"/>
+        </w:rPr>
+      </w:pPr>
+      <w:r>
+        <w:rPr>
+          <w:b/>
+        </w:rPr>
+        <w:t>•  Reportes y gráficos.</w:t>
+      </w:r>
+      <w:r>
+        <w:t xml:space="preserve"> Ventas por período, productos más vendidos, clientes con mayor deuda y antigüedad de los saldos por cobrar y por pagar.</w:t>
+      </w:r>
+    </w:p>
+    <w:p>
+      <w:pPr>
+        <w:spacing w:after="160" w:line="288" w:lineRule="auto"/>
+        <w:jc w:val="both"/>
+        <w:rPr>
+          <w:lang w:val="es-ES"/>
+        </w:rPr>
+      </w:pPr>
+      <w:r>
+        <w:rPr>
+          <w:b/>
+        </w:rPr>
+        <w:t>•  Alertas automáticas.</w:t>
+      </w:r>
+      <w:r>
+        <w:t xml:space="preserve"> Avisos de facturas vencidas, límites de crédito próximos a agotarse y productos con stock bajo el mínimo.</w:t>
+      </w:r>
+    </w:p>
+    <w:p>
+      <w:pPr>
+        <w:spacing w:after="160" w:line="288" w:lineRule="auto"/>
+        <w:jc w:val="both"/>
+        <w:rPr>
+          <w:lang w:val="es-ES"/>
+        </w:rPr>
+      </w:pPr>
+      <w:r>
+        <w:rPr>
+          <w:b/>
+        </w:rPr>
+        <w:t>•  Bitácora de auditoría.</w:t>
+      </w:r>
+      <w:r>
+        <w:t xml:space="preserve"> Registrar qué usuario hizo cada operación (creación, modificación, anulación) con fecha y hora, para trazabilidad completa.</w:t>
+      </w:r>
+    </w:p>
+    <w:p>
+      <w:pPr>
+        <w:spacing w:after="160" w:line="288" w:lineRule="auto"/>
+        <w:jc w:val="both"/>
+        <w:rPr>
+          <w:lang w:val="es-ES"/>
+        </w:rPr>
+      </w:pPr>
+      <w:r>
+        <w:rPr>
+          <w:b/>
+        </w:rPr>
+        <w:t>•  Descuentos y listas de precios.</w:t>
+      </w:r>
+      <w:r>
+        <w:t xml:space="preserve"> Descuentos por producto, por cliente o por volumen, y precios diferenciados por tipo de cliente.</w:t>
+      </w:r>
+    </w:p>
+    <w:p>
+      <w:pPr>
+        <w:spacing w:after="160" w:line="288" w:lineRule="auto"/>
+        <w:jc w:val="both"/>
+        <w:rPr>
+          <w:lang w:val="es-ES"/>
+        </w:rPr>
+      </w:pPr>
+      <w:r>
+        <w:rPr>
+          <w:b/>
+        </w:rPr>
+        <w:t>•  Múltiples almacenes y sucursales.</w:t>
+      </w:r>
+      <w:r>
+        <w:t xml:space="preserve"> Controlar el inventario por ubicación y consolidar las ventas de varias sucursales.</w:t>
+      </w:r>
+    </w:p>
+    <w:p>
+      <w:pPr>
+        <w:spacing w:after="160" w:line="288" w:lineRule="auto"/>
+        <w:jc w:val="both"/>
+        <w:rPr>
+          <w:lang w:val="es-ES"/>
+        </w:rPr>
+      </w:pPr>
+      <w:r>
+        <w:rPr>
+          <w:b/>
+        </w:rPr>
+        <w:t>•  Seguridad reforzada.</w:t>
+      </w:r>
+      <w:r>
+        <w:t xml:space="preserve"> Cifrar la cadena de conexión, agregar salt al hash de contraseñas y aplicar políticas de contraseña (complejidad y expiración).</w:t>
+      </w:r>
+    </w:p>
+    <w:p>
+      <w:pPr>
+        <w:spacing w:after="160" w:line="288" w:lineRule="auto"/>
+        <w:jc w:val="both"/>
+        <w:rPr>
+          <w:lang w:val="es-ES"/>
+        </w:rPr>
+      </w:pPr>
+      <w:r>
+        <w:rPr>
+          <w:b/>
+        </w:rPr>
+        <w:t>•  Respaldo automático.</w:t>
+      </w:r>
+      <w:r>
+        <w:t xml:space="preserve"> Programar copias de seguridad periódicas de la base de datos desde la propia aplicación.</w:t>
+      </w:r>
+    </w:p>
+    <w:p>
+      <w:pPr>
+        <w:spacing w:after="160" w:line="288" w:lineRule="auto"/>
+        <w:jc w:val="both"/>
+        <w:rPr>
+          <w:lang w:val="es-ES"/>
+        </w:rPr>
+      </w:pPr>
+      <w:r>
+        <w:rPr>
+          <w:b/>
+        </w:rPr>
+        <w:t>•  Migración tecnológica.</w:t>
+      </w:r>
+      <w:r>
+        <w:t xml:space="preserve"> Llevar el sistema a .NET moderno y evaluar una versión web para acceder desde cualquier dispositivo.</w:t>
+      </w:r>
+    </w:p>
+    <w:p>
+      <w:pPr>
+        <w:pageBreakBefore/>
+        <w:keepNext/>
+        <w:pBdr>
+          <w:bottom w:val="single" w:sz="6" w:space="6" w:color="0B4F6C"/>
+        </w:pBdr>
+        <w:spacing w:before="360" w:after="160"/>
+        <w:rPr>
+          <w:lang w:val="es-ES"/>
+        </w:rPr>
+      </w:pPr>
+      <w:r>
+        <w:rPr>
+          <w:rFonts w:ascii="Calibri" w:hAnsi="Calibri" w:cs="Calibri"/>
+          <w:b/>
+          <w:color w:val="0B4F6C"/>
+          <w:sz w:val="30"/>
+          <w:lang w:val="es-ES"/>
+        </w:rPr>
+        <w:t>16.  Glosario de términos</w:t>
+      </w:r>
+    </w:p>
+    <w:p>
+      <w:pPr>
+        <w:spacing w:after="160" w:line="288" w:lineRule="auto"/>
+        <w:jc w:val="both"/>
+        <w:rPr>
+          <w:lang w:val="es-ES"/>
+        </w:rPr>
+      </w:pPr>
+      <w:r>
+        <w:t>Definiciones breves de los términos técnicos y contables empleados a lo largo de este informe:</w:t>
+      </w:r>
+    </w:p>
+    <w:tbl>
+      <w:tblPr>
+        <w:tblW w:w="5000" w:type="pct"/>
+        <w:jc w:val="center"/>
+        <w:tblBorders>
+          <w:top w:val="single" w:sz="6" w:space="0" w:color="CBD5E0"/>
+          <w:left w:val="single" w:sz="6" w:space="0" w:color="CBD5E0"/>
+          <w:bottom w:val="single" w:sz="6" w:space="0" w:color="CBD5E0"/>
+          <w:right w:val="single" w:sz="6" w:space="0" w:color="CBD5E0"/>
+          <w:insideH w:val="single" w:sz="6" w:space="0" w:color="CBD5E0"/>
+          <w:insideV w:val="single" w:sz="6" w:space="0" w:color="CBD5E0"/>
+        </w:tblBorders>
+        <w:tblLook w:val="04A0" w:firstRow="1" w:lastRow="0" w:firstColumn="1" w:lastColumn="0" w:noHBand="0" w:noVBand="1"/>
+      </w:tblPr>
+      <w:tblGrid>
+        <w:gridCol w:w="2799"/>
+        <w:gridCol w:w="6823"/>
+      </w:tblGrid>
+      <w:tr>
+        <w:trPr>
+          <w:cantSplit/>
+          <w:jc w:val="center"/>
+        </w:trPr>
+        <w:tc>
+          <w:tcPr>
+            <w:tcW w:w="2721" w:type="dxa"/>
+            <w:shd w:val="clear" w:color="auto" w:fill="0B4F6C"/>
+            <w:vAlign w:val="center"/>
+          </w:tcPr>
+          <w:p>
+            <w:pPr>
+              <w:spacing w:before="40" w:after="40"/>
+            </w:pPr>
+            <w:r>
+              <w:rPr>
+                <w:rFonts w:ascii="Calibri" w:hAnsi="Calibri" w:cs="Calibri"/>
+                <w:b/>
+                <w:color w:val="FFFFFF"/>
+                <w:sz w:val="20"/>
+              </w:rPr>
+              <w:t xml:space="preserve">Término</w:t>
+            </w:r>
+          </w:p>
+        </w:tc>
+        <w:tc>
+          <w:tcPr>
+            <w:tcW w:w="6633" w:type="dxa"/>
+            <w:shd w:val="clear" w:color="auto" w:fill="0B4F6C"/>
+            <w:vAlign w:val="center"/>
+          </w:tcPr>
+          <w:p>
+            <w:pPr>
+              <w:spacing w:before="40" w:after="40"/>
+            </w:pPr>
+            <w:r>
+              <w:rPr>
+                <w:rFonts w:ascii="Calibri" w:hAnsi="Calibri" w:cs="Calibri"/>
+                <w:b/>
+                <w:color w:val="FFFFFF"/>
+                <w:sz w:val="20"/>
+              </w:rPr>
+              <w:t xml:space="preserve">Definición</w:t>
+            </w:r>
+          </w:p>
+        </w:tc>
+      </w:tr>
+      <w:tr>
+        <w:trPr>
+          <w:cantSplit/>
+          <w:jc w:val="center"/>
+        </w:trPr>
+        <w:tc>
+          <w:tcPr>
+            <w:tcW w:w="2721" w:type="dxa"/>
+            <w:shd w:val="clear" w:color="auto" w:fill="FFFFFF"/>
+            <w:vAlign w:val="center"/>
+          </w:tcPr>
+          <w:p>
+            <w:pPr>
+              <w:spacing w:before="40" w:after="40" w:line="264" w:lineRule="auto"/>
+            </w:pPr>
+            <w:r>
+              <w:rPr>
+                <w:rFonts w:cs="Cambria"/>
+                <w:b/>
+                <w:sz w:val="20"/>
+              </w:rPr>
+              <w:t xml:space="preserve">ADO.NET</w:t>
+            </w:r>
+          </w:p>
+        </w:tc>
+        <w:tc>
+          <w:tcPr>
+            <w:tcW w:w="6633" w:type="dxa"/>
+            <w:shd w:val="clear" w:color="auto" w:fill="FFFFFF"/>
+            <w:vAlign w:val="center"/>
+          </w:tcPr>
+          <w:p>
+            <w:pPr>
+              <w:spacing w:before="40" w:after="40" w:line="264" w:lineRule="auto"/>
+              <w:rPr>
+                <w:lang w:val="es-ES"/>
+              </w:rPr>
+            </w:pPr>
+            <w:r>
+              <w:rPr>
+                <w:rFonts w:cs="Cambria"/>
+                <w:sz w:val="20"/>
+                <w:lang w:val="es-ES"/>
+              </w:rPr>
+              <w:t xml:space="preserve">Conjunto de clases de .NET para comunicarse con bases de datos; en este proyecto se usa con SQL Server mediante SqlConnection, SqlCommand y SqlParameter.</w:t>
+            </w:r>
+          </w:p>
+        </w:tc>
+      </w:tr>
+      <w:tr>
+        <w:trPr>
+          <w:cantSplit/>
+          <w:jc w:val="center"/>
+        </w:trPr>
+        <w:tc>
+          <w:tcPr>
+            <w:tcW w:w="2721" w:type="dxa"/>
+            <w:shd w:val="clear" w:color="auto" w:fill="FFFFFF"/>
+            <w:vAlign w:val="center"/>
+          </w:tcPr>
+          <w:p>
+            <w:pPr>
+              <w:spacing w:before="40" w:after="40" w:line="264" w:lineRule="auto"/>
+            </w:pPr>
+            <w:r>
+              <w:rPr>
+                <w:rFonts w:cs="Cambria"/>
+                <w:b/>
+                <w:sz w:val="20"/>
+              </w:rPr>
+              <w:t xml:space="preserve">Arquitectura en capas</w:t>
+            </w:r>
+          </w:p>
+        </w:tc>
+        <w:tc>
+          <w:tcPr>
+            <w:tcW w:w="6633" w:type="dxa"/>
+            <w:shd w:val="clear" w:color="auto" w:fill="FFFFFF"/>
+            <w:vAlign w:val="center"/>
+          </w:tcPr>
+          <w:p>
+            <w:pPr>
+              <w:spacing w:before="40" w:after="40" w:line="264" w:lineRule="auto"/>
+              <w:rPr>
+                <w:lang w:val="es-ES"/>
+              </w:rPr>
+            </w:pPr>
+            <w:r>
+              <w:rPr>
+                <w:rFonts w:cs="Cambria"/>
+                <w:sz w:val="20"/>
+                <w:lang w:val="es-ES"/>
+              </w:rPr>
+              <w:t xml:space="preserve">Forma de organizar el código separando responsabilidades: presentación (pantallas), negocio (reglas) y acceso a datos (SQL). Cada capa solo se comunica con la siguiente.</w:t>
+            </w:r>
+          </w:p>
+        </w:tc>
+      </w:tr>
+      <w:tr>
+        <w:trPr>
+          <w:cantSplit/>
+          <w:jc w:val="center"/>
+        </w:trPr>
+        <w:tc>
+          <w:tcPr>
+            <w:tcW w:w="2721" w:type="dxa"/>
+            <w:shd w:val="clear" w:color="auto" w:fill="FFFFFF"/>
+            <w:vAlign w:val="center"/>
+          </w:tcPr>
+          <w:p>
+            <w:pPr>
+              <w:spacing w:before="40" w:after="40" w:line="264" w:lineRule="auto"/>
+            </w:pPr>
+            <w:r>
+              <w:rPr>
+                <w:rFonts w:cs="Cambria"/>
+                <w:b/>
+                <w:sz w:val="20"/>
+              </w:rPr>
+              <w:t xml:space="preserve">Cadena de conexión</w:t>
+            </w:r>
+          </w:p>
+        </w:tc>
+        <w:tc>
+          <w:tcPr>
+            <w:tcW w:w="6633" w:type="dxa"/>
+            <w:shd w:val="clear" w:color="auto" w:fill="FFFFFF"/>
+            <w:vAlign w:val="center"/>
+          </w:tcPr>
+          <w:p>
+            <w:pPr>
+              <w:spacing w:before="40" w:after="40" w:line="264" w:lineRule="auto"/>
+              <w:rPr>
+                <w:lang w:val="es-ES"/>
+              </w:rPr>
+            </w:pPr>
+            <w:r>
+              <w:rPr>
+                <w:rFonts w:cs="Cambria"/>
+                <w:sz w:val="20"/>
+                <w:lang w:val="es-ES"/>
+              </w:rPr>
+              <w:t xml:space="preserve">Texto de configuración que indica a la aplicación dónde está el servidor de base de datos y cómo conectarse; se guarda en App.config.</w:t>
+            </w:r>
+          </w:p>
+        </w:tc>
+      </w:tr>
+      <w:tr>
+        <w:trPr>
+          <w:cantSplit/>
+          <w:jc w:val="center"/>
+        </w:trPr>
+        <w:tc>
+          <w:tcPr>
+            <w:tcW w:w="2721" w:type="dxa"/>
+            <w:shd w:val="clear" w:color="auto" w:fill="FFFFFF"/>
+            <w:vAlign w:val="center"/>
+          </w:tcPr>
+          <w:p>
+            <w:pPr>
+              <w:spacing w:before="40" w:after="40" w:line="264" w:lineRule="auto"/>
+            </w:pPr>
+            <w:r>
+              <w:rPr>
+                <w:rFonts w:cs="Cambria"/>
+                <w:b/>
+                <w:sz w:val="20"/>
+              </w:rPr>
+              <w:t xml:space="preserve">Clave primaria (PK)</w:t>
+            </w:r>
+          </w:p>
+        </w:tc>
+        <w:tc>
+          <w:tcPr>
+            <w:tcW w:w="6633" w:type="dxa"/>
+            <w:shd w:val="clear" w:color="auto" w:fill="FFFFFF"/>
+            <w:vAlign w:val="center"/>
+          </w:tcPr>
+          <w:p>
+            <w:pPr>
+              <w:spacing w:before="40" w:after="40" w:line="264" w:lineRule="auto"/>
+              <w:rPr>
+                <w:lang w:val="es-ES"/>
+              </w:rPr>
+            </w:pPr>
+            <w:r>
+              <w:rPr>
+                <w:rFonts w:cs="Cambria"/>
+                <w:sz w:val="20"/>
+                <w:lang w:val="es-ES"/>
+              </w:rPr>
+              <w:t xml:space="preserve">Campo que identifica de forma única cada fila de una tabla, por ejemplo ClienteID.</w:t>
+            </w:r>
+          </w:p>
+        </w:tc>
+      </w:tr>
+      <w:tr>
+        <w:trPr>
+          <w:cantSplit/>
+          <w:jc w:val="center"/>
+        </w:trPr>
+        <w:tc>
+          <w:tcPr>
+            <w:tcW w:w="2721" w:type="dxa"/>
+            <w:shd w:val="clear" w:color="auto" w:fill="FFFFFF"/>
+            <w:vAlign w:val="center"/>
+          </w:tcPr>
+          <w:p>
+            <w:pPr>
+              <w:spacing w:before="40" w:after="40" w:line="264" w:lineRule="auto"/>
+            </w:pPr>
+            <w:r>
+              <w:rPr>
+                <w:rFonts w:cs="Cambria"/>
+                <w:b/>
+                <w:sz w:val="20"/>
+              </w:rPr>
+              <w:t xml:space="preserve">Clave foránea (FK)</w:t>
+            </w:r>
+          </w:p>
+        </w:tc>
+        <w:tc>
+          <w:tcPr>
+            <w:tcW w:w="6633" w:type="dxa"/>
+            <w:shd w:val="clear" w:color="auto" w:fill="FFFFFF"/>
+            <w:vAlign w:val="center"/>
+          </w:tcPr>
+          <w:p>
+            <w:pPr>
+              <w:spacing w:before="40" w:after="40" w:line="264" w:lineRule="auto"/>
+              <w:rPr>
+                <w:lang w:val="es-ES"/>
+              </w:rPr>
+            </w:pPr>
+            <w:r>
+              <w:rPr>
+                <w:rFonts w:cs="Cambria"/>
+                <w:sz w:val="20"/>
+                <w:lang w:val="es-ES"/>
+              </w:rPr>
+              <w:t xml:space="preserve">Campo que apunta a la clave primaria de otra tabla y crea la relación entre ambas, por ejemplo el ClienteID dentro de Facturas.</w:t>
+            </w:r>
+          </w:p>
+        </w:tc>
+      </w:tr>
+      <w:tr>
+        <w:trPr>
+          <w:cantSplit/>
+          <w:jc w:val="center"/>
+        </w:trPr>
+        <w:tc>
+          <w:tcPr>
+            <w:tcW w:w="2721" w:type="dxa"/>
+            <w:shd w:val="clear" w:color="auto" w:fill="FFFFFF"/>
+            <w:vAlign w:val="center"/>
+          </w:tcPr>
+          <w:p>
+            <w:pPr>
+              <w:spacing w:before="40" w:after="40" w:line="264" w:lineRule="auto"/>
+            </w:pPr>
+            <w:r>
+              <w:rPr>
+                <w:rFonts w:cs="Cambria"/>
+                <w:b/>
+                <w:sz w:val="20"/>
+              </w:rPr>
+              <w:t xml:space="preserve">Consulta parametrizada</w:t>
+            </w:r>
+          </w:p>
+        </w:tc>
+        <w:tc>
+          <w:tcPr>
+            <w:tcW w:w="6633" w:type="dxa"/>
+            <w:shd w:val="clear" w:color="auto" w:fill="FFFFFF"/>
+            <w:vAlign w:val="center"/>
+          </w:tcPr>
+          <w:p>
+            <w:pPr>
+              <w:spacing w:before="40" w:after="40" w:line="264" w:lineRule="auto"/>
+              <w:rPr>
+                <w:lang w:val="es-ES"/>
+              </w:rPr>
+            </w:pPr>
+            <w:r>
+              <w:rPr>
+                <w:rFonts w:cs="Cambria"/>
+                <w:sz w:val="20"/>
+                <w:lang w:val="es-ES"/>
+              </w:rPr>
+              <w:t xml:space="preserve">Sentencia SQL donde los valores del usuario viajan como parámetros (@nombre) y nunca se concatenan al texto de la consulta; es la defensa principal contra la inyección SQL.</w:t>
+            </w:r>
+          </w:p>
+        </w:tc>
+      </w:tr>
+      <w:tr>
+        <w:trPr>
+          <w:cantSplit/>
+          <w:jc w:val="center"/>
+        </w:trPr>
+        <w:tc>
+          <w:tcPr>
+            <w:tcW w:w="2721" w:type="dxa"/>
+            <w:shd w:val="clear" w:color="auto" w:fill="FFFFFF"/>
+            <w:vAlign w:val="center"/>
+          </w:tcPr>
+          <w:p>
+            <w:pPr>
+              <w:spacing w:before="40" w:after="40" w:line="264" w:lineRule="auto"/>
+            </w:pPr>
+            <w:r>
+              <w:rPr>
+                <w:rFonts w:cs="Cambria"/>
+                <w:b/>
+                <w:sz w:val="20"/>
+              </w:rPr>
+              <w:t xml:space="preserve">CRUD</w:t>
+            </w:r>
+          </w:p>
+        </w:tc>
+        <w:tc>
+          <w:tcPr>
+            <w:tcW w:w="6633" w:type="dxa"/>
+            <w:shd w:val="clear" w:color="auto" w:fill="FFFFFF"/>
+            <w:vAlign w:val="center"/>
+          </w:tcPr>
+          <w:p>
+            <w:pPr>
+              <w:spacing w:before="40" w:after="40" w:line="264" w:lineRule="auto"/>
+              <w:rPr>
+                <w:lang w:val="es-ES"/>
+              </w:rPr>
+            </w:pPr>
+            <w:r>
+              <w:rPr>
+                <w:rFonts w:cs="Cambria"/>
+                <w:sz w:val="20"/>
+                <w:lang w:val="es-ES"/>
+              </w:rPr>
+              <w:t xml:space="preserve">Siglas de Crear, Leer (Read), Actualizar y Eliminar (Delete): las cuatro operaciones básicas sobre cada entidad del sistema.</w:t>
+            </w:r>
+          </w:p>
+        </w:tc>
+      </w:tr>
+      <w:tr>
+        <w:trPr>
+          <w:cantSplit/>
+          <w:jc w:val="center"/>
+        </w:trPr>
+        <w:tc>
+          <w:tcPr>
+            <w:tcW w:w="2721" w:type="dxa"/>
+            <w:shd w:val="clear" w:color="auto" w:fill="FFFFFF"/>
+            <w:vAlign w:val="center"/>
+          </w:tcPr>
+          <w:p>
+            <w:pPr>
+              <w:spacing w:before="40" w:after="40" w:line="264" w:lineRule="auto"/>
+            </w:pPr>
+            <w:r>
+              <w:rPr>
+                <w:rFonts w:cs="Cambria"/>
+                <w:b/>
+                <w:sz w:val="20"/>
+              </w:rPr>
+              <w:t xml:space="preserve">Cuenta por cobrar</w:t>
+            </w:r>
+          </w:p>
+        </w:tc>
+        <w:tc>
+          <w:tcPr>
+            <w:tcW w:w="6633" w:type="dxa"/>
+            <w:shd w:val="clear" w:color="auto" w:fill="FFFFFF"/>
+            <w:vAlign w:val="center"/>
+          </w:tcPr>
+          <w:p>
+            <w:pPr>
+              <w:spacing w:before="40" w:after="40" w:line="264" w:lineRule="auto"/>
+              <w:rPr>
+                <w:lang w:val="es-ES"/>
+              </w:rPr>
+            </w:pPr>
+            <w:r>
+              <w:rPr>
+                <w:rFonts w:cs="Cambria"/>
+                <w:sz w:val="20"/>
+                <w:lang w:val="es-ES"/>
+              </w:rPr>
+              <w:t xml:space="preserve">Dinero que los clientes deben a la empresa por facturas a crédito aún no pagadas.</w:t>
+            </w:r>
+          </w:p>
+        </w:tc>
+      </w:tr>
+      <w:tr>
+        <w:trPr>
+          <w:cantSplit/>
+          <w:jc w:val="center"/>
+        </w:trPr>
+        <w:tc>
+          <w:tcPr>
+            <w:tcW w:w="2721" w:type="dxa"/>
+            <w:shd w:val="clear" w:color="auto" w:fill="FFFFFF"/>
+            <w:vAlign w:val="center"/>
+          </w:tcPr>
+          <w:p>
+            <w:pPr>
+              <w:spacing w:before="40" w:after="40" w:line="264" w:lineRule="auto"/>
+            </w:pPr>
+            <w:r>
+              <w:rPr>
+                <w:rFonts w:cs="Cambria"/>
+                <w:b/>
+                <w:sz w:val="20"/>
+              </w:rPr>
+              <w:t xml:space="preserve">Cuenta por pagar</w:t>
+            </w:r>
+          </w:p>
+        </w:tc>
+        <w:tc>
+          <w:tcPr>
+            <w:tcW w:w="6633" w:type="dxa"/>
+            <w:shd w:val="clear" w:color="auto" w:fill="FFFFFF"/>
+            <w:vAlign w:val="center"/>
+          </w:tcPr>
+          <w:p>
+            <w:pPr>
+              <w:spacing w:before="40" w:after="40" w:line="264" w:lineRule="auto"/>
+              <w:rPr>
+                <w:lang w:val="es-ES"/>
+              </w:rPr>
+            </w:pPr>
+            <w:r>
+              <w:rPr>
+                <w:rFonts w:cs="Cambria"/>
+                <w:sz w:val="20"/>
+                <w:lang w:val="es-ES"/>
+              </w:rPr>
+              <w:t xml:space="preserve">Dinero que la empresa debe a sus proveedores por compras a crédito aún no pagadas.</w:t>
+            </w:r>
+          </w:p>
+        </w:tc>
+      </w:tr>
+      <w:tr>
+        <w:trPr>
+          <w:cantSplit/>
+          <w:jc w:val="center"/>
+        </w:trPr>
+        <w:tc>
+          <w:tcPr>
+            <w:tcW w:w="2721" w:type="dxa"/>
+            <w:shd w:val="clear" w:color="auto" w:fill="FFFFFF"/>
+            <w:vAlign w:val="center"/>
+          </w:tcPr>
+          <w:p>
+            <w:pPr>
+              <w:spacing w:before="40" w:after="40" w:line="264" w:lineRule="auto"/>
+            </w:pPr>
+            <w:r>
+              <w:rPr>
+                <w:rFonts w:cs="Cambria"/>
+                <w:b/>
+                <w:sz w:val="20"/>
+              </w:rPr>
+              <w:t xml:space="preserve">DAO</w:t>
+            </w:r>
+          </w:p>
+        </w:tc>
+        <w:tc>
+          <w:tcPr>
+            <w:tcW w:w="6633" w:type="dxa"/>
+            <w:shd w:val="clear" w:color="auto" w:fill="FFFFFF"/>
+            <w:vAlign w:val="center"/>
+          </w:tcPr>
+          <w:p>
+            <w:pPr>
+              <w:spacing w:before="40" w:after="40" w:line="264" w:lineRule="auto"/>
+              <w:rPr>
+                <w:lang w:val="es-ES"/>
+              </w:rPr>
+            </w:pPr>
+            <w:r>
+              <w:rPr>
+                <w:rFonts w:cs="Cambria"/>
+                <w:sz w:val="20"/>
+                <w:lang w:val="es-ES"/>
+              </w:rPr>
+              <w:t xml:space="preserve">Data Access Object: clase dedicada al acceso a datos de una entidad (por ejemplo, ClienteDAO contiene todo el SQL de clientes).</w:t>
+            </w:r>
+          </w:p>
+        </w:tc>
+      </w:tr>
+      <w:tr>
+        <w:trPr>
+          <w:cantSplit/>
+          <w:jc w:val="center"/>
+        </w:trPr>
+        <w:tc>
+          <w:tcPr>
+            <w:tcW w:w="2721" w:type="dxa"/>
+            <w:shd w:val="clear" w:color="auto" w:fill="FFFFFF"/>
+            <w:vAlign w:val="center"/>
+          </w:tcPr>
+          <w:p>
+            <w:pPr>
+              <w:spacing w:before="40" w:after="40" w:line="264" w:lineRule="auto"/>
+            </w:pPr>
+            <w:r>
+              <w:rPr>
+                <w:rFonts w:cs="Cambria"/>
+                <w:b/>
+                <w:sz w:val="20"/>
+              </w:rPr>
+              <w:t xml:space="preserve">Entidad</w:t>
+            </w:r>
+          </w:p>
+        </w:tc>
+        <w:tc>
+          <w:tcPr>
+            <w:tcW w:w="6633" w:type="dxa"/>
+            <w:shd w:val="clear" w:color="auto" w:fill="FFFFFF"/>
+            <w:vAlign w:val="center"/>
+          </w:tcPr>
+          <w:p>
+            <w:pPr>
+              <w:spacing w:before="40" w:after="40" w:line="264" w:lineRule="auto"/>
+              <w:rPr>
+                <w:lang w:val="es-ES"/>
+              </w:rPr>
+            </w:pPr>
+            <w:r>
+              <w:rPr>
+                <w:rFonts w:cs="Cambria"/>
+                <w:sz w:val="20"/>
+                <w:lang w:val="es-ES"/>
+              </w:rPr>
+              <w:t xml:space="preserve">Clase que representa un concepto del negocio (Cliente, Factura, Producto) con sus propiedades; viaja entre las capas del sistema.</w:t>
+            </w:r>
+          </w:p>
+        </w:tc>
+      </w:tr>
+      <w:tr>
+        <w:trPr>
+          <w:cantSplit/>
+          <w:jc w:val="center"/>
+        </w:trPr>
+        <w:tc>
+          <w:tcPr>
+            <w:tcW w:w="2721" w:type="dxa"/>
+            <w:shd w:val="clear" w:color="auto" w:fill="FFFFFF"/>
+            <w:vAlign w:val="center"/>
+          </w:tcPr>
+          <w:p>
+            <w:pPr>
+              <w:spacing w:before="40" w:after="40" w:line="264" w:lineRule="auto"/>
+            </w:pPr>
+            <w:r>
+              <w:rPr>
+                <w:rFonts w:cs="Cambria"/>
+                <w:b/>
+                <w:sz w:val="20"/>
+              </w:rPr>
+              <w:t xml:space="preserve">Excepción</w:t>
+            </w:r>
+          </w:p>
+        </w:tc>
+        <w:tc>
+          <w:tcPr>
+            <w:tcW w:w="6633" w:type="dxa"/>
+            <w:shd w:val="clear" w:color="auto" w:fill="FFFFFF"/>
+            <w:vAlign w:val="center"/>
+          </w:tcPr>
+          <w:p>
+            <w:pPr>
+              <w:spacing w:before="40" w:after="40" w:line="264" w:lineRule="auto"/>
+              <w:rPr>
+                <w:lang w:val="es-ES"/>
+              </w:rPr>
+            </w:pPr>
+            <w:r>
+              <w:rPr>
+                <w:rFonts w:cs="Cambria"/>
+                <w:sz w:val="20"/>
+                <w:lang w:val="es-ES"/>
+              </w:rPr>
+              <w:t xml:space="preserve">Error que ocurre durante la ejecución; el sistema las captura con try/catch y las convierte en mensajes claros para el usuario.</w:t>
+            </w:r>
+          </w:p>
+        </w:tc>
+      </w:tr>
+      <w:tr>
+        <w:trPr>
+          <w:cantSplit/>
+          <w:jc w:val="center"/>
+        </w:trPr>
+        <w:tc>
+          <w:tcPr>
+            <w:tcW w:w="2721" w:type="dxa"/>
+            <w:shd w:val="clear" w:color="auto" w:fill="FFFFFF"/>
+            <w:vAlign w:val="center"/>
+          </w:tcPr>
+          <w:p>
+            <w:pPr>
+              <w:spacing w:before="40" w:after="40" w:line="264" w:lineRule="auto"/>
+            </w:pPr>
+            <w:r>
+              <w:rPr>
+                <w:rFonts w:cs="Cambria"/>
+                <w:b/>
+                <w:sz w:val="20"/>
+              </w:rPr>
+              <w:t xml:space="preserve">Hash SHA-256</w:t>
+            </w:r>
+          </w:p>
+        </w:tc>
+        <w:tc>
+          <w:tcPr>
+            <w:tcW w:w="6633" w:type="dxa"/>
+            <w:shd w:val="clear" w:color="auto" w:fill="FFFFFF"/>
+            <w:vAlign w:val="center"/>
+          </w:tcPr>
+          <w:p>
+            <w:pPr>
+              <w:spacing w:before="40" w:after="40" w:line="264" w:lineRule="auto"/>
+              <w:rPr>
+                <w:lang w:val="es-ES"/>
+              </w:rPr>
+            </w:pPr>
+            <w:r>
+              <w:rPr>
+                <w:rFonts w:cs="Cambria"/>
+                <w:sz w:val="20"/>
+                <w:lang w:val="es-ES"/>
+              </w:rPr>
+              <w:t xml:space="preserve">Función criptográfica que convierte una contraseña en una huella fija de 64 caracteres imposible de revertir; es lo que se guarda en la base de datos en lugar de la contraseña.</w:t>
+            </w:r>
+          </w:p>
+        </w:tc>
+      </w:tr>
+      <w:tr>
+        <w:trPr>
+          <w:cantSplit/>
+          <w:jc w:val="center"/>
+        </w:trPr>
+        <w:tc>
+          <w:tcPr>
+            <w:tcW w:w="2721" w:type="dxa"/>
+            <w:shd w:val="clear" w:color="auto" w:fill="FFFFFF"/>
+            <w:vAlign w:val="center"/>
+          </w:tcPr>
+          <w:p>
+            <w:pPr>
+              <w:spacing w:before="40" w:after="40" w:line="264" w:lineRule="auto"/>
+            </w:pPr>
+            <w:r>
+              <w:rPr>
+                <w:rFonts w:cs="Cambria"/>
+                <w:b/>
+                <w:sz w:val="20"/>
+              </w:rPr>
+              <w:t xml:space="preserve">Inyección SQL</w:t>
+            </w:r>
+          </w:p>
+        </w:tc>
+        <w:tc>
+          <w:tcPr>
+            <w:tcW w:w="6633" w:type="dxa"/>
+            <w:shd w:val="clear" w:color="auto" w:fill="FFFFFF"/>
+            <w:vAlign w:val="center"/>
+          </w:tcPr>
+          <w:p>
+            <w:pPr>
+              <w:spacing w:before="40" w:after="40" w:line="264" w:lineRule="auto"/>
+              <w:rPr>
+                <w:lang w:val="es-ES"/>
+              </w:rPr>
+            </w:pPr>
+            <w:r>
+              <w:rPr>
+                <w:rFonts w:cs="Cambria"/>
+                <w:sz w:val="20"/>
+                <w:lang w:val="es-ES"/>
+              </w:rPr>
+              <w:t xml:space="preserve">Ataque que intenta colar instrucciones SQL en los campos de un formulario para manipular la base de datos; se previene con consultas parametrizadas.</w:t>
+            </w:r>
+          </w:p>
+        </w:tc>
+      </w:tr>
+      <w:tr>
+        <w:trPr>
+          <w:cantSplit/>
+          <w:jc w:val="center"/>
+        </w:trPr>
+        <w:tc>
+          <w:tcPr>
+            <w:tcW w:w="2721" w:type="dxa"/>
+            <w:shd w:val="clear" w:color="auto" w:fill="FFFFFF"/>
+            <w:vAlign w:val="center"/>
+          </w:tcPr>
+          <w:p>
+            <w:pPr>
+              <w:spacing w:before="40" w:after="40" w:line="264" w:lineRule="auto"/>
+            </w:pPr>
+            <w:r>
+              <w:rPr>
+                <w:rFonts w:cs="Cambria"/>
+                <w:b/>
+                <w:sz w:val="20"/>
+              </w:rPr>
+              <w:t xml:space="preserve">ITBIS</w:t>
+            </w:r>
+          </w:p>
+        </w:tc>
+        <w:tc>
+          <w:tcPr>
+            <w:tcW w:w="6633" w:type="dxa"/>
+            <w:shd w:val="clear" w:color="auto" w:fill="FFFFFF"/>
+            <w:vAlign w:val="center"/>
+          </w:tcPr>
+          <w:p>
+            <w:pPr>
+              <w:spacing w:before="40" w:after="40" w:line="264" w:lineRule="auto"/>
+              <w:rPr>
+                <w:lang w:val="es-ES"/>
+              </w:rPr>
+            </w:pPr>
+            <w:r>
+              <w:rPr>
+                <w:rFonts w:cs="Cambria"/>
+                <w:sz w:val="20"/>
+                <w:lang w:val="es-ES"/>
+              </w:rPr>
+              <w:t xml:space="preserve">Impuesto sobre Transferencias de Bienes Industrializados y Servicios; en el sistema se calcula al 18 % sobre el subtotal de la factura.</w:t>
+            </w:r>
+          </w:p>
+        </w:tc>
+      </w:tr>
+      <w:tr>
+        <w:trPr>
+          <w:cantSplit/>
+          <w:jc w:val="center"/>
+        </w:trPr>
+        <w:tc>
+          <w:tcPr>
+            <w:tcW w:w="2721" w:type="dxa"/>
+            <w:shd w:val="clear" w:color="auto" w:fill="FFFFFF"/>
+            <w:vAlign w:val="center"/>
+          </w:tcPr>
+          <w:p>
+            <w:pPr>
+              <w:spacing w:before="40" w:after="40" w:line="264" w:lineRule="auto"/>
+            </w:pPr>
+            <w:r>
+              <w:rPr>
+                <w:rFonts w:cs="Cambria"/>
+                <w:b/>
+                <w:sz w:val="20"/>
+              </w:rPr>
+              <w:t xml:space="preserve">Rollback / Commit</w:t>
+            </w:r>
+          </w:p>
+        </w:tc>
+        <w:tc>
+          <w:tcPr>
+            <w:tcW w:w="6633" w:type="dxa"/>
+            <w:shd w:val="clear" w:color="auto" w:fill="FFFFFF"/>
+            <w:vAlign w:val="center"/>
+          </w:tcPr>
+          <w:p>
+            <w:pPr>
+              <w:spacing w:before="40" w:after="40" w:line="264" w:lineRule="auto"/>
+              <w:rPr>
+                <w:lang w:val="es-ES"/>
+              </w:rPr>
+            </w:pPr>
+            <w:r>
+              <w:rPr>
+                <w:rFonts w:cs="Cambria"/>
+                <w:sz w:val="20"/>
+                <w:lang w:val="es-ES"/>
+              </w:rPr>
+              <w:t xml:space="preserve">Operaciones de una transacción: Commit confirma todos los cambios juntos y Rollback los revierte todos si algo falla a mitad del proceso.</w:t>
+            </w:r>
+          </w:p>
+        </w:tc>
+      </w:tr>
+      <w:tr>
+        <w:trPr>
+          <w:cantSplit/>
+          <w:jc w:val="center"/>
+        </w:trPr>
+        <w:tc>
+          <w:tcPr>
+            <w:tcW w:w="2721" w:type="dxa"/>
+            <w:shd w:val="clear" w:color="auto" w:fill="FFFFFF"/>
+            <w:vAlign w:val="center"/>
+          </w:tcPr>
+          <w:p>
+            <w:pPr>
+              <w:spacing w:before="40" w:after="40" w:line="264" w:lineRule="auto"/>
+            </w:pPr>
+            <w:r>
+              <w:rPr>
+                <w:rFonts w:cs="Cambria"/>
+                <w:b/>
+                <w:sz w:val="20"/>
+              </w:rPr>
+              <w:t xml:space="preserve">Stock</w:t>
+            </w:r>
+          </w:p>
+        </w:tc>
+        <w:tc>
+          <w:tcPr>
+            <w:tcW w:w="6633" w:type="dxa"/>
+            <w:shd w:val="clear" w:color="auto" w:fill="FFFFFF"/>
+            <w:vAlign w:val="center"/>
+          </w:tcPr>
+          <w:p>
+            <w:pPr>
+              <w:spacing w:before="40" w:after="40" w:line="264" w:lineRule="auto"/>
+              <w:rPr>
+                <w:lang w:val="es-ES"/>
+              </w:rPr>
+            </w:pPr>
+            <w:r>
+              <w:rPr>
+                <w:rFonts w:cs="Cambria"/>
+                <w:sz w:val="20"/>
+                <w:lang w:val="es-ES"/>
+              </w:rPr>
+              <w:t xml:space="preserve">Cantidad de unidades de un producto disponibles en el inventario; se descuenta al facturar y aumenta al comprar.</w:t>
+            </w:r>
+          </w:p>
+        </w:tc>
+      </w:tr>
+      <w:tr>
+        <w:trPr>
+          <w:cantSplit/>
+          <w:jc w:val="center"/>
+        </w:trPr>
+        <w:tc>
+          <w:tcPr>
+            <w:tcW w:w="2721" w:type="dxa"/>
+            <w:shd w:val="clear" w:color="auto" w:fill="FFFFFF"/>
+            <w:vAlign w:val="center"/>
+          </w:tcPr>
+          <w:p>
+            <w:pPr>
+              <w:spacing w:before="40" w:after="40" w:line="264" w:lineRule="auto"/>
+            </w:pPr>
+            <w:r>
+              <w:rPr>
+                <w:rFonts w:cs="Cambria"/>
+                <w:b/>
+                <w:sz w:val="20"/>
+              </w:rPr>
+              <w:t xml:space="preserve">Transacción</w:t>
+            </w:r>
+          </w:p>
+        </w:tc>
+        <w:tc>
+          <w:tcPr>
+            <w:tcW w:w="6633" w:type="dxa"/>
+            <w:shd w:val="clear" w:color="auto" w:fill="FFFFFF"/>
+            <w:vAlign w:val="center"/>
+          </w:tcPr>
+          <w:p>
+            <w:pPr>
+              <w:spacing w:before="40" w:after="40" w:line="264" w:lineRule="auto"/>
+              <w:rPr>
+                <w:lang w:val="es-ES"/>
+              </w:rPr>
+            </w:pPr>
+            <w:r>
+              <w:rPr>
+                <w:rFonts w:cs="Cambria"/>
+                <w:sz w:val="20"/>
+                <w:lang w:val="es-ES"/>
+              </w:rPr>
+              <w:t xml:space="preserve">Grupo de operaciones de base de datos que se ejecutan como una sola unidad: o se completan todas o no se aplica ninguna.</w:t>
+            </w:r>
+          </w:p>
+        </w:tc>
+      </w:tr>
+      <w:tr>
+        <w:trPr>
+          <w:cantSplit/>
+          <w:jc w:val="center"/>
+        </w:trPr>
+        <w:tc>
+          <w:tcPr>
+            <w:tcW w:w="2721" w:type="dxa"/>
+            <w:shd w:val="clear" w:color="auto" w:fill="FFFFFF"/>
+            <w:vAlign w:val="center"/>
+          </w:tcPr>
+          <w:p>
+            <w:pPr>
+              <w:spacing w:before="40" w:after="40" w:line="264" w:lineRule="auto"/>
+            </w:pPr>
+            <w:r>
+              <w:rPr>
+                <w:rFonts w:cs="Cambria"/>
+                <w:b/>
+                <w:sz w:val="20"/>
+              </w:rPr>
+              <w:t xml:space="preserve">Windows Forms</w:t>
+            </w:r>
+          </w:p>
+        </w:tc>
+        <w:tc>
+          <w:tcPr>
+            <w:tcW w:w="6633" w:type="dxa"/>
+            <w:shd w:val="clear" w:color="auto" w:fill="FFFFFF"/>
+            <w:vAlign w:val="center"/>
+          </w:tcPr>
+          <w:p>
+            <w:pPr>
+              <w:spacing w:before="40" w:after="40" w:line="264" w:lineRule="auto"/>
+              <w:rPr>
+                <w:lang w:val="es-ES"/>
+              </w:rPr>
+            </w:pPr>
+            <w:r>
+              <w:rPr>
+                <w:rFonts w:cs="Cambria"/>
+                <w:sz w:val="20"/>
+                <w:lang w:val="es-ES"/>
+              </w:rPr>
+              <w:t xml:space="preserve">Tecnología de .NET para crear aplicaciones de escritorio con ventanas, botones y cuadrículas en Windows.</w:t>
+            </w:r>
+          </w:p>
+        </w:tc>
+      </w:tr>
+    </w:tbl>
+    <w:p>
+      <w:pPr>
+        <w:spacing w:after="160" w:line="288" w:lineRule="auto"/>
+        <w:jc w:val="both"/>
+        <w:rPr>
+          <w:lang w:val="es-ES"/>
+        </w:rPr>
+      </w:pPr>
+      <w:r/>
+    </w:p>
+    <w:p>
+      <w:pPr>
+        <w:keepNext/>
+        <w:pBdr>
+          <w:bottom w:val="single" w:sz="6" w:space="6" w:color="0B4F6C"/>
+        </w:pBdr>
+        <w:spacing w:before="360" w:after="160"/>
+        <w:rPr>
+          <w:lang w:val="es-ES"/>
+        </w:rPr>
+      </w:pPr>
+      <w:r>
+        <w:rPr>
+          <w:rFonts w:ascii="Calibri" w:hAnsi="Calibri" w:cs="Calibri"/>
+          <w:b/>
+          <w:color w:val="0B4F6C"/>
+          <w:sz w:val="30"/>
+          <w:lang w:val="es-ES"/>
+        </w:rPr>
+        <w:t>17.  Bibliografía</w:t>
+      </w:r>
+    </w:p>
+    <w:p>
+      <w:pPr>
+        <w:spacing w:after="160" w:line="288" w:lineRule="auto"/>
+        <w:jc w:val="both"/>
+        <w:rPr>
+          <w:lang w:val="es-ES"/>
+        </w:rPr>
+      </w:pPr>
+      <w:r>
+        <w:t>Fuentes consultadas durante el desarrollo del proyecto, citadas según el formato APA (7.ª edición):</w:t>
+      </w:r>
+    </w:p>
+    <w:p>
+      <w:pPr>
+        <w:spacing w:after="160" w:line="288" w:lineRule="auto"/>
+        <w:rPr>
+          <w:lang w:val="es-ES"/>
+        </w:rPr>
+      </w:pPr>
+      <w:r>
+        <w:t xml:space="preserve">Microsoft. (2025). </w:t>
+      </w:r>
+      <w:r>
+        <w:rPr>
+          <w:i/>
+        </w:rPr>
+        <w:t>Documentación de C#</w:t>
+      </w:r>
+      <w:r>
+        <w:t xml:space="preserve">. Microsoft Learn. </w:t>
+      </w:r>
+      <w:hyperlink r:id="rId38">
+        <w:r>
+          <w:rPr>
+            <w:color w:val="0563C1"/>
+            <w:u w:val="single"/>
+          </w:rPr>
+          <w:t xml:space="preserve">https://learn.microsoft.com/es-es/dotnet/csharp/</w:t>
+        </w:r>
+      </w:hyperlink>
+    </w:p>
+    <w:p>
+      <w:pPr>
+        <w:spacing w:after="160" w:line="288" w:lineRule="auto"/>
+        <w:rPr>
+          <w:lang w:val="es-ES"/>
+        </w:rPr>
+      </w:pPr>
+      <w:r>
+        <w:t xml:space="preserve">Microsoft. (2025). </w:t>
+      </w:r>
+      <w:r>
+        <w:rPr>
+          <w:i/>
+        </w:rPr>
+        <w:t>Información general sobre ADO.NET</w:t>
+      </w:r>
+      <w:r>
+        <w:t xml:space="preserve">. Microsoft Learn. </w:t>
+      </w:r>
+      <w:hyperlink r:id="rId39">
+        <w:r>
+          <w:rPr>
+            <w:color w:val="0563C1"/>
+            <w:u w:val="single"/>
+          </w:rPr>
+          <w:t xml:space="preserve">https://learn.microsoft.com/es-es/dotnet/framework/data/adonet/</w:t>
+        </w:r>
+      </w:hyperlink>
+    </w:p>
+    <w:p>
+      <w:pPr>
+        <w:spacing w:after="160" w:line="288" w:lineRule="auto"/>
+        <w:rPr>
+          <w:lang w:val="es-ES"/>
+        </w:rPr>
+      </w:pPr>
+      <w:r>
+        <w:t xml:space="preserve">Microsoft. (2025). </w:t>
+      </w:r>
+      <w:r>
+        <w:rPr>
+          <w:i/>
+        </w:rPr>
+        <w:t>Documentación de Windows Forms para .NET Framework</w:t>
+      </w:r>
+      <w:r>
+        <w:t xml:space="preserve">. Microsoft Learn. </w:t>
+      </w:r>
+      <w:hyperlink r:id="rId40">
+        <w:r>
+          <w:rPr>
+            <w:color w:val="0563C1"/>
+            <w:u w:val="single"/>
+          </w:rPr>
+          <w:t xml:space="preserve">https://learn.microsoft.com/es-es/dotnet/desktop/winforms/</w:t>
+        </w:r>
+      </w:hyperlink>
+    </w:p>
+    <w:p>
+      <w:pPr>
+        <w:spacing w:after="160" w:line="288" w:lineRule="auto"/>
+        <w:rPr>
+          <w:lang w:val="es-ES"/>
+        </w:rPr>
+      </w:pPr>
+      <w:r>
+        <w:t xml:space="preserve">Microsoft. (2025). </w:t>
+      </w:r>
+      <w:r>
+        <w:rPr>
+          <w:i/>
+        </w:rPr>
+        <w:t>Documentación técnica de SQL Server</w:t>
+      </w:r>
+      <w:r>
+        <w:t xml:space="preserve">. Microsoft Learn. </w:t>
+      </w:r>
+      <w:hyperlink r:id="rId41">
+        <w:r>
+          <w:rPr>
+            <w:color w:val="0563C1"/>
+            <w:u w:val="single"/>
+          </w:rPr>
+          <w:t xml:space="preserve">https://learn.microsoft.com/es-es/sql/sql-server/</w:t>
+        </w:r>
+      </w:hyperlink>
+    </w:p>
+    <w:p>
+      <w:pPr>
+        <w:spacing w:after="160" w:line="288" w:lineRule="auto"/>
+        <w:rPr>
+          <w:lang w:val="es-ES"/>
+        </w:rPr>
+      </w:pPr>
+      <w:r>
+        <w:t xml:space="preserve">Microsoft. (2025). </w:t>
+      </w:r>
+      <w:r>
+        <w:rPr>
+          <w:i/>
+        </w:rPr>
+        <w:t>SHA256 (clase) — System.Security.Cryptography</w:t>
+      </w:r>
+      <w:r>
+        <w:t xml:space="preserve">. Microsoft Learn. </w:t>
+      </w:r>
+      <w:hyperlink r:id="rId42">
+        <w:r>
+          <w:rPr>
+            <w:color w:val="0563C1"/>
+            <w:u w:val="single"/>
+          </w:rPr>
+          <w:t xml:space="preserve">https://learn.microsoft.com/es-es/dotnet/api/system.security.cryptography.sha256</w:t>
+        </w:r>
+      </w:hyperlink>
+    </w:p>
+    <w:p>
+      <w:pPr>
+        <w:spacing w:after="160" w:line="288" w:lineRule="auto"/>
+        <w:rPr>
+          <w:lang w:val="es-ES"/>
+        </w:rPr>
+      </w:pPr>
+      <w:r>
+        <w:t xml:space="preserve">Microsoft. (2025). </w:t>
+      </w:r>
+      <w:r>
+        <w:rPr>
+          <w:i/>
+        </w:rPr>
+        <w:t>SqlParameter (clase) — System.Data.SqlClient</w:t>
+      </w:r>
+      <w:r>
+        <w:t xml:space="preserve">. Microsoft Learn. </w:t>
+      </w:r>
+      <w:hyperlink r:id="rId43">
+        <w:r>
+          <w:rPr>
+            <w:color w:val="0563C1"/>
+            <w:u w:val="single"/>
+          </w:rPr>
+          <w:t xml:space="preserve">https://learn.microsoft.com/es-es/dotnet/api/system.data.sqlclient.sqlparameter</w:t>
+        </w:r>
+      </w:hyperlink>
+    </w:p>
+    <w:p>
+      <w:pPr>
+        <w:spacing w:after="160" w:line="288" w:lineRule="auto"/>
+        <w:rPr>
+          <w:lang w:val="es-ES"/>
+        </w:rPr>
+      </w:pPr>
+      <w:r>
+        <w:t xml:space="preserve">OWASP Foundation. (2025). </w:t>
+      </w:r>
+      <w:r>
+        <w:rPr>
+          <w:i/>
+        </w:rPr>
+        <w:t>SQL Injection</w:t>
+      </w:r>
+      <w:r>
+        <w:t xml:space="preserve">. </w:t>
+      </w:r>
+      <w:hyperlink r:id="rId44">
+        <w:r>
+          <w:rPr>
+            <w:color w:val="0563C1"/>
+            <w:u w:val="single"/>
+          </w:rPr>
+          <w:t xml:space="preserve">https://owasp.org/www-community/attacks/SQL_Injection</w:t>
+        </w:r>
+      </w:hyperlink>
+    </w:p>
+    <w:p>
+      <w:pPr>
+        <w:spacing w:after="160" w:line="288" w:lineRule="auto"/>
+        <w:rPr>
+          <w:lang w:val="es-ES"/>
+        </w:rPr>
+      </w:pPr>
+      <w:r>
+        <w:t xml:space="preserve">Dirección General de Impuestos Internos. (2025). </w:t>
+      </w:r>
+      <w:r>
+        <w:rPr>
+          <w:i/>
+        </w:rPr>
+        <w:t>ITBIS — Impuesto sobre Transferencias de Bienes Industrializados y Servicios</w:t>
+      </w:r>
+      <w:r>
+        <w:t xml:space="preserve">. DGII. </w:t>
+      </w:r>
+      <w:hyperlink r:id="rId45">
+        <w:r>
+          <w:rPr>
+            <w:color w:val="0563C1"/>
+            <w:u w:val="single"/>
+          </w:rPr>
+          <w:t xml:space="preserve">https://dgii.gov.do/</w:t>
+        </w:r>
+      </w:hyperlink>
+    </w:p>
+    <w:p>
+      <w:pPr>
         <w:keepNext/>
         <w:pBdr>
           <w:bottom w:val="single" w:sz="6" w:space="6" w:color="0B4F6C"/>
@@ -14406,25 +17556,19 @@
           <w:t>ver proyecto</w:t>
         </w:r>
       </w:hyperlink>
-      <w:r>
-        <w:rPr>
-          <w:lang w:val="es-ES"/>
-        </w:rPr>
-        <w:br/>
-      </w:r>
-      <w:r>
-        <w:rPr>
-          <w:lang w:val="es-ES"/>
-        </w:rPr>
-        <w:br/>
-      </w:r>
-      <w:r>
-        <w:rPr>
-          <w:lang w:val="es-ES"/>
-        </w:rPr>
-        <w:lastRenderedPageBreak/>
-        <w:br/>
-      </w:r>
+    </w:p>
+    <w:p>
+      <w:pPr>
+        <w:pageBreakBefore/>
+        <w:keepNext/>
+        <w:pBdr>
+          <w:bottom w:val="single" w:sz="6" w:space="6" w:color="0B4F6C"/>
+        </w:pBdr>
+        <w:spacing w:before="80" w:after="120"/>
+        <w:rPr>
+          <w:lang w:val="es-ES"/>
+        </w:rPr>
+      </w:pPr>
       <w:r>
         <w:rPr>
           <w:rFonts w:ascii="Calibri" w:hAnsi="Calibri" w:cs="Calibri"/>

</xml_diff>

<commit_message>
Restaurar la caja del video en la sección 12
</commit_message>
<xml_diff>
--- a/Documentacion/Informe_Final_SistemaFacturacion.docx
+++ b/Documentacion/Informe_Final_SistemaFacturacion.docx
@@ -13929,8 +13929,19 @@
         </w:rPr>
       </w:pPr>
       <w:r>
+        <w:rPr>
+          <w:lang w:val="es-ES"/>
+        </w:rPr>
         <w:t>El video de sustentación muestra a los integrantes explicando la aplicación en funcionamiento, con su rostro y su voz, siguiendo los guiones incluidos en la carpeta Documentacion del proyecto. A continuación se indican el título y el enlace del video, junto con el repositorio público de GitHub donde está disponible el código fuente completo:</w:t>
       </w:r>
+    </w:p>
+    <w:p>
+      <w:pPr>
+        <w:spacing w:after="160"/>
+        <w:rPr>
+          <w:lang w:val="es-ES"/>
+        </w:rPr>
+      </w:pPr>
     </w:p>
     <w:tbl>
       <w:tblPr>
@@ -14038,7 +14049,7 @@
               </w:rPr>
               <w:t xml:space="preserve">Repositorio del código fuente (GitHub):  </w:t>
             </w:r>
-            <w:hyperlink r:id="rId21">
+            <w:hyperlink r:id="rId29">
               <w:r>
                 <w:rPr>
                   <w:rFonts w:cs="Cambria"/>
@@ -14056,33 +14067,920 @@
     <w:p>
       <w:pPr>
         <w:spacing w:after="160"/>
+        <w:rPr>
+          <w:lang w:val="es-ES"/>
+        </w:rPr>
       </w:pPr>
     </w:p>
     <w:p>
       <w:pPr>
+        <w:keepNext/>
         <w:pageBreakBefore/>
+        <w:pBdr>
+          <w:bottom w:val="single" w:sz="6" w:space="6" w:color="0B4F6C"/>
+        </w:pBdr>
+        <w:spacing w:before="360" w:after="160"/>
+        <w:rPr>
+          <w:lang w:val="es-ES"/>
+        </w:rPr>
+      </w:pPr>
+      <w:r>
+        <w:rPr>
+          <w:rFonts w:ascii="Calibri" w:hAnsi="Calibri" w:cs="Calibri"/>
+          <w:b/>
+          <w:color w:val="0B4F6C"/>
+          <w:sz w:val="30"/>
+          <w:lang w:val="es-ES"/>
+        </w:rPr>
+        <w:lastRenderedPageBreak/>
+        <w:t>13.  Librerías utilizadas</w:t>
+      </w:r>
+    </w:p>
+    <w:p>
+      <w:pPr>
+        <w:spacing w:after="160" w:line="288" w:lineRule="auto"/>
+        <w:jc w:val="both"/>
+        <w:rPr>
+          <w:lang w:val="es-ES"/>
+        </w:rPr>
+      </w:pPr>
+      <w:r>
+        <w:rPr>
+          <w:lang w:val="es-ES"/>
+        </w:rPr>
+        <w:t>Todo el sistema se construyó con librerías estándar del .NET Framework 4.7.2; no fue necesario instalar paquetes externos, lo que simplifica la compilación y la entrega del proyecto. La siguiente tabla resume los espacios de nombres empleados, la capa donde se usan y el papel que cumple cada uno:</w:t>
+      </w:r>
+    </w:p>
+    <w:tbl>
+      <w:tblPr>
+        <w:tblW w:w="5000" w:type="pct"/>
+        <w:jc w:val="center"/>
+        <w:tblBorders>
+          <w:top w:val="single" w:sz="6" w:space="0" w:color="CBD5E0"/>
+          <w:left w:val="single" w:sz="6" w:space="0" w:color="CBD5E0"/>
+          <w:bottom w:val="single" w:sz="6" w:space="0" w:color="CBD5E0"/>
+          <w:right w:val="single" w:sz="6" w:space="0" w:color="CBD5E0"/>
+          <w:insideH w:val="single" w:sz="6" w:space="0" w:color="CBD5E0"/>
+          <w:insideV w:val="single" w:sz="6" w:space="0" w:color="CBD5E0"/>
+        </w:tblBorders>
+        <w:tblLook w:val="04A0" w:firstRow="1" w:lastRow="0" w:firstColumn="1" w:lastColumn="0" w:noHBand="0" w:noVBand="1"/>
+      </w:tblPr>
+      <w:tblGrid>
+        <w:gridCol w:w="3064"/>
+        <w:gridCol w:w="3215"/>
+        <w:gridCol w:w="3343"/>
+      </w:tblGrid>
+      <w:tr>
+        <w:trPr>
+          <w:cantSplit/>
+          <w:jc w:val="center"/>
+        </w:trPr>
+        <w:tc>
+          <w:tcPr>
+            <w:tcW w:w="1928" w:type="dxa"/>
+            <w:shd w:val="clear" w:color="auto" w:fill="0B4F6C"/>
+            <w:vAlign w:val="center"/>
+          </w:tcPr>
+          <w:p>
+            <w:pPr>
+              <w:spacing w:before="40" w:after="40"/>
+            </w:pPr>
+            <w:r>
+              <w:rPr>
+                <w:rFonts w:ascii="Calibri" w:hAnsi="Calibri" w:cs="Calibri"/>
+                <w:b/>
+                <w:color w:val="FFFFFF"/>
+                <w:sz w:val="19"/>
+              </w:rPr>
+              <w:t>Librería / Espacio de nombres</w:t>
+            </w:r>
+          </w:p>
+        </w:tc>
+        <w:tc>
+          <w:tcPr>
+            <w:tcW w:w="3742" w:type="dxa"/>
+            <w:shd w:val="clear" w:color="auto" w:fill="0B4F6C"/>
+            <w:vAlign w:val="center"/>
+          </w:tcPr>
+          <w:p>
+            <w:pPr>
+              <w:spacing w:before="40" w:after="40"/>
+            </w:pPr>
+            <w:r>
+              <w:rPr>
+                <w:rFonts w:ascii="Calibri" w:hAnsi="Calibri" w:cs="Calibri"/>
+                <w:b/>
+                <w:color w:val="FFFFFF"/>
+                <w:sz w:val="19"/>
+              </w:rPr>
+              <w:t>Capa donde se usa</w:t>
+            </w:r>
+          </w:p>
+        </w:tc>
+        <w:tc>
+          <w:tcPr>
+            <w:tcW w:w="3685" w:type="dxa"/>
+            <w:shd w:val="clear" w:color="auto" w:fill="0B4F6C"/>
+            <w:vAlign w:val="center"/>
+          </w:tcPr>
+          <w:p>
+            <w:pPr>
+              <w:spacing w:before="40" w:after="40"/>
+            </w:pPr>
+            <w:r>
+              <w:rPr>
+                <w:rFonts w:ascii="Calibri" w:hAnsi="Calibri" w:cs="Calibri"/>
+                <w:b/>
+                <w:color w:val="FFFFFF"/>
+                <w:sz w:val="19"/>
+              </w:rPr>
+              <w:t>Uso en el sistema</w:t>
+            </w:r>
+          </w:p>
+        </w:tc>
+      </w:tr>
+      <w:tr>
+        <w:trPr>
+          <w:cantSplit/>
+          <w:jc w:val="center"/>
+        </w:trPr>
+        <w:tc>
+          <w:tcPr>
+            <w:tcW w:w="1928" w:type="dxa"/>
+            <w:shd w:val="clear" w:color="auto" w:fill="FFFFFF"/>
+            <w:vAlign w:val="center"/>
+          </w:tcPr>
+          <w:p>
+            <w:pPr>
+              <w:spacing w:before="40" w:after="40" w:line="264" w:lineRule="auto"/>
+            </w:pPr>
+            <w:r>
+              <w:rPr>
+                <w:rFonts w:cs="Cambria"/>
+                <w:b/>
+                <w:sz w:val="19"/>
+              </w:rPr>
+              <w:t>System.Windows.Forms</w:t>
+            </w:r>
+          </w:p>
+        </w:tc>
+        <w:tc>
+          <w:tcPr>
+            <w:tcW w:w="3742" w:type="dxa"/>
+            <w:shd w:val="clear" w:color="auto" w:fill="FFFFFF"/>
+            <w:vAlign w:val="center"/>
+          </w:tcPr>
+          <w:p>
+            <w:pPr>
+              <w:spacing w:before="40" w:after="40" w:line="264" w:lineRule="auto"/>
+              <w:rPr>
+                <w:lang w:val="es-ES"/>
+              </w:rPr>
+            </w:pPr>
+            <w:r>
+              <w:rPr>
+                <w:rFonts w:cs="Cambria"/>
+                <w:sz w:val="19"/>
+                <w:lang w:val="es-ES"/>
+              </w:rPr>
+              <w:t>Presentación</w:t>
+            </w:r>
+          </w:p>
+        </w:tc>
+        <w:tc>
+          <w:tcPr>
+            <w:tcW w:w="3685" w:type="dxa"/>
+            <w:shd w:val="clear" w:color="auto" w:fill="FFFFFF"/>
+            <w:vAlign w:val="center"/>
+          </w:tcPr>
+          <w:p>
+            <w:pPr>
+              <w:spacing w:before="40" w:after="40" w:line="264" w:lineRule="auto"/>
+              <w:rPr>
+                <w:lang w:val="es-ES"/>
+              </w:rPr>
+            </w:pPr>
+            <w:r>
+              <w:rPr>
+                <w:rFonts w:cs="Cambria"/>
+                <w:sz w:val="19"/>
+                <w:lang w:val="es-ES"/>
+              </w:rPr>
+              <w:t>Formularios, controles (DataGridView, TextBox, botones, menús) y eventos de la interfaz gráfica.</w:t>
+            </w:r>
+          </w:p>
+        </w:tc>
+      </w:tr>
+      <w:tr>
+        <w:trPr>
+          <w:cantSplit/>
+          <w:jc w:val="center"/>
+        </w:trPr>
+        <w:tc>
+          <w:tcPr>
+            <w:tcW w:w="1928" w:type="dxa"/>
+            <w:shd w:val="clear" w:color="auto" w:fill="FFFFFF"/>
+            <w:vAlign w:val="center"/>
+          </w:tcPr>
+          <w:p>
+            <w:pPr>
+              <w:spacing w:before="40" w:after="40" w:line="264" w:lineRule="auto"/>
+            </w:pPr>
+            <w:r>
+              <w:rPr>
+                <w:rFonts w:cs="Cambria"/>
+                <w:b/>
+                <w:sz w:val="19"/>
+              </w:rPr>
+              <w:t>System.Drawing</w:t>
+            </w:r>
+          </w:p>
+        </w:tc>
+        <w:tc>
+          <w:tcPr>
+            <w:tcW w:w="3742" w:type="dxa"/>
+            <w:shd w:val="clear" w:color="auto" w:fill="FFFFFF"/>
+            <w:vAlign w:val="center"/>
+          </w:tcPr>
+          <w:p>
+            <w:pPr>
+              <w:spacing w:before="40" w:after="40" w:line="264" w:lineRule="auto"/>
+              <w:rPr>
+                <w:lang w:val="es-ES"/>
+              </w:rPr>
+            </w:pPr>
+            <w:r>
+              <w:rPr>
+                <w:rFonts w:cs="Cambria"/>
+                <w:sz w:val="19"/>
+                <w:lang w:val="es-ES"/>
+              </w:rPr>
+              <w:t>Presentación</w:t>
+            </w:r>
+          </w:p>
+        </w:tc>
+        <w:tc>
+          <w:tcPr>
+            <w:tcW w:w="3685" w:type="dxa"/>
+            <w:shd w:val="clear" w:color="auto" w:fill="FFFFFF"/>
+            <w:vAlign w:val="center"/>
+          </w:tcPr>
+          <w:p>
+            <w:pPr>
+              <w:spacing w:before="40" w:after="40" w:line="264" w:lineRule="auto"/>
+              <w:rPr>
+                <w:lang w:val="es-ES"/>
+              </w:rPr>
+            </w:pPr>
+            <w:r>
+              <w:rPr>
+                <w:rFonts w:cs="Cambria"/>
+                <w:sz w:val="19"/>
+                <w:lang w:val="es-ES"/>
+              </w:rPr>
+              <w:t>Colores, fuentes y estilos visuales unificados de la interfaz (clase UI.cs).</w:t>
+            </w:r>
+          </w:p>
+        </w:tc>
+      </w:tr>
+      <w:tr>
+        <w:trPr>
+          <w:cantSplit/>
+          <w:jc w:val="center"/>
+        </w:trPr>
+        <w:tc>
+          <w:tcPr>
+            <w:tcW w:w="1928" w:type="dxa"/>
+            <w:shd w:val="clear" w:color="auto" w:fill="FFFFFF"/>
+            <w:vAlign w:val="center"/>
+          </w:tcPr>
+          <w:p>
+            <w:pPr>
+              <w:spacing w:before="40" w:after="40" w:line="264" w:lineRule="auto"/>
+            </w:pPr>
+            <w:r>
+              <w:rPr>
+                <w:rFonts w:cs="Cambria"/>
+                <w:b/>
+                <w:sz w:val="19"/>
+              </w:rPr>
+              <w:t>System.Data</w:t>
+            </w:r>
+          </w:p>
+        </w:tc>
+        <w:tc>
+          <w:tcPr>
+            <w:tcW w:w="3742" w:type="dxa"/>
+            <w:shd w:val="clear" w:color="auto" w:fill="FFFFFF"/>
+            <w:vAlign w:val="center"/>
+          </w:tcPr>
+          <w:p>
+            <w:pPr>
+              <w:spacing w:before="40" w:after="40" w:line="264" w:lineRule="auto"/>
+              <w:rPr>
+                <w:lang w:val="es-ES"/>
+              </w:rPr>
+            </w:pPr>
+            <w:r>
+              <w:rPr>
+                <w:rFonts w:cs="Cambria"/>
+                <w:sz w:val="19"/>
+                <w:lang w:val="es-ES"/>
+              </w:rPr>
+              <w:t>Acceso a datos</w:t>
+            </w:r>
+          </w:p>
+        </w:tc>
+        <w:tc>
+          <w:tcPr>
+            <w:tcW w:w="3685" w:type="dxa"/>
+            <w:shd w:val="clear" w:color="auto" w:fill="FFFFFF"/>
+            <w:vAlign w:val="center"/>
+          </w:tcPr>
+          <w:p>
+            <w:pPr>
+              <w:spacing w:before="40" w:after="40" w:line="264" w:lineRule="auto"/>
+              <w:rPr>
+                <w:lang w:val="es-ES"/>
+              </w:rPr>
+            </w:pPr>
+            <w:r>
+              <w:rPr>
+                <w:rFonts w:cs="Cambria"/>
+                <w:sz w:val="19"/>
+                <w:lang w:val="es-ES"/>
+              </w:rPr>
+              <w:t>Estructuras DataTable y DataRow para manejar los resultados de las consultas.</w:t>
+            </w:r>
+          </w:p>
+        </w:tc>
+      </w:tr>
+      <w:tr>
+        <w:trPr>
+          <w:cantSplit/>
+          <w:jc w:val="center"/>
+        </w:trPr>
+        <w:tc>
+          <w:tcPr>
+            <w:tcW w:w="1928" w:type="dxa"/>
+            <w:shd w:val="clear" w:color="auto" w:fill="FFFFFF"/>
+            <w:vAlign w:val="center"/>
+          </w:tcPr>
+          <w:p>
+            <w:pPr>
+              <w:spacing w:before="40" w:after="40" w:line="264" w:lineRule="auto"/>
+            </w:pPr>
+            <w:r>
+              <w:rPr>
+                <w:rFonts w:cs="Cambria"/>
+                <w:b/>
+                <w:sz w:val="19"/>
+              </w:rPr>
+              <w:t>System.Data.SqlClient</w:t>
+            </w:r>
+          </w:p>
+        </w:tc>
+        <w:tc>
+          <w:tcPr>
+            <w:tcW w:w="3742" w:type="dxa"/>
+            <w:shd w:val="clear" w:color="auto" w:fill="FFFFFF"/>
+            <w:vAlign w:val="center"/>
+          </w:tcPr>
+          <w:p>
+            <w:pPr>
+              <w:spacing w:before="40" w:after="40" w:line="264" w:lineRule="auto"/>
+              <w:rPr>
+                <w:lang w:val="es-ES"/>
+              </w:rPr>
+            </w:pPr>
+            <w:r>
+              <w:rPr>
+                <w:rFonts w:cs="Cambria"/>
+                <w:sz w:val="19"/>
+                <w:lang w:val="es-ES"/>
+              </w:rPr>
+              <w:t>Acceso a datos</w:t>
+            </w:r>
+          </w:p>
+        </w:tc>
+        <w:tc>
+          <w:tcPr>
+            <w:tcW w:w="3685" w:type="dxa"/>
+            <w:shd w:val="clear" w:color="auto" w:fill="FFFFFF"/>
+            <w:vAlign w:val="center"/>
+          </w:tcPr>
+          <w:p>
+            <w:pPr>
+              <w:spacing w:before="40" w:after="40" w:line="264" w:lineRule="auto"/>
+            </w:pPr>
+            <w:r>
+              <w:rPr>
+                <w:rFonts w:cs="Cambria"/>
+                <w:sz w:val="19"/>
+              </w:rPr>
+              <w:t>Comunicación con SQL Server: SqlConnection, SqlCommand, SqlParameter y SqlTransaction.</w:t>
+            </w:r>
+          </w:p>
+        </w:tc>
+      </w:tr>
+      <w:tr>
+        <w:trPr>
+          <w:cantSplit/>
+          <w:jc w:val="center"/>
+        </w:trPr>
+        <w:tc>
+          <w:tcPr>
+            <w:tcW w:w="1928" w:type="dxa"/>
+            <w:shd w:val="clear" w:color="auto" w:fill="FFFFFF"/>
+            <w:vAlign w:val="center"/>
+          </w:tcPr>
+          <w:p>
+            <w:pPr>
+              <w:spacing w:before="40" w:after="40" w:line="264" w:lineRule="auto"/>
+            </w:pPr>
+            <w:r>
+              <w:rPr>
+                <w:rFonts w:cs="Cambria"/>
+                <w:b/>
+                <w:sz w:val="19"/>
+              </w:rPr>
+              <w:t>System.Configuration</w:t>
+            </w:r>
+          </w:p>
+        </w:tc>
+        <w:tc>
+          <w:tcPr>
+            <w:tcW w:w="3742" w:type="dxa"/>
+            <w:shd w:val="clear" w:color="auto" w:fill="FFFFFF"/>
+            <w:vAlign w:val="center"/>
+          </w:tcPr>
+          <w:p>
+            <w:pPr>
+              <w:spacing w:before="40" w:after="40" w:line="264" w:lineRule="auto"/>
+              <w:rPr>
+                <w:lang w:val="es-ES"/>
+              </w:rPr>
+            </w:pPr>
+            <w:r>
+              <w:rPr>
+                <w:rFonts w:cs="Cambria"/>
+                <w:sz w:val="19"/>
+                <w:lang w:val="es-ES"/>
+              </w:rPr>
+              <w:t>Acceso a datos</w:t>
+            </w:r>
+          </w:p>
+        </w:tc>
+        <w:tc>
+          <w:tcPr>
+            <w:tcW w:w="3685" w:type="dxa"/>
+            <w:shd w:val="clear" w:color="auto" w:fill="FFFFFF"/>
+            <w:vAlign w:val="center"/>
+          </w:tcPr>
+          <w:p>
+            <w:pPr>
+              <w:spacing w:before="40" w:after="40" w:line="264" w:lineRule="auto"/>
+              <w:rPr>
+                <w:lang w:val="es-ES"/>
+              </w:rPr>
+            </w:pPr>
+            <w:r>
+              <w:rPr>
+                <w:rFonts w:cs="Cambria"/>
+                <w:sz w:val="19"/>
+                <w:lang w:val="es-ES"/>
+              </w:rPr>
+              <w:t>Lectura de la cadena de conexión desde App.config mediante ConfigurationManager.</w:t>
+            </w:r>
+          </w:p>
+        </w:tc>
+      </w:tr>
+      <w:tr>
+        <w:trPr>
+          <w:cantSplit/>
+          <w:jc w:val="center"/>
+        </w:trPr>
+        <w:tc>
+          <w:tcPr>
+            <w:tcW w:w="1928" w:type="dxa"/>
+            <w:shd w:val="clear" w:color="auto" w:fill="FFFFFF"/>
+            <w:vAlign w:val="center"/>
+          </w:tcPr>
+          <w:p>
+            <w:pPr>
+              <w:spacing w:before="40" w:after="40" w:line="264" w:lineRule="auto"/>
+            </w:pPr>
+            <w:r>
+              <w:rPr>
+                <w:rFonts w:cs="Cambria"/>
+                <w:b/>
+                <w:sz w:val="19"/>
+              </w:rPr>
+              <w:t>System.Security.Cryptography</w:t>
+            </w:r>
+          </w:p>
+        </w:tc>
+        <w:tc>
+          <w:tcPr>
+            <w:tcW w:w="3742" w:type="dxa"/>
+            <w:shd w:val="clear" w:color="auto" w:fill="FFFFFF"/>
+            <w:vAlign w:val="center"/>
+          </w:tcPr>
+          <w:p>
+            <w:pPr>
+              <w:spacing w:before="40" w:after="40" w:line="264" w:lineRule="auto"/>
+              <w:rPr>
+                <w:lang w:val="es-ES"/>
+              </w:rPr>
+            </w:pPr>
+            <w:r>
+              <w:rPr>
+                <w:rFonts w:cs="Cambria"/>
+                <w:sz w:val="19"/>
+                <w:lang w:val="es-ES"/>
+              </w:rPr>
+              <w:t>Negocio</w:t>
+            </w:r>
+          </w:p>
+        </w:tc>
+        <w:tc>
+          <w:tcPr>
+            <w:tcW w:w="3685" w:type="dxa"/>
+            <w:shd w:val="clear" w:color="auto" w:fill="FFFFFF"/>
+            <w:vAlign w:val="center"/>
+          </w:tcPr>
+          <w:p>
+            <w:pPr>
+              <w:spacing w:before="40" w:after="40" w:line="264" w:lineRule="auto"/>
+              <w:rPr>
+                <w:lang w:val="es-ES"/>
+              </w:rPr>
+            </w:pPr>
+            <w:r>
+              <w:rPr>
+                <w:rFonts w:cs="Cambria"/>
+                <w:sz w:val="19"/>
+                <w:lang w:val="es-ES"/>
+              </w:rPr>
+              <w:t>Cálculo del hash SHA-256 de las contraseñas (Seguridad.cs).</w:t>
+            </w:r>
+          </w:p>
+        </w:tc>
+      </w:tr>
+      <w:tr>
+        <w:trPr>
+          <w:cantSplit/>
+          <w:jc w:val="center"/>
+        </w:trPr>
+        <w:tc>
+          <w:tcPr>
+            <w:tcW w:w="1928" w:type="dxa"/>
+            <w:shd w:val="clear" w:color="auto" w:fill="FFFFFF"/>
+            <w:vAlign w:val="center"/>
+          </w:tcPr>
+          <w:p>
+            <w:pPr>
+              <w:spacing w:before="40" w:after="40" w:line="264" w:lineRule="auto"/>
+            </w:pPr>
+            <w:r>
+              <w:rPr>
+                <w:rFonts w:cs="Cambria"/>
+                <w:b/>
+                <w:sz w:val="19"/>
+              </w:rPr>
+              <w:t>System.Text</w:t>
+            </w:r>
+          </w:p>
+        </w:tc>
+        <w:tc>
+          <w:tcPr>
+            <w:tcW w:w="3742" w:type="dxa"/>
+            <w:shd w:val="clear" w:color="auto" w:fill="FFFFFF"/>
+            <w:vAlign w:val="center"/>
+          </w:tcPr>
+          <w:p>
+            <w:pPr>
+              <w:spacing w:before="40" w:after="40" w:line="264" w:lineRule="auto"/>
+              <w:rPr>
+                <w:lang w:val="es-ES"/>
+              </w:rPr>
+            </w:pPr>
+            <w:r>
+              <w:rPr>
+                <w:rFonts w:cs="Cambria"/>
+                <w:sz w:val="19"/>
+                <w:lang w:val="es-ES"/>
+              </w:rPr>
+              <w:t>Negocio</w:t>
+            </w:r>
+          </w:p>
+        </w:tc>
+        <w:tc>
+          <w:tcPr>
+            <w:tcW w:w="3685" w:type="dxa"/>
+            <w:shd w:val="clear" w:color="auto" w:fill="FFFFFF"/>
+            <w:vAlign w:val="center"/>
+          </w:tcPr>
+          <w:p>
+            <w:pPr>
+              <w:spacing w:before="40" w:after="40" w:line="264" w:lineRule="auto"/>
+              <w:rPr>
+                <w:lang w:val="es-ES"/>
+              </w:rPr>
+            </w:pPr>
+            <w:r>
+              <w:rPr>
+                <w:rFonts w:cs="Cambria"/>
+                <w:sz w:val="19"/>
+                <w:lang w:val="es-ES"/>
+              </w:rPr>
+              <w:t>Conversión del hash a texto hexadecimal con StringBuilder.</w:t>
+            </w:r>
+          </w:p>
+        </w:tc>
+      </w:tr>
+      <w:tr>
+        <w:trPr>
+          <w:cantSplit/>
+          <w:jc w:val="center"/>
+        </w:trPr>
+        <w:tc>
+          <w:tcPr>
+            <w:tcW w:w="1928" w:type="dxa"/>
+            <w:shd w:val="clear" w:color="auto" w:fill="FFFFFF"/>
+            <w:vAlign w:val="center"/>
+          </w:tcPr>
+          <w:p>
+            <w:pPr>
+              <w:spacing w:before="40" w:after="40" w:line="264" w:lineRule="auto"/>
+            </w:pPr>
+            <w:r>
+              <w:rPr>
+                <w:rFonts w:cs="Cambria"/>
+                <w:b/>
+                <w:sz w:val="19"/>
+              </w:rPr>
+              <w:t>System.Text.RegularExpressions</w:t>
+            </w:r>
+          </w:p>
+        </w:tc>
+        <w:tc>
+          <w:tcPr>
+            <w:tcW w:w="3742" w:type="dxa"/>
+            <w:shd w:val="clear" w:color="auto" w:fill="FFFFFF"/>
+            <w:vAlign w:val="center"/>
+          </w:tcPr>
+          <w:p>
+            <w:pPr>
+              <w:spacing w:before="40" w:after="40" w:line="264" w:lineRule="auto"/>
+              <w:rPr>
+                <w:lang w:val="es-ES"/>
+              </w:rPr>
+            </w:pPr>
+            <w:r>
+              <w:rPr>
+                <w:rFonts w:cs="Cambria"/>
+                <w:sz w:val="19"/>
+                <w:lang w:val="es-ES"/>
+              </w:rPr>
+              <w:t>Negocio</w:t>
+            </w:r>
+          </w:p>
+        </w:tc>
+        <w:tc>
+          <w:tcPr>
+            <w:tcW w:w="3685" w:type="dxa"/>
+            <w:shd w:val="clear" w:color="auto" w:fill="FFFFFF"/>
+            <w:vAlign w:val="center"/>
+          </w:tcPr>
+          <w:p>
+            <w:pPr>
+              <w:spacing w:before="40" w:after="40" w:line="264" w:lineRule="auto"/>
+              <w:rPr>
+                <w:lang w:val="es-ES"/>
+              </w:rPr>
+            </w:pPr>
+            <w:r>
+              <w:rPr>
+                <w:rFonts w:cs="Cambria"/>
+                <w:sz w:val="19"/>
+                <w:lang w:val="es-ES"/>
+              </w:rPr>
+              <w:t>Validación del formato del correo electrónico (Validaciones.cs).</w:t>
+            </w:r>
+          </w:p>
+        </w:tc>
+      </w:tr>
+      <w:tr>
+        <w:trPr>
+          <w:cantSplit/>
+          <w:jc w:val="center"/>
+        </w:trPr>
+        <w:tc>
+          <w:tcPr>
+            <w:tcW w:w="1928" w:type="dxa"/>
+            <w:shd w:val="clear" w:color="auto" w:fill="FFFFFF"/>
+            <w:vAlign w:val="center"/>
+          </w:tcPr>
+          <w:p>
+            <w:pPr>
+              <w:spacing w:before="40" w:after="40" w:line="264" w:lineRule="auto"/>
+            </w:pPr>
+            <w:r>
+              <w:rPr>
+                <w:rFonts w:cs="Cambria"/>
+                <w:b/>
+                <w:sz w:val="19"/>
+              </w:rPr>
+              <w:t>System.Collections.Generic</w:t>
+            </w:r>
+          </w:p>
+        </w:tc>
+        <w:tc>
+          <w:tcPr>
+            <w:tcW w:w="3742" w:type="dxa"/>
+            <w:shd w:val="clear" w:color="auto" w:fill="FFFFFF"/>
+            <w:vAlign w:val="center"/>
+          </w:tcPr>
+          <w:p>
+            <w:pPr>
+              <w:spacing w:before="40" w:after="40" w:line="264" w:lineRule="auto"/>
+              <w:rPr>
+                <w:lang w:val="es-ES"/>
+              </w:rPr>
+            </w:pPr>
+            <w:r>
+              <w:rPr>
+                <w:rFonts w:cs="Cambria"/>
+                <w:sz w:val="19"/>
+                <w:lang w:val="es-ES"/>
+              </w:rPr>
+              <w:t>Todas las capas</w:t>
+            </w:r>
+          </w:p>
+        </w:tc>
+        <w:tc>
+          <w:tcPr>
+            <w:tcW w:w="3685" w:type="dxa"/>
+            <w:shd w:val="clear" w:color="auto" w:fill="FFFFFF"/>
+            <w:vAlign w:val="center"/>
+          </w:tcPr>
+          <w:p>
+            <w:pPr>
+              <w:spacing w:before="40" w:after="40" w:line="264" w:lineRule="auto"/>
+              <w:rPr>
+                <w:lang w:val="es-ES"/>
+              </w:rPr>
+            </w:pPr>
+            <w:r>
+              <w:rPr>
+                <w:rFonts w:cs="Cambria"/>
+                <w:sz w:val="19"/>
+                <w:lang w:val="es-ES"/>
+              </w:rPr>
+              <w:t>Listas tipadas List&lt;T&gt; para mover colecciones de entidades entre capas.</w:t>
+            </w:r>
+          </w:p>
+        </w:tc>
+      </w:tr>
+      <w:tr>
+        <w:trPr>
+          <w:cantSplit/>
+          <w:jc w:val="center"/>
+        </w:trPr>
+        <w:tc>
+          <w:tcPr>
+            <w:tcW w:w="1928" w:type="dxa"/>
+            <w:shd w:val="clear" w:color="auto" w:fill="FFFFFF"/>
+            <w:vAlign w:val="center"/>
+          </w:tcPr>
+          <w:p>
+            <w:pPr>
+              <w:spacing w:before="40" w:after="40" w:line="264" w:lineRule="auto"/>
+            </w:pPr>
+            <w:r>
+              <w:rPr>
+                <w:rFonts w:cs="Cambria"/>
+                <w:b/>
+                <w:sz w:val="19"/>
+              </w:rPr>
+              <w:t>System</w:t>
+            </w:r>
+          </w:p>
+        </w:tc>
+        <w:tc>
+          <w:tcPr>
+            <w:tcW w:w="3742" w:type="dxa"/>
+            <w:shd w:val="clear" w:color="auto" w:fill="FFFFFF"/>
+            <w:vAlign w:val="center"/>
+          </w:tcPr>
+          <w:p>
+            <w:pPr>
+              <w:spacing w:before="40" w:after="40" w:line="264" w:lineRule="auto"/>
+              <w:rPr>
+                <w:lang w:val="es-ES"/>
+              </w:rPr>
+            </w:pPr>
+            <w:r>
+              <w:rPr>
+                <w:rFonts w:cs="Cambria"/>
+                <w:sz w:val="19"/>
+                <w:lang w:val="es-ES"/>
+              </w:rPr>
+              <w:t>Todas las capas</w:t>
+            </w:r>
+          </w:p>
+        </w:tc>
+        <w:tc>
+          <w:tcPr>
+            <w:tcW w:w="3685" w:type="dxa"/>
+            <w:shd w:val="clear" w:color="auto" w:fill="FFFFFF"/>
+            <w:vAlign w:val="center"/>
+          </w:tcPr>
+          <w:p>
+            <w:pPr>
+              <w:spacing w:before="40" w:after="40" w:line="264" w:lineRule="auto"/>
+              <w:rPr>
+                <w:lang w:val="es-ES"/>
+              </w:rPr>
+            </w:pPr>
+            <w:r>
+              <w:rPr>
+                <w:rFonts w:cs="Cambria"/>
+                <w:sz w:val="19"/>
+                <w:lang w:val="es-ES"/>
+              </w:rPr>
+              <w:t>Tipos base (decimal, DateTime), excepciones y utilidades generales.</w:t>
+            </w:r>
+          </w:p>
+        </w:tc>
+      </w:tr>
+    </w:tbl>
+    <w:p>
+      <w:pPr>
+        <w:spacing w:after="160" w:line="288" w:lineRule="auto"/>
+        <w:jc w:val="both"/>
+        <w:rPr>
+          <w:lang w:val="es-ES"/>
+        </w:rPr>
+      </w:pPr>
+    </w:p>
+    <w:p>
+      <w:pPr>
         <w:keepNext/>
         <w:pBdr>
           <w:bottom w:val="single" w:sz="6" w:space="6" w:color="0B4F6C"/>
         </w:pBdr>
         <w:spacing w:before="360" w:after="160"/>
         <w:rPr>
-          <w:lang w:val="es-ES"/>
-        </w:rPr>
-      </w:pPr>
-      <w:r>
-        <w:rPr>
           <w:rFonts w:ascii="Calibri" w:hAnsi="Calibri" w:cs="Calibri"/>
           <w:b/>
           <w:color w:val="0B4F6C"/>
           <w:sz w:val="30"/>
           <w:lang w:val="es-ES"/>
         </w:rPr>
-        <w:t>13.  Librerías utilizadas</w:t>
-      </w:r>
+      </w:pPr>
     </w:p>
     <w:p>
       <w:pPr>
+        <w:keepNext/>
+        <w:pBdr>
+          <w:bottom w:val="single" w:sz="6" w:space="6" w:color="0B4F6C"/>
+        </w:pBdr>
+        <w:spacing w:before="360" w:after="160"/>
+        <w:rPr>
+          <w:rFonts w:ascii="Calibri" w:hAnsi="Calibri" w:cs="Calibri"/>
+          <w:b/>
+          <w:color w:val="0B4F6C"/>
+          <w:sz w:val="30"/>
+          <w:lang w:val="es-ES"/>
+        </w:rPr>
+      </w:pPr>
+    </w:p>
+    <w:p>
+      <w:pPr>
+        <w:keepNext/>
+        <w:pBdr>
+          <w:bottom w:val="single" w:sz="6" w:space="6" w:color="0B4F6C"/>
+        </w:pBdr>
+        <w:spacing w:before="360" w:after="160"/>
+        <w:rPr>
+          <w:lang w:val="es-ES"/>
+        </w:rPr>
+      </w:pPr>
+      <w:r>
+        <w:rPr>
+          <w:rFonts w:ascii="Calibri" w:hAnsi="Calibri" w:cs="Calibri"/>
+          <w:b/>
+          <w:color w:val="0B4F6C"/>
+          <w:sz w:val="30"/>
+          <w:lang w:val="es-ES"/>
+        </w:rPr>
+        <w:t>14.  Pruebas de seguridad realizadas</w:t>
+      </w:r>
+    </w:p>
+    <w:p>
+      <w:pPr>
         <w:spacing w:after="160" w:line="288" w:lineRule="auto"/>
         <w:jc w:val="both"/>
         <w:rPr>
@@ -14090,7 +14988,10 @@
         </w:rPr>
       </w:pPr>
       <w:r>
-        <w:t>Todo el sistema se construyó con librerías estándar del .NET Framework 4.7.2; no fue necesario instalar paquetes externos, lo que simplifica la compilación y la entrega del proyecto. La siguiente tabla resume los espacios de nombres empleados, la capa donde se usan y el papel que cumple cada uno:</w:t>
+        <w:rPr>
+          <w:lang w:val="es-ES"/>
+        </w:rPr>
+        <w:t>Además de las validaciones descritas en la sección 8, se realizaron pruebas específicas para comprobar que las protecciones del sistema funcionan en la práctica. La tabla documenta cada prueba, la forma en que se ejecutó y el resultado obtenido:</w:t>
       </w:r>
     </w:p>
     <w:tbl>
@@ -14134,7 +15035,7 @@
                 <w:color w:val="FFFFFF"/>
                 <w:sz w:val="19"/>
               </w:rPr>
-              <w:t xml:space="preserve">Librería / Espacio de nombres</w:t>
+              <w:t>Prueba realizada</w:t>
             </w:r>
           </w:p>
         </w:tc>
@@ -14155,7 +15056,7 @@
                 <w:color w:val="FFFFFF"/>
                 <w:sz w:val="19"/>
               </w:rPr>
-              <w:t xml:space="preserve">Capa donde se usa</w:t>
+              <w:t>Cómo se probó</w:t>
             </w:r>
           </w:p>
         </w:tc>
@@ -14176,7 +15077,7 @@
                 <w:color w:val="FFFFFF"/>
                 <w:sz w:val="19"/>
               </w:rPr>
-              <w:t xml:space="preserve">Uso en el sistema</w:t>
+              <w:t>Resultado obtenido</w:t>
             </w:r>
           </w:p>
         </w:tc>
@@ -14195,14 +15096,18 @@
           <w:p>
             <w:pPr>
               <w:spacing w:before="40" w:after="40" w:line="264" w:lineRule="auto"/>
+              <w:rPr>
+                <w:lang w:val="es-ES"/>
+              </w:rPr>
             </w:pPr>
             <w:r>
               <w:rPr>
                 <w:rFonts w:cs="Cambria"/>
                 <w:b/>
                 <w:sz w:val="19"/>
-              </w:rPr>
-              <w:t xml:space="preserve">System.Windows.Forms</w:t>
+                <w:lang w:val="es-ES"/>
+              </w:rPr>
+              <w:t>1. Inyección SQL en el inicio de sesión</w:t>
             </w:r>
           </w:p>
         </w:tc>
@@ -14225,7 +15130,7 @@
                 <w:sz w:val="19"/>
                 <w:lang w:val="es-ES"/>
               </w:rPr>
-              <w:t xml:space="preserve">Presentación</w:t>
+              <w:t>Se intentó iniciar sesión escribiendo ' OR '1'='1 como usuario y contraseña, y se escribieron comillas y fragmentos de SQL en los cuadros de búsqueda.</w:t>
             </w:r>
           </w:p>
         </w:tc>
@@ -14238,13 +15143,17 @@
           <w:p>
             <w:pPr>
               <w:spacing w:before="40" w:after="40" w:line="264" w:lineRule="auto"/>
+              <w:rPr>
+                <w:lang w:val="es-ES"/>
+              </w:rPr>
             </w:pPr>
             <w:r>
               <w:rPr>
                 <w:rFonts w:cs="Cambria"/>
                 <w:sz w:val="19"/>
-              </w:rPr>
-              <w:t xml:space="preserve">Formularios, controles (DataGridView, TextBox, botones, menús) y eventos de la interfaz gráfica.</w:t>
+                <w:lang w:val="es-ES"/>
+              </w:rPr>
+              <w:t>Acceso denegado. Lo escrito se trata como dato y no como SQL, porque el 100 % del acceso a datos usa consultas parametrizadas (ConexionBD.Parametro); no existe concatenación de texto del usuario en ninguna sentencia.</w:t>
             </w:r>
           </w:p>
         </w:tc>
@@ -14270,7 +15179,7 @@
                 <w:b/>
                 <w:sz w:val="19"/>
               </w:rPr>
-              <w:t xml:space="preserve">System.Drawing</w:t>
+              <w:t>2. Almacenamiento de contraseñas</w:t>
             </w:r>
           </w:p>
         </w:tc>
@@ -14293,7 +15202,7 @@
                 <w:sz w:val="19"/>
                 <w:lang w:val="es-ES"/>
               </w:rPr>
-              <w:t xml:space="preserve">Presentación</w:t>
+              <w:t>Se consultó directamente la tabla Usuarios en SQL Server para ver cómo quedan guardadas las contraseñas.</w:t>
             </w:r>
           </w:p>
         </w:tc>
@@ -14306,13 +15215,17 @@
           <w:p>
             <w:pPr>
               <w:spacing w:before="40" w:after="40" w:line="264" w:lineRule="auto"/>
+              <w:rPr>
+                <w:lang w:val="es-ES"/>
+              </w:rPr>
             </w:pPr>
             <w:r>
               <w:rPr>
                 <w:rFonts w:cs="Cambria"/>
                 <w:sz w:val="19"/>
-              </w:rPr>
-              <w:t xml:space="preserve">Colores, fuentes y estilos visuales unificados de la interfaz (clase UI.cs).</w:t>
+                <w:lang w:val="es-ES"/>
+              </w:rPr>
+              <w:t>Las contraseñas aparecen como hash SHA-256 de 64 caracteres hexadecimales; en ninguna tabla de la base de datos existe una contraseña en texto plano.</w:t>
             </w:r>
           </w:p>
         </w:tc>
@@ -14331,14 +15244,18 @@
           <w:p>
             <w:pPr>
               <w:spacing w:before="40" w:after="40" w:line="264" w:lineRule="auto"/>
+              <w:rPr>
+                <w:lang w:val="es-ES"/>
+              </w:rPr>
             </w:pPr>
             <w:r>
               <w:rPr>
                 <w:rFonts w:cs="Cambria"/>
                 <w:b/>
                 <w:sz w:val="19"/>
-              </w:rPr>
-              <w:t xml:space="preserve">System.Data</w:t>
+                <w:lang w:val="es-ES"/>
+              </w:rPr>
+              <w:t>3. Control de acceso por rol</w:t>
             </w:r>
           </w:p>
         </w:tc>
@@ -14361,7 +15278,7 @@
                 <w:sz w:val="19"/>
                 <w:lang w:val="es-ES"/>
               </w:rPr>
-              <w:t xml:space="preserve">Acceso a datos</w:t>
+              <w:t>Se inició sesión con el usuario cajero (rol Usuario) y se intentó abrir el módulo de Usuarios.</w:t>
             </w:r>
           </w:p>
         </w:tc>
@@ -14374,13 +15291,17 @@
           <w:p>
             <w:pPr>
               <w:spacing w:before="40" w:after="40" w:line="264" w:lineRule="auto"/>
+              <w:rPr>
+                <w:lang w:val="es-ES"/>
+              </w:rPr>
             </w:pPr>
             <w:r>
               <w:rPr>
                 <w:rFonts w:cs="Cambria"/>
                 <w:sz w:val="19"/>
-              </w:rPr>
-              <w:t xml:space="preserve">Estructuras DataTable y DataRow para manejar los resultados de las consultas.</w:t>
+                <w:lang w:val="es-ES"/>
+              </w:rPr>
+              <w:t>El sistema muestra la advertencia «Solo un usuario Administrador puede gestionar los usuarios del sistema» y no abre el módulo.</w:t>
             </w:r>
           </w:p>
         </w:tc>
@@ -14399,14 +15320,18 @@
           <w:p>
             <w:pPr>
               <w:spacing w:before="40" w:after="40" w:line="264" w:lineRule="auto"/>
+              <w:rPr>
+                <w:lang w:val="es-ES"/>
+              </w:rPr>
             </w:pPr>
             <w:r>
               <w:rPr>
                 <w:rFonts w:cs="Cambria"/>
                 <w:b/>
                 <w:sz w:val="19"/>
-              </w:rPr>
-              <w:t xml:space="preserve">System.Data.SqlClient</w:t>
+                <w:lang w:val="es-ES"/>
+              </w:rPr>
+              <w:t>4. Autoeliminación de la cuenta en sesión</w:t>
             </w:r>
           </w:p>
         </w:tc>
@@ -14429,7 +15354,7 @@
                 <w:sz w:val="19"/>
                 <w:lang w:val="es-ES"/>
               </w:rPr>
-              <w:t xml:space="preserve">Acceso a datos</w:t>
+              <w:t>Con la sesión de admin abierta se intentó eliminar la propia cuenta admin desde el módulo de Usuarios.</w:t>
             </w:r>
           </w:p>
         </w:tc>
@@ -14442,13 +15367,17 @@
           <w:p>
             <w:pPr>
               <w:spacing w:before="40" w:after="40" w:line="264" w:lineRule="auto"/>
+              <w:rPr>
+                <w:lang w:val="es-ES"/>
+              </w:rPr>
             </w:pPr>
             <w:r>
               <w:rPr>
                 <w:rFonts w:cs="Cambria"/>
                 <w:sz w:val="19"/>
-              </w:rPr>
-              <w:t xml:space="preserve">Comunicación con SQL Server: SqlConnection, SqlCommand, SqlParameter y SqlTransaction.</w:t>
+                <w:lang w:val="es-ES"/>
+              </w:rPr>
+              <w:t>La operación se bloquea: el sistema no permite que un usuario elimine la cuenta con la que tiene la sesión abierta.</w:t>
             </w:r>
           </w:p>
         </w:tc>
@@ -14474,7 +15403,7 @@
                 <w:b/>
                 <w:sz w:val="19"/>
               </w:rPr>
-              <w:t xml:space="preserve">System.Configuration</w:t>
+              <w:t>5. Validación de entradas</w:t>
             </w:r>
           </w:p>
         </w:tc>
@@ -14497,7 +15426,7 @@
                 <w:sz w:val="19"/>
                 <w:lang w:val="es-ES"/>
               </w:rPr>
-              <w:t xml:space="preserve">Acceso a datos</w:t>
+              <w:t>Se probaron montos y cantidades negativos, texto en campos numéricos, campos obligatorios vacíos y correos con formato incorrecto.</w:t>
             </w:r>
           </w:p>
         </w:tc>
@@ -14510,13 +15439,17 @@
           <w:p>
             <w:pPr>
               <w:spacing w:before="40" w:after="40" w:line="264" w:lineRule="auto"/>
+              <w:rPr>
+                <w:lang w:val="es-ES"/>
+              </w:rPr>
             </w:pPr>
             <w:r>
               <w:rPr>
                 <w:rFonts w:cs="Cambria"/>
                 <w:sz w:val="19"/>
-              </w:rPr>
-              <w:t xml:space="preserve">Lectura de la cadena de conexión desde App.config mediante ConfigurationManager.</w:t>
+                <w:lang w:val="es-ES"/>
+              </w:rPr>
+              <w:t>Todos los casos se rechazan con un mensaje claro (NegocioException) antes de llegar a la base de datos, sin cerrar la aplicación.</w:t>
             </w:r>
           </w:p>
         </w:tc>
@@ -14535,14 +15468,18 @@
           <w:p>
             <w:pPr>
               <w:spacing w:before="40" w:after="40" w:line="264" w:lineRule="auto"/>
+              <w:rPr>
+                <w:lang w:val="es-ES"/>
+              </w:rPr>
             </w:pPr>
             <w:r>
               <w:rPr>
                 <w:rFonts w:cs="Cambria"/>
                 <w:b/>
                 <w:sz w:val="19"/>
-              </w:rPr>
-              <w:t xml:space="preserve">System.Security.Cryptography</w:t>
+                <w:lang w:val="es-ES"/>
+              </w:rPr>
+              <w:t>6. Reglas de negocio como defensa</w:t>
             </w:r>
           </w:p>
         </w:tc>
@@ -14565,7 +15502,7 @@
                 <w:sz w:val="19"/>
                 <w:lang w:val="es-ES"/>
               </w:rPr>
-              <w:t xml:space="preserve">Negocio</w:t>
+              <w:t>Se intentó facturar más unidades de las existentes en stock y registrar una venta a crédito que supera el límite de crédito del cliente.</w:t>
             </w:r>
           </w:p>
         </w:tc>
@@ -14578,13 +15515,17 @@
           <w:p>
             <w:pPr>
               <w:spacing w:before="40" w:after="40" w:line="264" w:lineRule="auto"/>
+              <w:rPr>
+                <w:lang w:val="es-ES"/>
+              </w:rPr>
             </w:pPr>
             <w:r>
               <w:rPr>
                 <w:rFonts w:cs="Cambria"/>
                 <w:sz w:val="19"/>
-              </w:rPr>
-              <w:t xml:space="preserve">Cálculo del hash SHA-256 de las contraseñas (Seguridad.cs).</w:t>
+                <w:lang w:val="es-ES"/>
+              </w:rPr>
+              <w:t>Ambas operaciones se bloquean con el mensaje correspondiente y no se guarda ningún dato.</w:t>
             </w:r>
           </w:p>
         </w:tc>
@@ -14610,7 +15551,7 @@
                 <w:b/>
                 <w:sz w:val="19"/>
               </w:rPr>
-              <w:t xml:space="preserve">System.Text</w:t>
+              <w:t>7. Integridad transaccional</w:t>
             </w:r>
           </w:p>
         </w:tc>
@@ -14633,7 +15574,7 @@
                 <w:sz w:val="19"/>
                 <w:lang w:val="es-ES"/>
               </w:rPr>
-              <w:t xml:space="preserve">Negocio</w:t>
+              <w:t>Se forzó un error a mitad del guardado de una factura (operación que toca varias tablas a la vez).</w:t>
             </w:r>
           </w:p>
         </w:tc>
@@ -14646,13 +15587,17 @@
           <w:p>
             <w:pPr>
               <w:spacing w:before="40" w:after="40" w:line="264" w:lineRule="auto"/>
+              <w:rPr>
+                <w:lang w:val="es-ES"/>
+              </w:rPr>
             </w:pPr>
             <w:r>
               <w:rPr>
                 <w:rFonts w:cs="Cambria"/>
                 <w:sz w:val="19"/>
-              </w:rPr>
-              <w:t xml:space="preserve">Conversión del hash a texto hexadecimal con StringBuilder.</w:t>
+                <w:lang w:val="es-ES"/>
+              </w:rPr>
+              <w:t>El Rollback de la transacción deja la base de datos exactamente como estaba: no quedan facturas a medias, ni stock descontado, ni saldos alterados.</w:t>
             </w:r>
           </w:p>
         </w:tc>
@@ -14678,7 +15623,7 @@
                 <w:b/>
                 <w:sz w:val="19"/>
               </w:rPr>
-              <w:t xml:space="preserve">System.Text.RegularExpressions</w:t>
+              <w:t>8. Manejo global de errores</w:t>
             </w:r>
           </w:p>
         </w:tc>
@@ -14701,7 +15646,7 @@
                 <w:sz w:val="19"/>
                 <w:lang w:val="es-ES"/>
               </w:rPr>
-              <w:t xml:space="preserve">Negocio</w:t>
+              <w:t>Se provocaron errores inesperados, por ejemplo deteniendo el servicio de SQL Server con la aplicación abierta.</w:t>
             </w:r>
           </w:p>
         </w:tc>
@@ -14714,51 +15659,6 @@
           <w:p>
             <w:pPr>
               <w:spacing w:before="40" w:after="40" w:line="264" w:lineRule="auto"/>
-            </w:pPr>
-            <w:r>
-              <w:rPr>
-                <w:rFonts w:cs="Cambria"/>
-                <w:sz w:val="19"/>
-              </w:rPr>
-              <w:t xml:space="preserve">Validación del formato del correo electrónico (Validaciones.cs).</w:t>
-            </w:r>
-          </w:p>
-        </w:tc>
-      </w:tr>
-      <w:tr>
-        <w:trPr>
-          <w:cantSplit/>
-          <w:jc w:val="center"/>
-        </w:trPr>
-        <w:tc>
-          <w:tcPr>
-            <w:tcW w:w="1928" w:type="dxa"/>
-            <w:shd w:val="clear" w:color="auto" w:fill="FFFFFF"/>
-            <w:vAlign w:val="center"/>
-          </w:tcPr>
-          <w:p>
-            <w:pPr>
-              <w:spacing w:before="40" w:after="40" w:line="264" w:lineRule="auto"/>
-            </w:pPr>
-            <w:r>
-              <w:rPr>
-                <w:rFonts w:cs="Cambria"/>
-                <w:b/>
-                <w:sz w:val="19"/>
-              </w:rPr>
-              <w:t xml:space="preserve">System.Collections.Generic</w:t>
-            </w:r>
-          </w:p>
-        </w:tc>
-        <w:tc>
-          <w:tcPr>
-            <w:tcW w:w="3742" w:type="dxa"/>
-            <w:shd w:val="clear" w:color="auto" w:fill="FFFFFF"/>
-            <w:vAlign w:val="center"/>
-          </w:tcPr>
-          <w:p>
-            <w:pPr>
-              <w:spacing w:before="40" w:after="40" w:line="264" w:lineRule="auto"/>
               <w:rPr>
                 <w:lang w:val="es-ES"/>
               </w:rPr>
@@ -14769,94 +15669,7 @@
                 <w:sz w:val="19"/>
                 <w:lang w:val="es-ES"/>
               </w:rPr>
-              <w:t xml:space="preserve">Todas las capas</w:t>
-            </w:r>
-          </w:p>
-        </w:tc>
-        <w:tc>
-          <w:tcPr>
-            <w:tcW w:w="3685" w:type="dxa"/>
-            <w:shd w:val="clear" w:color="auto" w:fill="FFFFFF"/>
-            <w:vAlign w:val="center"/>
-          </w:tcPr>
-          <w:p>
-            <w:pPr>
-              <w:spacing w:before="40" w:after="40" w:line="264" w:lineRule="auto"/>
-            </w:pPr>
-            <w:r>
-              <w:rPr>
-                <w:rFonts w:cs="Cambria"/>
-                <w:sz w:val="19"/>
-              </w:rPr>
-              <w:t xml:space="preserve">Listas tipadas List&lt;T&gt; para mover colecciones de entidades entre capas.</w:t>
-            </w:r>
-          </w:p>
-        </w:tc>
-      </w:tr>
-      <w:tr>
-        <w:trPr>
-          <w:cantSplit/>
-          <w:jc w:val="center"/>
-        </w:trPr>
-        <w:tc>
-          <w:tcPr>
-            <w:tcW w:w="1928" w:type="dxa"/>
-            <w:shd w:val="clear" w:color="auto" w:fill="FFFFFF"/>
-            <w:vAlign w:val="center"/>
-          </w:tcPr>
-          <w:p>
-            <w:pPr>
-              <w:spacing w:before="40" w:after="40" w:line="264" w:lineRule="auto"/>
-            </w:pPr>
-            <w:r>
-              <w:rPr>
-                <w:rFonts w:cs="Cambria"/>
-                <w:b/>
-                <w:sz w:val="19"/>
-              </w:rPr>
-              <w:t xml:space="preserve">System</w:t>
-            </w:r>
-          </w:p>
-        </w:tc>
-        <w:tc>
-          <w:tcPr>
-            <w:tcW w:w="3742" w:type="dxa"/>
-            <w:shd w:val="clear" w:color="auto" w:fill="FFFFFF"/>
-            <w:vAlign w:val="center"/>
-          </w:tcPr>
-          <w:p>
-            <w:pPr>
-              <w:spacing w:before="40" w:after="40" w:line="264" w:lineRule="auto"/>
-              <w:rPr>
-                <w:lang w:val="es-ES"/>
-              </w:rPr>
-            </w:pPr>
-            <w:r>
-              <w:rPr>
-                <w:rFonts w:cs="Cambria"/>
-                <w:sz w:val="19"/>
-                <w:lang w:val="es-ES"/>
-              </w:rPr>
-              <w:t xml:space="preserve">Todas las capas</w:t>
-            </w:r>
-          </w:p>
-        </w:tc>
-        <w:tc>
-          <w:tcPr>
-            <w:tcW w:w="3685" w:type="dxa"/>
-            <w:shd w:val="clear" w:color="auto" w:fill="FFFFFF"/>
-            <w:vAlign w:val="center"/>
-          </w:tcPr>
-          <w:p>
-            <w:pPr>
-              <w:spacing w:before="40" w:after="40" w:line="264" w:lineRule="auto"/>
-            </w:pPr>
-            <w:r>
-              <w:rPr>
-                <w:rFonts w:cs="Cambria"/>
-                <w:sz w:val="19"/>
-              </w:rPr>
-              <w:t xml:space="preserve">Tipos base (decimal, DateTime), excepciones y utilidades generales.</w:t>
+              <w:t>El manejador global instalado en Program.cs captura la excepción y muestra un mensaje amigable; la aplicación no se cierra ni expone detalles técnicos internos.</w:t>
             </w:r>
           </w:p>
         </w:tc>
@@ -14870,11 +15683,11 @@
           <w:lang w:val="es-ES"/>
         </w:rPr>
       </w:pPr>
-      <w:r/>
     </w:p>
     <w:p>
       <w:pPr>
         <w:keepNext/>
+        <w:pageBreakBefore/>
         <w:pBdr>
           <w:bottom w:val="single" w:sz="6" w:space="6" w:color="0B4F6C"/>
         </w:pBdr>
@@ -14891,7 +15704,8 @@
           <w:sz w:val="30"/>
           <w:lang w:val="es-ES"/>
         </w:rPr>
-        <w:t>14.  Pruebas de seguridad realizadas</w:t>
+        <w:lastRenderedPageBreak/>
+        <w:t>15.  Mejoras futuras del sistema</w:t>
       </w:r>
     </w:p>
     <w:p>
@@ -14903,642 +15717,12 @@
         </w:rPr>
       </w:pPr>
       <w:r>
-        <w:t>Además de las validaciones descritas en la sección 8, se realizaron pruebas específicas para comprobar que las protecciones del sistema funcionan en la práctica. La tabla documenta cada prueba, la forma en que se ejecutó y el resultado obtenido:</w:t>
+        <w:rPr>
+          <w:lang w:val="es-ES"/>
+        </w:rPr>
+        <w:t>El sistema cumple los objetivos planteados para la asignatura; sin embargo, durante el desarrollo el equipo identificó mejoras que podrían implementarse en versiones futuras para acercarlo aún más a un producto comercial:</w:t>
       </w:r>
     </w:p>
-    <w:tbl>
-      <w:tblPr>
-        <w:tblW w:w="5000" w:type="pct"/>
-        <w:jc w:val="center"/>
-        <w:tblBorders>
-          <w:top w:val="single" w:sz="6" w:space="0" w:color="CBD5E0"/>
-          <w:left w:val="single" w:sz="6" w:space="0" w:color="CBD5E0"/>
-          <w:bottom w:val="single" w:sz="6" w:space="0" w:color="CBD5E0"/>
-          <w:right w:val="single" w:sz="6" w:space="0" w:color="CBD5E0"/>
-          <w:insideH w:val="single" w:sz="6" w:space="0" w:color="CBD5E0"/>
-          <w:insideV w:val="single" w:sz="6" w:space="0" w:color="CBD5E0"/>
-        </w:tblBorders>
-        <w:tblLook w:val="04A0" w:firstRow="1" w:lastRow="0" w:firstColumn="1" w:lastColumn="0" w:noHBand="0" w:noVBand="1"/>
-      </w:tblPr>
-      <w:tblGrid>
-        <w:gridCol w:w="1983"/>
-        <w:gridCol w:w="3849"/>
-        <w:gridCol w:w="3790"/>
-      </w:tblGrid>
-      <w:tr>
-        <w:trPr>
-          <w:cantSplit/>
-          <w:jc w:val="center"/>
-        </w:trPr>
-        <w:tc>
-          <w:tcPr>
-            <w:tcW w:w="1928" w:type="dxa"/>
-            <w:shd w:val="clear" w:color="auto" w:fill="0B4F6C"/>
-            <w:vAlign w:val="center"/>
-          </w:tcPr>
-          <w:p>
-            <w:pPr>
-              <w:spacing w:before="40" w:after="40"/>
-            </w:pPr>
-            <w:r>
-              <w:rPr>
-                <w:rFonts w:ascii="Calibri" w:hAnsi="Calibri" w:cs="Calibri"/>
-                <w:b/>
-                <w:color w:val="FFFFFF"/>
-                <w:sz w:val="19"/>
-              </w:rPr>
-              <w:t xml:space="preserve">Prueba realizada</w:t>
-            </w:r>
-          </w:p>
-        </w:tc>
-        <w:tc>
-          <w:tcPr>
-            <w:tcW w:w="3742" w:type="dxa"/>
-            <w:shd w:val="clear" w:color="auto" w:fill="0B4F6C"/>
-            <w:vAlign w:val="center"/>
-          </w:tcPr>
-          <w:p>
-            <w:pPr>
-              <w:spacing w:before="40" w:after="40"/>
-            </w:pPr>
-            <w:r>
-              <w:rPr>
-                <w:rFonts w:ascii="Calibri" w:hAnsi="Calibri" w:cs="Calibri"/>
-                <w:b/>
-                <w:color w:val="FFFFFF"/>
-                <w:sz w:val="19"/>
-              </w:rPr>
-              <w:t xml:space="preserve">Cómo se probó</w:t>
-            </w:r>
-          </w:p>
-        </w:tc>
-        <w:tc>
-          <w:tcPr>
-            <w:tcW w:w="3685" w:type="dxa"/>
-            <w:shd w:val="clear" w:color="auto" w:fill="0B4F6C"/>
-            <w:vAlign w:val="center"/>
-          </w:tcPr>
-          <w:p>
-            <w:pPr>
-              <w:spacing w:before="40" w:after="40"/>
-            </w:pPr>
-            <w:r>
-              <w:rPr>
-                <w:rFonts w:ascii="Calibri" w:hAnsi="Calibri" w:cs="Calibri"/>
-                <w:b/>
-                <w:color w:val="FFFFFF"/>
-                <w:sz w:val="19"/>
-              </w:rPr>
-              <w:t xml:space="preserve">Resultado obtenido</w:t>
-            </w:r>
-          </w:p>
-        </w:tc>
-      </w:tr>
-      <w:tr>
-        <w:trPr>
-          <w:cantSplit/>
-          <w:jc w:val="center"/>
-        </w:trPr>
-        <w:tc>
-          <w:tcPr>
-            <w:tcW w:w="1928" w:type="dxa"/>
-            <w:shd w:val="clear" w:color="auto" w:fill="FFFFFF"/>
-            <w:vAlign w:val="center"/>
-          </w:tcPr>
-          <w:p>
-            <w:pPr>
-              <w:spacing w:before="40" w:after="40" w:line="264" w:lineRule="auto"/>
-            </w:pPr>
-            <w:r>
-              <w:rPr>
-                <w:rFonts w:cs="Cambria"/>
-                <w:b/>
-                <w:sz w:val="19"/>
-              </w:rPr>
-              <w:t xml:space="preserve">1. Inyección SQL en el inicio de sesión</w:t>
-            </w:r>
-          </w:p>
-        </w:tc>
-        <w:tc>
-          <w:tcPr>
-            <w:tcW w:w="3742" w:type="dxa"/>
-            <w:shd w:val="clear" w:color="auto" w:fill="FFFFFF"/>
-            <w:vAlign w:val="center"/>
-          </w:tcPr>
-          <w:p>
-            <w:pPr>
-              <w:spacing w:before="40" w:after="40" w:line="264" w:lineRule="auto"/>
-              <w:rPr>
-                <w:lang w:val="es-ES"/>
-              </w:rPr>
-            </w:pPr>
-            <w:r>
-              <w:rPr>
-                <w:rFonts w:cs="Cambria"/>
-                <w:sz w:val="19"/>
-                <w:lang w:val="es-ES"/>
-              </w:rPr>
-              <w:t xml:space="preserve">Se intentó iniciar sesión escribiendo ' OR '1'='1 como usuario y contraseña, y se escribieron comillas y fragmentos de SQL en los cuadros de búsqueda.</w:t>
-            </w:r>
-          </w:p>
-        </w:tc>
-        <w:tc>
-          <w:tcPr>
-            <w:tcW w:w="3685" w:type="dxa"/>
-            <w:shd w:val="clear" w:color="auto" w:fill="FFFFFF"/>
-            <w:vAlign w:val="center"/>
-          </w:tcPr>
-          <w:p>
-            <w:pPr>
-              <w:spacing w:before="40" w:after="40" w:line="264" w:lineRule="auto"/>
-            </w:pPr>
-            <w:r>
-              <w:rPr>
-                <w:rFonts w:cs="Cambria"/>
-                <w:sz w:val="19"/>
-              </w:rPr>
-              <w:t xml:space="preserve">Acceso denegado. Lo escrito se trata como dato y no como SQL, porque el 100 % del acceso a datos usa consultas parametrizadas (ConexionBD.Parametro); no existe concatenación de texto del usuario en ninguna sentencia.</w:t>
-            </w:r>
-          </w:p>
-        </w:tc>
-      </w:tr>
-      <w:tr>
-        <w:trPr>
-          <w:cantSplit/>
-          <w:jc w:val="center"/>
-        </w:trPr>
-        <w:tc>
-          <w:tcPr>
-            <w:tcW w:w="1928" w:type="dxa"/>
-            <w:shd w:val="clear" w:color="auto" w:fill="FFFFFF"/>
-            <w:vAlign w:val="center"/>
-          </w:tcPr>
-          <w:p>
-            <w:pPr>
-              <w:spacing w:before="40" w:after="40" w:line="264" w:lineRule="auto"/>
-            </w:pPr>
-            <w:r>
-              <w:rPr>
-                <w:rFonts w:cs="Cambria"/>
-                <w:b/>
-                <w:sz w:val="19"/>
-              </w:rPr>
-              <w:t xml:space="preserve">2. Almacenamiento de contraseñas</w:t>
-            </w:r>
-          </w:p>
-        </w:tc>
-        <w:tc>
-          <w:tcPr>
-            <w:tcW w:w="3742" w:type="dxa"/>
-            <w:shd w:val="clear" w:color="auto" w:fill="FFFFFF"/>
-            <w:vAlign w:val="center"/>
-          </w:tcPr>
-          <w:p>
-            <w:pPr>
-              <w:spacing w:before="40" w:after="40" w:line="264" w:lineRule="auto"/>
-              <w:rPr>
-                <w:lang w:val="es-ES"/>
-              </w:rPr>
-            </w:pPr>
-            <w:r>
-              <w:rPr>
-                <w:rFonts w:cs="Cambria"/>
-                <w:sz w:val="19"/>
-                <w:lang w:val="es-ES"/>
-              </w:rPr>
-              <w:t xml:space="preserve">Se consultó directamente la tabla Usuarios en SQL Server para ver cómo quedan guardadas las contraseñas.</w:t>
-            </w:r>
-          </w:p>
-        </w:tc>
-        <w:tc>
-          <w:tcPr>
-            <w:tcW w:w="3685" w:type="dxa"/>
-            <w:shd w:val="clear" w:color="auto" w:fill="FFFFFF"/>
-            <w:vAlign w:val="center"/>
-          </w:tcPr>
-          <w:p>
-            <w:pPr>
-              <w:spacing w:before="40" w:after="40" w:line="264" w:lineRule="auto"/>
-            </w:pPr>
-            <w:r>
-              <w:rPr>
-                <w:rFonts w:cs="Cambria"/>
-                <w:sz w:val="19"/>
-              </w:rPr>
-              <w:t xml:space="preserve">Las contraseñas aparecen como hash SHA-256 de 64 caracteres hexadecimales; en ninguna tabla de la base de datos existe una contraseña en texto plano.</w:t>
-            </w:r>
-          </w:p>
-        </w:tc>
-      </w:tr>
-      <w:tr>
-        <w:trPr>
-          <w:cantSplit/>
-          <w:jc w:val="center"/>
-        </w:trPr>
-        <w:tc>
-          <w:tcPr>
-            <w:tcW w:w="1928" w:type="dxa"/>
-            <w:shd w:val="clear" w:color="auto" w:fill="FFFFFF"/>
-            <w:vAlign w:val="center"/>
-          </w:tcPr>
-          <w:p>
-            <w:pPr>
-              <w:spacing w:before="40" w:after="40" w:line="264" w:lineRule="auto"/>
-            </w:pPr>
-            <w:r>
-              <w:rPr>
-                <w:rFonts w:cs="Cambria"/>
-                <w:b/>
-                <w:sz w:val="19"/>
-              </w:rPr>
-              <w:t xml:space="preserve">3. Control de acceso por rol</w:t>
-            </w:r>
-          </w:p>
-        </w:tc>
-        <w:tc>
-          <w:tcPr>
-            <w:tcW w:w="3742" w:type="dxa"/>
-            <w:shd w:val="clear" w:color="auto" w:fill="FFFFFF"/>
-            <w:vAlign w:val="center"/>
-          </w:tcPr>
-          <w:p>
-            <w:pPr>
-              <w:spacing w:before="40" w:after="40" w:line="264" w:lineRule="auto"/>
-              <w:rPr>
-                <w:lang w:val="es-ES"/>
-              </w:rPr>
-            </w:pPr>
-            <w:r>
-              <w:rPr>
-                <w:rFonts w:cs="Cambria"/>
-                <w:sz w:val="19"/>
-                <w:lang w:val="es-ES"/>
-              </w:rPr>
-              <w:t xml:space="preserve">Se inició sesión con el usuario cajero (rol Usuario) y se intentó abrir el módulo de Usuarios.</w:t>
-            </w:r>
-          </w:p>
-        </w:tc>
-        <w:tc>
-          <w:tcPr>
-            <w:tcW w:w="3685" w:type="dxa"/>
-            <w:shd w:val="clear" w:color="auto" w:fill="FFFFFF"/>
-            <w:vAlign w:val="center"/>
-          </w:tcPr>
-          <w:p>
-            <w:pPr>
-              <w:spacing w:before="40" w:after="40" w:line="264" w:lineRule="auto"/>
-            </w:pPr>
-            <w:r>
-              <w:rPr>
-                <w:rFonts w:cs="Cambria"/>
-                <w:sz w:val="19"/>
-              </w:rPr>
-              <w:t xml:space="preserve">El sistema muestra la advertencia «Solo un usuario Administrador puede gestionar los usuarios del sistema» y no abre el módulo.</w:t>
-            </w:r>
-          </w:p>
-        </w:tc>
-      </w:tr>
-      <w:tr>
-        <w:trPr>
-          <w:cantSplit/>
-          <w:jc w:val="center"/>
-        </w:trPr>
-        <w:tc>
-          <w:tcPr>
-            <w:tcW w:w="1928" w:type="dxa"/>
-            <w:shd w:val="clear" w:color="auto" w:fill="FFFFFF"/>
-            <w:vAlign w:val="center"/>
-          </w:tcPr>
-          <w:p>
-            <w:pPr>
-              <w:spacing w:before="40" w:after="40" w:line="264" w:lineRule="auto"/>
-            </w:pPr>
-            <w:r>
-              <w:rPr>
-                <w:rFonts w:cs="Cambria"/>
-                <w:b/>
-                <w:sz w:val="19"/>
-              </w:rPr>
-              <w:t xml:space="preserve">4. Autoeliminación de la cuenta en sesión</w:t>
-            </w:r>
-          </w:p>
-        </w:tc>
-        <w:tc>
-          <w:tcPr>
-            <w:tcW w:w="3742" w:type="dxa"/>
-            <w:shd w:val="clear" w:color="auto" w:fill="FFFFFF"/>
-            <w:vAlign w:val="center"/>
-          </w:tcPr>
-          <w:p>
-            <w:pPr>
-              <w:spacing w:before="40" w:after="40" w:line="264" w:lineRule="auto"/>
-              <w:rPr>
-                <w:lang w:val="es-ES"/>
-              </w:rPr>
-            </w:pPr>
-            <w:r>
-              <w:rPr>
-                <w:rFonts w:cs="Cambria"/>
-                <w:sz w:val="19"/>
-                <w:lang w:val="es-ES"/>
-              </w:rPr>
-              <w:t xml:space="preserve">Con la sesión de admin abierta se intentó eliminar la propia cuenta admin desde el módulo de Usuarios.</w:t>
-            </w:r>
-          </w:p>
-        </w:tc>
-        <w:tc>
-          <w:tcPr>
-            <w:tcW w:w="3685" w:type="dxa"/>
-            <w:shd w:val="clear" w:color="auto" w:fill="FFFFFF"/>
-            <w:vAlign w:val="center"/>
-          </w:tcPr>
-          <w:p>
-            <w:pPr>
-              <w:spacing w:before="40" w:after="40" w:line="264" w:lineRule="auto"/>
-            </w:pPr>
-            <w:r>
-              <w:rPr>
-                <w:rFonts w:cs="Cambria"/>
-                <w:sz w:val="19"/>
-              </w:rPr>
-              <w:t xml:space="preserve">La operación se bloquea: el sistema no permite que un usuario elimine la cuenta con la que tiene la sesión abierta.</w:t>
-            </w:r>
-          </w:p>
-        </w:tc>
-      </w:tr>
-      <w:tr>
-        <w:trPr>
-          <w:cantSplit/>
-          <w:jc w:val="center"/>
-        </w:trPr>
-        <w:tc>
-          <w:tcPr>
-            <w:tcW w:w="1928" w:type="dxa"/>
-            <w:shd w:val="clear" w:color="auto" w:fill="FFFFFF"/>
-            <w:vAlign w:val="center"/>
-          </w:tcPr>
-          <w:p>
-            <w:pPr>
-              <w:spacing w:before="40" w:after="40" w:line="264" w:lineRule="auto"/>
-            </w:pPr>
-            <w:r>
-              <w:rPr>
-                <w:rFonts w:cs="Cambria"/>
-                <w:b/>
-                <w:sz w:val="19"/>
-              </w:rPr>
-              <w:t xml:space="preserve">5. Validación de entradas</w:t>
-            </w:r>
-          </w:p>
-        </w:tc>
-        <w:tc>
-          <w:tcPr>
-            <w:tcW w:w="3742" w:type="dxa"/>
-            <w:shd w:val="clear" w:color="auto" w:fill="FFFFFF"/>
-            <w:vAlign w:val="center"/>
-          </w:tcPr>
-          <w:p>
-            <w:pPr>
-              <w:spacing w:before="40" w:after="40" w:line="264" w:lineRule="auto"/>
-              <w:rPr>
-                <w:lang w:val="es-ES"/>
-              </w:rPr>
-            </w:pPr>
-            <w:r>
-              <w:rPr>
-                <w:rFonts w:cs="Cambria"/>
-                <w:sz w:val="19"/>
-                <w:lang w:val="es-ES"/>
-              </w:rPr>
-              <w:t xml:space="preserve">Se probaron montos y cantidades negativos, texto en campos numéricos, campos obligatorios vacíos y correos con formato incorrecto.</w:t>
-            </w:r>
-          </w:p>
-        </w:tc>
-        <w:tc>
-          <w:tcPr>
-            <w:tcW w:w="3685" w:type="dxa"/>
-            <w:shd w:val="clear" w:color="auto" w:fill="FFFFFF"/>
-            <w:vAlign w:val="center"/>
-          </w:tcPr>
-          <w:p>
-            <w:pPr>
-              <w:spacing w:before="40" w:after="40" w:line="264" w:lineRule="auto"/>
-            </w:pPr>
-            <w:r>
-              <w:rPr>
-                <w:rFonts w:cs="Cambria"/>
-                <w:sz w:val="19"/>
-              </w:rPr>
-              <w:t xml:space="preserve">Todos los casos se rechazan con un mensaje claro (NegocioException) antes de llegar a la base de datos, sin cerrar la aplicación.</w:t>
-            </w:r>
-          </w:p>
-        </w:tc>
-      </w:tr>
-      <w:tr>
-        <w:trPr>
-          <w:cantSplit/>
-          <w:jc w:val="center"/>
-        </w:trPr>
-        <w:tc>
-          <w:tcPr>
-            <w:tcW w:w="1928" w:type="dxa"/>
-            <w:shd w:val="clear" w:color="auto" w:fill="FFFFFF"/>
-            <w:vAlign w:val="center"/>
-          </w:tcPr>
-          <w:p>
-            <w:pPr>
-              <w:spacing w:before="40" w:after="40" w:line="264" w:lineRule="auto"/>
-            </w:pPr>
-            <w:r>
-              <w:rPr>
-                <w:rFonts w:cs="Cambria"/>
-                <w:b/>
-                <w:sz w:val="19"/>
-              </w:rPr>
-              <w:t xml:space="preserve">6. Reglas de negocio como defensa</w:t>
-            </w:r>
-          </w:p>
-        </w:tc>
-        <w:tc>
-          <w:tcPr>
-            <w:tcW w:w="3742" w:type="dxa"/>
-            <w:shd w:val="clear" w:color="auto" w:fill="FFFFFF"/>
-            <w:vAlign w:val="center"/>
-          </w:tcPr>
-          <w:p>
-            <w:pPr>
-              <w:spacing w:before="40" w:after="40" w:line="264" w:lineRule="auto"/>
-              <w:rPr>
-                <w:lang w:val="es-ES"/>
-              </w:rPr>
-            </w:pPr>
-            <w:r>
-              <w:rPr>
-                <w:rFonts w:cs="Cambria"/>
-                <w:sz w:val="19"/>
-                <w:lang w:val="es-ES"/>
-              </w:rPr>
-              <w:t xml:space="preserve">Se intentó facturar más unidades de las existentes en stock y registrar una venta a crédito que supera el límite de crédito del cliente.</w:t>
-            </w:r>
-          </w:p>
-        </w:tc>
-        <w:tc>
-          <w:tcPr>
-            <w:tcW w:w="3685" w:type="dxa"/>
-            <w:shd w:val="clear" w:color="auto" w:fill="FFFFFF"/>
-            <w:vAlign w:val="center"/>
-          </w:tcPr>
-          <w:p>
-            <w:pPr>
-              <w:spacing w:before="40" w:after="40" w:line="264" w:lineRule="auto"/>
-            </w:pPr>
-            <w:r>
-              <w:rPr>
-                <w:rFonts w:cs="Cambria"/>
-                <w:sz w:val="19"/>
-              </w:rPr>
-              <w:t xml:space="preserve">Ambas operaciones se bloquean con el mensaje correspondiente y no se guarda ningún dato.</w:t>
-            </w:r>
-          </w:p>
-        </w:tc>
-      </w:tr>
-      <w:tr>
-        <w:trPr>
-          <w:cantSplit/>
-          <w:jc w:val="center"/>
-        </w:trPr>
-        <w:tc>
-          <w:tcPr>
-            <w:tcW w:w="1928" w:type="dxa"/>
-            <w:shd w:val="clear" w:color="auto" w:fill="FFFFFF"/>
-            <w:vAlign w:val="center"/>
-          </w:tcPr>
-          <w:p>
-            <w:pPr>
-              <w:spacing w:before="40" w:after="40" w:line="264" w:lineRule="auto"/>
-            </w:pPr>
-            <w:r>
-              <w:rPr>
-                <w:rFonts w:cs="Cambria"/>
-                <w:b/>
-                <w:sz w:val="19"/>
-              </w:rPr>
-              <w:t xml:space="preserve">7. Integridad transaccional</w:t>
-            </w:r>
-          </w:p>
-        </w:tc>
-        <w:tc>
-          <w:tcPr>
-            <w:tcW w:w="3742" w:type="dxa"/>
-            <w:shd w:val="clear" w:color="auto" w:fill="FFFFFF"/>
-            <w:vAlign w:val="center"/>
-          </w:tcPr>
-          <w:p>
-            <w:pPr>
-              <w:spacing w:before="40" w:after="40" w:line="264" w:lineRule="auto"/>
-              <w:rPr>
-                <w:lang w:val="es-ES"/>
-              </w:rPr>
-            </w:pPr>
-            <w:r>
-              <w:rPr>
-                <w:rFonts w:cs="Cambria"/>
-                <w:sz w:val="19"/>
-                <w:lang w:val="es-ES"/>
-              </w:rPr>
-              <w:t xml:space="preserve">Se forzó un error a mitad del guardado de una factura (operación que toca varias tablas a la vez).</w:t>
-            </w:r>
-          </w:p>
-        </w:tc>
-        <w:tc>
-          <w:tcPr>
-            <w:tcW w:w="3685" w:type="dxa"/>
-            <w:shd w:val="clear" w:color="auto" w:fill="FFFFFF"/>
-            <w:vAlign w:val="center"/>
-          </w:tcPr>
-          <w:p>
-            <w:pPr>
-              <w:spacing w:before="40" w:after="40" w:line="264" w:lineRule="auto"/>
-            </w:pPr>
-            <w:r>
-              <w:rPr>
-                <w:rFonts w:cs="Cambria"/>
-                <w:sz w:val="19"/>
-              </w:rPr>
-              <w:t xml:space="preserve">El Rollback de la transacción deja la base de datos exactamente como estaba: no quedan facturas a medias, ni stock descontado, ni saldos alterados.</w:t>
-            </w:r>
-          </w:p>
-        </w:tc>
-      </w:tr>
-      <w:tr>
-        <w:trPr>
-          <w:cantSplit/>
-          <w:jc w:val="center"/>
-        </w:trPr>
-        <w:tc>
-          <w:tcPr>
-            <w:tcW w:w="1928" w:type="dxa"/>
-            <w:shd w:val="clear" w:color="auto" w:fill="FFFFFF"/>
-            <w:vAlign w:val="center"/>
-          </w:tcPr>
-          <w:p>
-            <w:pPr>
-              <w:spacing w:before="40" w:after="40" w:line="264" w:lineRule="auto"/>
-            </w:pPr>
-            <w:r>
-              <w:rPr>
-                <w:rFonts w:cs="Cambria"/>
-                <w:b/>
-                <w:sz w:val="19"/>
-              </w:rPr>
-              <w:t xml:space="preserve">8. Manejo global de errores</w:t>
-            </w:r>
-          </w:p>
-        </w:tc>
-        <w:tc>
-          <w:tcPr>
-            <w:tcW w:w="3742" w:type="dxa"/>
-            <w:shd w:val="clear" w:color="auto" w:fill="FFFFFF"/>
-            <w:vAlign w:val="center"/>
-          </w:tcPr>
-          <w:p>
-            <w:pPr>
-              <w:spacing w:before="40" w:after="40" w:line="264" w:lineRule="auto"/>
-              <w:rPr>
-                <w:lang w:val="es-ES"/>
-              </w:rPr>
-            </w:pPr>
-            <w:r>
-              <w:rPr>
-                <w:rFonts w:cs="Cambria"/>
-                <w:sz w:val="19"/>
-                <w:lang w:val="es-ES"/>
-              </w:rPr>
-              <w:t xml:space="preserve">Se provocaron errores inesperados, por ejemplo deteniendo el servicio de SQL Server con la aplicación abierta.</w:t>
-            </w:r>
-          </w:p>
-        </w:tc>
-        <w:tc>
-          <w:tcPr>
-            <w:tcW w:w="3685" w:type="dxa"/>
-            <w:shd w:val="clear" w:color="auto" w:fill="FFFFFF"/>
-            <w:vAlign w:val="center"/>
-          </w:tcPr>
-          <w:p>
-            <w:pPr>
-              <w:spacing w:before="40" w:after="40" w:line="264" w:lineRule="auto"/>
-            </w:pPr>
-            <w:r>
-              <w:rPr>
-                <w:rFonts w:cs="Cambria"/>
-                <w:sz w:val="19"/>
-              </w:rPr>
-              <w:t xml:space="preserve">El manejador global instalado en Program.cs captura la excepción y muestra un mensaje amigable; la aplicación no se cierra ni expone detalles técnicos internos.</w:t>
-            </w:r>
-          </w:p>
-        </w:tc>
-      </w:tr>
-    </w:tbl>
     <w:p>
       <w:pPr>
         <w:spacing w:after="160" w:line="288" w:lineRule="auto"/>
@@ -15547,12 +15731,222 @@
           <w:lang w:val="es-ES"/>
         </w:rPr>
       </w:pPr>
-      <w:r/>
+      <w:r>
+        <w:rPr>
+          <w:b/>
+          <w:lang w:val="es-ES"/>
+        </w:rPr>
+        <w:t>•  Impresión y exportación de facturas.</w:t>
+      </w:r>
+      <w:r>
+        <w:rPr>
+          <w:lang w:val="es-ES"/>
+        </w:rPr>
+        <w:t xml:space="preserve"> Generar la factura en PDF con el formato de la empresa y enviarla por correo al cliente.</w:t>
+      </w:r>
     </w:p>
     <w:p>
       <w:pPr>
+        <w:spacing w:after="160" w:line="288" w:lineRule="auto"/>
+        <w:jc w:val="both"/>
+        <w:rPr>
+          <w:lang w:val="es-ES"/>
+        </w:rPr>
+      </w:pPr>
+      <w:r>
+        <w:rPr>
+          <w:b/>
+          <w:lang w:val="es-ES"/>
+        </w:rPr>
+        <w:t>•  Comprobantes fiscales (NCF).</w:t>
+      </w:r>
+      <w:r>
+        <w:rPr>
+          <w:lang w:val="es-ES"/>
+        </w:rPr>
+        <w:t xml:space="preserve"> Incorporar la numeración de comprobantes fiscales de la DGII para que las facturas tengan validez fiscal en la República Dominicana.</w:t>
+      </w:r>
+    </w:p>
+    <w:p>
+      <w:pPr>
+        <w:spacing w:after="160" w:line="288" w:lineRule="auto"/>
+        <w:jc w:val="both"/>
+        <w:rPr>
+          <w:lang w:val="es-ES"/>
+        </w:rPr>
+      </w:pPr>
+      <w:r>
+        <w:rPr>
+          <w:b/>
+          <w:lang w:val="es-ES"/>
+        </w:rPr>
+        <w:t>•  Reportes y gráficos.</w:t>
+      </w:r>
+      <w:r>
+        <w:rPr>
+          <w:lang w:val="es-ES"/>
+        </w:rPr>
+        <w:t xml:space="preserve"> Ventas por período, productos más vendidos, clientes con mayor deuda y antigüedad de los saldos por cobrar y por pagar.</w:t>
+      </w:r>
+    </w:p>
+    <w:p>
+      <w:pPr>
+        <w:spacing w:after="160" w:line="288" w:lineRule="auto"/>
+        <w:jc w:val="both"/>
+        <w:rPr>
+          <w:lang w:val="es-ES"/>
+        </w:rPr>
+      </w:pPr>
+      <w:r>
+        <w:rPr>
+          <w:b/>
+          <w:lang w:val="es-ES"/>
+        </w:rPr>
+        <w:t>•  Alertas automáticas.</w:t>
+      </w:r>
+      <w:r>
+        <w:rPr>
+          <w:lang w:val="es-ES"/>
+        </w:rPr>
+        <w:t xml:space="preserve"> Avisos de facturas vencidas, límites de crédito próximos a agotarse y productos con stock bajo el mínimo.</w:t>
+      </w:r>
+    </w:p>
+    <w:p>
+      <w:pPr>
+        <w:spacing w:after="160" w:line="288" w:lineRule="auto"/>
+        <w:jc w:val="both"/>
+        <w:rPr>
+          <w:lang w:val="es-ES"/>
+        </w:rPr>
+      </w:pPr>
+      <w:r>
+        <w:rPr>
+          <w:b/>
+          <w:lang w:val="es-ES"/>
+        </w:rPr>
+        <w:t>•  Bitácora de auditoría.</w:t>
+      </w:r>
+      <w:r>
+        <w:rPr>
+          <w:lang w:val="es-ES"/>
+        </w:rPr>
+        <w:t xml:space="preserve"> Registrar qué usuario hizo cada operación (creación, modificación, anulación) con fecha y hora, para trazabilidad completa.</w:t>
+      </w:r>
+    </w:p>
+    <w:p>
+      <w:pPr>
+        <w:spacing w:after="160" w:line="288" w:lineRule="auto"/>
+        <w:jc w:val="both"/>
+        <w:rPr>
+          <w:lang w:val="es-ES"/>
+        </w:rPr>
+      </w:pPr>
+      <w:r>
+        <w:rPr>
+          <w:b/>
+          <w:lang w:val="es-ES"/>
+        </w:rPr>
+        <w:t>•  Descuentos y listas de precios.</w:t>
+      </w:r>
+      <w:r>
+        <w:rPr>
+          <w:lang w:val="es-ES"/>
+        </w:rPr>
+        <w:t xml:space="preserve"> Descuentos por producto, por cliente o por volumen, y precios diferenciados por tipo de cliente.</w:t>
+      </w:r>
+    </w:p>
+    <w:p>
+      <w:pPr>
+        <w:spacing w:after="160" w:line="288" w:lineRule="auto"/>
+        <w:jc w:val="both"/>
+        <w:rPr>
+          <w:lang w:val="es-ES"/>
+        </w:rPr>
+      </w:pPr>
+      <w:r>
+        <w:rPr>
+          <w:b/>
+          <w:lang w:val="es-ES"/>
+        </w:rPr>
+        <w:t>•  Múltiples almacenes y sucursales.</w:t>
+      </w:r>
+      <w:r>
+        <w:rPr>
+          <w:lang w:val="es-ES"/>
+        </w:rPr>
+        <w:t xml:space="preserve"> Controlar el inventario por ubicación y consolidar las ventas de varias sucursales.</w:t>
+      </w:r>
+    </w:p>
+    <w:p>
+      <w:pPr>
+        <w:spacing w:after="160" w:line="288" w:lineRule="auto"/>
+        <w:jc w:val="both"/>
+        <w:rPr>
+          <w:lang w:val="es-ES"/>
+        </w:rPr>
+      </w:pPr>
+      <w:r>
+        <w:rPr>
+          <w:b/>
+          <w:lang w:val="es-ES"/>
+        </w:rPr>
+        <w:t>•  Seguridad reforzada.</w:t>
+      </w:r>
+      <w:r>
+        <w:rPr>
+          <w:lang w:val="es-ES"/>
+        </w:rPr>
+        <w:t xml:space="preserve"> Cifrar la cadena de conexión, agregar salt al hash de contraseñas y aplicar políticas de contraseña (complejidad y expiración).</w:t>
+      </w:r>
+    </w:p>
+    <w:p>
+      <w:pPr>
+        <w:spacing w:after="160" w:line="288" w:lineRule="auto"/>
+        <w:jc w:val="both"/>
+        <w:rPr>
+          <w:lang w:val="es-ES"/>
+        </w:rPr>
+      </w:pPr>
+      <w:r>
+        <w:rPr>
+          <w:b/>
+          <w:lang w:val="es-ES"/>
+        </w:rPr>
+        <w:t>•  Respaldo automático.</w:t>
+      </w:r>
+      <w:r>
+        <w:rPr>
+          <w:lang w:val="es-ES"/>
+        </w:rPr>
+        <w:t xml:space="preserve"> Programar copias de seguridad periódicas de la base de datos desde la propia aplicación.</w:t>
+      </w:r>
+    </w:p>
+    <w:p>
+      <w:pPr>
+        <w:spacing w:after="160" w:line="288" w:lineRule="auto"/>
+        <w:jc w:val="both"/>
+        <w:rPr>
+          <w:lang w:val="es-ES"/>
+        </w:rPr>
+      </w:pPr>
+      <w:r>
+        <w:rPr>
+          <w:b/>
+          <w:lang w:val="es-ES"/>
+        </w:rPr>
+        <w:t>•  Migración tecnológica.</w:t>
+      </w:r>
+      <w:r>
+        <w:rPr>
+          <w:lang w:val="es-ES"/>
+        </w:rPr>
+        <w:t xml:space="preserve"> Llevar el sistema a .NET moderno y evaluar una versión web para acceder desde cualquier dispositivo.</w:t>
+      </w:r>
+    </w:p>
+    <w:p>
+      <w:pPr>
+        <w:keepNext/>
         <w:pageBreakBefore/>
-        <w:keepNext/>
         <w:pBdr>
           <w:bottom w:val="single" w:sz="6" w:space="6" w:color="0B4F6C"/>
         </w:pBdr>
@@ -15569,7 +15963,8 @@
           <w:sz w:val="30"/>
           <w:lang w:val="es-ES"/>
         </w:rPr>
-        <w:t>15.  Mejoras futuras del sistema</w:t>
+        <w:lastRenderedPageBreak/>
+        <w:t>16.  Glosario de términos</w:t>
       </w:r>
     </w:p>
     <w:p>
@@ -15581,221 +15976,9 @@
         </w:rPr>
       </w:pPr>
       <w:r>
-        <w:t>El sistema cumple los objetivos planteados para la asignatura; sin embargo, durante el desarrollo el equipo identificó mejoras que podrían implementarse en versiones futuras para acercarlo aún más a un producto comercial:</w:t>
-      </w:r>
-    </w:p>
-    <w:p>
-      <w:pPr>
-        <w:spacing w:after="160" w:line="288" w:lineRule="auto"/>
-        <w:jc w:val="both"/>
-        <w:rPr>
-          <w:lang w:val="es-ES"/>
-        </w:rPr>
-      </w:pPr>
-      <w:r>
-        <w:rPr>
-          <w:b/>
-        </w:rPr>
-        <w:t>•  Impresión y exportación de facturas.</w:t>
-      </w:r>
-      <w:r>
-        <w:t xml:space="preserve"> Generar la factura en PDF con el formato de la empresa y enviarla por correo al cliente.</w:t>
-      </w:r>
-    </w:p>
-    <w:p>
-      <w:pPr>
-        <w:spacing w:after="160" w:line="288" w:lineRule="auto"/>
-        <w:jc w:val="both"/>
-        <w:rPr>
-          <w:lang w:val="es-ES"/>
-        </w:rPr>
-      </w:pPr>
-      <w:r>
-        <w:rPr>
-          <w:b/>
-        </w:rPr>
-        <w:t>•  Comprobantes fiscales (NCF).</w:t>
-      </w:r>
-      <w:r>
-        <w:t xml:space="preserve"> Incorporar la numeración de comprobantes fiscales de la DGII para que las facturas tengan validez fiscal en la República Dominicana.</w:t>
-      </w:r>
-    </w:p>
-    <w:p>
-      <w:pPr>
-        <w:spacing w:after="160" w:line="288" w:lineRule="auto"/>
-        <w:jc w:val="both"/>
-        <w:rPr>
-          <w:lang w:val="es-ES"/>
-        </w:rPr>
-      </w:pPr>
-      <w:r>
-        <w:rPr>
-          <w:b/>
-        </w:rPr>
-        <w:t>•  Reportes y gráficos.</w:t>
-      </w:r>
-      <w:r>
-        <w:t xml:space="preserve"> Ventas por período, productos más vendidos, clientes con mayor deuda y antigüedad de los saldos por cobrar y por pagar.</w:t>
-      </w:r>
-    </w:p>
-    <w:p>
-      <w:pPr>
-        <w:spacing w:after="160" w:line="288" w:lineRule="auto"/>
-        <w:jc w:val="both"/>
-        <w:rPr>
-          <w:lang w:val="es-ES"/>
-        </w:rPr>
-      </w:pPr>
-      <w:r>
-        <w:rPr>
-          <w:b/>
-        </w:rPr>
-        <w:t>•  Alertas automáticas.</w:t>
-      </w:r>
-      <w:r>
-        <w:t xml:space="preserve"> Avisos de facturas vencidas, límites de crédito próximos a agotarse y productos con stock bajo el mínimo.</w:t>
-      </w:r>
-    </w:p>
-    <w:p>
-      <w:pPr>
-        <w:spacing w:after="160" w:line="288" w:lineRule="auto"/>
-        <w:jc w:val="both"/>
-        <w:rPr>
-          <w:lang w:val="es-ES"/>
-        </w:rPr>
-      </w:pPr>
-      <w:r>
-        <w:rPr>
-          <w:b/>
-        </w:rPr>
-        <w:t>•  Bitácora de auditoría.</w:t>
-      </w:r>
-      <w:r>
-        <w:t xml:space="preserve"> Registrar qué usuario hizo cada operación (creación, modificación, anulación) con fecha y hora, para trazabilidad completa.</w:t>
-      </w:r>
-    </w:p>
-    <w:p>
-      <w:pPr>
-        <w:spacing w:after="160" w:line="288" w:lineRule="auto"/>
-        <w:jc w:val="both"/>
-        <w:rPr>
-          <w:lang w:val="es-ES"/>
-        </w:rPr>
-      </w:pPr>
-      <w:r>
-        <w:rPr>
-          <w:b/>
-        </w:rPr>
-        <w:t>•  Descuentos y listas de precios.</w:t>
-      </w:r>
-      <w:r>
-        <w:t xml:space="preserve"> Descuentos por producto, por cliente o por volumen, y precios diferenciados por tipo de cliente.</w:t>
-      </w:r>
-    </w:p>
-    <w:p>
-      <w:pPr>
-        <w:spacing w:after="160" w:line="288" w:lineRule="auto"/>
-        <w:jc w:val="both"/>
-        <w:rPr>
-          <w:lang w:val="es-ES"/>
-        </w:rPr>
-      </w:pPr>
-      <w:r>
-        <w:rPr>
-          <w:b/>
-        </w:rPr>
-        <w:t>•  Múltiples almacenes y sucursales.</w:t>
-      </w:r>
-      <w:r>
-        <w:t xml:space="preserve"> Controlar el inventario por ubicación y consolidar las ventas de varias sucursales.</w:t>
-      </w:r>
-    </w:p>
-    <w:p>
-      <w:pPr>
-        <w:spacing w:after="160" w:line="288" w:lineRule="auto"/>
-        <w:jc w:val="both"/>
-        <w:rPr>
-          <w:lang w:val="es-ES"/>
-        </w:rPr>
-      </w:pPr>
-      <w:r>
-        <w:rPr>
-          <w:b/>
-        </w:rPr>
-        <w:t>•  Seguridad reforzada.</w:t>
-      </w:r>
-      <w:r>
-        <w:t xml:space="preserve"> Cifrar la cadena de conexión, agregar salt al hash de contraseñas y aplicar políticas de contraseña (complejidad y expiración).</w:t>
-      </w:r>
-    </w:p>
-    <w:p>
-      <w:pPr>
-        <w:spacing w:after="160" w:line="288" w:lineRule="auto"/>
-        <w:jc w:val="both"/>
-        <w:rPr>
-          <w:lang w:val="es-ES"/>
-        </w:rPr>
-      </w:pPr>
-      <w:r>
-        <w:rPr>
-          <w:b/>
-        </w:rPr>
-        <w:t>•  Respaldo automático.</w:t>
-      </w:r>
-      <w:r>
-        <w:t xml:space="preserve"> Programar copias de seguridad periódicas de la base de datos desde la propia aplicación.</w:t>
-      </w:r>
-    </w:p>
-    <w:p>
-      <w:pPr>
-        <w:spacing w:after="160" w:line="288" w:lineRule="auto"/>
-        <w:jc w:val="both"/>
-        <w:rPr>
-          <w:lang w:val="es-ES"/>
-        </w:rPr>
-      </w:pPr>
-      <w:r>
-        <w:rPr>
-          <w:b/>
-        </w:rPr>
-        <w:t>•  Migración tecnológica.</w:t>
-      </w:r>
-      <w:r>
-        <w:t xml:space="preserve"> Llevar el sistema a .NET moderno y evaluar una versión web para acceder desde cualquier dispositivo.</w:t>
-      </w:r>
-    </w:p>
-    <w:p>
-      <w:pPr>
-        <w:pageBreakBefore/>
-        <w:keepNext/>
-        <w:pBdr>
-          <w:bottom w:val="single" w:sz="6" w:space="6" w:color="0B4F6C"/>
-        </w:pBdr>
-        <w:spacing w:before="360" w:after="160"/>
-        <w:rPr>
-          <w:lang w:val="es-ES"/>
-        </w:rPr>
-      </w:pPr>
-      <w:r>
-        <w:rPr>
-          <w:rFonts w:ascii="Calibri" w:hAnsi="Calibri" w:cs="Calibri"/>
-          <w:b/>
-          <w:color w:val="0B4F6C"/>
-          <w:sz w:val="30"/>
-          <w:lang w:val="es-ES"/>
-        </w:rPr>
-        <w:t>16.  Glosario de términos</w:t>
-      </w:r>
-    </w:p>
-    <w:p>
-      <w:pPr>
-        <w:spacing w:after="160" w:line="288" w:lineRule="auto"/>
-        <w:jc w:val="both"/>
-        <w:rPr>
-          <w:lang w:val="es-ES"/>
-        </w:rPr>
-      </w:pPr>
-      <w:r>
+        <w:rPr>
+          <w:lang w:val="es-ES"/>
+        </w:rPr>
         <w:t>Definiciones breves de los términos técnicos y contables empleados a lo largo de este informe:</w:t>
       </w:r>
     </w:p>
@@ -15839,7 +16022,7 @@
                 <w:color w:val="FFFFFF"/>
                 <w:sz w:val="20"/>
               </w:rPr>
-              <w:t xml:space="preserve">Término</w:t>
+              <w:t>Término</w:t>
             </w:r>
           </w:p>
         </w:tc>
@@ -15860,7 +16043,7 @@
                 <w:color w:val="FFFFFF"/>
                 <w:sz w:val="20"/>
               </w:rPr>
-              <w:t xml:space="preserve">Definición</w:t>
+              <w:t>Definición</w:t>
             </w:r>
           </w:p>
         </w:tc>
@@ -15886,7 +16069,7 @@
                 <w:b/>
                 <w:sz w:val="20"/>
               </w:rPr>
-              <w:t xml:space="preserve">ADO.NET</w:t>
+              <w:t>ADO.NET</w:t>
             </w:r>
           </w:p>
         </w:tc>
@@ -15909,7 +16092,7 @@
                 <w:sz w:val="20"/>
                 <w:lang w:val="es-ES"/>
               </w:rPr>
-              <w:t xml:space="preserve">Conjunto de clases de .NET para comunicarse con bases de datos; en este proyecto se usa con SQL Server mediante SqlConnection, SqlCommand y SqlParameter.</w:t>
+              <w:t>Conjunto de clases de .NET para comunicarse con bases de datos; en este proyecto se usa con SQL Server mediante SqlConnection, SqlCommand y SqlParameter.</w:t>
             </w:r>
           </w:p>
         </w:tc>
@@ -15935,7 +16118,7 @@
                 <w:b/>
                 <w:sz w:val="20"/>
               </w:rPr>
-              <w:t xml:space="preserve">Arquitectura en capas</w:t>
+              <w:t>Arquitectura en capas</w:t>
             </w:r>
           </w:p>
         </w:tc>
@@ -15958,7 +16141,7 @@
                 <w:sz w:val="20"/>
                 <w:lang w:val="es-ES"/>
               </w:rPr>
-              <w:t xml:space="preserve">Forma de organizar el código separando responsabilidades: presentación (pantallas), negocio (reglas) y acceso a datos (SQL). Cada capa solo se comunica con la siguiente.</w:t>
+              <w:t>Forma de organizar el código separando responsabilidades: presentación (pantallas), negocio (reglas) y acceso a datos (SQL). Cada capa solo se comunica con la siguiente.</w:t>
             </w:r>
           </w:p>
         </w:tc>
@@ -15984,7 +16167,7 @@
                 <w:b/>
                 <w:sz w:val="20"/>
               </w:rPr>
-              <w:t xml:space="preserve">Cadena de conexión</w:t>
+              <w:t>Cadena de conexión</w:t>
             </w:r>
           </w:p>
         </w:tc>
@@ -16007,7 +16190,7 @@
                 <w:sz w:val="20"/>
                 <w:lang w:val="es-ES"/>
               </w:rPr>
-              <w:t xml:space="preserve">Texto de configuración que indica a la aplicación dónde está el servidor de base de datos y cómo conectarse; se guarda en App.config.</w:t>
+              <w:t>Texto de configuración que indica a la aplicación dónde está el servidor de base de datos y cómo conectarse; se guarda en App.config.</w:t>
             </w:r>
           </w:p>
         </w:tc>
@@ -16033,7 +16216,7 @@
                 <w:b/>
                 <w:sz w:val="20"/>
               </w:rPr>
-              <w:t xml:space="preserve">Clave primaria (PK)</w:t>
+              <w:t>Clave primaria (PK)</w:t>
             </w:r>
           </w:p>
         </w:tc>
@@ -16056,7 +16239,7 @@
                 <w:sz w:val="20"/>
                 <w:lang w:val="es-ES"/>
               </w:rPr>
-              <w:t xml:space="preserve">Campo que identifica de forma única cada fila de una tabla, por ejemplo ClienteID.</w:t>
+              <w:t>Campo que identifica de forma única cada fila de una tabla, por ejemplo ClienteID.</w:t>
             </w:r>
           </w:p>
         </w:tc>
@@ -16082,7 +16265,7 @@
                 <w:b/>
                 <w:sz w:val="20"/>
               </w:rPr>
-              <w:t xml:space="preserve">Clave foránea (FK)</w:t>
+              <w:t>Clave foránea (FK)</w:t>
             </w:r>
           </w:p>
         </w:tc>
@@ -16105,7 +16288,7 @@
                 <w:sz w:val="20"/>
                 <w:lang w:val="es-ES"/>
               </w:rPr>
-              <w:t xml:space="preserve">Campo que apunta a la clave primaria de otra tabla y crea la relación entre ambas, por ejemplo el ClienteID dentro de Facturas.</w:t>
+              <w:t>Campo que apunta a la clave primaria de otra tabla y crea la relación entre ambas, por ejemplo el ClienteID dentro de Facturas.</w:t>
             </w:r>
           </w:p>
         </w:tc>
@@ -16131,7 +16314,7 @@
                 <w:b/>
                 <w:sz w:val="20"/>
               </w:rPr>
-              <w:t xml:space="preserve">Consulta parametrizada</w:t>
+              <w:t>Consulta parametrizada</w:t>
             </w:r>
           </w:p>
         </w:tc>
@@ -16154,7 +16337,7 @@
                 <w:sz w:val="20"/>
                 <w:lang w:val="es-ES"/>
               </w:rPr>
-              <w:t xml:space="preserve">Sentencia SQL donde los valores del usuario viajan como parámetros (@nombre) y nunca se concatenan al texto de la consulta; es la defensa principal contra la inyección SQL.</w:t>
+              <w:t>Sentencia SQL donde los valores del usuario viajan como parámetros (@nombre) y nunca se concatenan al texto de la consulta; es la defensa principal contra la inyección SQL.</w:t>
             </w:r>
           </w:p>
         </w:tc>
@@ -16180,7 +16363,7 @@
                 <w:b/>
                 <w:sz w:val="20"/>
               </w:rPr>
-              <w:t xml:space="preserve">CRUD</w:t>
+              <w:t>CRUD</w:t>
             </w:r>
           </w:p>
         </w:tc>
@@ -16203,7 +16386,7 @@
                 <w:sz w:val="20"/>
                 <w:lang w:val="es-ES"/>
               </w:rPr>
-              <w:t xml:space="preserve">Siglas de Crear, Leer (Read), Actualizar y Eliminar (Delete): las cuatro operaciones básicas sobre cada entidad del sistema.</w:t>
+              <w:t>Siglas de Crear, Leer (Read), Actualizar y Eliminar (Delete): las cuatro operaciones básicas sobre cada entidad del sistema.</w:t>
             </w:r>
           </w:p>
         </w:tc>
@@ -16229,7 +16412,7 @@
                 <w:b/>
                 <w:sz w:val="20"/>
               </w:rPr>
-              <w:t xml:space="preserve">Cuenta por cobrar</w:t>
+              <w:t>Cuenta por cobrar</w:t>
             </w:r>
           </w:p>
         </w:tc>
@@ -16252,7 +16435,7 @@
                 <w:sz w:val="20"/>
                 <w:lang w:val="es-ES"/>
               </w:rPr>
-              <w:t xml:space="preserve">Dinero que los clientes deben a la empresa por facturas a crédito aún no pagadas.</w:t>
+              <w:t>Dinero que los clientes deben a la empresa por facturas a crédito aún no pagadas.</w:t>
             </w:r>
           </w:p>
         </w:tc>
@@ -16278,7 +16461,7 @@
                 <w:b/>
                 <w:sz w:val="20"/>
               </w:rPr>
-              <w:t xml:space="preserve">Cuenta por pagar</w:t>
+              <w:t>Cuenta por pagar</w:t>
             </w:r>
           </w:p>
         </w:tc>
@@ -16301,7 +16484,7 @@
                 <w:sz w:val="20"/>
                 <w:lang w:val="es-ES"/>
               </w:rPr>
-              <w:t xml:space="preserve">Dinero que la empresa debe a sus proveedores por compras a crédito aún no pagadas.</w:t>
+              <w:t>Dinero que la empresa debe a sus proveedores por compras a crédito aún no pagadas.</w:t>
             </w:r>
           </w:p>
         </w:tc>
@@ -16327,7 +16510,7 @@
                 <w:b/>
                 <w:sz w:val="20"/>
               </w:rPr>
-              <w:t xml:space="preserve">DAO</w:t>
+              <w:t>DAO</w:t>
             </w:r>
           </w:p>
         </w:tc>
@@ -16350,7 +16533,7 @@
                 <w:sz w:val="20"/>
                 <w:lang w:val="es-ES"/>
               </w:rPr>
-              <w:t xml:space="preserve">Data Access Object: clase dedicada al acceso a datos de una entidad (por ejemplo, ClienteDAO contiene todo el SQL de clientes).</w:t>
+              <w:t>Data Access Object: clase dedicada al acceso a datos de una entidad (por ejemplo, ClienteDAO contiene todo el SQL de clientes).</w:t>
             </w:r>
           </w:p>
         </w:tc>
@@ -16376,7 +16559,7 @@
                 <w:b/>
                 <w:sz w:val="20"/>
               </w:rPr>
-              <w:t xml:space="preserve">Entidad</w:t>
+              <w:t>Entidad</w:t>
             </w:r>
           </w:p>
         </w:tc>
@@ -16399,7 +16582,7 @@
                 <w:sz w:val="20"/>
                 <w:lang w:val="es-ES"/>
               </w:rPr>
-              <w:t xml:space="preserve">Clase que representa un concepto del negocio (Cliente, Factura, Producto) con sus propiedades; viaja entre las capas del sistema.</w:t>
+              <w:t>Clase que representa un concepto del negocio (Cliente, Factura, Producto) con sus propiedades; viaja entre las capas del sistema.</w:t>
             </w:r>
           </w:p>
         </w:tc>
@@ -16425,7 +16608,7 @@
                 <w:b/>
                 <w:sz w:val="20"/>
               </w:rPr>
-              <w:t xml:space="preserve">Excepción</w:t>
+              <w:t>Excepción</w:t>
             </w:r>
           </w:p>
         </w:tc>
@@ -16448,7 +16631,7 @@
                 <w:sz w:val="20"/>
                 <w:lang w:val="es-ES"/>
               </w:rPr>
-              <w:t xml:space="preserve">Error que ocurre durante la ejecución; el sistema las captura con try/catch y las convierte en mensajes claros para el usuario.</w:t>
+              <w:t>Error que ocurre durante la ejecución; el sistema las captura con try/catch y las convierte en mensajes claros para el usuario.</w:t>
             </w:r>
           </w:p>
         </w:tc>
@@ -16474,7 +16657,7 @@
                 <w:b/>
                 <w:sz w:val="20"/>
               </w:rPr>
-              <w:t xml:space="preserve">Hash SHA-256</w:t>
+              <w:t>Hash SHA-256</w:t>
             </w:r>
           </w:p>
         </w:tc>
@@ -16497,7 +16680,7 @@
                 <w:sz w:val="20"/>
                 <w:lang w:val="es-ES"/>
               </w:rPr>
-              <w:t xml:space="preserve">Función criptográfica que convierte una contraseña en una huella fija de 64 caracteres imposible de revertir; es lo que se guarda en la base de datos en lugar de la contraseña.</w:t>
+              <w:t>Función criptográfica que convierte una contraseña en una huella fija de 64 caracteres imposible de revertir; es lo que se guarda en la base de datos en lugar de la contraseña.</w:t>
             </w:r>
           </w:p>
         </w:tc>
@@ -16523,7 +16706,7 @@
                 <w:b/>
                 <w:sz w:val="20"/>
               </w:rPr>
-              <w:t xml:space="preserve">Inyección SQL</w:t>
+              <w:t>Inyección SQL</w:t>
             </w:r>
           </w:p>
         </w:tc>
@@ -16546,7 +16729,7 @@
                 <w:sz w:val="20"/>
                 <w:lang w:val="es-ES"/>
               </w:rPr>
-              <w:t xml:space="preserve">Ataque que intenta colar instrucciones SQL en los campos de un formulario para manipular la base de datos; se previene con consultas parametrizadas.</w:t>
+              <w:t>Ataque que intenta colar instrucciones SQL en los campos de un formulario para manipular la base de datos; se previene con consultas parametrizadas.</w:t>
             </w:r>
           </w:p>
         </w:tc>
@@ -16572,7 +16755,7 @@
                 <w:b/>
                 <w:sz w:val="20"/>
               </w:rPr>
-              <w:t xml:space="preserve">ITBIS</w:t>
+              <w:t>ITBIS</w:t>
             </w:r>
           </w:p>
         </w:tc>
@@ -16595,7 +16778,7 @@
                 <w:sz w:val="20"/>
                 <w:lang w:val="es-ES"/>
               </w:rPr>
-              <w:t xml:space="preserve">Impuesto sobre Transferencias de Bienes Industrializados y Servicios; en el sistema se calcula al 18 % sobre el subtotal de la factura.</w:t>
+              <w:t>Impuesto sobre Transferencias de Bienes Industrializados y Servicios; en el sistema se calcula al 18 % sobre el subtotal de la factura.</w:t>
             </w:r>
           </w:p>
         </w:tc>
@@ -16621,7 +16804,7 @@
                 <w:b/>
                 <w:sz w:val="20"/>
               </w:rPr>
-              <w:t xml:space="preserve">Rollback / Commit</w:t>
+              <w:t>Rollback / Commit</w:t>
             </w:r>
           </w:p>
         </w:tc>
@@ -16644,7 +16827,7 @@
                 <w:sz w:val="20"/>
                 <w:lang w:val="es-ES"/>
               </w:rPr>
-              <w:t xml:space="preserve">Operaciones de una transacción: Commit confirma todos los cambios juntos y Rollback los revierte todos si algo falla a mitad del proceso.</w:t>
+              <w:t>Operaciones de una transacción: Commit confirma todos los cambios juntos y Rollback los revierte todos si algo falla a mitad del proceso.</w:t>
             </w:r>
           </w:p>
         </w:tc>
@@ -16670,7 +16853,8 @@
                 <w:b/>
                 <w:sz w:val="20"/>
               </w:rPr>
-              <w:t xml:space="preserve">Stock</w:t>
+              <w:lastRenderedPageBreak/>
+              <w:t>Stock</w:t>
             </w:r>
           </w:p>
         </w:tc>
@@ -16693,7 +16877,7 @@
                 <w:sz w:val="20"/>
                 <w:lang w:val="es-ES"/>
               </w:rPr>
-              <w:t xml:space="preserve">Cantidad de unidades de un producto disponibles en el inventario; se descuenta al facturar y aumenta al comprar.</w:t>
+              <w:t>Cantidad de unidades de un producto disponibles en el inventario; se descuenta al facturar y aumenta al comprar.</w:t>
             </w:r>
           </w:p>
         </w:tc>
@@ -16719,7 +16903,7 @@
                 <w:b/>
                 <w:sz w:val="20"/>
               </w:rPr>
-              <w:t xml:space="preserve">Transacción</w:t>
+              <w:t>Transacción</w:t>
             </w:r>
           </w:p>
         </w:tc>
@@ -16742,7 +16926,7 @@
                 <w:sz w:val="20"/>
                 <w:lang w:val="es-ES"/>
               </w:rPr>
-              <w:t xml:space="preserve">Grupo de operaciones de base de datos que se ejecutan como una sola unidad: o se completan todas o no se aplica ninguna.</w:t>
+              <w:t>Grupo de operaciones de base de datos que se ejecutan como una sola unidad: o se completan todas o no se aplica ninguna.</w:t>
             </w:r>
           </w:p>
         </w:tc>
@@ -16768,7 +16952,7 @@
                 <w:b/>
                 <w:sz w:val="20"/>
               </w:rPr>
-              <w:t xml:space="preserve">Windows Forms</w:t>
+              <w:t>Windows Forms</w:t>
             </w:r>
           </w:p>
         </w:tc>
@@ -16791,7 +16975,7 @@
                 <w:sz w:val="20"/>
                 <w:lang w:val="es-ES"/>
               </w:rPr>
-              <w:t xml:space="preserve">Tecnología de .NET para crear aplicaciones de escritorio con ventanas, botones y cuadrículas en Windows.</w:t>
+              <w:t>Tecnología de .NET para crear aplicaciones de escritorio con ventanas, botones y cuadrículas en Windows.</w:t>
             </w:r>
           </w:p>
         </w:tc>
@@ -16805,7 +16989,6 @@
           <w:lang w:val="es-ES"/>
         </w:rPr>
       </w:pPr>
-      <w:r/>
     </w:p>
     <w:p>
       <w:pPr>
@@ -16838,6 +17021,9 @@
         </w:rPr>
       </w:pPr>
       <w:r>
+        <w:rPr>
+          <w:lang w:val="es-ES"/>
+        </w:rPr>
         <w:t>Fuentes consultadas durante el desarrollo del proyecto, citadas según el formato APA (7.ª edición):</w:t>
       </w:r>
     </w:p>
@@ -16849,33 +17035,71 @@
         </w:rPr>
       </w:pPr>
       <w:r>
+        <w:rPr>
+          <w:lang w:val="es-ES"/>
+        </w:rPr>
         <w:t xml:space="preserve">Microsoft. (2025). </w:t>
       </w:r>
       <w:r>
         <w:rPr>
           <w:i/>
+          <w:lang w:val="es-ES"/>
         </w:rPr>
         <w:t>Documentación de C#</w:t>
       </w:r>
       <w:r>
+        <w:rPr>
+          <w:lang w:val="es-ES"/>
+        </w:rPr>
         <w:t xml:space="preserve">. Microsoft Learn. </w:t>
       </w:r>
-      <w:hyperlink r:id="rId38">
+      <w:hyperlink r:id="rId21">
+        <w:r>
+          <w:rPr>
+            <w:color w:val="0563C1"/>
+            <w:u w:val="single"/>
+            <w:lang w:val="es-ES"/>
+          </w:rPr>
+          <w:t>https://learn.microsoft.com/es-es/dotnet/csharp/</w:t>
+        </w:r>
+      </w:hyperlink>
+    </w:p>
+    <w:p>
+      <w:pPr>
+        <w:spacing w:after="160" w:line="288" w:lineRule="auto"/>
+      </w:pPr>
+      <w:r>
+        <w:rPr>
+          <w:lang w:val="es-ES"/>
+        </w:rPr>
+        <w:t xml:space="preserve">Microsoft. (2025). </w:t>
+      </w:r>
+      <w:r>
+        <w:rPr>
+          <w:i/>
+          <w:lang w:val="es-ES"/>
+        </w:rPr>
+        <w:t>Información general sobre ADO.NET</w:t>
+      </w:r>
+      <w:r>
+        <w:rPr>
+          <w:lang w:val="es-ES"/>
+        </w:rPr>
+        <w:t xml:space="preserve">. Microsoft Learn. </w:t>
+      </w:r>
+      <w:hyperlink r:id="rId22">
         <w:r>
           <w:rPr>
             <w:color w:val="0563C1"/>
             <w:u w:val="single"/>
           </w:rPr>
-          <w:t xml:space="preserve">https://learn.microsoft.com/es-es/dotnet/csharp/</w:t>
+          <w:t>https://learn.microsoft.com/es-es/dotnet/framework/data/adonet/</w:t>
         </w:r>
       </w:hyperlink>
     </w:p>
     <w:p>
       <w:pPr>
         <w:spacing w:after="160" w:line="288" w:lineRule="auto"/>
-        <w:rPr>
-          <w:lang w:val="es-ES"/>
-        </w:rPr>
       </w:pPr>
       <w:r>
         <w:t xml:space="preserve">Microsoft. (2025). </w:t>
@@ -16884,56 +17108,63 @@
         <w:rPr>
           <w:i/>
         </w:rPr>
-        <w:t>Información general sobre ADO.NET</w:t>
+        <w:t>Documentación de Windows Forms para .NET Framework</w:t>
       </w:r>
       <w:r>
         <w:t xml:space="preserve">. Microsoft Learn. </w:t>
       </w:r>
-      <w:hyperlink r:id="rId39">
+      <w:hyperlink r:id="rId23">
         <w:r>
           <w:rPr>
             <w:color w:val="0563C1"/>
             <w:u w:val="single"/>
           </w:rPr>
-          <w:t xml:space="preserve">https://learn.microsoft.com/es-es/dotnet/framework/data/adonet/</w:t>
+          <w:t>https://learn.microsoft.com/es-es/dotnet/desktop/winforms/</w:t>
         </w:r>
       </w:hyperlink>
     </w:p>
     <w:p>
       <w:pPr>
         <w:spacing w:after="160" w:line="288" w:lineRule="auto"/>
-        <w:rPr>
-          <w:lang w:val="es-ES"/>
-        </w:rPr>
-      </w:pPr>
-      <w:r>
-        <w:t xml:space="preserve">Microsoft. (2025). </w:t>
+      </w:pPr>
+      <w:r>
+        <w:t xml:space="preserve">Microsoft. </w:t>
+      </w:r>
+      <w:r>
+        <w:rPr>
+          <w:lang w:val="es-ES"/>
+        </w:rPr>
+        <w:t xml:space="preserve">(2025). </w:t>
       </w:r>
       <w:r>
         <w:rPr>
           <w:i/>
-        </w:rPr>
-        <w:t>Documentación de Windows Forms para .NET Framework</w:t>
-      </w:r>
-      <w:r>
-        <w:t xml:space="preserve">. Microsoft Learn. </w:t>
-      </w:r>
-      <w:hyperlink r:id="rId40">
+          <w:lang w:val="es-ES"/>
+        </w:rPr>
+        <w:t>Documentación técnica de SQL Server</w:t>
+      </w:r>
+      <w:r>
+        <w:rPr>
+          <w:lang w:val="es-ES"/>
+        </w:rPr>
+        <w:t xml:space="preserve">. </w:t>
+      </w:r>
+      <w:r>
+        <w:t xml:space="preserve">Microsoft Learn. </w:t>
+      </w:r>
+      <w:hyperlink r:id="rId24">
         <w:r>
           <w:rPr>
             <w:color w:val="0563C1"/>
             <w:u w:val="single"/>
           </w:rPr>
-          <w:t xml:space="preserve">https://learn.microsoft.com/es-es/dotnet/desktop/winforms/</w:t>
+          <w:t>https://learn.microsoft.com/es-es/sql/sql-server/</w:t>
         </w:r>
       </w:hyperlink>
     </w:p>
     <w:p>
       <w:pPr>
         <w:spacing w:after="160" w:line="288" w:lineRule="auto"/>
-        <w:rPr>
-          <w:lang w:val="es-ES"/>
-        </w:rPr>
       </w:pPr>
       <w:r>
         <w:t xml:space="preserve">Microsoft. (2025). </w:t>
@@ -16942,27 +17173,24 @@
         <w:rPr>
           <w:i/>
         </w:rPr>
-        <w:t>Documentación técnica de SQL Server</w:t>
+        <w:t>SHA256 (clase) — System.Security.Cryptography</w:t>
       </w:r>
       <w:r>
         <w:t xml:space="preserve">. Microsoft Learn. </w:t>
       </w:r>
-      <w:hyperlink r:id="rId41">
+      <w:hyperlink r:id="rId25">
         <w:r>
           <w:rPr>
             <w:color w:val="0563C1"/>
             <w:u w:val="single"/>
           </w:rPr>
-          <w:t xml:space="preserve">https://learn.microsoft.com/es-es/sql/sql-server/</w:t>
+          <w:t>https://learn.microsoft.com/es-es/dotnet/api/system.security.cryptography.sha256</w:t>
         </w:r>
       </w:hyperlink>
     </w:p>
     <w:p>
       <w:pPr>
         <w:spacing w:after="160" w:line="288" w:lineRule="auto"/>
-        <w:rPr>
-          <w:lang w:val="es-ES"/>
-        </w:rPr>
       </w:pPr>
       <w:r>
         <w:t xml:space="preserve">Microsoft. (2025). </w:t>
@@ -16971,47 +17199,44 @@
         <w:rPr>
           <w:i/>
         </w:rPr>
-        <w:t>SHA256 (clase) — System.Security.Cryptography</w:t>
+        <w:t>SqlParameter (clase) — System.Data.SqlClient</w:t>
       </w:r>
       <w:r>
         <w:t xml:space="preserve">. Microsoft Learn. </w:t>
       </w:r>
-      <w:hyperlink r:id="rId42">
+      <w:hyperlink r:id="rId26">
         <w:r>
           <w:rPr>
             <w:color w:val="0563C1"/>
             <w:u w:val="single"/>
           </w:rPr>
-          <w:t xml:space="preserve">https://learn.microsoft.com/es-es/dotnet/api/system.security.cryptography.sha256</w:t>
+          <w:t>https://learn.microsoft.com/es-es/dotnet/api/system.data.sqlclient.sqlparameter</w:t>
         </w:r>
       </w:hyperlink>
     </w:p>
     <w:p>
       <w:pPr>
         <w:spacing w:after="160" w:line="288" w:lineRule="auto"/>
-        <w:rPr>
-          <w:lang w:val="es-ES"/>
-        </w:rPr>
-      </w:pPr>
-      <w:r>
-        <w:t xml:space="preserve">Microsoft. (2025). </w:t>
+      </w:pPr>
+      <w:r>
+        <w:t xml:space="preserve">OWASP Foundation. (2025). </w:t>
       </w:r>
       <w:r>
         <w:rPr>
           <w:i/>
         </w:rPr>
-        <w:t>SqlParameter (clase) — System.Data.SqlClient</w:t>
-      </w:r>
-      <w:r>
-        <w:t xml:space="preserve">. Microsoft Learn. </w:t>
-      </w:r>
-      <w:hyperlink r:id="rId43">
+        <w:t>SQL Injection</w:t>
+      </w:r>
+      <w:r>
+        <w:t xml:space="preserve">. </w:t>
+      </w:r>
+      <w:hyperlink r:id="rId27">
         <w:r>
           <w:rPr>
             <w:color w:val="0563C1"/>
             <w:u w:val="single"/>
           </w:rPr>
-          <w:t xml:space="preserve">https://learn.microsoft.com/es-es/dotnet/api/system.data.sqlclient.sqlparameter</w:t>
+          <w:t>https://owasp.org/www-community/attacks/SQL_Injection</w:t>
         </w:r>
       </w:hyperlink>
     </w:p>
@@ -17023,53 +17248,32 @@
         </w:rPr>
       </w:pPr>
       <w:r>
-        <w:t xml:space="preserve">OWASP Foundation. (2025). </w:t>
+        <w:rPr>
+          <w:lang w:val="es-ES"/>
+        </w:rPr>
+        <w:t xml:space="preserve">Dirección General de Impuestos Internos. (2025). </w:t>
       </w:r>
       <w:r>
         <w:rPr>
           <w:i/>
-        </w:rPr>
-        <w:t>SQL Injection</w:t>
-      </w:r>
-      <w:r>
-        <w:t xml:space="preserve">. </w:t>
-      </w:r>
-      <w:hyperlink r:id="rId44">
+          <w:lang w:val="es-ES"/>
+        </w:rPr>
+        <w:t>ITBIS — Impuesto sobre Transferencias de Bienes Industrializados y Servicios</w:t>
+      </w:r>
+      <w:r>
+        <w:rPr>
+          <w:lang w:val="es-ES"/>
+        </w:rPr>
+        <w:t xml:space="preserve">. DGII. </w:t>
+      </w:r>
+      <w:hyperlink r:id="rId28">
         <w:r>
           <w:rPr>
             <w:color w:val="0563C1"/>
             <w:u w:val="single"/>
+            <w:lang w:val="es-ES"/>
           </w:rPr>
-          <w:t xml:space="preserve">https://owasp.org/www-community/attacks/SQL_Injection</w:t>
-        </w:r>
-      </w:hyperlink>
-    </w:p>
-    <w:p>
-      <w:pPr>
-        <w:spacing w:after="160" w:line="288" w:lineRule="auto"/>
-        <w:rPr>
-          <w:lang w:val="es-ES"/>
-        </w:rPr>
-      </w:pPr>
-      <w:r>
-        <w:t xml:space="preserve">Dirección General de Impuestos Internos. (2025). </w:t>
-      </w:r>
-      <w:r>
-        <w:rPr>
-          <w:i/>
-        </w:rPr>
-        <w:t>ITBIS — Impuesto sobre Transferencias de Bienes Industrializados y Servicios</w:t>
-      </w:r>
-      <w:r>
-        <w:t xml:space="preserve">. DGII. </w:t>
-      </w:r>
-      <w:hyperlink r:id="rId45">
-        <w:r>
-          <w:rPr>
-            <w:color w:val="0563C1"/>
-            <w:u w:val="single"/>
-          </w:rPr>
-          <w:t xml:space="preserve">https://dgii.gov.do/</w:t>
+          <w:t>https://dgii.gov.do/</w:t>
         </w:r>
       </w:hyperlink>
     </w:p>
@@ -17092,7 +17296,6 @@
           <w:sz w:val="32"/>
           <w:lang w:val="es-ES"/>
         </w:rPr>
-        <w:lastRenderedPageBreak/>
         <w:t>Anexo A — Código fuente completo</w:t>
       </w:r>
     </w:p>
@@ -17133,7 +17336,7 @@
         </w:rPr>
         <w:t xml:space="preserve">Repositorio del proyecto:  </w:t>
       </w:r>
-      <w:hyperlink r:id="rId21">
+      <w:hyperlink r:id="rId29">
         <w:r>
           <w:rPr>
             <w:color w:val="0563C1"/>
@@ -17155,6 +17358,7 @@
         <w:rPr>
           <w:lang w:val="es-ES"/>
         </w:rPr>
+        <w:lastRenderedPageBreak/>
         <w:t>Enlaces directos a cada capa dentro del repositorio:</w:t>
       </w:r>
     </w:p>
@@ -17178,7 +17382,7 @@
         </w:rPr>
         <w:t xml:space="preserve"> — clases del dominio (Cliente, Factura, Cobro, …): </w:t>
       </w:r>
-      <w:hyperlink r:id="rId22">
+      <w:hyperlink r:id="rId30">
         <w:r>
           <w:rPr>
             <w:color w:val="0563C1"/>
@@ -17209,7 +17413,7 @@
         </w:rPr>
         <w:t xml:space="preserve"> — capa de acceso a datos con ADO.NET (ConexionBD y DAOs): </w:t>
       </w:r>
-      <w:hyperlink r:id="rId23">
+      <w:hyperlink r:id="rId31">
         <w:r>
           <w:rPr>
             <w:color w:val="0563C1"/>
@@ -17240,7 +17444,7 @@
         </w:rPr>
         <w:t xml:space="preserve"> — lógica de negocio (cálculos, saldos, validaciones, seguridad): </w:t>
       </w:r>
-      <w:hyperlink r:id="rId24">
+      <w:hyperlink r:id="rId32">
         <w:r>
           <w:rPr>
             <w:color w:val="0563C1"/>
@@ -17271,7 +17475,7 @@
         </w:rPr>
         <w:t xml:space="preserve"> — formularios Windows Forms: </w:t>
       </w:r>
-      <w:hyperlink r:id="rId25">
+      <w:hyperlink r:id="rId33">
         <w:r>
           <w:rPr>
             <w:color w:val="0563C1"/>
@@ -17302,7 +17506,7 @@
         </w:rPr>
         <w:t xml:space="preserve"> — punto de entrada de la aplicación: </w:t>
       </w:r>
-      <w:hyperlink r:id="rId26">
+      <w:hyperlink r:id="rId34">
         <w:r>
           <w:rPr>
             <w:color w:val="0563C1"/>
@@ -17385,7 +17589,7 @@
         </w:rPr>
         <w:t xml:space="preserve"> — crea la base de datos SistemaFacturacionDB con sus tablas, claves y relaciones: </w:t>
       </w:r>
-      <w:hyperlink r:id="rId27">
+      <w:hyperlink r:id="rId35">
         <w:r>
           <w:rPr>
             <w:color w:val="0563C1"/>
@@ -17416,7 +17620,7 @@
         </w:rPr>
         <w:t xml:space="preserve"> — inserta los datos de prueba iniciales (usuarios, clientes, proveedores, productos): </w:t>
       </w:r>
-      <w:hyperlink r:id="rId28">
+      <w:hyperlink r:id="rId36">
         <w:r>
           <w:rPr>
             <w:color w:val="0563C1"/>
@@ -17484,7 +17688,7 @@
         </w:rPr>
         <w:t xml:space="preserve"> — cadena de conexión a SQL Server: </w:t>
       </w:r>
-      <w:hyperlink r:id="rId29">
+      <w:hyperlink r:id="rId37">
         <w:r>
           <w:rPr>
             <w:color w:val="0563C1"/>
@@ -17515,7 +17719,7 @@
         </w:rPr>
         <w:t xml:space="preserve"> — compila y ejecuta el proyecto sin necesidad de Visual Studio: </w:t>
       </w:r>
-      <w:hyperlink r:id="rId30">
+      <w:hyperlink r:id="rId38">
         <w:r>
           <w:rPr>
             <w:color w:val="0563C1"/>
@@ -17546,7 +17750,7 @@
         </w:rPr>
         <w:t xml:space="preserve"> — proyecto y solución para abrir en Visual Studio: </w:t>
       </w:r>
-      <w:hyperlink r:id="rId31">
+      <w:hyperlink r:id="rId39">
         <w:r>
           <w:rPr>
             <w:color w:val="0563C1"/>
@@ -17559,8 +17763,8 @@
     </w:p>
     <w:p>
       <w:pPr>
+        <w:keepNext/>
         <w:pageBreakBefore/>
-        <w:keepNext/>
         <w:pBdr>
           <w:bottom w:val="single" w:sz="6" w:space="6" w:color="0B4F6C"/>
         </w:pBdr>
@@ -17577,6 +17781,7 @@
           <w:sz w:val="32"/>
           <w:lang w:val="es-ES"/>
         </w:rPr>
+        <w:lastRenderedPageBreak/>
         <w:t>Anexo D — Declaración de originalidad y autoría</w:t>
       </w:r>
     </w:p>
@@ -17707,7 +17912,7 @@
         </w:rPr>
         <w:t xml:space="preserve">5.  El repositorio del código fuente está disponible en: </w:t>
       </w:r>
-      <w:hyperlink r:id="rId32">
+      <w:hyperlink r:id="rId40">
         <w:r>
           <w:rPr>
             <w:color w:val="0563C1"/>
@@ -17869,7 +18074,7 @@
                     </pic:cNvPicPr>
                   </pic:nvPicPr>
                   <pic:blipFill>
-                    <a:blip r:embed="rId33">
+                    <a:blip r:embed="rId41">
                       <a:extLst>
                         <a:ext uri="{28A0092B-C50C-407E-A947-70E740481C1C}">
                           <a14:useLocalDpi xmlns:a14="http://schemas.microsoft.com/office/drawing/2010/main" val="0"/>
@@ -18007,7 +18212,7 @@
                     </pic:cNvPicPr>
                   </pic:nvPicPr>
                   <pic:blipFill rotWithShape="1">
-                    <a:blip r:embed="rId34">
+                    <a:blip r:embed="rId42">
                       <a:extLst>
                         <a:ext uri="{28A0092B-C50C-407E-A947-70E740481C1C}">
                           <a14:useLocalDpi xmlns:a14="http://schemas.microsoft.com/office/drawing/2010/main" val="0"/>
@@ -18135,7 +18340,7 @@
                     </pic:cNvPicPr>
                   </pic:nvPicPr>
                   <pic:blipFill rotWithShape="1">
-                    <a:blip r:embed="rId35">
+                    <a:blip r:embed="rId43">
                       <a:extLst>
                         <a:ext uri="{28A0092B-C50C-407E-A947-70E740481C1C}">
                           <a14:useLocalDpi xmlns:a14="http://schemas.microsoft.com/office/drawing/2010/main" val="0"/>

</xml_diff>